<commit_message>
Báo cáo lab: điền bảng so sánh 4.4 (Claude Project vs Excel) và nhật ký AI Bài 3
Co-Authored-By: Claude Opus 5.5 <noreply@anthropic.com>
</commit_message>
<xml_diff>
--- a/docs/lab/QLDA_Nhom_PharmaDash_Lab.docx
+++ b/docs/lab/QLDA_Nhom_PharmaDash_Lab.docx
@@ -998,7 +998,7 @@
           <w:r>
             <w:fldChar w:fldCharType="separate"/>
           </w:r>
-          <w:hyperlink w:anchor="_Toc242012422" w:history="1">
+          <w:hyperlink w:anchor="_Toc242014135" w:history="1">
             <w:r>
               <w:rPr>
                 <w:rStyle w:val="Hyperlink"/>
@@ -1022,7 +1022,7 @@
               <w:rPr>
                 <w:noProof/>
               </w:rPr>
-              <w:instrText xml:space="preserve"> PAGEREF _Toc242012422 \h </w:instrText>
+              <w:instrText xml:space="preserve"> PAGEREF _Toc242014135 \h </w:instrText>
             </w:r>
             <w:r>
               <w:rPr>
@@ -1064,7 +1064,7 @@
               <w14:ligatures w14:val="standardContextual"/>
             </w:rPr>
           </w:pPr>
-          <w:hyperlink w:anchor="_Toc242012423" w:history="1">
+          <w:hyperlink w:anchor="_Toc242014136" w:history="1">
             <w:r>
               <w:rPr>
                 <w:rStyle w:val="Hyperlink"/>
@@ -1088,7 +1088,7 @@
               <w:rPr>
                 <w:noProof/>
               </w:rPr>
-              <w:instrText xml:space="preserve"> PAGEREF _Toc242012423 \h </w:instrText>
+              <w:instrText xml:space="preserve"> PAGEREF _Toc242014136 \h </w:instrText>
             </w:r>
             <w:r>
               <w:rPr>
@@ -1130,7 +1130,7 @@
               <w14:ligatures w14:val="standardContextual"/>
             </w:rPr>
           </w:pPr>
-          <w:hyperlink w:anchor="_Toc242012424" w:history="1">
+          <w:hyperlink w:anchor="_Toc242014137" w:history="1">
             <w:r>
               <w:rPr>
                 <w:rStyle w:val="Hyperlink"/>
@@ -1154,7 +1154,7 @@
               <w:rPr>
                 <w:noProof/>
               </w:rPr>
-              <w:instrText xml:space="preserve"> PAGEREF _Toc242012424 \h </w:instrText>
+              <w:instrText xml:space="preserve"> PAGEREF _Toc242014137 \h </w:instrText>
             </w:r>
             <w:r>
               <w:rPr>
@@ -1196,7 +1196,7 @@
               <w14:ligatures w14:val="standardContextual"/>
             </w:rPr>
           </w:pPr>
-          <w:hyperlink w:anchor="_Toc242012425" w:history="1">
+          <w:hyperlink w:anchor="_Toc242014138" w:history="1">
             <w:r>
               <w:rPr>
                 <w:rStyle w:val="Hyperlink"/>
@@ -1220,7 +1220,7 @@
               <w:rPr>
                 <w:noProof/>
               </w:rPr>
-              <w:instrText xml:space="preserve"> PAGEREF _Toc242012425 \h </w:instrText>
+              <w:instrText xml:space="preserve"> PAGEREF _Toc242014138 \h </w:instrText>
             </w:r>
             <w:r>
               <w:rPr>
@@ -1262,7 +1262,7 @@
               <w14:ligatures w14:val="standardContextual"/>
             </w:rPr>
           </w:pPr>
-          <w:hyperlink w:anchor="_Toc242012426" w:history="1">
+          <w:hyperlink w:anchor="_Toc242014139" w:history="1">
             <w:r>
               <w:rPr>
                 <w:rStyle w:val="Hyperlink"/>
@@ -1286,7 +1286,7 @@
               <w:rPr>
                 <w:noProof/>
               </w:rPr>
-              <w:instrText xml:space="preserve"> PAGEREF _Toc242012426 \h </w:instrText>
+              <w:instrText xml:space="preserve"> PAGEREF _Toc242014139 \h </w:instrText>
             </w:r>
             <w:r>
               <w:rPr>
@@ -1328,7 +1328,7 @@
               <w14:ligatures w14:val="standardContextual"/>
             </w:rPr>
           </w:pPr>
-          <w:hyperlink w:anchor="_Toc242012427" w:history="1">
+          <w:hyperlink w:anchor="_Toc242014140" w:history="1">
             <w:r>
               <w:rPr>
                 <w:rStyle w:val="Hyperlink"/>
@@ -1352,7 +1352,7 @@
               <w:rPr>
                 <w:noProof/>
               </w:rPr>
-              <w:instrText xml:space="preserve"> PAGEREF _Toc242012427 \h </w:instrText>
+              <w:instrText xml:space="preserve"> PAGEREF _Toc242014140 \h </w:instrText>
             </w:r>
             <w:r>
               <w:rPr>
@@ -1394,7 +1394,7 @@
               <w14:ligatures w14:val="standardContextual"/>
             </w:rPr>
           </w:pPr>
-          <w:hyperlink w:anchor="_Toc242012428" w:history="1">
+          <w:hyperlink w:anchor="_Toc242014141" w:history="1">
             <w:r>
               <w:rPr>
                 <w:rStyle w:val="Hyperlink"/>
@@ -1418,7 +1418,7 @@
               <w:rPr>
                 <w:noProof/>
               </w:rPr>
-              <w:instrText xml:space="preserve"> PAGEREF _Toc242012428 \h </w:instrText>
+              <w:instrText xml:space="preserve"> PAGEREF _Toc242014141 \h </w:instrText>
             </w:r>
             <w:r>
               <w:rPr>
@@ -1460,7 +1460,7 @@
               <w14:ligatures w14:val="standardContextual"/>
             </w:rPr>
           </w:pPr>
-          <w:hyperlink w:anchor="_Toc242012429" w:history="1">
+          <w:hyperlink w:anchor="_Toc242014142" w:history="1">
             <w:r>
               <w:rPr>
                 <w:rStyle w:val="Hyperlink"/>
@@ -1484,7 +1484,7 @@
               <w:rPr>
                 <w:noProof/>
               </w:rPr>
-              <w:instrText xml:space="preserve"> PAGEREF _Toc242012429 \h </w:instrText>
+              <w:instrText xml:space="preserve"> PAGEREF _Toc242014142 \h </w:instrText>
             </w:r>
             <w:r>
               <w:rPr>
@@ -1526,7 +1526,7 @@
               <w14:ligatures w14:val="standardContextual"/>
             </w:rPr>
           </w:pPr>
-          <w:hyperlink w:anchor="_Toc242012430" w:history="1">
+          <w:hyperlink w:anchor="_Toc242014143" w:history="1">
             <w:r>
               <w:rPr>
                 <w:rStyle w:val="Hyperlink"/>
@@ -1550,7 +1550,7 @@
               <w:rPr>
                 <w:noProof/>
               </w:rPr>
-              <w:instrText xml:space="preserve"> PAGEREF _Toc242012430 \h </w:instrText>
+              <w:instrText xml:space="preserve"> PAGEREF _Toc242014143 \h </w:instrText>
             </w:r>
             <w:r>
               <w:rPr>
@@ -1592,7 +1592,7 @@
               <w14:ligatures w14:val="standardContextual"/>
             </w:rPr>
           </w:pPr>
-          <w:hyperlink w:anchor="_Toc242012431" w:history="1">
+          <w:hyperlink w:anchor="_Toc242014144" w:history="1">
             <w:r>
               <w:rPr>
                 <w:rStyle w:val="Hyperlink"/>
@@ -1616,7 +1616,7 @@
               <w:rPr>
                 <w:noProof/>
               </w:rPr>
-              <w:instrText xml:space="preserve"> PAGEREF _Toc242012431 \h </w:instrText>
+              <w:instrText xml:space="preserve"> PAGEREF _Toc242014144 \h </w:instrText>
             </w:r>
             <w:r>
               <w:rPr>
@@ -1658,7 +1658,7 @@
               <w14:ligatures w14:val="standardContextual"/>
             </w:rPr>
           </w:pPr>
-          <w:hyperlink w:anchor="_Toc242012432" w:history="1">
+          <w:hyperlink w:anchor="_Toc242014145" w:history="1">
             <w:r>
               <w:rPr>
                 <w:rStyle w:val="Hyperlink"/>
@@ -1682,7 +1682,7 @@
               <w:rPr>
                 <w:noProof/>
               </w:rPr>
-              <w:instrText xml:space="preserve"> PAGEREF _Toc242012432 \h </w:instrText>
+              <w:instrText xml:space="preserve"> PAGEREF _Toc242014145 \h </w:instrText>
             </w:r>
             <w:r>
               <w:rPr>
@@ -1724,7 +1724,7 @@
               <w14:ligatures w14:val="standardContextual"/>
             </w:rPr>
           </w:pPr>
-          <w:hyperlink w:anchor="_Toc242012433" w:history="1">
+          <w:hyperlink w:anchor="_Toc242014146" w:history="1">
             <w:r>
               <w:rPr>
                 <w:rStyle w:val="Hyperlink"/>
@@ -1748,7 +1748,7 @@
               <w:rPr>
                 <w:noProof/>
               </w:rPr>
-              <w:instrText xml:space="preserve"> PAGEREF _Toc242012433 \h </w:instrText>
+              <w:instrText xml:space="preserve"> PAGEREF _Toc242014146 \h </w:instrText>
             </w:r>
             <w:r>
               <w:rPr>
@@ -1790,7 +1790,7 @@
               <w14:ligatures w14:val="standardContextual"/>
             </w:rPr>
           </w:pPr>
-          <w:hyperlink w:anchor="_Toc242012434" w:history="1">
+          <w:hyperlink w:anchor="_Toc242014147" w:history="1">
             <w:r>
               <w:rPr>
                 <w:rStyle w:val="Hyperlink"/>
@@ -1814,7 +1814,7 @@
               <w:rPr>
                 <w:noProof/>
               </w:rPr>
-              <w:instrText xml:space="preserve"> PAGEREF _Toc242012434 \h </w:instrText>
+              <w:instrText xml:space="preserve"> PAGEREF _Toc242014147 \h </w:instrText>
             </w:r>
             <w:r>
               <w:rPr>
@@ -1856,7 +1856,7 @@
               <w14:ligatures w14:val="standardContextual"/>
             </w:rPr>
           </w:pPr>
-          <w:hyperlink w:anchor="_Toc242012435" w:history="1">
+          <w:hyperlink w:anchor="_Toc242014148" w:history="1">
             <w:r>
               <w:rPr>
                 <w:rStyle w:val="Hyperlink"/>
@@ -1880,7 +1880,7 @@
               <w:rPr>
                 <w:noProof/>
               </w:rPr>
-              <w:instrText xml:space="preserve"> PAGEREF _Toc242012435 \h </w:instrText>
+              <w:instrText xml:space="preserve"> PAGEREF _Toc242014148 \h </w:instrText>
             </w:r>
             <w:r>
               <w:rPr>
@@ -1922,7 +1922,7 @@
               <w14:ligatures w14:val="standardContextual"/>
             </w:rPr>
           </w:pPr>
-          <w:hyperlink w:anchor="_Toc242012436" w:history="1">
+          <w:hyperlink w:anchor="_Toc242014149" w:history="1">
             <w:r>
               <w:rPr>
                 <w:rStyle w:val="Hyperlink"/>
@@ -1946,7 +1946,7 @@
               <w:rPr>
                 <w:noProof/>
               </w:rPr>
-              <w:instrText xml:space="preserve"> PAGEREF _Toc242012436 \h </w:instrText>
+              <w:instrText xml:space="preserve"> PAGEREF _Toc242014149 \h </w:instrText>
             </w:r>
             <w:r>
               <w:rPr>
@@ -1988,7 +1988,7 @@
               <w14:ligatures w14:val="standardContextual"/>
             </w:rPr>
           </w:pPr>
-          <w:hyperlink w:anchor="_Toc242012437" w:history="1">
+          <w:hyperlink w:anchor="_Toc242014150" w:history="1">
             <w:r>
               <w:rPr>
                 <w:rStyle w:val="Hyperlink"/>
@@ -2012,7 +2012,7 @@
               <w:rPr>
                 <w:noProof/>
               </w:rPr>
-              <w:instrText xml:space="preserve"> PAGEREF _Toc242012437 \h </w:instrText>
+              <w:instrText xml:space="preserve"> PAGEREF _Toc242014150 \h </w:instrText>
             </w:r>
             <w:r>
               <w:rPr>
@@ -2054,7 +2054,7 @@
               <w14:ligatures w14:val="standardContextual"/>
             </w:rPr>
           </w:pPr>
-          <w:hyperlink w:anchor="_Toc242012438" w:history="1">
+          <w:hyperlink w:anchor="_Toc242014151" w:history="1">
             <w:r>
               <w:rPr>
                 <w:rStyle w:val="Hyperlink"/>
@@ -2078,7 +2078,7 @@
               <w:rPr>
                 <w:noProof/>
               </w:rPr>
-              <w:instrText xml:space="preserve"> PAGEREF _Toc242012438 \h </w:instrText>
+              <w:instrText xml:space="preserve"> PAGEREF _Toc242014151 \h </w:instrText>
             </w:r>
             <w:r>
               <w:rPr>
@@ -2120,7 +2120,7 @@
               <w14:ligatures w14:val="standardContextual"/>
             </w:rPr>
           </w:pPr>
-          <w:hyperlink w:anchor="_Toc242012439" w:history="1">
+          <w:hyperlink w:anchor="_Toc242014152" w:history="1">
             <w:r>
               <w:rPr>
                 <w:rStyle w:val="Hyperlink"/>
@@ -2144,7 +2144,7 @@
               <w:rPr>
                 <w:noProof/>
               </w:rPr>
-              <w:instrText xml:space="preserve"> PAGEREF _Toc242012439 \h </w:instrText>
+              <w:instrText xml:space="preserve"> PAGEREF _Toc242014152 \h </w:instrText>
             </w:r>
             <w:r>
               <w:rPr>
@@ -2186,7 +2186,7 @@
               <w14:ligatures w14:val="standardContextual"/>
             </w:rPr>
           </w:pPr>
-          <w:hyperlink w:anchor="_Toc242012440" w:history="1">
+          <w:hyperlink w:anchor="_Toc242014153" w:history="1">
             <w:r>
               <w:rPr>
                 <w:rStyle w:val="Hyperlink"/>
@@ -2210,7 +2210,7 @@
               <w:rPr>
                 <w:noProof/>
               </w:rPr>
-              <w:instrText xml:space="preserve"> PAGEREF _Toc242012440 \h </w:instrText>
+              <w:instrText xml:space="preserve"> PAGEREF _Toc242014153 \h </w:instrText>
             </w:r>
             <w:r>
               <w:rPr>
@@ -2252,7 +2252,7 @@
               <w14:ligatures w14:val="standardContextual"/>
             </w:rPr>
           </w:pPr>
-          <w:hyperlink w:anchor="_Toc242012441" w:history="1">
+          <w:hyperlink w:anchor="_Toc242014154" w:history="1">
             <w:r>
               <w:rPr>
                 <w:rStyle w:val="Hyperlink"/>
@@ -2276,7 +2276,7 @@
               <w:rPr>
                 <w:noProof/>
               </w:rPr>
-              <w:instrText xml:space="preserve"> PAGEREF _Toc242012441 \h </w:instrText>
+              <w:instrText xml:space="preserve"> PAGEREF _Toc242014154 \h </w:instrText>
             </w:r>
             <w:r>
               <w:rPr>
@@ -2318,7 +2318,7 @@
               <w14:ligatures w14:val="standardContextual"/>
             </w:rPr>
           </w:pPr>
-          <w:hyperlink w:anchor="_Toc242012442" w:history="1">
+          <w:hyperlink w:anchor="_Toc242014155" w:history="1">
             <w:r>
               <w:rPr>
                 <w:rStyle w:val="Hyperlink"/>
@@ -2342,7 +2342,7 @@
               <w:rPr>
                 <w:noProof/>
               </w:rPr>
-              <w:instrText xml:space="preserve"> PAGEREF _Toc242012442 \h </w:instrText>
+              <w:instrText xml:space="preserve"> PAGEREF _Toc242014155 \h </w:instrText>
             </w:r>
             <w:r>
               <w:rPr>
@@ -2384,7 +2384,7 @@
               <w14:ligatures w14:val="standardContextual"/>
             </w:rPr>
           </w:pPr>
-          <w:hyperlink w:anchor="_Toc242012443" w:history="1">
+          <w:hyperlink w:anchor="_Toc242014156" w:history="1">
             <w:r>
               <w:rPr>
                 <w:rStyle w:val="Hyperlink"/>
@@ -2408,7 +2408,7 @@
               <w:rPr>
                 <w:noProof/>
               </w:rPr>
-              <w:instrText xml:space="preserve"> PAGEREF _Toc242012443 \h </w:instrText>
+              <w:instrText xml:space="preserve"> PAGEREF _Toc242014156 \h </w:instrText>
             </w:r>
             <w:r>
               <w:rPr>
@@ -2450,7 +2450,7 @@
               <w14:ligatures w14:val="standardContextual"/>
             </w:rPr>
           </w:pPr>
-          <w:hyperlink w:anchor="_Toc242012444" w:history="1">
+          <w:hyperlink w:anchor="_Toc242014157" w:history="1">
             <w:r>
               <w:rPr>
                 <w:rStyle w:val="Hyperlink"/>
@@ -2474,7 +2474,7 @@
               <w:rPr>
                 <w:noProof/>
               </w:rPr>
-              <w:instrText xml:space="preserve"> PAGEREF _Toc242012444 \h </w:instrText>
+              <w:instrText xml:space="preserve"> PAGEREF _Toc242014157 \h </w:instrText>
             </w:r>
             <w:r>
               <w:rPr>
@@ -2516,7 +2516,7 @@
               <w14:ligatures w14:val="standardContextual"/>
             </w:rPr>
           </w:pPr>
-          <w:hyperlink w:anchor="_Toc242012445" w:history="1">
+          <w:hyperlink w:anchor="_Toc242014158" w:history="1">
             <w:r>
               <w:rPr>
                 <w:rStyle w:val="Hyperlink"/>
@@ -2540,7 +2540,7 @@
               <w:rPr>
                 <w:noProof/>
               </w:rPr>
-              <w:instrText xml:space="preserve"> PAGEREF _Toc242012445 \h </w:instrText>
+              <w:instrText xml:space="preserve"> PAGEREF _Toc242014158 \h </w:instrText>
             </w:r>
             <w:r>
               <w:rPr>
@@ -2582,7 +2582,7 @@
               <w14:ligatures w14:val="standardContextual"/>
             </w:rPr>
           </w:pPr>
-          <w:hyperlink w:anchor="_Toc242012446" w:history="1">
+          <w:hyperlink w:anchor="_Toc242014159" w:history="1">
             <w:r>
               <w:rPr>
                 <w:rStyle w:val="Hyperlink"/>
@@ -2606,7 +2606,7 @@
               <w:rPr>
                 <w:noProof/>
               </w:rPr>
-              <w:instrText xml:space="preserve"> PAGEREF _Toc242012446 \h </w:instrText>
+              <w:instrText xml:space="preserve"> PAGEREF _Toc242014159 \h </w:instrText>
             </w:r>
             <w:r>
               <w:rPr>
@@ -2648,7 +2648,7 @@
               <w14:ligatures w14:val="standardContextual"/>
             </w:rPr>
           </w:pPr>
-          <w:hyperlink w:anchor="_Toc242012447" w:history="1">
+          <w:hyperlink w:anchor="_Toc242014160" w:history="1">
             <w:r>
               <w:rPr>
                 <w:rStyle w:val="Hyperlink"/>
@@ -2672,7 +2672,7 @@
               <w:rPr>
                 <w:noProof/>
               </w:rPr>
-              <w:instrText xml:space="preserve"> PAGEREF _Toc242012447 \h </w:instrText>
+              <w:instrText xml:space="preserve"> PAGEREF _Toc242014160 \h </w:instrText>
             </w:r>
             <w:r>
               <w:rPr>
@@ -2714,7 +2714,7 @@
               <w14:ligatures w14:val="standardContextual"/>
             </w:rPr>
           </w:pPr>
-          <w:hyperlink w:anchor="_Toc242012448" w:history="1">
+          <w:hyperlink w:anchor="_Toc242014161" w:history="1">
             <w:r>
               <w:rPr>
                 <w:rStyle w:val="Hyperlink"/>
@@ -2738,7 +2738,7 @@
               <w:rPr>
                 <w:noProof/>
               </w:rPr>
-              <w:instrText xml:space="preserve"> PAGEREF _Toc242012448 \h </w:instrText>
+              <w:instrText xml:space="preserve"> PAGEREF _Toc242014161 \h </w:instrText>
             </w:r>
             <w:r>
               <w:rPr>
@@ -2780,7 +2780,7 @@
               <w14:ligatures w14:val="standardContextual"/>
             </w:rPr>
           </w:pPr>
-          <w:hyperlink w:anchor="_Toc242012449" w:history="1">
+          <w:hyperlink w:anchor="_Toc242014162" w:history="1">
             <w:r>
               <w:rPr>
                 <w:rStyle w:val="Hyperlink"/>
@@ -2804,7 +2804,7 @@
               <w:rPr>
                 <w:noProof/>
               </w:rPr>
-              <w:instrText xml:space="preserve"> PAGEREF _Toc242012449 \h </w:instrText>
+              <w:instrText xml:space="preserve"> PAGEREF _Toc242014162 \h </w:instrText>
             </w:r>
             <w:r>
               <w:rPr>
@@ -2864,7 +2864,7 @@
         <w:keepNext/>
         <w:keepLines/>
       </w:pPr>
-      <w:bookmarkStart w:id="0" w:name="_Toc242012422"/>
+      <w:bookmarkStart w:id="0" w:name="_Toc242014135"/>
       <w:r>
         <w:lastRenderedPageBreak/>
         <w:t>1. Thiết lập Claude Project</w:t>
@@ -3683,7 +3683,7 @@
         <w:keepNext/>
         <w:keepLines/>
       </w:pPr>
-      <w:bookmarkStart w:id="1" w:name="_Toc242012423"/>
+      <w:bookmarkStart w:id="1" w:name="_Toc242014136"/>
       <w:r>
         <w:t>2. Project Charter (Tuyên bố dự án)</w:t>
       </w:r>
@@ -4169,7 +4169,7 @@
         <w:keepNext/>
         <w:keepLines/>
       </w:pPr>
-      <w:bookmarkStart w:id="2" w:name="_Toc242012424"/>
+      <w:bookmarkStart w:id="2" w:name="_Toc242014137"/>
       <w:r>
         <w:t>2.1 Mục tiêu SMART</w:t>
       </w:r>
@@ -5194,7 +5194,7 @@
         <w:keepNext/>
         <w:keepLines/>
       </w:pPr>
-      <w:bookmarkStart w:id="3" w:name="_Toc242012425"/>
+      <w:bookmarkStart w:id="3" w:name="_Toc242014138"/>
       <w:r>
         <w:t>2.2 Phạm vi</w:t>
       </w:r>
@@ -5604,7 +5604,7 @@
         <w:keepNext/>
         <w:keepLines/>
       </w:pPr>
-      <w:bookmarkStart w:id="4" w:name="_Toc242012426"/>
+      <w:bookmarkStart w:id="4" w:name="_Toc242014139"/>
       <w:r>
         <w:t>2.3 Sản phẩm bàn giao chính</w:t>
       </w:r>
@@ -5668,7 +5668,7 @@
         <w:keepNext/>
         <w:keepLines/>
       </w:pPr>
-      <w:bookmarkStart w:id="5" w:name="_Toc242012427"/>
+      <w:bookmarkStart w:id="5" w:name="_Toc242014140"/>
       <w:r>
         <w:t>2.4 Các bên liên quan</w:t>
       </w:r>
@@ -6455,7 +6455,7 @@
         <w:keepNext/>
         <w:keepLines/>
       </w:pPr>
-      <w:bookmarkStart w:id="6" w:name="_Toc242012428"/>
+      <w:bookmarkStart w:id="6" w:name="_Toc242014141"/>
       <w:r>
         <w:t>2.5 Mốc thời gian chính (mục tiêu)</w:t>
       </w:r>
@@ -7501,7 +7501,7 @@
         <w:keepNext/>
         <w:keepLines/>
       </w:pPr>
-      <w:bookmarkStart w:id="7" w:name="_Toc242012429"/>
+      <w:bookmarkStart w:id="7" w:name="_Toc242014142"/>
       <w:r>
         <w:t>2.6 Giả định và ràng buộc</w:t>
       </w:r>
@@ -7768,7 +7768,7 @@
         <w:keepNext/>
         <w:keepLines/>
       </w:pPr>
-      <w:bookmarkStart w:id="8" w:name="_Toc242012430"/>
+      <w:bookmarkStart w:id="8" w:name="_Toc242014143"/>
       <w:r>
         <w:t>2.7 Rủi ro cấp cao</w:t>
       </w:r>
@@ -7832,7 +7832,7 @@
         <w:keepNext/>
         <w:keepLines/>
       </w:pPr>
-      <w:bookmarkStart w:id="9" w:name="_Toc242012431"/>
+      <w:bookmarkStart w:id="9" w:name="_Toc242014144"/>
       <w:r>
         <w:t>2.8 Tiêu chí thành công và nghiệm thu</w:t>
       </w:r>
@@ -7909,7 +7909,7 @@
         <w:keepNext/>
         <w:keepLines/>
       </w:pPr>
-      <w:bookmarkStart w:id="10" w:name="_Toc242012432"/>
+      <w:bookmarkStart w:id="10" w:name="_Toc242014145"/>
       <w:r>
         <w:t>2.9 Thông tin còn thiếu – câu hỏi làm rõ với khách hàng</w:t>
       </w:r>
@@ -9180,7 +9180,7 @@
         <w:keepNext/>
         <w:keepLines/>
       </w:pPr>
-      <w:bookmarkStart w:id="11" w:name="_Toc242012433"/>
+      <w:bookmarkStart w:id="11" w:name="_Toc242014146"/>
       <w:r>
         <w:t>3. Phạm vi và WBS</w:t>
       </w:r>
@@ -9211,7 +9211,7 @@
         <w:keepNext/>
         <w:keepLines/>
       </w:pPr>
-      <w:bookmarkStart w:id="12" w:name="_Toc242012434"/>
+      <w:bookmarkStart w:id="12" w:name="_Toc242014147"/>
       <w:r>
         <w:t>3.1 Sơ đồ cây WBS</w:t>
       </w:r>
@@ -9300,7 +9300,7 @@
         <w:keepNext/>
         <w:keepLines/>
       </w:pPr>
-      <w:bookmarkStart w:id="13" w:name="_Toc242012435"/>
+      <w:bookmarkStart w:id="13" w:name="_Toc242014148"/>
       <w:r>
         <w:t>3.2 Bảng WBS</w:t>
       </w:r>
@@ -21206,7 +21206,7 @@
         <w:keepNext/>
         <w:keepLines/>
       </w:pPr>
-      <w:bookmarkStart w:id="14" w:name="_Toc242012436"/>
+      <w:bookmarkStart w:id="14" w:name="_Toc242014149"/>
       <w:r>
         <w:t>3.3 Từ điển WBS (3 gói công việc quan trọng nhất)</w:t>
       </w:r>
@@ -22912,7 +22912,7 @@
         <w:keepNext/>
         <w:keepLines/>
       </w:pPr>
-      <w:bookmarkStart w:id="15" w:name="_Toc242012437"/>
+      <w:bookmarkStart w:id="15" w:name="_Toc242014150"/>
       <w:r>
         <w:t>4. Ước lượng, lịch dự án và đường găng</w:t>
       </w:r>
@@ -22932,7 +22932,7 @@
         <w:keepNext/>
         <w:keepLines/>
       </w:pPr>
-      <w:bookmarkStart w:id="16" w:name="_Toc242012438"/>
+      <w:bookmarkStart w:id="16" w:name="_Toc242014151"/>
       <w:r>
         <w:t>4.1 Bảng PERT và CPM</w:t>
       </w:r>
@@ -30532,7 +30532,7 @@
         <w:keepNext/>
         <w:keepLines/>
       </w:pPr>
-      <w:bookmarkStart w:id="17" w:name="_Toc242012439"/>
+      <w:bookmarkStart w:id="17" w:name="_Toc242014152"/>
       <w:r>
         <w:t>4.2 Kết quả</w:t>
       </w:r>
@@ -31081,7 +31081,7 @@
         <w:keepNext/>
         <w:keepLines/>
       </w:pPr>
-      <w:bookmarkStart w:id="18" w:name="_Toc242012440"/>
+      <w:bookmarkStart w:id="18" w:name="_Toc242014153"/>
       <w:r>
         <w:t>4.3 Biểu đồ Gantt</w:t>
       </w:r>
@@ -31159,7 +31159,7 @@
         <w:keepNext/>
         <w:keepLines/>
       </w:pPr>
-      <w:bookmarkStart w:id="19" w:name="_Toc242012441"/>
+      <w:bookmarkStart w:id="19" w:name="_Toc242014154"/>
       <w:r>
         <w:t>4.4 So sánh kết quả Excel với câu trả lời của AI (Claude Project)</w:t>
       </w:r>
@@ -31170,13 +31170,7 @@
         <w:spacing w:after="120"/>
       </w:pPr>
       <w:r>
-        <w:rPr>
-          <w:i/>
-          <w:iCs/>
-          <w:color w:val="7A5C00"/>
-          <w:highlight w:val="yellow"/>
-        </w:rPr>
-        <w:t>[NHÓM ĐIỀN: Nhập TE mà Claude trả lời trong chat Bai3_Lich vào cột “TE theo AI” của sheet PERT, rồi ghi lại các chỗ khác biệt (sai số học, hiểu sai quan hệ phụ thuộc, sai đường găng...) vào bảng dưới]</w:t>
+        <w:t>Đã nhập TE do Claude tính (chat Bai3_Lich trong Claude Project, 04/10/2026) vào cột S sheet PERT của file Excel; cột chênh lệch bằng 0,00 ở cả 15 hoạt động. So sánh chi tiết:</w:t>
       </w:r>
     </w:p>
     <w:tbl>
@@ -31370,12 +31364,10 @@
             </w:pPr>
             <w:r>
               <w:rPr>
-                <w:i/>
-                <w:iCs/>
-                <w:color w:val="7A5C00"/>
-                <w:highlight w:val="yellow"/>
-              </w:rPr>
-              <w:t>[NHÓM ĐIỀN: …]</w:t>
+                <w:b/>
+                <w:sz w:val="18"/>
+              </w:rPr>
+              <w:t>Đường găng</w:t>
             </w:r>
           </w:p>
         </w:tc>
@@ -31401,12 +31393,9 @@
             </w:pPr>
             <w:r>
               <w:rPr>
-                <w:i/>
-                <w:iCs/>
-                <w:color w:val="7A5C00"/>
-                <w:highlight w:val="yellow"/>
-              </w:rPr>
-              <w:t>[NHÓM ĐIỀN: …]</w:t>
+                <w:sz w:val="18"/>
+              </w:rPr>
+              <w:t>A → B → C → E → I → J → M → N → O; liệt kê đủ 5 đường từ A đến O</w:t>
             </w:r>
           </w:p>
         </w:tc>
@@ -31432,12 +31421,9 @@
             </w:pPr>
             <w:r>
               <w:rPr>
-                <w:i/>
-                <w:iCs/>
-                <w:color w:val="7A5C00"/>
-                <w:highlight w:val="yellow"/>
-              </w:rPr>
-              <w:t>[NHÓM ĐIỀN: …]</w:t>
+                <w:sz w:val="18"/>
+              </w:rPr>
+              <w:t>A → B → C → E → I → J → M → N → O</w:t>
             </w:r>
           </w:p>
         </w:tc>
@@ -31463,12 +31449,9 @@
             </w:pPr>
             <w:r>
               <w:rPr>
-                <w:i/>
-                <w:iCs/>
-                <w:color w:val="7A5C00"/>
-                <w:highlight w:val="yellow"/>
-              </w:rPr>
-              <w:t>[NHÓM ĐIỀN: …]</w:t>
+                <w:sz w:val="18"/>
+              </w:rPr>
+              <w:t>Khớp. Claude còn chỉ ra đường gần găng A-B-C-D-F-G-K-M-N-O chỉ ngắn hơn 0,5 ngày – trùng với slack 0,5 của D, F, G, K trong Excel.</w:t>
             </w:r>
           </w:p>
         </w:tc>
@@ -31499,12 +31482,10 @@
             </w:pPr>
             <w:r>
               <w:rPr>
-                <w:i/>
-                <w:iCs/>
-                <w:color w:val="7A5C00"/>
-                <w:highlight w:val="yellow"/>
-              </w:rPr>
-              <w:t>[NHÓM ĐIỀN: …]</w:t>
+                <w:b/>
+                <w:sz w:val="18"/>
+              </w:rPr>
+              <w:t>TE 15 hoạt động</w:t>
             </w:r>
           </w:p>
         </w:tc>
@@ -31530,12 +31511,9 @@
             </w:pPr>
             <w:r>
               <w:rPr>
-                <w:i/>
-                <w:iCs/>
-                <w:color w:val="7A5C00"/>
-                <w:highlight w:val="yellow"/>
-              </w:rPr>
-              <w:t>[NHÓM ĐIỀN: …]</w:t>
+                <w:sz w:val="18"/>
+              </w:rPr>
+              <w:t>Phân số chính xác, ví dụ A = 31/6 ≈ 5,17; J = 123/6 = 20,50</w:t>
             </w:r>
           </w:p>
         </w:tc>
@@ -31561,12 +31539,9 @@
             </w:pPr>
             <w:r>
               <w:rPr>
-                <w:i/>
-                <w:iCs/>
-                <w:color w:val="7A5C00"/>
-                <w:highlight w:val="yellow"/>
-              </w:rPr>
-              <w:t>[NHÓM ĐIỀN: …]</w:t>
+                <w:sz w:val="18"/>
+              </w:rPr>
+              <w:t>Cột H sheet PERT; TE của AI nhập ở cột S</w:t>
             </w:r>
           </w:p>
         </w:tc>
@@ -31592,12 +31567,9 @@
             </w:pPr>
             <w:r>
               <w:rPr>
-                <w:i/>
-                <w:iCs/>
-                <w:color w:val="7A5C00"/>
-                <w:highlight w:val="yellow"/>
-              </w:rPr>
-              <w:t>[NHÓM ĐIỀN: …]</w:t>
+                <w:sz w:val="18"/>
+              </w:rPr>
+              <w:t>Khớp: cột chênh lệch (T) bằng 0,00 ở cả 15 hoạt động. Claude tính bằng script Python với phân số nên không có sai số làm tròn.</w:t>
             </w:r>
           </w:p>
         </w:tc>
@@ -31628,12 +31600,10 @@
             </w:pPr>
             <w:r>
               <w:rPr>
-                <w:i/>
-                <w:iCs/>
-                <w:color w:val="7A5C00"/>
-                <w:highlight w:val="yellow"/>
-              </w:rPr>
-              <w:t>[NHÓM ĐIỀN: …]</w:t>
+                <w:b/>
+                <w:sz w:val="18"/>
+              </w:rPr>
+              <w:t>T, σ, xác suất kịp hạn</w:t>
             </w:r>
           </w:p>
         </w:tc>
@@ -31659,12 +31629,9 @@
             </w:pPr>
             <w:r>
               <w:rPr>
-                <w:i/>
-                <w:iCs/>
-                <w:color w:val="7A5C00"/>
-                <w:highlight w:val="yellow"/>
-              </w:rPr>
-              <w:t>[NHÓM ĐIỀN: …]</w:t>
+                <w:sz w:val="18"/>
+              </w:rPr>
+              <w:t>T = 452/6 ≈ 75,33 ngày; σ = √(235/18) ≈ 3,61; Z = −3,14; P ≈ 0,09%</w:t>
             </w:r>
           </w:p>
         </w:tc>
@@ -31690,12 +31657,9 @@
             </w:pPr>
             <w:r>
               <w:rPr>
-                <w:i/>
-                <w:iCs/>
-                <w:color w:val="7A5C00"/>
-                <w:highlight w:val="yellow"/>
-              </w:rPr>
-              <w:t>[NHÓM ĐIỀN: …]</w:t>
+                <w:sz w:val="18"/>
+              </w:rPr>
+              <w:t>T = 75,33; σ = 3,61; Z = −3,14; P ≈ 0,09%</w:t>
             </w:r>
           </w:p>
         </w:tc>
@@ -31721,12 +31685,245 @@
             </w:pPr>
             <w:r>
               <w:rPr>
-                <w:i/>
-                <w:iCs/>
-                <w:color w:val="7A5C00"/>
-                <w:highlight w:val="yellow"/>
-              </w:rPr>
-              <w:t>[NHÓM ĐIỀN: …]</w:t>
+                <w:sz w:val="18"/>
+              </w:rPr>
+              <w:t>Khớp. Claude cộng đúng phương sai σ² của các hoạt động găng rồi mới lấy căn, không cộng trực tiếp σ.</w:t>
+            </w:r>
+          </w:p>
+        </w:tc>
+      </w:tr>
+      <w:tr>
+        <w:trPr>
+          <w:cantSplit/>
+        </w:trPr>
+        <w:tc>
+          <w:tcPr>
+            <w:tcW w:w="1500" w:type="dxa"/>
+            <w:tcBorders>
+              <w:top w:val="single" w:sz="4" w:space="0" w:color="BFBFBF"/>
+              <w:left w:val="single" w:sz="4" w:space="0" w:color="BFBFBF"/>
+              <w:bottom w:val="single" w:sz="4" w:space="0" w:color="BFBFBF"/>
+              <w:right w:val="single" w:sz="4" w:space="0" w:color="BFBFBF"/>
+            </w:tcBorders>
+            <w:tcMar>
+              <w:top w:w="50" w:type="dxa"/>
+              <w:left w:w="90" w:type="dxa"/>
+              <w:bottom w:w="50" w:type="dxa"/>
+              <w:right w:w="90" w:type="dxa"/>
+            </w:tcMar>
+          </w:tcPr>
+          <w:p>
+            <w:pPr>
+              <w:spacing w:after="20"/>
+            </w:pPr>
+            <w:r>
+              <w:rPr>
+                <w:b/>
+                <w:sz w:val="18"/>
+              </w:rPr>
+              <w:t>Ngày kết thúc</w:t>
+            </w:r>
+          </w:p>
+        </w:tc>
+        <w:tc>
+          <w:tcPr>
+            <w:tcW w:w="4500" w:type="dxa"/>
+            <w:tcBorders>
+              <w:top w:val="single" w:sz="4" w:space="0" w:color="BFBFBF"/>
+              <w:left w:val="single" w:sz="4" w:space="0" w:color="BFBFBF"/>
+              <w:bottom w:val="single" w:sz="4" w:space="0" w:color="BFBFBF"/>
+              <w:right w:val="single" w:sz="4" w:space="0" w:color="BFBFBF"/>
+            </w:tcBorders>
+            <w:tcMar>
+              <w:top w:w="50" w:type="dxa"/>
+              <w:left w:w="90" w:type="dxa"/>
+              <w:bottom w:w="50" w:type="dxa"/>
+              <w:right w:w="90" w:type="dxa"/>
+            </w:tcMar>
+          </w:tcPr>
+          <w:p>
+            <w:pPr>
+              <w:spacing w:after="20"/>
+            </w:pPr>
+            <w:r>
+              <w:rPr>
+                <w:sz w:val="18"/>
+              </w:rPr>
+              <w:t>18/01/2027, hoặc 19/01/2027 nếu nghỉ Tết Dương lịch 01/01/2027</w:t>
+            </w:r>
+          </w:p>
+        </w:tc>
+        <w:tc>
+          <w:tcPr>
+            <w:tcW w:w="4500" w:type="dxa"/>
+            <w:tcBorders>
+              <w:top w:val="single" w:sz="4" w:space="0" w:color="BFBFBF"/>
+              <w:left w:val="single" w:sz="4" w:space="0" w:color="BFBFBF"/>
+              <w:bottom w:val="single" w:sz="4" w:space="0" w:color="BFBFBF"/>
+              <w:right w:val="single" w:sz="4" w:space="0" w:color="BFBFBF"/>
+            </w:tcBorders>
+            <w:tcMar>
+              <w:top w:w="50" w:type="dxa"/>
+              <w:left w:w="90" w:type="dxa"/>
+              <w:bottom w:w="50" w:type="dxa"/>
+              <w:right w:w="90" w:type="dxa"/>
+            </w:tcMar>
+          </w:tcPr>
+          <w:p>
+            <w:pPr>
+              <w:spacing w:after="20"/>
+            </w:pPr>
+            <w:r>
+              <w:rPr>
+                <w:sz w:val="18"/>
+              </w:rPr>
+              <w:t>18/01/2027 (hàm WORKDAY chưa khai báo ngày lễ)</w:t>
+            </w:r>
+          </w:p>
+        </w:tc>
+        <w:tc>
+          <w:tcPr>
+            <w:tcW w:w="4070" w:type="dxa"/>
+            <w:tcBorders>
+              <w:top w:val="single" w:sz="4" w:space="0" w:color="BFBFBF"/>
+              <w:left w:val="single" w:sz="4" w:space="0" w:color="BFBFBF"/>
+              <w:bottom w:val="single" w:sz="4" w:space="0" w:color="BFBFBF"/>
+              <w:right w:val="single" w:sz="4" w:space="0" w:color="BFBFBF"/>
+            </w:tcBorders>
+            <w:tcMar>
+              <w:top w:w="50" w:type="dxa"/>
+              <w:left w:w="90" w:type="dxa"/>
+              <w:bottom w:w="50" w:type="dxa"/>
+              <w:right w:w="90" w:type="dxa"/>
+            </w:tcMar>
+          </w:tcPr>
+          <w:p>
+            <w:pPr>
+              <w:spacing w:after="20"/>
+            </w:pPr>
+            <w:r>
+              <w:rPr>
+                <w:sz w:val="18"/>
+              </w:rPr>
+              <w:t>AI tốt hơn Excel ở điểm này: 01/01 là ngày nghỉ lễ chính thức. Cần bổ sung danh sách ngày lễ vào hàm WORKDAY. Lịch sau khi nén (kết thúc 29/12/2026) không bị ảnh hưởng.</w:t>
+            </w:r>
+          </w:p>
+        </w:tc>
+      </w:tr>
+      <w:tr>
+        <w:trPr>
+          <w:cantSplit/>
+        </w:trPr>
+        <w:tc>
+          <w:tcPr>
+            <w:tcW w:w="1500" w:type="dxa"/>
+            <w:tcBorders>
+              <w:top w:val="single" w:sz="4" w:space="0" w:color="BFBFBF"/>
+              <w:left w:val="single" w:sz="4" w:space="0" w:color="BFBFBF"/>
+              <w:bottom w:val="single" w:sz="4" w:space="0" w:color="BFBFBF"/>
+              <w:right w:val="single" w:sz="4" w:space="0" w:color="BFBFBF"/>
+            </w:tcBorders>
+            <w:tcMar>
+              <w:top w:w="50" w:type="dxa"/>
+              <w:left w:w="90" w:type="dxa"/>
+              <w:bottom w:w="50" w:type="dxa"/>
+              <w:right w:w="90" w:type="dxa"/>
+            </w:tcMar>
+          </w:tcPr>
+          <w:p>
+            <w:pPr>
+              <w:spacing w:after="20"/>
+            </w:pPr>
+            <w:r>
+              <w:rPr>
+                <w:b/>
+                <w:sz w:val="18"/>
+              </w:rPr>
+              <w:t>Giả định nguồn lực</w:t>
+            </w:r>
+          </w:p>
+        </w:tc>
+        <w:tc>
+          <w:tcPr>
+            <w:tcW w:w="4500" w:type="dxa"/>
+            <w:tcBorders>
+              <w:top w:val="single" w:sz="4" w:space="0" w:color="BFBFBF"/>
+              <w:left w:val="single" w:sz="4" w:space="0" w:color="BFBFBF"/>
+              <w:bottom w:val="single" w:sz="4" w:space="0" w:color="BFBFBF"/>
+              <w:right w:val="single" w:sz="4" w:space="0" w:color="BFBFBF"/>
+            </w:tcBorders>
+            <w:tcMar>
+              <w:top w:w="50" w:type="dxa"/>
+              <w:left w:w="90" w:type="dxa"/>
+              <w:bottom w:w="50" w:type="dxa"/>
+              <w:right w:w="90" w:type="dxa"/>
+            </w:tcMar>
+          </w:tcPr>
+          <w:p>
+            <w:pPr>
+              <w:spacing w:after="20"/>
+            </w:pPr>
+            <w:r>
+              <w:rPr>
+                <w:sz w:val="18"/>
+              </w:rPr>
+              <w:t>Giả định 3: "đủ nguồn lực để các hoạt động song song chạy cùng lúc"; tự lưu ý G và H đều là việc của BE</w:t>
+            </w:r>
+          </w:p>
+        </w:tc>
+        <w:tc>
+          <w:tcPr>
+            <w:tcW w:w="4500" w:type="dxa"/>
+            <w:tcBorders>
+              <w:top w:val="single" w:sz="4" w:space="0" w:color="BFBFBF"/>
+              <w:left w:val="single" w:sz="4" w:space="0" w:color="BFBFBF"/>
+              <w:bottom w:val="single" w:sz="4" w:space="0" w:color="BFBFBF"/>
+              <w:right w:val="single" w:sz="4" w:space="0" w:color="BFBFBF"/>
+            </w:tcBorders>
+            <w:tcMar>
+              <w:top w:w="50" w:type="dxa"/>
+              <w:left w:w="90" w:type="dxa"/>
+              <w:bottom w:w="50" w:type="dxa"/>
+              <w:right w:w="90" w:type="dxa"/>
+            </w:tcMar>
+          </w:tcPr>
+          <w:p>
+            <w:pPr>
+              <w:spacing w:after="20"/>
+            </w:pPr>
+            <w:r>
+              <w:rPr>
+                <w:sz w:val="18"/>
+              </w:rPr>
+              <w:t>Không tính nguồn lực (CPM thuần)</w:t>
+            </w:r>
+          </w:p>
+        </w:tc>
+        <w:tc>
+          <w:tcPr>
+            <w:tcW w:w="4070" w:type="dxa"/>
+            <w:tcBorders>
+              <w:top w:val="single" w:sz="4" w:space="0" w:color="BFBFBF"/>
+              <w:left w:val="single" w:sz="4" w:space="0" w:color="BFBFBF"/>
+              <w:bottom w:val="single" w:sz="4" w:space="0" w:color="BFBFBF"/>
+              <w:right w:val="single" w:sz="4" w:space="0" w:color="BFBFBF"/>
+            </w:tcBorders>
+            <w:tcMar>
+              <w:top w:w="50" w:type="dxa"/>
+              <w:left w:w="90" w:type="dxa"/>
+              <w:bottom w:w="50" w:type="dxa"/>
+              <w:right w:w="90" w:type="dxa"/>
+            </w:tcMar>
+          </w:tcPr>
+          <w:p>
+            <w:pPr>
+              <w:spacing w:after="20"/>
+            </w:pPr>
+            <w:r>
+              <w:rPr>
+                <w:sz w:val="18"/>
+              </w:rPr>
+              <w:t>Thiếu sót chung của cả hai: G (API) và H (tích hợp, chuyển đổi dữ liệu) chạy song song từ ngày 29,17 đến 41,83 nhưng đội chỉ có 1 BE, nên lịch thực tế dài hơn 75,33 ngày. Cần cân bằng nguồn lực (resource leveling) hoặc chia lại việc của H.</w:t>
             </w:r>
           </w:p>
         </w:tc>
@@ -31738,7 +31935,7 @@
         <w:keepNext/>
         <w:keepLines/>
       </w:pPr>
-      <w:bookmarkStart w:id="20" w:name="_Toc242012442"/>
+      <w:bookmarkStart w:id="20" w:name="_Toc242014155"/>
       <w:r>
         <w:t>4.5 Phương án nén lịch (AI gợi ý – nhóm tự chọn và lý giải)</w:t>
       </w:r>
@@ -34736,7 +34933,7 @@
         <w:keepNext/>
         <w:keepLines/>
       </w:pPr>
-      <w:bookmarkStart w:id="21" w:name="_Toc242012443"/>
+      <w:bookmarkStart w:id="21" w:name="_Toc242014156"/>
       <w:r>
         <w:t>5. Ước lượng chi phí</w:t>
       </w:r>
@@ -37070,7 +37267,7 @@
         <w:keepNext/>
         <w:keepLines/>
       </w:pPr>
-      <w:bookmarkStart w:id="22" w:name="_Toc242012444"/>
+      <w:bookmarkStart w:id="22" w:name="_Toc242014157"/>
       <w:r>
         <w:t>6. Quản lý rủi ro</w:t>
       </w:r>
@@ -41688,7 +41885,7 @@
         <w:keepNext/>
         <w:keepLines/>
       </w:pPr>
-      <w:bookmarkStart w:id="23" w:name="_Toc242012445"/>
+      <w:bookmarkStart w:id="23" w:name="_Toc242014158"/>
       <w:r>
         <w:t>6.1 Ma trận xác suất – tác động</w:t>
       </w:r>
@@ -41766,7 +41963,7 @@
         <w:keepNext/>
         <w:keepLines/>
       </w:pPr>
-      <w:bookmarkStart w:id="24" w:name="_Toc242012446"/>
+      <w:bookmarkStart w:id="24" w:name="_Toc242014159"/>
       <w:r>
         <w:t>6.2 Kế hoạch dự phòng cho rủi ro điểm cao nhất – R01</w:t>
       </w:r>
@@ -42334,7 +42531,7 @@
         <w:keepNext/>
         <w:keepLines/>
       </w:pPr>
-      <w:bookmarkStart w:id="25" w:name="_Toc242012447"/>
+      <w:bookmarkStart w:id="25" w:name="_Toc242014160"/>
       <w:r>
         <w:t>7. Phản biện đầu ra AI</w:t>
       </w:r>
@@ -42965,7 +43162,7 @@
         <w:keepNext/>
         <w:keepLines/>
       </w:pPr>
-      <w:bookmarkStart w:id="26" w:name="_Toc242012448"/>
+      <w:bookmarkStart w:id="26" w:name="_Toc242014161"/>
       <w:r>
         <w:t>7.1 Phản tư</w:t>
       </w:r>
@@ -43029,7 +43226,7 @@
         <w:keepNext/>
         <w:keepLines/>
       </w:pPr>
-      <w:bookmarkStart w:id="27" w:name="_Toc242012449"/>
+      <w:bookmarkStart w:id="27" w:name="_Toc242014162"/>
       <w:r>
         <w:t>8. Nhật ký sử dụng AI</w:t>
       </w:r>
@@ -43482,9 +43679,8 @@
             <w:r>
               <w:rPr>
                 <w:sz w:val="18"/>
-                <w:szCs w:val="18"/>
-              </w:rPr>
-              <w:t>Claude Code: rà soát và viết lại mục tiêu SMART (1, 2, 4), đối chiếu phạm vi, chọn 3 câu hỏi ưu tiên, vẽ sơ đồ cây WBS, đề xuất phương án nén lịch và lập sheet NenLich</w:t>
+              </w:rPr>
+              <w:t>Claude Code: rà soát và viết lại mục tiêu SMART (1, 2, 4), đối chiếu phạm vi, chọn 3 câu hỏi ưu tiên, vẽ sơ đồ cây WBS, đề xuất phương án nén lịch và lập sheet NenLich; nhập TE của Claude Project vào cột S sheet PERT và soạn bảng so sánh 4.4</w:t>
             </w:r>
           </w:p>
         </w:tc>
@@ -43972,12 +44168,9 @@
             </w:pPr>
             <w:r>
               <w:rPr>
-                <w:i/>
-                <w:iCs/>
-                <w:color w:val="7A5C00"/>
-                <w:highlight w:val="yellow"/>
-              </w:rPr>
-              <w:t>[NHÓM ĐIỀN: …]</w:t>
+                <w:sz w:val="18"/>
+              </w:rPr>
+              <w:t>Tính đúng toàn bộ (kiểm tra bằng script, dùng phân số chính xác); liệt kê đủ 5 đường; chỉ ra đường gần găng (chênh 0,5 ngày); nêu rõ giả định chưa cân bằng nguồn lực; tính tới ngày nghỉ 01/01/2027.</w:t>
             </w:r>
           </w:p>
         </w:tc>
@@ -44003,12 +44196,9 @@
             </w:pPr>
             <w:r>
               <w:rPr>
-                <w:i/>
-                <w:iCs/>
-                <w:color w:val="7A5C00"/>
-                <w:highlight w:val="yellow"/>
-              </w:rPr>
-              <w:t>[NHÓM ĐIỀN: …]</w:t>
+                <w:sz w:val="18"/>
+              </w:rPr>
+              <w:t>Đối chiếu với Excel: khớp 100%, không phải sửa số liệu. Bổ sung vào mục 4.4 hai nhận xét: thiếu cân bằng nguồn lực BE (G song song H) và lịch Excel chưa trừ ngày lễ 01/01/2027.</w:t>
             </w:r>
           </w:p>
         </w:tc>

</xml_diff>

<commit_message>
Báo cáo lab: chèn kết quả Claude Project Bài 1-3, đối chiếu Charter/WBS, thêm Q10, nhật ký AI Bài 1-2
Co-Authored-By: Claude Opus 5.5 <noreply@anthropic.com>
</commit_message>
<xml_diff>
--- a/docs/lab/QLDA_Nhom_PharmaDash_Lab.docx
+++ b/docs/lab/QLDA_Nhom_PharmaDash_Lab.docx
@@ -998,7 +998,7 @@
           <w:r>
             <w:fldChar w:fldCharType="separate"/>
           </w:r>
-          <w:hyperlink w:anchor="_Toc242014135" w:history="1">
+          <w:hyperlink w:anchor="_Toc242014650" w:history="1">
             <w:r>
               <w:rPr>
                 <w:rStyle w:val="Hyperlink"/>
@@ -1022,7 +1022,7 @@
               <w:rPr>
                 <w:noProof/>
               </w:rPr>
-              <w:instrText xml:space="preserve"> PAGEREF _Toc242014135 \h </w:instrText>
+              <w:instrText xml:space="preserve"> PAGEREF _Toc242014650 \h </w:instrText>
             </w:r>
             <w:r>
               <w:rPr>
@@ -1064,7 +1064,7 @@
               <w14:ligatures w14:val="standardContextual"/>
             </w:rPr>
           </w:pPr>
-          <w:hyperlink w:anchor="_Toc242014136" w:history="1">
+          <w:hyperlink w:anchor="_Toc242014651" w:history="1">
             <w:r>
               <w:rPr>
                 <w:rStyle w:val="Hyperlink"/>
@@ -1088,7 +1088,7 @@
               <w:rPr>
                 <w:noProof/>
               </w:rPr>
-              <w:instrText xml:space="preserve"> PAGEREF _Toc242014136 \h </w:instrText>
+              <w:instrText xml:space="preserve"> PAGEREF _Toc242014651 \h </w:instrText>
             </w:r>
             <w:r>
               <w:rPr>
@@ -1130,7 +1130,7 @@
               <w14:ligatures w14:val="standardContextual"/>
             </w:rPr>
           </w:pPr>
-          <w:hyperlink w:anchor="_Toc242014137" w:history="1">
+          <w:hyperlink w:anchor="_Toc242014652" w:history="1">
             <w:r>
               <w:rPr>
                 <w:rStyle w:val="Hyperlink"/>
@@ -1154,7 +1154,7 @@
               <w:rPr>
                 <w:noProof/>
               </w:rPr>
-              <w:instrText xml:space="preserve"> PAGEREF _Toc242014137 \h </w:instrText>
+              <w:instrText xml:space="preserve"> PAGEREF _Toc242014652 \h </w:instrText>
             </w:r>
             <w:r>
               <w:rPr>
@@ -1196,7 +1196,7 @@
               <w14:ligatures w14:val="standardContextual"/>
             </w:rPr>
           </w:pPr>
-          <w:hyperlink w:anchor="_Toc242014138" w:history="1">
+          <w:hyperlink w:anchor="_Toc242014653" w:history="1">
             <w:r>
               <w:rPr>
                 <w:rStyle w:val="Hyperlink"/>
@@ -1220,7 +1220,7 @@
               <w:rPr>
                 <w:noProof/>
               </w:rPr>
-              <w:instrText xml:space="preserve"> PAGEREF _Toc242014138 \h </w:instrText>
+              <w:instrText xml:space="preserve"> PAGEREF _Toc242014653 \h </w:instrText>
             </w:r>
             <w:r>
               <w:rPr>
@@ -1262,7 +1262,7 @@
               <w14:ligatures w14:val="standardContextual"/>
             </w:rPr>
           </w:pPr>
-          <w:hyperlink w:anchor="_Toc242014139" w:history="1">
+          <w:hyperlink w:anchor="_Toc242014654" w:history="1">
             <w:r>
               <w:rPr>
                 <w:rStyle w:val="Hyperlink"/>
@@ -1286,7 +1286,7 @@
               <w:rPr>
                 <w:noProof/>
               </w:rPr>
-              <w:instrText xml:space="preserve"> PAGEREF _Toc242014139 \h </w:instrText>
+              <w:instrText xml:space="preserve"> PAGEREF _Toc242014654 \h </w:instrText>
             </w:r>
             <w:r>
               <w:rPr>
@@ -1328,7 +1328,7 @@
               <w14:ligatures w14:val="standardContextual"/>
             </w:rPr>
           </w:pPr>
-          <w:hyperlink w:anchor="_Toc242014140" w:history="1">
+          <w:hyperlink w:anchor="_Toc242014655" w:history="1">
             <w:r>
               <w:rPr>
                 <w:rStyle w:val="Hyperlink"/>
@@ -1352,7 +1352,7 @@
               <w:rPr>
                 <w:noProof/>
               </w:rPr>
-              <w:instrText xml:space="preserve"> PAGEREF _Toc242014140 \h </w:instrText>
+              <w:instrText xml:space="preserve"> PAGEREF _Toc242014655 \h </w:instrText>
             </w:r>
             <w:r>
               <w:rPr>
@@ -1394,7 +1394,7 @@
               <w14:ligatures w14:val="standardContextual"/>
             </w:rPr>
           </w:pPr>
-          <w:hyperlink w:anchor="_Toc242014141" w:history="1">
+          <w:hyperlink w:anchor="_Toc242014656" w:history="1">
             <w:r>
               <w:rPr>
                 <w:rStyle w:val="Hyperlink"/>
@@ -1418,7 +1418,7 @@
               <w:rPr>
                 <w:noProof/>
               </w:rPr>
-              <w:instrText xml:space="preserve"> PAGEREF _Toc242014141 \h </w:instrText>
+              <w:instrText xml:space="preserve"> PAGEREF _Toc242014656 \h </w:instrText>
             </w:r>
             <w:r>
               <w:rPr>
@@ -1460,7 +1460,7 @@
               <w14:ligatures w14:val="standardContextual"/>
             </w:rPr>
           </w:pPr>
-          <w:hyperlink w:anchor="_Toc242014142" w:history="1">
+          <w:hyperlink w:anchor="_Toc242014657" w:history="1">
             <w:r>
               <w:rPr>
                 <w:rStyle w:val="Hyperlink"/>
@@ -1484,7 +1484,7 @@
               <w:rPr>
                 <w:noProof/>
               </w:rPr>
-              <w:instrText xml:space="preserve"> PAGEREF _Toc242014142 \h </w:instrText>
+              <w:instrText xml:space="preserve"> PAGEREF _Toc242014657 \h </w:instrText>
             </w:r>
             <w:r>
               <w:rPr>
@@ -1526,7 +1526,7 @@
               <w14:ligatures w14:val="standardContextual"/>
             </w:rPr>
           </w:pPr>
-          <w:hyperlink w:anchor="_Toc242014143" w:history="1">
+          <w:hyperlink w:anchor="_Toc242014658" w:history="1">
             <w:r>
               <w:rPr>
                 <w:rStyle w:val="Hyperlink"/>
@@ -1550,7 +1550,7 @@
               <w:rPr>
                 <w:noProof/>
               </w:rPr>
-              <w:instrText xml:space="preserve"> PAGEREF _Toc242014143 \h </w:instrText>
+              <w:instrText xml:space="preserve"> PAGEREF _Toc242014658 \h </w:instrText>
             </w:r>
             <w:r>
               <w:rPr>
@@ -1592,7 +1592,7 @@
               <w14:ligatures w14:val="standardContextual"/>
             </w:rPr>
           </w:pPr>
-          <w:hyperlink w:anchor="_Toc242014144" w:history="1">
+          <w:hyperlink w:anchor="_Toc242014659" w:history="1">
             <w:r>
               <w:rPr>
                 <w:rStyle w:val="Hyperlink"/>
@@ -1616,7 +1616,7 @@
               <w:rPr>
                 <w:noProof/>
               </w:rPr>
-              <w:instrText xml:space="preserve"> PAGEREF _Toc242014144 \h </w:instrText>
+              <w:instrText xml:space="preserve"> PAGEREF _Toc242014659 \h </w:instrText>
             </w:r>
             <w:r>
               <w:rPr>
@@ -1658,7 +1658,7 @@
               <w14:ligatures w14:val="standardContextual"/>
             </w:rPr>
           </w:pPr>
-          <w:hyperlink w:anchor="_Toc242014145" w:history="1">
+          <w:hyperlink w:anchor="_Toc242014660" w:history="1">
             <w:r>
               <w:rPr>
                 <w:rStyle w:val="Hyperlink"/>
@@ -1682,7 +1682,7 @@
               <w:rPr>
                 <w:noProof/>
               </w:rPr>
-              <w:instrText xml:space="preserve"> PAGEREF _Toc242014145 \h </w:instrText>
+              <w:instrText xml:space="preserve"> PAGEREF _Toc242014660 \h </w:instrText>
             </w:r>
             <w:r>
               <w:rPr>
@@ -1724,7 +1724,7 @@
               <w14:ligatures w14:val="standardContextual"/>
             </w:rPr>
           </w:pPr>
-          <w:hyperlink w:anchor="_Toc242014146" w:history="1">
+          <w:hyperlink w:anchor="_Toc242014661" w:history="1">
             <w:r>
               <w:rPr>
                 <w:rStyle w:val="Hyperlink"/>
@@ -1748,7 +1748,7 @@
               <w:rPr>
                 <w:noProof/>
               </w:rPr>
-              <w:instrText xml:space="preserve"> PAGEREF _Toc242014146 \h </w:instrText>
+              <w:instrText xml:space="preserve"> PAGEREF _Toc242014661 \h </w:instrText>
             </w:r>
             <w:r>
               <w:rPr>
@@ -1765,7 +1765,7 @@
               <w:rPr>
                 <w:noProof/>
               </w:rPr>
-              <w:t>10</w:t>
+              <w:t>11</w:t>
             </w:r>
             <w:r>
               <w:rPr>
@@ -1790,7 +1790,7 @@
               <w14:ligatures w14:val="standardContextual"/>
             </w:rPr>
           </w:pPr>
-          <w:hyperlink w:anchor="_Toc242014147" w:history="1">
+          <w:hyperlink w:anchor="_Toc242014662" w:history="1">
             <w:r>
               <w:rPr>
                 <w:rStyle w:val="Hyperlink"/>
@@ -1814,7 +1814,7 @@
               <w:rPr>
                 <w:noProof/>
               </w:rPr>
-              <w:instrText xml:space="preserve"> PAGEREF _Toc242014147 \h </w:instrText>
+              <w:instrText xml:space="preserve"> PAGEREF _Toc242014662 \h </w:instrText>
             </w:r>
             <w:r>
               <w:rPr>
@@ -1831,7 +1831,7 @@
               <w:rPr>
                 <w:noProof/>
               </w:rPr>
-              <w:t>11</w:t>
+              <w:t>12</w:t>
             </w:r>
             <w:r>
               <w:rPr>
@@ -1856,7 +1856,7 @@
               <w14:ligatures w14:val="standardContextual"/>
             </w:rPr>
           </w:pPr>
-          <w:hyperlink w:anchor="_Toc242014148" w:history="1">
+          <w:hyperlink w:anchor="_Toc242014663" w:history="1">
             <w:r>
               <w:rPr>
                 <w:rStyle w:val="Hyperlink"/>
@@ -1880,7 +1880,7 @@
               <w:rPr>
                 <w:noProof/>
               </w:rPr>
-              <w:instrText xml:space="preserve"> PAGEREF _Toc242014148 \h </w:instrText>
+              <w:instrText xml:space="preserve"> PAGEREF _Toc242014663 \h </w:instrText>
             </w:r>
             <w:r>
               <w:rPr>
@@ -1897,7 +1897,7 @@
               <w:rPr>
                 <w:noProof/>
               </w:rPr>
-              <w:t>12</w:t>
+              <w:t>13</w:t>
             </w:r>
             <w:r>
               <w:rPr>
@@ -1922,7 +1922,7 @@
               <w14:ligatures w14:val="standardContextual"/>
             </w:rPr>
           </w:pPr>
-          <w:hyperlink w:anchor="_Toc242014149" w:history="1">
+          <w:hyperlink w:anchor="_Toc242014664" w:history="1">
             <w:r>
               <w:rPr>
                 <w:rStyle w:val="Hyperlink"/>
@@ -1946,7 +1946,7 @@
               <w:rPr>
                 <w:noProof/>
               </w:rPr>
-              <w:instrText xml:space="preserve"> PAGEREF _Toc242014149 \h </w:instrText>
+              <w:instrText xml:space="preserve"> PAGEREF _Toc242014664 \h </w:instrText>
             </w:r>
             <w:r>
               <w:rPr>
@@ -1963,7 +1963,7 @@
               <w:rPr>
                 <w:noProof/>
               </w:rPr>
-              <w:t>14</w:t>
+              <w:t>15</w:t>
             </w:r>
             <w:r>
               <w:rPr>
@@ -1988,7 +1988,7 @@
               <w14:ligatures w14:val="standardContextual"/>
             </w:rPr>
           </w:pPr>
-          <w:hyperlink w:anchor="_Toc242014150" w:history="1">
+          <w:hyperlink w:anchor="_Toc242014665" w:history="1">
             <w:r>
               <w:rPr>
                 <w:rStyle w:val="Hyperlink"/>
@@ -2012,7 +2012,7 @@
               <w:rPr>
                 <w:noProof/>
               </w:rPr>
-              <w:instrText xml:space="preserve"> PAGEREF _Toc242014150 \h </w:instrText>
+              <w:instrText xml:space="preserve"> PAGEREF _Toc242014665 \h </w:instrText>
             </w:r>
             <w:r>
               <w:rPr>
@@ -2029,7 +2029,7 @@
               <w:rPr>
                 <w:noProof/>
               </w:rPr>
-              <w:t>15</w:t>
+              <w:t>17</w:t>
             </w:r>
             <w:r>
               <w:rPr>
@@ -2054,7 +2054,7 @@
               <w14:ligatures w14:val="standardContextual"/>
             </w:rPr>
           </w:pPr>
-          <w:hyperlink w:anchor="_Toc242014151" w:history="1">
+          <w:hyperlink w:anchor="_Toc242014666" w:history="1">
             <w:r>
               <w:rPr>
                 <w:rStyle w:val="Hyperlink"/>
@@ -2078,7 +2078,7 @@
               <w:rPr>
                 <w:noProof/>
               </w:rPr>
-              <w:instrText xml:space="preserve"> PAGEREF _Toc242014151 \h </w:instrText>
+              <w:instrText xml:space="preserve"> PAGEREF _Toc242014666 \h </w:instrText>
             </w:r>
             <w:r>
               <w:rPr>
@@ -2095,7 +2095,7 @@
               <w:rPr>
                 <w:noProof/>
               </w:rPr>
-              <w:t>15</w:t>
+              <w:t>17</w:t>
             </w:r>
             <w:r>
               <w:rPr>
@@ -2120,7 +2120,7 @@
               <w14:ligatures w14:val="standardContextual"/>
             </w:rPr>
           </w:pPr>
-          <w:hyperlink w:anchor="_Toc242014152" w:history="1">
+          <w:hyperlink w:anchor="_Toc242014667" w:history="1">
             <w:r>
               <w:rPr>
                 <w:rStyle w:val="Hyperlink"/>
@@ -2144,7 +2144,7 @@
               <w:rPr>
                 <w:noProof/>
               </w:rPr>
-              <w:instrText xml:space="preserve"> PAGEREF _Toc242014152 \h </w:instrText>
+              <w:instrText xml:space="preserve"> PAGEREF _Toc242014667 \h </w:instrText>
             </w:r>
             <w:r>
               <w:rPr>
@@ -2161,7 +2161,7 @@
               <w:rPr>
                 <w:noProof/>
               </w:rPr>
-              <w:t>15</w:t>
+              <w:t>17</w:t>
             </w:r>
             <w:r>
               <w:rPr>
@@ -2186,7 +2186,7 @@
               <w14:ligatures w14:val="standardContextual"/>
             </w:rPr>
           </w:pPr>
-          <w:hyperlink w:anchor="_Toc242014153" w:history="1">
+          <w:hyperlink w:anchor="_Toc242014668" w:history="1">
             <w:r>
               <w:rPr>
                 <w:rStyle w:val="Hyperlink"/>
@@ -2210,7 +2210,7 @@
               <w:rPr>
                 <w:noProof/>
               </w:rPr>
-              <w:instrText xml:space="preserve"> PAGEREF _Toc242014153 \h </w:instrText>
+              <w:instrText xml:space="preserve"> PAGEREF _Toc242014668 \h </w:instrText>
             </w:r>
             <w:r>
               <w:rPr>
@@ -2227,7 +2227,7 @@
               <w:rPr>
                 <w:noProof/>
               </w:rPr>
-              <w:t>16</w:t>
+              <w:t>18</w:t>
             </w:r>
             <w:r>
               <w:rPr>
@@ -2252,7 +2252,7 @@
               <w14:ligatures w14:val="standardContextual"/>
             </w:rPr>
           </w:pPr>
-          <w:hyperlink w:anchor="_Toc242014154" w:history="1">
+          <w:hyperlink w:anchor="_Toc242014669" w:history="1">
             <w:r>
               <w:rPr>
                 <w:rStyle w:val="Hyperlink"/>
@@ -2276,7 +2276,7 @@
               <w:rPr>
                 <w:noProof/>
               </w:rPr>
-              <w:instrText xml:space="preserve"> PAGEREF _Toc242014154 \h </w:instrText>
+              <w:instrText xml:space="preserve"> PAGEREF _Toc242014669 \h </w:instrText>
             </w:r>
             <w:r>
               <w:rPr>
@@ -2293,7 +2293,7 @@
               <w:rPr>
                 <w:noProof/>
               </w:rPr>
-              <w:t>16</w:t>
+              <w:t>18</w:t>
             </w:r>
             <w:r>
               <w:rPr>
@@ -2318,7 +2318,7 @@
               <w14:ligatures w14:val="standardContextual"/>
             </w:rPr>
           </w:pPr>
-          <w:hyperlink w:anchor="_Toc242014155" w:history="1">
+          <w:hyperlink w:anchor="_Toc242014670" w:history="1">
             <w:r>
               <w:rPr>
                 <w:rStyle w:val="Hyperlink"/>
@@ -2342,7 +2342,7 @@
               <w:rPr>
                 <w:noProof/>
               </w:rPr>
-              <w:instrText xml:space="preserve"> PAGEREF _Toc242014155 \h </w:instrText>
+              <w:instrText xml:space="preserve"> PAGEREF _Toc242014670 \h </w:instrText>
             </w:r>
             <w:r>
               <w:rPr>
@@ -2359,7 +2359,7 @@
               <w:rPr>
                 <w:noProof/>
               </w:rPr>
-              <w:t>17</w:t>
+              <w:t>20</w:t>
             </w:r>
             <w:r>
               <w:rPr>
@@ -2384,7 +2384,7 @@
               <w14:ligatures w14:val="standardContextual"/>
             </w:rPr>
           </w:pPr>
-          <w:hyperlink w:anchor="_Toc242014156" w:history="1">
+          <w:hyperlink w:anchor="_Toc242014671" w:history="1">
             <w:r>
               <w:rPr>
                 <w:rStyle w:val="Hyperlink"/>
@@ -2408,7 +2408,7 @@
               <w:rPr>
                 <w:noProof/>
               </w:rPr>
-              <w:instrText xml:space="preserve"> PAGEREF _Toc242014156 \h </w:instrText>
+              <w:instrText xml:space="preserve"> PAGEREF _Toc242014671 \h </w:instrText>
             </w:r>
             <w:r>
               <w:rPr>
@@ -2425,7 +2425,7 @@
               <w:rPr>
                 <w:noProof/>
               </w:rPr>
-              <w:t>19</w:t>
+              <w:t>22</w:t>
             </w:r>
             <w:r>
               <w:rPr>
@@ -2450,7 +2450,7 @@
               <w14:ligatures w14:val="standardContextual"/>
             </w:rPr>
           </w:pPr>
-          <w:hyperlink w:anchor="_Toc242014157" w:history="1">
+          <w:hyperlink w:anchor="_Toc242014672" w:history="1">
             <w:r>
               <w:rPr>
                 <w:rStyle w:val="Hyperlink"/>
@@ -2474,7 +2474,7 @@
               <w:rPr>
                 <w:noProof/>
               </w:rPr>
-              <w:instrText xml:space="preserve"> PAGEREF _Toc242014157 \h </w:instrText>
+              <w:instrText xml:space="preserve"> PAGEREF _Toc242014672 \h </w:instrText>
             </w:r>
             <w:r>
               <w:rPr>
@@ -2491,7 +2491,7 @@
               <w:rPr>
                 <w:noProof/>
               </w:rPr>
-              <w:t>20</w:t>
+              <w:t>23</w:t>
             </w:r>
             <w:r>
               <w:rPr>
@@ -2516,7 +2516,7 @@
               <w14:ligatures w14:val="standardContextual"/>
             </w:rPr>
           </w:pPr>
-          <w:hyperlink w:anchor="_Toc242014158" w:history="1">
+          <w:hyperlink w:anchor="_Toc242014673" w:history="1">
             <w:r>
               <w:rPr>
                 <w:rStyle w:val="Hyperlink"/>
@@ -2540,7 +2540,7 @@
               <w:rPr>
                 <w:noProof/>
               </w:rPr>
-              <w:instrText xml:space="preserve"> PAGEREF _Toc242014158 \h </w:instrText>
+              <w:instrText xml:space="preserve"> PAGEREF _Toc242014673 \h </w:instrText>
             </w:r>
             <w:r>
               <w:rPr>
@@ -2557,7 +2557,7 @@
               <w:rPr>
                 <w:noProof/>
               </w:rPr>
-              <w:t>22</w:t>
+              <w:t>25</w:t>
             </w:r>
             <w:r>
               <w:rPr>
@@ -2582,7 +2582,7 @@
               <w14:ligatures w14:val="standardContextual"/>
             </w:rPr>
           </w:pPr>
-          <w:hyperlink w:anchor="_Toc242014159" w:history="1">
+          <w:hyperlink w:anchor="_Toc242014674" w:history="1">
             <w:r>
               <w:rPr>
                 <w:rStyle w:val="Hyperlink"/>
@@ -2606,7 +2606,7 @@
               <w:rPr>
                 <w:noProof/>
               </w:rPr>
-              <w:instrText xml:space="preserve"> PAGEREF _Toc242014159 \h </w:instrText>
+              <w:instrText xml:space="preserve"> PAGEREF _Toc242014674 \h </w:instrText>
             </w:r>
             <w:r>
               <w:rPr>
@@ -2623,7 +2623,7 @@
               <w:rPr>
                 <w:noProof/>
               </w:rPr>
-              <w:t>22</w:t>
+              <w:t>25</w:t>
             </w:r>
             <w:r>
               <w:rPr>
@@ -2648,7 +2648,7 @@
               <w14:ligatures w14:val="standardContextual"/>
             </w:rPr>
           </w:pPr>
-          <w:hyperlink w:anchor="_Toc242014160" w:history="1">
+          <w:hyperlink w:anchor="_Toc242014675" w:history="1">
             <w:r>
               <w:rPr>
                 <w:rStyle w:val="Hyperlink"/>
@@ -2672,7 +2672,7 @@
               <w:rPr>
                 <w:noProof/>
               </w:rPr>
-              <w:instrText xml:space="preserve"> PAGEREF _Toc242014160 \h </w:instrText>
+              <w:instrText xml:space="preserve"> PAGEREF _Toc242014675 \h </w:instrText>
             </w:r>
             <w:r>
               <w:rPr>
@@ -2689,7 +2689,7 @@
               <w:rPr>
                 <w:noProof/>
               </w:rPr>
-              <w:t>23</w:t>
+              <w:t>26</w:t>
             </w:r>
             <w:r>
               <w:rPr>
@@ -2714,7 +2714,7 @@
               <w14:ligatures w14:val="standardContextual"/>
             </w:rPr>
           </w:pPr>
-          <w:hyperlink w:anchor="_Toc242014161" w:history="1">
+          <w:hyperlink w:anchor="_Toc242014676" w:history="1">
             <w:r>
               <w:rPr>
                 <w:rStyle w:val="Hyperlink"/>
@@ -2738,7 +2738,7 @@
               <w:rPr>
                 <w:noProof/>
               </w:rPr>
-              <w:instrText xml:space="preserve"> PAGEREF _Toc242014161 \h </w:instrText>
+              <w:instrText xml:space="preserve"> PAGEREF _Toc242014676 \h </w:instrText>
             </w:r>
             <w:r>
               <w:rPr>
@@ -2755,7 +2755,7 @@
               <w:rPr>
                 <w:noProof/>
               </w:rPr>
-              <w:t>23</w:t>
+              <w:t>26</w:t>
             </w:r>
             <w:r>
               <w:rPr>
@@ -2780,7 +2780,7 @@
               <w14:ligatures w14:val="standardContextual"/>
             </w:rPr>
           </w:pPr>
-          <w:hyperlink w:anchor="_Toc242014162" w:history="1">
+          <w:hyperlink w:anchor="_Toc242014677" w:history="1">
             <w:r>
               <w:rPr>
                 <w:rStyle w:val="Hyperlink"/>
@@ -2804,7 +2804,7 @@
               <w:rPr>
                 <w:noProof/>
               </w:rPr>
-              <w:instrText xml:space="preserve"> PAGEREF _Toc242014162 \h </w:instrText>
+              <w:instrText xml:space="preserve"> PAGEREF _Toc242014677 \h </w:instrText>
             </w:r>
             <w:r>
               <w:rPr>
@@ -2821,7 +2821,7 @@
               <w:rPr>
                 <w:noProof/>
               </w:rPr>
-              <w:t>23</w:t>
+              <w:t>26</w:t>
             </w:r>
             <w:r>
               <w:rPr>
@@ -2864,7 +2864,7 @@
         <w:keepNext/>
         <w:keepLines/>
       </w:pPr>
-      <w:bookmarkStart w:id="0" w:name="_Toc242014135"/>
+      <w:bookmarkStart w:id="0" w:name="_Toc242014650"/>
       <w:r>
         <w:lastRenderedPageBreak/>
         <w:t>1. Thiết lập Claude Project</w:t>
@@ -3683,7 +3683,7 @@
         <w:keepNext/>
         <w:keepLines/>
       </w:pPr>
-      <w:bookmarkStart w:id="1" w:name="_Toc242014136"/>
+      <w:bookmarkStart w:id="1" w:name="_Toc242014651"/>
       <w:r>
         <w:t>2. Project Charter (Tuyên bố dự án)</w:t>
       </w:r>
@@ -4169,7 +4169,7 @@
         <w:keepNext/>
         <w:keepLines/>
       </w:pPr>
-      <w:bookmarkStart w:id="2" w:name="_Toc242014137"/>
+      <w:bookmarkStart w:id="2" w:name="_Toc242014652"/>
       <w:r>
         <w:t>2.1 Mục tiêu SMART</w:t>
       </w:r>
@@ -5194,7 +5194,7 @@
         <w:keepNext/>
         <w:keepLines/>
       </w:pPr>
-      <w:bookmarkStart w:id="3" w:name="_Toc242014138"/>
+      <w:bookmarkStart w:id="3" w:name="_Toc242014653"/>
       <w:r>
         <w:t>2.2 Phạm vi</w:t>
       </w:r>
@@ -5604,7 +5604,7 @@
         <w:keepNext/>
         <w:keepLines/>
       </w:pPr>
-      <w:bookmarkStart w:id="4" w:name="_Toc242014139"/>
+      <w:bookmarkStart w:id="4" w:name="_Toc242014654"/>
       <w:r>
         <w:t>2.3 Sản phẩm bàn giao chính</w:t>
       </w:r>
@@ -5668,7 +5668,7 @@
         <w:keepNext/>
         <w:keepLines/>
       </w:pPr>
-      <w:bookmarkStart w:id="5" w:name="_Toc242014140"/>
+      <w:bookmarkStart w:id="5" w:name="_Toc242014655"/>
       <w:r>
         <w:t>2.4 Các bên liên quan</w:t>
       </w:r>
@@ -6455,7 +6455,7 @@
         <w:keepNext/>
         <w:keepLines/>
       </w:pPr>
-      <w:bookmarkStart w:id="6" w:name="_Toc242014141"/>
+      <w:bookmarkStart w:id="6" w:name="_Toc242014656"/>
       <w:r>
         <w:t>2.5 Mốc thời gian chính (mục tiêu)</w:t>
       </w:r>
@@ -7501,7 +7501,7 @@
         <w:keepNext/>
         <w:keepLines/>
       </w:pPr>
-      <w:bookmarkStart w:id="7" w:name="_Toc242014142"/>
+      <w:bookmarkStart w:id="7" w:name="_Toc242014657"/>
       <w:r>
         <w:t>2.6 Giả định và ràng buộc</w:t>
       </w:r>
@@ -7768,7 +7768,7 @@
         <w:keepNext/>
         <w:keepLines/>
       </w:pPr>
-      <w:bookmarkStart w:id="8" w:name="_Toc242014143"/>
+      <w:bookmarkStart w:id="8" w:name="_Toc242014658"/>
       <w:r>
         <w:t>2.7 Rủi ro cấp cao</w:t>
       </w:r>
@@ -7832,7 +7832,7 @@
         <w:keepNext/>
         <w:keepLines/>
       </w:pPr>
-      <w:bookmarkStart w:id="9" w:name="_Toc242014144"/>
+      <w:bookmarkStart w:id="9" w:name="_Toc242014659"/>
       <w:r>
         <w:t>2.8 Tiêu chí thành công và nghiệm thu</w:t>
       </w:r>
@@ -7909,7 +7909,7 @@
         <w:keepNext/>
         <w:keepLines/>
       </w:pPr>
-      <w:bookmarkStart w:id="10" w:name="_Toc242014145"/>
+      <w:bookmarkStart w:id="10" w:name="_Toc242014660"/>
       <w:r>
         <w:t>2.9 Thông tin còn thiếu – câu hỏi làm rõ với khách hàng</w:t>
       </w:r>
@@ -8869,6 +8869,98 @@
                 <w:szCs w:val="19"/>
               </w:rPr>
               <w:t>Phạm vi (hiện để ngoài phạm vi)</w:t>
+            </w:r>
+          </w:p>
+        </w:tc>
+      </w:tr>
+      <w:tr>
+        <w:trPr>
+          <w:cantSplit/>
+        </w:trPr>
+        <w:tc>
+          <w:tcPr>
+            <w:tcW w:w="700" w:type="dxa"/>
+            <w:tcBorders>
+              <w:top w:val="single" w:sz="4" w:space="0" w:color="BFBFBF"/>
+              <w:left w:val="single" w:sz="4" w:space="0" w:color="BFBFBF"/>
+              <w:bottom w:val="single" w:sz="4" w:space="0" w:color="BFBFBF"/>
+              <w:right w:val="single" w:sz="4" w:space="0" w:color="BFBFBF"/>
+            </w:tcBorders>
+            <w:tcMar>
+              <w:top w:w="50" w:type="dxa"/>
+              <w:left w:w="90" w:type="dxa"/>
+              <w:bottom w:w="50" w:type="dxa"/>
+              <w:right w:w="90" w:type="dxa"/>
+            </w:tcMar>
+          </w:tcPr>
+          <w:p>
+            <w:pPr>
+              <w:spacing w:after="20"/>
+            </w:pPr>
+            <w:r>
+              <w:rPr>
+                <w:sz w:val="19"/>
+                <w:szCs w:val="19"/>
+              </w:rPr>
+              <w:t>Q10</w:t>
+            </w:r>
+          </w:p>
+        </w:tc>
+        <w:tc>
+          <w:tcPr>
+            <w:tcW w:w="5638" w:type="dxa"/>
+            <w:tcBorders>
+              <w:top w:val="single" w:sz="4" w:space="0" w:color="BFBFBF"/>
+              <w:left w:val="single" w:sz="4" w:space="0" w:color="BFBFBF"/>
+              <w:bottom w:val="single" w:sz="4" w:space="0" w:color="BFBFBF"/>
+              <w:right w:val="single" w:sz="4" w:space="0" w:color="BFBFBF"/>
+            </w:tcBorders>
+            <w:tcMar>
+              <w:top w:w="50" w:type="dxa"/>
+              <w:left w:w="90" w:type="dxa"/>
+              <w:bottom w:w="50" w:type="dxa"/>
+              <w:right w:w="90" w:type="dxa"/>
+            </w:tcMar>
+          </w:tcPr>
+          <w:p>
+            <w:pPr>
+              <w:spacing w:after="20"/>
+            </w:pPr>
+            <w:r>
+              <w:rPr>
+                <w:sz w:val="19"/>
+                <w:szCs w:val="19"/>
+              </w:rPr>
+              <w:t>Lợi nhuận tính theo giá vốn nào: FIFO theo lô hay giá bình quân? (câu hỏi Claude Project bổ sung ở Bài 1)</w:t>
+            </w:r>
+          </w:p>
+        </w:tc>
+        <w:tc>
+          <w:tcPr>
+            <w:tcW w:w="3300" w:type="dxa"/>
+            <w:tcBorders>
+              <w:top w:val="single" w:sz="4" w:space="0" w:color="BFBFBF"/>
+              <w:left w:val="single" w:sz="4" w:space="0" w:color="BFBFBF"/>
+              <w:bottom w:val="single" w:sz="4" w:space="0" w:color="BFBFBF"/>
+              <w:right w:val="single" w:sz="4" w:space="0" w:color="BFBFBF"/>
+            </w:tcBorders>
+            <w:tcMar>
+              <w:top w:w="50" w:type="dxa"/>
+              <w:left w:w="90" w:type="dxa"/>
+              <w:bottom w:w="50" w:type="dxa"/>
+              <w:right w:w="90" w:type="dxa"/>
+            </w:tcMar>
+          </w:tcPr>
+          <w:p>
+            <w:pPr>
+              <w:spacing w:after="20"/>
+            </w:pPr>
+            <w:r>
+              <w:rPr>
+                <w:sz w:val="19"/>
+                <w:szCs w:val="19"/>
+              </w:rPr>
+              <w:t>KPI lợi nhuận (FR01), thiết kế CSDL</w:t>
             </w:r>
           </w:p>
         </w:tc>
@@ -9170,6 +9262,1106 @@
       </w:tr>
     </w:tbl>
     <w:p>
+      <w:pPr>
+        <w:pStyle w:val="Heading3"/>
+        <w:keepNext/>
+      </w:pPr>
+      <w:r>
+        <w:t>2.10 K</w:t>
+      </w:r>
+      <w:r>
+        <w:t>ế</w:t>
+      </w:r>
+      <w:r>
+        <w:t>t qu</w:t>
+      </w:r>
+      <w:r>
+        <w:t>ả</w:t>
+      </w:r>
+      <w:r>
+        <w:t xml:space="preserve"> Claude Project (Bài 1) và đ</w:t>
+      </w:r>
+      <w:r>
+        <w:t>ố</w:t>
+      </w:r>
+      <w:r>
+        <w:t>i chi</w:t>
+      </w:r>
+      <w:r>
+        <w:t>ế</w:t>
+      </w:r>
+      <w:r>
+        <w:t>u</w:t>
+      </w:r>
+    </w:p>
+    <w:p>
+      <w:pPr>
+        <w:spacing w:after="60"/>
+      </w:pPr>
+      <w:r>
+        <w:t>Charter do Claude so</w:t>
+      </w:r>
+      <w:r>
+        <w:t>ạ</w:t>
+      </w:r>
+      <w:r>
+        <w:t>n trong chat Bài 1 (tài li</w:t>
+      </w:r>
+      <w:r>
+        <w:t>ệ</w:t>
+      </w:r>
+      <w:r>
+        <w:t>u "Project Charter PharmaDash" trong Claude Project):</w:t>
+      </w:r>
+    </w:p>
+    <w:p>
+      <w:pPr>
+        <w:keepNext/>
+        <w:jc w:val="center"/>
+      </w:pPr>
+      <w:r>
+        <w:rPr>
+          <w:noProof/>
+        </w:rPr>
+        <w:drawing>
+          <wp:inline distT="0" distB="0" distL="0" distR="0" wp14:anchorId="73ADD58B" wp14:editId="6EE62E0E">
+            <wp:extent cx="5220000" cy="3510149"/>
+            <wp:effectExtent l="0" t="0" r="0" b="0"/>
+            <wp:docPr id="7" name="Picture 7"/>
+            <wp:cNvGraphicFramePr>
+              <a:graphicFrameLocks xmlns:a="http://schemas.openxmlformats.org/drawingml/2006/main" noChangeAspect="1"/>
+            </wp:cNvGraphicFramePr>
+            <a:graphic xmlns:a="http://schemas.openxmlformats.org/drawingml/2006/main">
+              <a:graphicData uri="http://schemas.openxmlformats.org/drawingml/2006/picture">
+                <pic:pic xmlns:pic="http://schemas.openxmlformats.org/drawingml/2006/picture">
+                  <pic:nvPicPr>
+                    <pic:cNvPr id="0" name="b1_charter_1.png"/>
+                    <pic:cNvPicPr/>
+                  </pic:nvPicPr>
+                  <pic:blipFill>
+                    <a:blip r:embed="rId10"/>
+                    <a:stretch>
+                      <a:fillRect/>
+                    </a:stretch>
+                  </pic:blipFill>
+                  <pic:spPr>
+                    <a:xfrm>
+                      <a:off x="0" y="0"/>
+                      <a:ext cx="5220000" cy="3510149"/>
+                    </a:xfrm>
+                    <a:prstGeom prst="rect">
+                      <a:avLst/>
+                    </a:prstGeom>
+                  </pic:spPr>
+                </pic:pic>
+              </a:graphicData>
+            </a:graphic>
+          </wp:inline>
+        </w:drawing>
+      </w:r>
+    </w:p>
+    <w:p>
+      <w:pPr>
+        <w:jc w:val="center"/>
+      </w:pPr>
+      <w:r>
+        <w:rPr>
+          <w:i/>
+          <w:color w:val="595959"/>
+          <w:sz w:val="18"/>
+        </w:rPr>
+        <w:t>Hình 2.1 – Project Charter do Claude Project so</w:t>
+      </w:r>
+      <w:r>
+        <w:rPr>
+          <w:i/>
+          <w:color w:val="595959"/>
+          <w:sz w:val="18"/>
+        </w:rPr>
+        <w:t>ạ</w:t>
+      </w:r>
+      <w:r>
+        <w:rPr>
+          <w:i/>
+          <w:color w:val="595959"/>
+          <w:sz w:val="18"/>
+        </w:rPr>
+        <w:t>n: m</w:t>
+      </w:r>
+      <w:r>
+        <w:rPr>
+          <w:i/>
+          <w:color w:val="595959"/>
+          <w:sz w:val="18"/>
+        </w:rPr>
+        <w:t>ụ</w:t>
+      </w:r>
+      <w:r>
+        <w:rPr>
+          <w:i/>
+          <w:color w:val="595959"/>
+          <w:sz w:val="18"/>
+        </w:rPr>
+        <w:t>c đích d</w:t>
+      </w:r>
+      <w:r>
+        <w:rPr>
+          <w:i/>
+          <w:color w:val="595959"/>
+          <w:sz w:val="18"/>
+        </w:rPr>
+        <w:t>ự</w:t>
+      </w:r>
+      <w:r>
+        <w:rPr>
+          <w:i/>
+          <w:color w:val="595959"/>
+          <w:sz w:val="18"/>
+        </w:rPr>
+        <w:t xml:space="preserve"> án</w:t>
+      </w:r>
+    </w:p>
+    <w:p>
+      <w:pPr>
+        <w:keepNext/>
+        <w:jc w:val="center"/>
+      </w:pPr>
+      <w:r>
+        <w:rPr>
+          <w:noProof/>
+        </w:rPr>
+        <w:drawing>
+          <wp:inline distT="0" distB="0" distL="0" distR="0" wp14:anchorId="0F81B2F8" wp14:editId="7DBB8C83">
+            <wp:extent cx="5220000" cy="2756436"/>
+            <wp:effectExtent l="0" t="0" r="0" b="0"/>
+            <wp:docPr id="8" name="Picture 8"/>
+            <wp:cNvGraphicFramePr>
+              <a:graphicFrameLocks xmlns:a="http://schemas.openxmlformats.org/drawingml/2006/main" noChangeAspect="1"/>
+            </wp:cNvGraphicFramePr>
+            <a:graphic xmlns:a="http://schemas.openxmlformats.org/drawingml/2006/main">
+              <a:graphicData uri="http://schemas.openxmlformats.org/drawingml/2006/picture">
+                <pic:pic xmlns:pic="http://schemas.openxmlformats.org/drawingml/2006/picture">
+                  <pic:nvPicPr>
+                    <pic:cNvPr id="0" name="b1_charter_2.png"/>
+                    <pic:cNvPicPr/>
+                  </pic:nvPicPr>
+                  <pic:blipFill>
+                    <a:blip r:embed="rId11"/>
+                    <a:stretch>
+                      <a:fillRect/>
+                    </a:stretch>
+                  </pic:blipFill>
+                  <pic:spPr>
+                    <a:xfrm>
+                      <a:off x="0" y="0"/>
+                      <a:ext cx="5220000" cy="2756436"/>
+                    </a:xfrm>
+                    <a:prstGeom prst="rect">
+                      <a:avLst/>
+                    </a:prstGeom>
+                  </pic:spPr>
+                </pic:pic>
+              </a:graphicData>
+            </a:graphic>
+          </wp:inline>
+        </w:drawing>
+      </w:r>
+    </w:p>
+    <w:p>
+      <w:pPr>
+        <w:jc w:val="center"/>
+      </w:pPr>
+      <w:r>
+        <w:rPr>
+          <w:i/>
+          <w:color w:val="595959"/>
+          <w:sz w:val="18"/>
+        </w:rPr>
+        <w:t>Hình 2.2 – M</w:t>
+      </w:r>
+      <w:r>
+        <w:rPr>
+          <w:i/>
+          <w:color w:val="595959"/>
+          <w:sz w:val="18"/>
+        </w:rPr>
+        <w:t>ụ</w:t>
+      </w:r>
+      <w:r>
+        <w:rPr>
+          <w:i/>
+          <w:color w:val="595959"/>
+          <w:sz w:val="18"/>
+        </w:rPr>
+        <w:t>c tiêu SMART trong Charter c</w:t>
+      </w:r>
+      <w:r>
+        <w:rPr>
+          <w:i/>
+          <w:color w:val="595959"/>
+          <w:sz w:val="18"/>
+        </w:rPr>
+        <w:t>ủ</w:t>
+      </w:r>
+      <w:r>
+        <w:rPr>
+          <w:i/>
+          <w:color w:val="595959"/>
+          <w:sz w:val="18"/>
+        </w:rPr>
+        <w:t>a Claude</w:t>
+      </w:r>
+    </w:p>
+    <w:p>
+      <w:pPr>
+        <w:keepNext/>
+        <w:jc w:val="center"/>
+      </w:pPr>
+      <w:r>
+        <w:rPr>
+          <w:noProof/>
+        </w:rPr>
+        <w:drawing>
+          <wp:inline distT="0" distB="0" distL="0" distR="0" wp14:anchorId="1F0A752D" wp14:editId="6F3E154A">
+            <wp:extent cx="5220000" cy="3012366"/>
+            <wp:effectExtent l="0" t="0" r="0" b="0"/>
+            <wp:docPr id="9" name="Picture 9"/>
+            <wp:cNvGraphicFramePr>
+              <a:graphicFrameLocks xmlns:a="http://schemas.openxmlformats.org/drawingml/2006/main" noChangeAspect="1"/>
+            </wp:cNvGraphicFramePr>
+            <a:graphic xmlns:a="http://schemas.openxmlformats.org/drawingml/2006/main">
+              <a:graphicData uri="http://schemas.openxmlformats.org/drawingml/2006/picture">
+                <pic:pic xmlns:pic="http://schemas.openxmlformats.org/drawingml/2006/picture">
+                  <pic:nvPicPr>
+                    <pic:cNvPr id="0" name="b1_charter_3.png"/>
+                    <pic:cNvPicPr/>
+                  </pic:nvPicPr>
+                  <pic:blipFill>
+                    <a:blip r:embed="rId12"/>
+                    <a:stretch>
+                      <a:fillRect/>
+                    </a:stretch>
+                  </pic:blipFill>
+                  <pic:spPr>
+                    <a:xfrm>
+                      <a:off x="0" y="0"/>
+                      <a:ext cx="5220000" cy="3012366"/>
+                    </a:xfrm>
+                    <a:prstGeom prst="rect">
+                      <a:avLst/>
+                    </a:prstGeom>
+                  </pic:spPr>
+                </pic:pic>
+              </a:graphicData>
+            </a:graphic>
+          </wp:inline>
+        </w:drawing>
+      </w:r>
+    </w:p>
+    <w:p>
+      <w:pPr>
+        <w:jc w:val="center"/>
+      </w:pPr>
+      <w:r>
+        <w:rPr>
+          <w:i/>
+          <w:color w:val="595959"/>
+          <w:sz w:val="18"/>
+        </w:rPr>
+        <w:t>Hình 2.3 – Ph</w:t>
+      </w:r>
+      <w:r>
+        <w:rPr>
+          <w:i/>
+          <w:color w:val="595959"/>
+          <w:sz w:val="18"/>
+        </w:rPr>
+        <w:t>ạ</w:t>
+      </w:r>
+      <w:r>
+        <w:rPr>
+          <w:i/>
+          <w:color w:val="595959"/>
+          <w:sz w:val="18"/>
+        </w:rPr>
+        <w:t>m vi trong Charter c</w:t>
+      </w:r>
+      <w:r>
+        <w:rPr>
+          <w:i/>
+          <w:color w:val="595959"/>
+          <w:sz w:val="18"/>
+        </w:rPr>
+        <w:t>ủ</w:t>
+      </w:r>
+      <w:r>
+        <w:rPr>
+          <w:i/>
+          <w:color w:val="595959"/>
+          <w:sz w:val="18"/>
+        </w:rPr>
+        <w:t>a Claude</w:t>
+      </w:r>
+    </w:p>
+    <w:p>
+      <w:pPr>
+        <w:spacing w:after="60"/>
+      </w:pPr>
+      <w:r>
+        <w:t>Đ</w:t>
+      </w:r>
+      <w:r>
+        <w:t>ố</w:t>
+      </w:r>
+      <w:r>
+        <w:t>i chi</w:t>
+      </w:r>
+      <w:r>
+        <w:t>ế</w:t>
+      </w:r>
+      <w:r>
+        <w:t>u v</w:t>
+      </w:r>
+      <w:r>
+        <w:t>ớ</w:t>
+      </w:r>
+      <w:r>
+        <w:t>i Charter c</w:t>
+      </w:r>
+      <w:r>
+        <w:t>ủ</w:t>
+      </w:r>
+      <w:r>
+        <w:t>a nhóm (m</w:t>
+      </w:r>
+      <w:r>
+        <w:t>ụ</w:t>
+      </w:r>
+      <w:r>
+        <w:t>c 2.1–2.9):</w:t>
+      </w:r>
+    </w:p>
+    <w:p>
+      <w:pPr>
+        <w:spacing w:after="60"/>
+        <w:ind w:left="340" w:hanging="227"/>
+      </w:pPr>
+      <w:r>
+        <w:rPr>
+          <w:sz w:val="20"/>
+        </w:rPr>
+        <w:t>• Gi</w:t>
+      </w:r>
+      <w:r>
+        <w:rPr>
+          <w:sz w:val="20"/>
+        </w:rPr>
+        <w:t>ố</w:t>
+      </w:r>
+      <w:r>
+        <w:rPr>
+          <w:sz w:val="20"/>
+        </w:rPr>
+        <w:t>ng nhau: Claude cũng tách "gi</w:t>
+      </w:r>
+      <w:r>
+        <w:rPr>
+          <w:sz w:val="20"/>
+        </w:rPr>
+        <w:t>ả</w:t>
+      </w:r>
+      <w:r>
+        <w:rPr>
+          <w:sz w:val="20"/>
+        </w:rPr>
+        <w:t>m thu</w:t>
+      </w:r>
+      <w:r>
+        <w:rPr>
+          <w:sz w:val="20"/>
+        </w:rPr>
+        <w:t>ố</w:t>
+      </w:r>
+      <w:r>
+        <w:rPr>
+          <w:sz w:val="20"/>
+        </w:rPr>
+        <w:t>c h</w:t>
+      </w:r>
+      <w:r>
+        <w:rPr>
+          <w:sz w:val="20"/>
+        </w:rPr>
+        <w:t>ủ</w:t>
+      </w:r>
+      <w:r>
+        <w:rPr>
+          <w:sz w:val="20"/>
+        </w:rPr>
+        <w:t>y" và "rút ng</w:t>
+      </w:r>
+      <w:r>
+        <w:rPr>
+          <w:sz w:val="20"/>
+        </w:rPr>
+        <w:t>ắ</w:t>
+      </w:r>
+      <w:r>
+        <w:rPr>
+          <w:sz w:val="20"/>
+        </w:rPr>
+        <w:t>n l</w:t>
+      </w:r>
+      <w:r>
+        <w:rPr>
+          <w:sz w:val="20"/>
+        </w:rPr>
+        <w:t>ậ</w:t>
+      </w:r>
+      <w:r>
+        <w:rPr>
+          <w:sz w:val="20"/>
+        </w:rPr>
+        <w:t>p báo cáo" thành l</w:t>
+      </w:r>
+      <w:r>
+        <w:rPr>
+          <w:sz w:val="20"/>
+        </w:rPr>
+        <w:t>ợ</w:t>
+      </w:r>
+      <w:r>
+        <w:rPr>
+          <w:sz w:val="20"/>
+        </w:rPr>
+        <w:t>i ích kinh doanh, không dùng đ</w:t>
+      </w:r>
+      <w:r>
+        <w:rPr>
+          <w:sz w:val="20"/>
+        </w:rPr>
+        <w:t>ể</w:t>
+      </w:r>
+      <w:r>
+        <w:rPr>
+          <w:sz w:val="20"/>
+        </w:rPr>
+        <w:t xml:space="preserve"> nghi</w:t>
+      </w:r>
+      <w:r>
+        <w:rPr>
+          <w:sz w:val="20"/>
+        </w:rPr>
+        <w:t>ệ</w:t>
+      </w:r>
+      <w:r>
+        <w:rPr>
+          <w:sz w:val="20"/>
+        </w:rPr>
+        <w:t>m thu – trùng v</w:t>
+      </w:r>
+      <w:r>
+        <w:rPr>
+          <w:sz w:val="20"/>
+        </w:rPr>
+        <w:t>ớ</w:t>
+      </w:r>
+      <w:r>
+        <w:rPr>
+          <w:sz w:val="20"/>
+        </w:rPr>
+        <w:t>i cách nhóm vi</w:t>
+      </w:r>
+      <w:r>
+        <w:rPr>
+          <w:sz w:val="20"/>
+        </w:rPr>
+        <w:t>ế</w:t>
+      </w:r>
+      <w:r>
+        <w:rPr>
+          <w:sz w:val="20"/>
+        </w:rPr>
+        <w:t>t l</w:t>
+      </w:r>
+      <w:r>
+        <w:rPr>
+          <w:sz w:val="20"/>
+        </w:rPr>
+        <w:t>ạ</w:t>
+      </w:r>
+      <w:r>
+        <w:rPr>
+          <w:sz w:val="20"/>
+        </w:rPr>
+        <w:t>i m</w:t>
+      </w:r>
+      <w:r>
+        <w:rPr>
+          <w:sz w:val="20"/>
+        </w:rPr>
+        <w:t>ụ</w:t>
+      </w:r>
+      <w:r>
+        <w:rPr>
+          <w:sz w:val="20"/>
+        </w:rPr>
+        <w:t>c tiêu 2.</w:t>
+      </w:r>
+    </w:p>
+    <w:p>
+      <w:pPr>
+        <w:spacing w:after="60"/>
+        <w:ind w:left="340" w:hanging="227"/>
+      </w:pPr>
+      <w:r>
+        <w:rPr>
+          <w:sz w:val="20"/>
+        </w:rPr>
+        <w:t>• M</w:t>
+      </w:r>
+      <w:r>
+        <w:rPr>
+          <w:sz w:val="20"/>
+        </w:rPr>
+        <w:t>ụ</w:t>
+      </w:r>
+      <w:r>
+        <w:rPr>
+          <w:sz w:val="20"/>
+        </w:rPr>
+        <w:t>c tiêu 1 c</w:t>
+      </w:r>
+      <w:r>
+        <w:rPr>
+          <w:sz w:val="20"/>
+        </w:rPr>
+        <w:t>ủ</w:t>
+      </w:r>
+      <w:r>
+        <w:rPr>
+          <w:sz w:val="20"/>
+        </w:rPr>
+        <w:t>a Claude chưa có th</w:t>
+      </w:r>
+      <w:r>
+        <w:rPr>
+          <w:sz w:val="20"/>
+        </w:rPr>
+        <w:t>ờ</w:t>
+      </w:r>
+      <w:r>
+        <w:rPr>
+          <w:sz w:val="20"/>
+        </w:rPr>
+        <w:t>i h</w:t>
+      </w:r>
+      <w:r>
+        <w:rPr>
+          <w:sz w:val="20"/>
+        </w:rPr>
+        <w:t>ạ</w:t>
+      </w:r>
+      <w:r>
+        <w:rPr>
+          <w:sz w:val="20"/>
+        </w:rPr>
+        <w:t>n (ch</w:t>
+      </w:r>
+      <w:r>
+        <w:rPr>
+          <w:sz w:val="20"/>
+        </w:rPr>
+        <w:t>ỉ</w:t>
+      </w:r>
+      <w:r>
+        <w:rPr>
+          <w:sz w:val="20"/>
+        </w:rPr>
+        <w:t xml:space="preserve"> ghi "go-live", không ghi 31/12/2026) nên chưa đ</w:t>
+      </w:r>
+      <w:r>
+        <w:rPr>
+          <w:sz w:val="20"/>
+        </w:rPr>
+        <w:t>ạ</w:t>
+      </w:r>
+      <w:r>
+        <w:rPr>
+          <w:sz w:val="20"/>
+        </w:rPr>
+        <w:t>t ch</w:t>
+      </w:r>
+      <w:r>
+        <w:rPr>
+          <w:sz w:val="20"/>
+        </w:rPr>
+        <w:t>ữ</w:t>
+      </w:r>
+      <w:r>
+        <w:rPr>
+          <w:sz w:val="20"/>
+        </w:rPr>
+        <w:t xml:space="preserve"> T trong SMART; b</w:t>
+      </w:r>
+      <w:r>
+        <w:rPr>
+          <w:sz w:val="20"/>
+        </w:rPr>
+        <w:t>ả</w:t>
+      </w:r>
+      <w:r>
+        <w:rPr>
+          <w:sz w:val="20"/>
+        </w:rPr>
+        <w:t>n c</w:t>
+      </w:r>
+      <w:r>
+        <w:rPr>
+          <w:sz w:val="20"/>
+        </w:rPr>
+        <w:t>ủ</w:t>
+      </w:r>
+      <w:r>
+        <w:rPr>
+          <w:sz w:val="20"/>
+        </w:rPr>
+        <w:t>a nhóm có h</w:t>
+      </w:r>
+      <w:r>
+        <w:rPr>
+          <w:sz w:val="20"/>
+        </w:rPr>
+        <w:t>ạ</w:t>
+      </w:r>
+      <w:r>
+        <w:rPr>
+          <w:sz w:val="20"/>
+        </w:rPr>
+        <w:t>n chót c</w:t>
+      </w:r>
+      <w:r>
+        <w:rPr>
+          <w:sz w:val="20"/>
+        </w:rPr>
+        <w:t>ụ</w:t>
+      </w:r>
+      <w:r>
+        <w:rPr>
+          <w:sz w:val="20"/>
+        </w:rPr>
+        <w:t xml:space="preserve"> th</w:t>
+      </w:r>
+      <w:r>
+        <w:rPr>
+          <w:sz w:val="20"/>
+        </w:rPr>
+        <w:t>ể</w:t>
+      </w:r>
+      <w:r>
+        <w:rPr>
+          <w:sz w:val="20"/>
+        </w:rPr>
+        <w:t>.</w:t>
+      </w:r>
+    </w:p>
+    <w:p>
+      <w:pPr>
+        <w:spacing w:after="60"/>
+        <w:ind w:left="340" w:hanging="227"/>
+      </w:pPr>
+      <w:r>
+        <w:rPr>
+          <w:sz w:val="20"/>
+        </w:rPr>
+        <w:t>• Ph</w:t>
+      </w:r>
+      <w:r>
+        <w:rPr>
+          <w:sz w:val="20"/>
+        </w:rPr>
+        <w:t>ạ</w:t>
+      </w:r>
+      <w:r>
+        <w:rPr>
+          <w:sz w:val="20"/>
+        </w:rPr>
+        <w:t>m vi: Claude x</w:t>
+      </w:r>
+      <w:r>
+        <w:rPr>
+          <w:sz w:val="20"/>
+        </w:rPr>
+        <w:t>ế</w:t>
+      </w:r>
+      <w:r>
+        <w:rPr>
+          <w:sz w:val="20"/>
+        </w:rPr>
+        <w:t>p FR09–FR11 ra ngoài ph</w:t>
+      </w:r>
+      <w:r>
+        <w:rPr>
+          <w:sz w:val="20"/>
+        </w:rPr>
+        <w:t>ạ</w:t>
+      </w:r>
+      <w:r>
+        <w:rPr>
+          <w:sz w:val="20"/>
+        </w:rPr>
+        <w:t>m vi cam k</w:t>
+      </w:r>
+      <w:r>
+        <w:rPr>
+          <w:sz w:val="20"/>
+        </w:rPr>
+        <w:t>ế</w:t>
+      </w:r>
+      <w:r>
+        <w:rPr>
+          <w:sz w:val="20"/>
+        </w:rPr>
+        <w:t>t, còn Charter nhóm gi</w:t>
+      </w:r>
+      <w:r>
+        <w:rPr>
+          <w:sz w:val="20"/>
+        </w:rPr>
+        <w:t>ữ</w:t>
+      </w:r>
+      <w:r>
+        <w:rPr>
+          <w:sz w:val="20"/>
+        </w:rPr>
+        <w:t xml:space="preserve"> FR09–FR10 trong ph</w:t>
+      </w:r>
+      <w:r>
+        <w:rPr>
+          <w:sz w:val="20"/>
+        </w:rPr>
+        <w:t>ạ</w:t>
+      </w:r>
+      <w:r>
+        <w:rPr>
+          <w:sz w:val="20"/>
+        </w:rPr>
+        <w:t>m vi. Hai cách nhìn th</w:t>
+      </w:r>
+      <w:r>
+        <w:rPr>
+          <w:sz w:val="20"/>
+        </w:rPr>
+        <w:t>ố</w:t>
+      </w:r>
+      <w:r>
+        <w:rPr>
+          <w:sz w:val="20"/>
+        </w:rPr>
+        <w:t>ng nh</w:t>
+      </w:r>
+      <w:r>
+        <w:rPr>
+          <w:sz w:val="20"/>
+        </w:rPr>
+        <w:t>ấ</w:t>
+      </w:r>
+      <w:r>
+        <w:rPr>
+          <w:sz w:val="20"/>
+        </w:rPr>
+        <w:t xml:space="preserve">t </w:t>
+      </w:r>
+      <w:r>
+        <w:rPr>
+          <w:sz w:val="20"/>
+        </w:rPr>
+        <w:t>ở</w:t>
+      </w:r>
+      <w:r>
+        <w:rPr>
+          <w:sz w:val="20"/>
+        </w:rPr>
+        <w:t xml:space="preserve"> phương án nén l</w:t>
+      </w:r>
+      <w:r>
+        <w:rPr>
+          <w:sz w:val="20"/>
+        </w:rPr>
+        <w:t>ị</w:t>
+      </w:r>
+      <w:r>
+        <w:rPr>
+          <w:sz w:val="20"/>
+        </w:rPr>
+        <w:t>ch 4.5: d</w:t>
+      </w:r>
+      <w:r>
+        <w:rPr>
+          <w:sz w:val="20"/>
+        </w:rPr>
+        <w:t>ờ</w:t>
+      </w:r>
+      <w:r>
+        <w:rPr>
+          <w:sz w:val="20"/>
+        </w:rPr>
+        <w:t>i FR09–FR10 sang giai đo</w:t>
+      </w:r>
+      <w:r>
+        <w:rPr>
+          <w:sz w:val="20"/>
+        </w:rPr>
+        <w:t>ạ</w:t>
+      </w:r>
+      <w:r>
+        <w:rPr>
+          <w:sz w:val="20"/>
+        </w:rPr>
+        <w:t>n 2 n</w:t>
+      </w:r>
+      <w:r>
+        <w:rPr>
+          <w:sz w:val="20"/>
+        </w:rPr>
+        <w:t>ế</w:t>
+      </w:r>
+      <w:r>
+        <w:rPr>
+          <w:sz w:val="20"/>
+        </w:rPr>
+        <w:t>u Sponsor đ</w:t>
+      </w:r>
+      <w:r>
+        <w:rPr>
+          <w:sz w:val="20"/>
+        </w:rPr>
+        <w:t>ồ</w:t>
+      </w:r>
+      <w:r>
+        <w:rPr>
+          <w:sz w:val="20"/>
+        </w:rPr>
+        <w:t>ng ý.</w:t>
+      </w:r>
+    </w:p>
+    <w:p>
+      <w:pPr>
+        <w:spacing w:after="60"/>
+        <w:ind w:left="340" w:hanging="227"/>
+      </w:pPr>
+      <w:r>
+        <w:rPr>
+          <w:sz w:val="20"/>
+        </w:rPr>
+        <w:t>• Con s</w:t>
+      </w:r>
+      <w:r>
+        <w:rPr>
+          <w:sz w:val="20"/>
+        </w:rPr>
+        <w:t>ố</w:t>
+      </w:r>
+      <w:r>
+        <w:rPr>
+          <w:sz w:val="20"/>
+        </w:rPr>
+        <w:t xml:space="preserve"> đích c</w:t>
+      </w:r>
+      <w:r>
+        <w:rPr>
+          <w:sz w:val="20"/>
+        </w:rPr>
+        <w:t>ủ</w:t>
+      </w:r>
+      <w:r>
+        <w:rPr>
+          <w:sz w:val="20"/>
+        </w:rPr>
+        <w:t>a m</w:t>
+      </w:r>
+      <w:r>
+        <w:rPr>
+          <w:sz w:val="20"/>
+        </w:rPr>
+        <w:t>ụ</w:t>
+      </w:r>
+      <w:r>
+        <w:rPr>
+          <w:sz w:val="20"/>
+        </w:rPr>
+        <w:t>c tiêu báo cáo khác nhau (Claude: dư</w:t>
+      </w:r>
+      <w:r>
+        <w:rPr>
+          <w:sz w:val="20"/>
+        </w:rPr>
+        <w:t>ớ</w:t>
+      </w:r>
+      <w:r>
+        <w:rPr>
+          <w:sz w:val="20"/>
+        </w:rPr>
+        <w:t>i 1 gi</w:t>
+      </w:r>
+      <w:r>
+        <w:rPr>
+          <w:sz w:val="20"/>
+        </w:rPr>
+        <w:t>ờ</w:t>
+      </w:r>
+      <w:r>
+        <w:rPr>
+          <w:sz w:val="20"/>
+        </w:rPr>
+        <w:t>; nhóm: dư</w:t>
+      </w:r>
+      <w:r>
+        <w:rPr>
+          <w:sz w:val="20"/>
+        </w:rPr>
+        <w:t>ớ</w:t>
+      </w:r>
+      <w:r>
+        <w:rPr>
+          <w:sz w:val="20"/>
+        </w:rPr>
+        <w:t>i 10 phút). C</w:t>
+      </w:r>
+      <w:r>
+        <w:rPr>
+          <w:sz w:val="20"/>
+        </w:rPr>
+        <w:t>ả</w:t>
+      </w:r>
+      <w:r>
+        <w:rPr>
+          <w:sz w:val="20"/>
+        </w:rPr>
+        <w:t xml:space="preserve"> hai đ</w:t>
+      </w:r>
+      <w:r>
+        <w:rPr>
+          <w:sz w:val="20"/>
+        </w:rPr>
+        <w:t>ề</w:t>
+      </w:r>
+      <w:r>
+        <w:rPr>
+          <w:sz w:val="20"/>
+        </w:rPr>
+        <w:t>u là đ</w:t>
+      </w:r>
+      <w:r>
+        <w:rPr>
+          <w:sz w:val="20"/>
+        </w:rPr>
+        <w:t>ề</w:t>
+      </w:r>
+      <w:r>
+        <w:rPr>
+          <w:sz w:val="20"/>
+        </w:rPr>
+        <w:t xml:space="preserve"> xu</w:t>
+      </w:r>
+      <w:r>
+        <w:rPr>
+          <w:sz w:val="20"/>
+        </w:rPr>
+        <w:t>ấ</w:t>
+      </w:r>
+      <w:r>
+        <w:rPr>
+          <w:sz w:val="20"/>
+        </w:rPr>
+        <w:t>t, c</w:t>
+      </w:r>
+      <w:r>
+        <w:rPr>
+          <w:sz w:val="20"/>
+        </w:rPr>
+        <w:t>ầ</w:t>
+      </w:r>
+      <w:r>
+        <w:rPr>
+          <w:sz w:val="20"/>
+        </w:rPr>
+        <w:t>n khách hàng xác nh</w:t>
+      </w:r>
+      <w:r>
+        <w:rPr>
+          <w:sz w:val="20"/>
+        </w:rPr>
+        <w:t>ậ</w:t>
+      </w:r>
+      <w:r>
+        <w:rPr>
+          <w:sz w:val="20"/>
+        </w:rPr>
+        <w:t>n.</w:t>
+      </w:r>
+    </w:p>
+    <w:p>
+      <w:pPr>
+        <w:spacing w:after="60"/>
+        <w:ind w:left="340" w:hanging="227"/>
+      </w:pPr>
+      <w:r>
+        <w:rPr>
+          <w:sz w:val="20"/>
+        </w:rPr>
+        <w:t>• Claude h</w:t>
+      </w:r>
+      <w:r>
+        <w:rPr>
+          <w:sz w:val="20"/>
+        </w:rPr>
+        <w:t>ỏ</w:t>
+      </w:r>
+      <w:r>
+        <w:rPr>
+          <w:sz w:val="20"/>
+        </w:rPr>
+        <w:t>i thêm câu v</w:t>
+      </w:r>
+      <w:r>
+        <w:rPr>
+          <w:sz w:val="20"/>
+        </w:rPr>
+        <w:t>ề</w:t>
+      </w:r>
+      <w:r>
+        <w:rPr>
+          <w:sz w:val="20"/>
+        </w:rPr>
+        <w:t xml:space="preserve"> cách tính giá v</w:t>
+      </w:r>
+      <w:r>
+        <w:rPr>
+          <w:sz w:val="20"/>
+        </w:rPr>
+        <w:t>ố</w:t>
+      </w:r>
+      <w:r>
+        <w:rPr>
+          <w:sz w:val="20"/>
+        </w:rPr>
+        <w:t>n (FIFO theo lô hay bình quân) – chưa có trong Q1–Q9, đã b</w:t>
+      </w:r>
+      <w:r>
+        <w:rPr>
+          <w:sz w:val="20"/>
+        </w:rPr>
+        <w:t>ổ</w:t>
+      </w:r>
+      <w:r>
+        <w:rPr>
+          <w:sz w:val="20"/>
+        </w:rPr>
+        <w:t xml:space="preserve"> sung thành Q10.</w:t>
+      </w:r>
+    </w:p>
+    <w:p>
       <w:r>
         <w:br w:type="page"/>
       </w:r>
@@ -9180,7 +10372,7 @@
         <w:keepNext/>
         <w:keepLines/>
       </w:pPr>
-      <w:bookmarkStart w:id="11" w:name="_Toc242014146"/>
+      <w:bookmarkStart w:id="11" w:name="_Toc242014661"/>
       <w:r>
         <w:t>3. Phạm vi và WBS</w:t>
       </w:r>
@@ -9197,7 +10389,7 @@
     <w:p>
       <w:pPr>
         <w:sectPr>
-          <w:footerReference w:type="default" r:id="rId10"/>
+          <w:footerReference w:type="default" r:id="rId13"/>
           <w:pgSz w:w="11906" w:h="16838"/>
           <w:pgMar w:top="1134" w:right="1134" w:bottom="1134" w:left="1134" w:header="708" w:footer="708" w:gutter="0"/>
           <w:cols w:space="720"/>
@@ -9211,7 +10403,7 @@
         <w:keepNext/>
         <w:keepLines/>
       </w:pPr>
-      <w:bookmarkStart w:id="12" w:name="_Toc242014147"/>
+      <w:bookmarkStart w:id="12" w:name="_Toc242014662"/>
       <w:r>
         <w:t>3.1 Sơ đồ cây WBS</w:t>
       </w:r>
@@ -9245,7 +10437,7 @@
                     </pic:cNvPicPr>
                   </pic:nvPicPr>
                   <pic:blipFill>
-                    <a:blip r:embed="rId11"/>
+                    <a:blip r:embed="rId14"/>
                     <a:srcRect/>
                     <a:stretch>
                       <a:fillRect/>
@@ -9286,7 +10478,7 @@
     <w:p>
       <w:pPr>
         <w:sectPr>
-          <w:footerReference w:type="default" r:id="rId12"/>
+          <w:footerReference w:type="default" r:id="rId15"/>
           <w:pgSz w:w="16838" w:h="11906" w:orient="landscape"/>
           <w:pgMar w:top="1134" w:right="1134" w:bottom="1134" w:left="1134" w:header="708" w:footer="708" w:gutter="0"/>
           <w:cols w:space="720"/>
@@ -9300,7 +10492,7 @@
         <w:keepNext/>
         <w:keepLines/>
       </w:pPr>
-      <w:bookmarkStart w:id="13" w:name="_Toc242014148"/>
+      <w:bookmarkStart w:id="13" w:name="_Toc242014663"/>
       <w:r>
         <w:t>3.2 Bảng WBS</w:t>
       </w:r>
@@ -21202,11 +22394,783 @@
     </w:p>
     <w:p>
       <w:pPr>
+        <w:pStyle w:val="Heading3"/>
+        <w:keepNext/>
+      </w:pPr>
+      <w:r>
+        <w:t>Đ</w:t>
+      </w:r>
+      <w:r>
+        <w:t>ố</w:t>
+      </w:r>
+      <w:r>
+        <w:t>i chi</w:t>
+      </w:r>
+      <w:r>
+        <w:t>ế</w:t>
+      </w:r>
+      <w:r>
+        <w:t>u v</w:t>
+      </w:r>
+      <w:r>
+        <w:t>ớ</w:t>
+      </w:r>
+      <w:r>
+        <w:t>i WBS c</w:t>
+      </w:r>
+      <w:r>
+        <w:t>ủ</w:t>
+      </w:r>
+      <w:r>
+        <w:t>a Claude Project (Bài 2)</w:t>
+      </w:r>
+    </w:p>
+    <w:p>
+      <w:pPr>
+        <w:keepNext/>
+        <w:jc w:val="center"/>
+      </w:pPr>
+      <w:r>
+        <w:rPr>
+          <w:noProof/>
+        </w:rPr>
+        <w:drawing>
+          <wp:inline distT="0" distB="0" distL="0" distR="0" wp14:anchorId="3BC39ED6" wp14:editId="5AB14165">
+            <wp:extent cx="2700000" cy="4465184"/>
+            <wp:effectExtent l="0" t="0" r="0" b="0"/>
+            <wp:docPr id="10" name="Picture 10"/>
+            <wp:cNvGraphicFramePr>
+              <a:graphicFrameLocks xmlns:a="http://schemas.openxmlformats.org/drawingml/2006/main" noChangeAspect="1"/>
+            </wp:cNvGraphicFramePr>
+            <a:graphic xmlns:a="http://schemas.openxmlformats.org/drawingml/2006/main">
+              <a:graphicData uri="http://schemas.openxmlformats.org/drawingml/2006/picture">
+                <pic:pic xmlns:pic="http://schemas.openxmlformats.org/drawingml/2006/picture">
+                  <pic:nvPicPr>
+                    <pic:cNvPr id="0" name="b2_wbs.png"/>
+                    <pic:cNvPicPr/>
+                  </pic:nvPicPr>
+                  <pic:blipFill>
+                    <a:blip r:embed="rId16"/>
+                    <a:stretch>
+                      <a:fillRect/>
+                    </a:stretch>
+                  </pic:blipFill>
+                  <pic:spPr>
+                    <a:xfrm>
+                      <a:off x="0" y="0"/>
+                      <a:ext cx="2700000" cy="4465184"/>
+                    </a:xfrm>
+                    <a:prstGeom prst="rect">
+                      <a:avLst/>
+                    </a:prstGeom>
+                  </pic:spPr>
+                </pic:pic>
+              </a:graphicData>
+            </a:graphic>
+          </wp:inline>
+        </w:drawing>
+      </w:r>
+    </w:p>
+    <w:p>
+      <w:pPr>
+        <w:jc w:val="center"/>
+      </w:pPr>
+      <w:r>
+        <w:rPr>
+          <w:i/>
+          <w:color w:val="595959"/>
+          <w:sz w:val="18"/>
+        </w:rPr>
+        <w:t>Hình 3.2 – Tóm t</w:t>
+      </w:r>
+      <w:r>
+        <w:rPr>
+          <w:i/>
+          <w:color w:val="595959"/>
+          <w:sz w:val="18"/>
+        </w:rPr>
+        <w:t>ắ</w:t>
+      </w:r>
+      <w:r>
+        <w:rPr>
+          <w:i/>
+          <w:color w:val="595959"/>
+          <w:sz w:val="18"/>
+        </w:rPr>
+        <w:t>t WBS do Claude Project l</w:t>
+      </w:r>
+      <w:r>
+        <w:rPr>
+          <w:i/>
+          <w:color w:val="595959"/>
+          <w:sz w:val="18"/>
+        </w:rPr>
+        <w:t>ậ</w:t>
+      </w:r>
+      <w:r>
+        <w:rPr>
+          <w:i/>
+          <w:color w:val="595959"/>
+          <w:sz w:val="18"/>
+        </w:rPr>
+        <w:t>p trong chat Bài 2</w:t>
+      </w:r>
+    </w:p>
+    <w:p>
+      <w:pPr>
+        <w:spacing w:after="60"/>
+        <w:ind w:left="340" w:hanging="227"/>
+      </w:pPr>
+      <w:r>
+        <w:rPr>
+          <w:sz w:val="20"/>
+        </w:rPr>
+        <w:t>• Quy mô: Claude 46 gói công vi</w:t>
+      </w:r>
+      <w:r>
+        <w:rPr>
+          <w:sz w:val="20"/>
+        </w:rPr>
+        <w:t>ệ</w:t>
+      </w:r>
+      <w:r>
+        <w:rPr>
+          <w:sz w:val="20"/>
+        </w:rPr>
+        <w:t>c, 1.912 gi</w:t>
+      </w:r>
+      <w:r>
+        <w:rPr>
+          <w:sz w:val="20"/>
+        </w:rPr>
+        <w:t>ờ</w:t>
+      </w:r>
+      <w:r>
+        <w:rPr>
+          <w:sz w:val="20"/>
+        </w:rPr>
+        <w:t xml:space="preserve"> công; WBS c</w:t>
+      </w:r>
+      <w:r>
+        <w:rPr>
+          <w:sz w:val="20"/>
+        </w:rPr>
+        <w:t>ủ</w:t>
+      </w:r>
+      <w:r>
+        <w:rPr>
+          <w:sz w:val="20"/>
+        </w:rPr>
+        <w:t>a nhóm 47 gói, 1.364 gi</w:t>
+      </w:r>
+      <w:r>
+        <w:rPr>
+          <w:sz w:val="20"/>
+        </w:rPr>
+        <w:t>ờ</w:t>
+      </w:r>
+      <w:r>
+        <w:rPr>
+          <w:sz w:val="20"/>
+        </w:rPr>
+        <w:t>. Claude ư</w:t>
+      </w:r>
+      <w:r>
+        <w:rPr>
+          <w:sz w:val="20"/>
+        </w:rPr>
+        <w:t>ớ</w:t>
+      </w:r>
+      <w:r>
+        <w:rPr>
+          <w:sz w:val="20"/>
+        </w:rPr>
+        <w:t>c lư</w:t>
+      </w:r>
+      <w:r>
+        <w:rPr>
+          <w:sz w:val="20"/>
+        </w:rPr>
+        <w:t>ợ</w:t>
+      </w:r>
+      <w:r>
+        <w:rPr>
+          <w:sz w:val="20"/>
+        </w:rPr>
+        <w:t>ng nhi</w:t>
+      </w:r>
+      <w:r>
+        <w:rPr>
+          <w:sz w:val="20"/>
+        </w:rPr>
+        <w:t>ề</w:t>
+      </w:r>
+      <w:r>
+        <w:rPr>
+          <w:sz w:val="20"/>
+        </w:rPr>
+        <w:t>u hơn kho</w:t>
+      </w:r>
+      <w:r>
+        <w:rPr>
+          <w:sz w:val="20"/>
+        </w:rPr>
+        <w:t>ả</w:t>
+      </w:r>
+      <w:r>
+        <w:rPr>
+          <w:sz w:val="20"/>
+        </w:rPr>
+        <w:t>ng 40%.</w:t>
+      </w:r>
+    </w:p>
+    <w:p>
+      <w:pPr>
+        <w:spacing w:after="60"/>
+        <w:ind w:left="340" w:hanging="227"/>
+      </w:pPr>
+      <w:r>
+        <w:rPr>
+          <w:sz w:val="20"/>
+        </w:rPr>
+        <w:t>• Chi phí: 1.912 gi</w:t>
+      </w:r>
+      <w:r>
+        <w:rPr>
+          <w:sz w:val="20"/>
+        </w:rPr>
+        <w:t>ờ</w:t>
+      </w:r>
+      <w:r>
+        <w:rPr>
+          <w:sz w:val="20"/>
+        </w:rPr>
+        <w:t xml:space="preserve"> × đơn giá trung bình c</w:t>
+      </w:r>
+      <w:r>
+        <w:rPr>
+          <w:sz w:val="20"/>
+        </w:rPr>
+        <w:t>ủ</w:t>
+      </w:r>
+      <w:r>
+        <w:rPr>
+          <w:sz w:val="20"/>
+        </w:rPr>
+        <w:t>a nhóm (kho</w:t>
+      </w:r>
+      <w:r>
+        <w:rPr>
+          <w:sz w:val="20"/>
+        </w:rPr>
+        <w:t>ả</w:t>
+      </w:r>
+      <w:r>
+        <w:rPr>
+          <w:sz w:val="20"/>
+        </w:rPr>
+        <w:t>ng 153.000 đ/gi</w:t>
+      </w:r>
+      <w:r>
+        <w:rPr>
+          <w:sz w:val="20"/>
+        </w:rPr>
+        <w:t>ờ</w:t>
+      </w:r>
+      <w:r>
+        <w:rPr>
+          <w:sz w:val="20"/>
+        </w:rPr>
+        <w:t>) ≈ 293 tri</w:t>
+      </w:r>
+      <w:r>
+        <w:rPr>
+          <w:sz w:val="20"/>
+        </w:rPr>
+        <w:t>ệ</w:t>
+      </w:r>
+      <w:r>
+        <w:rPr>
+          <w:sz w:val="20"/>
+        </w:rPr>
+        <w:t>u đ</w:t>
+      </w:r>
+      <w:r>
+        <w:rPr>
+          <w:sz w:val="20"/>
+        </w:rPr>
+        <w:t>ồ</w:t>
+      </w:r>
+      <w:r>
+        <w:rPr>
+          <w:sz w:val="20"/>
+        </w:rPr>
+        <w:t>ng ti</w:t>
+      </w:r>
+      <w:r>
+        <w:rPr>
+          <w:sz w:val="20"/>
+        </w:rPr>
+        <w:t>ề</w:t>
+      </w:r>
+      <w:r>
+        <w:rPr>
+          <w:sz w:val="20"/>
+        </w:rPr>
+        <w:t>n công, c</w:t>
+      </w:r>
+      <w:r>
+        <w:rPr>
+          <w:sz w:val="20"/>
+        </w:rPr>
+        <w:t>ộ</w:t>
+      </w:r>
+      <w:r>
+        <w:rPr>
+          <w:sz w:val="20"/>
+        </w:rPr>
+        <w:t>ng d</w:t>
+      </w:r>
+      <w:r>
+        <w:rPr>
+          <w:sz w:val="20"/>
+        </w:rPr>
+        <w:t>ự</w:t>
+      </w:r>
+      <w:r>
+        <w:rPr>
+          <w:sz w:val="20"/>
+        </w:rPr>
+        <w:t xml:space="preserve"> phòng thì vư</w:t>
+      </w:r>
+      <w:r>
+        <w:rPr>
+          <w:sz w:val="20"/>
+        </w:rPr>
+        <w:t>ợ</w:t>
+      </w:r>
+      <w:r>
+        <w:rPr>
+          <w:sz w:val="20"/>
+        </w:rPr>
+        <w:t>t ngân sách 250 tri</w:t>
+      </w:r>
+      <w:r>
+        <w:rPr>
+          <w:sz w:val="20"/>
+        </w:rPr>
+        <w:t>ệ</w:t>
+      </w:r>
+      <w:r>
+        <w:rPr>
+          <w:sz w:val="20"/>
+        </w:rPr>
+        <w:t>u. Claude ch</w:t>
+      </w:r>
+      <w:r>
+        <w:rPr>
+          <w:sz w:val="20"/>
+        </w:rPr>
+        <w:t>ỉ</w:t>
+      </w:r>
+      <w:r>
+        <w:rPr>
+          <w:sz w:val="20"/>
+        </w:rPr>
+        <w:t xml:space="preserve"> ki</w:t>
+      </w:r>
+      <w:r>
+        <w:rPr>
+          <w:sz w:val="20"/>
+        </w:rPr>
+        <w:t>ể</w:t>
+      </w:r>
+      <w:r>
+        <w:rPr>
+          <w:sz w:val="20"/>
+        </w:rPr>
+        <w:t>m tra năng l</w:t>
+      </w:r>
+      <w:r>
+        <w:rPr>
+          <w:sz w:val="20"/>
+        </w:rPr>
+        <w:t>ự</w:t>
+      </w:r>
+      <w:r>
+        <w:rPr>
+          <w:sz w:val="20"/>
+        </w:rPr>
+        <w:t>c đ</w:t>
+      </w:r>
+      <w:r>
+        <w:rPr>
+          <w:sz w:val="20"/>
+        </w:rPr>
+        <w:t>ộ</w:t>
+      </w:r>
+      <w:r>
+        <w:rPr>
+          <w:sz w:val="20"/>
+        </w:rPr>
+        <w:t>i, không đ</w:t>
+      </w:r>
+      <w:r>
+        <w:rPr>
+          <w:sz w:val="20"/>
+        </w:rPr>
+        <w:t>ố</w:t>
+      </w:r>
+      <w:r>
+        <w:rPr>
+          <w:sz w:val="20"/>
+        </w:rPr>
+        <w:t>i chi</w:t>
+      </w:r>
+      <w:r>
+        <w:rPr>
+          <w:sz w:val="20"/>
+        </w:rPr>
+        <w:t>ế</w:t>
+      </w:r>
+      <w:r>
+        <w:rPr>
+          <w:sz w:val="20"/>
+        </w:rPr>
+        <w:t>u ngân sách.</w:t>
+      </w:r>
+    </w:p>
+    <w:p>
+      <w:pPr>
+        <w:spacing w:after="60"/>
+        <w:ind w:left="340" w:hanging="227"/>
+      </w:pPr>
+      <w:r>
+        <w:rPr>
+          <w:sz w:val="20"/>
+        </w:rPr>
+        <w:t>• Ph</w:t>
+      </w:r>
+      <w:r>
+        <w:rPr>
+          <w:sz w:val="20"/>
+        </w:rPr>
+        <w:t>ạ</w:t>
+      </w:r>
+      <w:r>
+        <w:rPr>
+          <w:sz w:val="20"/>
+        </w:rPr>
+        <w:t>m vi: WBS c</w:t>
+      </w:r>
+      <w:r>
+        <w:rPr>
+          <w:sz w:val="20"/>
+        </w:rPr>
+        <w:t>ủ</w:t>
+      </w:r>
+      <w:r>
+        <w:rPr>
+          <w:sz w:val="20"/>
+        </w:rPr>
+        <w:t>a Claude không có FR09–FR12 (nh</w:t>
+      </w:r>
+      <w:r>
+        <w:rPr>
+          <w:sz w:val="20"/>
+        </w:rPr>
+        <w:t>ấ</w:t>
+      </w:r>
+      <w:r>
+        <w:rPr>
+          <w:sz w:val="20"/>
+        </w:rPr>
+        <w:t>t quán v</w:t>
+      </w:r>
+      <w:r>
+        <w:rPr>
+          <w:sz w:val="20"/>
+        </w:rPr>
+        <w:t>ớ</w:t>
+      </w:r>
+      <w:r>
+        <w:rPr>
+          <w:sz w:val="20"/>
+        </w:rPr>
+        <w:t>i Charter c</w:t>
+      </w:r>
+      <w:r>
+        <w:rPr>
+          <w:sz w:val="20"/>
+        </w:rPr>
+        <w:t>ủ</w:t>
+      </w:r>
+      <w:r>
+        <w:rPr>
+          <w:sz w:val="20"/>
+        </w:rPr>
+        <w:t>a Claude) nhưng l</w:t>
+      </w:r>
+      <w:r>
+        <w:rPr>
+          <w:sz w:val="20"/>
+        </w:rPr>
+        <w:t>ệ</w:t>
+      </w:r>
+      <w:r>
+        <w:rPr>
+          <w:sz w:val="20"/>
+        </w:rPr>
+        <w:t>ch so v</w:t>
+      </w:r>
+      <w:r>
+        <w:rPr>
+          <w:sz w:val="20"/>
+        </w:rPr>
+        <w:t>ớ</w:t>
+      </w:r>
+      <w:r>
+        <w:rPr>
+          <w:sz w:val="20"/>
+        </w:rPr>
+        <w:t>i Charter c</w:t>
+      </w:r>
+      <w:r>
+        <w:rPr>
+          <w:sz w:val="20"/>
+        </w:rPr>
+        <w:t>ủ</w:t>
+      </w:r>
+      <w:r>
+        <w:rPr>
+          <w:sz w:val="20"/>
+        </w:rPr>
+        <w:t>a nhóm.</w:t>
+      </w:r>
+    </w:p>
+    <w:p>
+      <w:pPr>
+        <w:spacing w:after="60"/>
+        <w:ind w:left="340" w:hanging="227"/>
+      </w:pPr>
+      <w:r>
+        <w:rPr>
+          <w:sz w:val="20"/>
+        </w:rPr>
+        <w:t>• Nhân l</w:t>
+      </w:r>
+      <w:r>
+        <w:rPr>
+          <w:sz w:val="20"/>
+        </w:rPr>
+        <w:t>ự</w:t>
+      </w:r>
+      <w:r>
+        <w:rPr>
+          <w:sz w:val="20"/>
+        </w:rPr>
+        <w:t>c: c</w:t>
+      </w:r>
+      <w:r>
+        <w:rPr>
+          <w:sz w:val="20"/>
+        </w:rPr>
+        <w:t>ả</w:t>
+      </w:r>
+      <w:r>
+        <w:rPr>
+          <w:sz w:val="20"/>
+        </w:rPr>
+        <w:t xml:space="preserve"> hai cùng phát hi</w:t>
+      </w:r>
+      <w:r>
+        <w:rPr>
+          <w:sz w:val="20"/>
+        </w:rPr>
+        <w:t>ệ</w:t>
+      </w:r>
+      <w:r>
+        <w:rPr>
+          <w:sz w:val="20"/>
+        </w:rPr>
+        <w:t>n l</w:t>
+      </w:r>
+      <w:r>
+        <w:rPr>
+          <w:sz w:val="20"/>
+        </w:rPr>
+        <w:t>ậ</w:t>
+      </w:r>
+      <w:r>
+        <w:rPr>
+          <w:sz w:val="20"/>
+        </w:rPr>
+        <w:t>p trình viên backend quá t</w:t>
+      </w:r>
+      <w:r>
+        <w:rPr>
+          <w:sz w:val="20"/>
+        </w:rPr>
+        <w:t>ả</w:t>
+      </w:r>
+      <w:r>
+        <w:rPr>
+          <w:sz w:val="20"/>
+        </w:rPr>
+        <w:t>i (Claude: 572/480 gi</w:t>
+      </w:r>
+      <w:r>
+        <w:rPr>
+          <w:sz w:val="20"/>
+        </w:rPr>
+        <w:t>ờ</w:t>
+      </w:r>
+      <w:r>
+        <w:rPr>
+          <w:sz w:val="20"/>
+        </w:rPr>
+        <w:t>; nhóm: 460/512 gi</w:t>
+      </w:r>
+      <w:r>
+        <w:rPr>
+          <w:sz w:val="20"/>
+        </w:rPr>
+        <w:t>ờ</w:t>
+      </w:r>
+      <w:r>
+        <w:rPr>
+          <w:sz w:val="20"/>
+        </w:rPr>
+        <w:t xml:space="preserve"> – r</w:t>
+      </w:r>
+      <w:r>
+        <w:rPr>
+          <w:sz w:val="20"/>
+        </w:rPr>
+        <w:t>ủ</w:t>
+      </w:r>
+      <w:r>
+        <w:rPr>
+          <w:sz w:val="20"/>
+        </w:rPr>
+        <w:t>i ro R05).</w:t>
+      </w:r>
+    </w:p>
+    <w:p>
+      <w:pPr>
+        <w:spacing w:after="60"/>
+        <w:ind w:left="340" w:hanging="227"/>
+      </w:pPr>
+      <w:r>
+        <w:rPr>
+          <w:sz w:val="20"/>
+        </w:rPr>
+        <w:t>• Quy t</w:t>
+      </w:r>
+      <w:r>
+        <w:rPr>
+          <w:sz w:val="20"/>
+        </w:rPr>
+        <w:t>ắ</w:t>
+      </w:r>
+      <w:r>
+        <w:rPr>
+          <w:sz w:val="20"/>
+        </w:rPr>
+        <w:t>c 8/80 đ</w:t>
+      </w:r>
+      <w:r>
+        <w:rPr>
+          <w:sz w:val="20"/>
+        </w:rPr>
+        <w:t>ề</w:t>
+      </w:r>
+      <w:r>
+        <w:rPr>
+          <w:sz w:val="20"/>
+        </w:rPr>
+        <w:t>u đ</w:t>
+      </w:r>
+      <w:r>
+        <w:rPr>
+          <w:sz w:val="20"/>
+        </w:rPr>
+        <w:t>ạ</w:t>
+      </w:r>
+      <w:r>
+        <w:rPr>
+          <w:sz w:val="20"/>
+        </w:rPr>
+        <w:t>t (Claude: 12–72 gi</w:t>
+      </w:r>
+      <w:r>
+        <w:rPr>
+          <w:sz w:val="20"/>
+        </w:rPr>
+        <w:t>ờ</w:t>
+      </w:r>
+      <w:r>
+        <w:rPr>
+          <w:sz w:val="20"/>
+        </w:rPr>
+        <w:t>; nhóm: 8–80 gi</w:t>
+      </w:r>
+      <w:r>
+        <w:rPr>
+          <w:sz w:val="20"/>
+        </w:rPr>
+        <w:t>ờ</w:t>
+      </w:r>
+      <w:r>
+        <w:rPr>
+          <w:sz w:val="20"/>
+        </w:rPr>
+        <w:t>). Nhóm gi</w:t>
+      </w:r>
+      <w:r>
+        <w:rPr>
+          <w:sz w:val="20"/>
+        </w:rPr>
+        <w:t>ữ</w:t>
+      </w:r>
+      <w:r>
+        <w:rPr>
+          <w:sz w:val="20"/>
+        </w:rPr>
+        <w:t xml:space="preserve"> WBS 1.364 gi</w:t>
+      </w:r>
+      <w:r>
+        <w:rPr>
+          <w:sz w:val="20"/>
+        </w:rPr>
+        <w:t>ờ</w:t>
+      </w:r>
+      <w:r>
+        <w:rPr>
+          <w:sz w:val="20"/>
+        </w:rPr>
+        <w:t xml:space="preserve"> vì n</w:t>
+      </w:r>
+      <w:r>
+        <w:rPr>
+          <w:sz w:val="20"/>
+        </w:rPr>
+        <w:t>ằ</w:t>
+      </w:r>
+      <w:r>
+        <w:rPr>
+          <w:sz w:val="20"/>
+        </w:rPr>
+        <w:t>m trong ngân sách.</w:t>
+      </w:r>
+    </w:p>
+    <w:p>
+      <w:pPr>
         <w:pStyle w:val="Heading2"/>
         <w:keepNext/>
         <w:keepLines/>
       </w:pPr>
-      <w:bookmarkStart w:id="14" w:name="_Toc242014149"/>
+      <w:bookmarkStart w:id="14" w:name="_Toc242014664"/>
       <w:r>
         <w:t>3.3 Từ điển WBS (3 gói công việc quan trọng nhất)</w:t>
       </w:r>
@@ -22898,7 +24862,7 @@
     <w:p>
       <w:pPr>
         <w:sectPr>
-          <w:footerReference w:type="default" r:id="rId13"/>
+          <w:footerReference w:type="default" r:id="rId17"/>
           <w:pgSz w:w="11906" w:h="16838"/>
           <w:pgMar w:top="1134" w:right="1134" w:bottom="1134" w:left="1134" w:header="708" w:footer="708" w:gutter="0"/>
           <w:cols w:space="720"/>
@@ -22912,7 +24876,7 @@
         <w:keepNext/>
         <w:keepLines/>
       </w:pPr>
-      <w:bookmarkStart w:id="15" w:name="_Toc242014150"/>
+      <w:bookmarkStart w:id="15" w:name="_Toc242014665"/>
       <w:r>
         <w:t>4. Ước lượng, lịch dự án và đường găng</w:t>
       </w:r>
@@ -22932,7 +24896,7 @@
         <w:keepNext/>
         <w:keepLines/>
       </w:pPr>
-      <w:bookmarkStart w:id="16" w:name="_Toc242014151"/>
+      <w:bookmarkStart w:id="16" w:name="_Toc242014666"/>
       <w:r>
         <w:t>4.1 Bảng PERT và CPM</w:t>
       </w:r>
@@ -30532,7 +32496,7 @@
         <w:keepNext/>
         <w:keepLines/>
       </w:pPr>
-      <w:bookmarkStart w:id="17" w:name="_Toc242014152"/>
+      <w:bookmarkStart w:id="17" w:name="_Toc242014667"/>
       <w:r>
         <w:t>4.2 Kết quả</w:t>
       </w:r>
@@ -31081,7 +33045,7 @@
         <w:keepNext/>
         <w:keepLines/>
       </w:pPr>
-      <w:bookmarkStart w:id="18" w:name="_Toc242014153"/>
+      <w:bookmarkStart w:id="18" w:name="_Toc242014668"/>
       <w:r>
         <w:t>4.3 Biểu đồ Gantt</w:t>
       </w:r>
@@ -31115,7 +33079,7 @@
                     </pic:cNvPicPr>
                   </pic:nvPicPr>
                   <pic:blipFill>
-                    <a:blip r:embed="rId14"/>
+                    <a:blip r:embed="rId18"/>
                     <a:srcRect/>
                     <a:stretch>
                       <a:fillRect/>
@@ -31159,7 +33123,7 @@
         <w:keepNext/>
         <w:keepLines/>
       </w:pPr>
-      <w:bookmarkStart w:id="19" w:name="_Toc242014154"/>
+      <w:bookmarkStart w:id="19" w:name="_Toc242014669"/>
       <w:r>
         <w:t>4.4 So sánh kết quả Excel với câu trả lời của AI (Claude Project)</w:t>
       </w:r>
@@ -31931,11 +33895,182 @@
     </w:tbl>
     <w:p>
       <w:pPr>
+        <w:keepNext/>
+        <w:jc w:val="center"/>
+      </w:pPr>
+      <w:r>
+        <w:rPr>
+          <w:noProof/>
+        </w:rPr>
+        <w:drawing>
+          <wp:inline distT="0" distB="0" distL="0" distR="0" wp14:anchorId="5D26AEBC" wp14:editId="300A437B">
+            <wp:extent cx="8280000" cy="3685055"/>
+            <wp:effectExtent l="0" t="0" r="0" b="0"/>
+            <wp:docPr id="11" name="Picture 11"/>
+            <wp:cNvGraphicFramePr>
+              <a:graphicFrameLocks xmlns:a="http://schemas.openxmlformats.org/drawingml/2006/main" noChangeAspect="1"/>
+            </wp:cNvGraphicFramePr>
+            <a:graphic xmlns:a="http://schemas.openxmlformats.org/drawingml/2006/main">
+              <a:graphicData uri="http://schemas.openxmlformats.org/drawingml/2006/picture">
+                <pic:pic xmlns:pic="http://schemas.openxmlformats.org/drawingml/2006/picture">
+                  <pic:nvPicPr>
+                    <pic:cNvPr id="0" name="b3_pert.png"/>
+                    <pic:cNvPicPr/>
+                  </pic:nvPicPr>
+                  <pic:blipFill>
+                    <a:blip r:embed="rId19"/>
+                    <a:stretch>
+                      <a:fillRect/>
+                    </a:stretch>
+                  </pic:blipFill>
+                  <pic:spPr>
+                    <a:xfrm>
+                      <a:off x="0" y="0"/>
+                      <a:ext cx="8280000" cy="3685055"/>
+                    </a:xfrm>
+                    <a:prstGeom prst="rect">
+                      <a:avLst/>
+                    </a:prstGeom>
+                  </pic:spPr>
+                </pic:pic>
+              </a:graphicData>
+            </a:graphic>
+          </wp:inline>
+        </w:drawing>
+      </w:r>
+    </w:p>
+    <w:p>
+      <w:pPr>
+        <w:jc w:val="center"/>
+      </w:pPr>
+      <w:r>
+        <w:rPr>
+          <w:i/>
+          <w:color w:val="595959"/>
+          <w:sz w:val="18"/>
+        </w:rPr>
+        <w:t>Hình 4.2 – K</w:t>
+      </w:r>
+      <w:r>
+        <w:rPr>
+          <w:i/>
+          <w:color w:val="595959"/>
+          <w:sz w:val="18"/>
+        </w:rPr>
+        <w:t>ế</w:t>
+      </w:r>
+      <w:r>
+        <w:rPr>
+          <w:i/>
+          <w:color w:val="595959"/>
+          <w:sz w:val="18"/>
+        </w:rPr>
+        <w:t>t qu</w:t>
+      </w:r>
+      <w:r>
+        <w:rPr>
+          <w:i/>
+          <w:color w:val="595959"/>
+          <w:sz w:val="18"/>
+        </w:rPr>
+        <w:t>ả</w:t>
+      </w:r>
+      <w:r>
+        <w:rPr>
+          <w:i/>
+          <w:color w:val="595959"/>
+          <w:sz w:val="18"/>
+        </w:rPr>
+        <w:t xml:space="preserve"> Bài 3 trong Claude Project: tài li</w:t>
+      </w:r>
+      <w:r>
+        <w:rPr>
+          <w:i/>
+          <w:color w:val="595959"/>
+          <w:sz w:val="18"/>
+        </w:rPr>
+        <w:t>ệ</w:t>
+      </w:r>
+      <w:r>
+        <w:rPr>
+          <w:i/>
+          <w:color w:val="595959"/>
+          <w:sz w:val="18"/>
+        </w:rPr>
+        <w:t>u PERT (trái) và b</w:t>
+      </w:r>
+      <w:r>
+        <w:rPr>
+          <w:i/>
+          <w:color w:val="595959"/>
+          <w:sz w:val="18"/>
+        </w:rPr>
+        <w:t>ả</w:t>
+      </w:r>
+      <w:r>
+        <w:rPr>
+          <w:i/>
+          <w:color w:val="595959"/>
+          <w:sz w:val="18"/>
+        </w:rPr>
+        <w:t>ng k</w:t>
+      </w:r>
+      <w:r>
+        <w:rPr>
+          <w:i/>
+          <w:color w:val="595959"/>
+          <w:sz w:val="18"/>
+        </w:rPr>
+        <w:t>ế</w:t>
+      </w:r>
+      <w:r>
+        <w:rPr>
+          <w:i/>
+          <w:color w:val="595959"/>
+          <w:sz w:val="18"/>
+        </w:rPr>
+        <w:t>t qu</w:t>
+      </w:r>
+      <w:r>
+        <w:rPr>
+          <w:i/>
+          <w:color w:val="595959"/>
+          <w:sz w:val="18"/>
+        </w:rPr>
+        <w:t>ả</w:t>
+      </w:r>
+      <w:r>
+        <w:rPr>
+          <w:i/>
+          <w:color w:val="595959"/>
+          <w:sz w:val="18"/>
+        </w:rPr>
+        <w:t xml:space="preserve"> (ph</w:t>
+      </w:r>
+      <w:r>
+        <w:rPr>
+          <w:i/>
+          <w:color w:val="595959"/>
+          <w:sz w:val="18"/>
+        </w:rPr>
+        <w:t>ả</w:t>
+      </w:r>
+      <w:r>
+        <w:rPr>
+          <w:i/>
+          <w:color w:val="595959"/>
+          <w:sz w:val="18"/>
+        </w:rPr>
+        <w:t>i)</w:t>
+      </w:r>
+    </w:p>
+    <w:p>
+      <w:pPr>
         <w:pStyle w:val="Heading2"/>
         <w:keepNext/>
         <w:keepLines/>
       </w:pPr>
-      <w:bookmarkStart w:id="20" w:name="_Toc242014155"/>
+      <w:bookmarkStart w:id="20" w:name="_Toc242014670"/>
       <w:r>
         <w:t>4.5 Phương án nén lịch (AI gợi ý – nhóm tự chọn và lý giải)</w:t>
       </w:r>
@@ -34919,7 +37054,7 @@
     <w:p>
       <w:pPr>
         <w:sectPr>
-          <w:footerReference w:type="default" r:id="rId15"/>
+          <w:footerReference w:type="default" r:id="rId20"/>
           <w:pgSz w:w="16838" w:h="11906" w:orient="landscape"/>
           <w:pgMar w:top="1134" w:right="1134" w:bottom="1134" w:left="1134" w:header="708" w:footer="708" w:gutter="0"/>
           <w:cols w:space="720"/>
@@ -34933,7 +37068,7 @@
         <w:keepNext/>
         <w:keepLines/>
       </w:pPr>
-      <w:bookmarkStart w:id="21" w:name="_Toc242014156"/>
+      <w:bookmarkStart w:id="21" w:name="_Toc242014671"/>
       <w:r>
         <w:t>5. Ước lượng chi phí</w:t>
       </w:r>
@@ -37253,7 +39388,7 @@
     <w:p>
       <w:pPr>
         <w:sectPr>
-          <w:footerReference w:type="default" r:id="rId16"/>
+          <w:footerReference w:type="default" r:id="rId21"/>
           <w:pgSz w:w="11906" w:h="16838"/>
           <w:pgMar w:top="1134" w:right="1134" w:bottom="1134" w:left="1134" w:header="708" w:footer="708" w:gutter="0"/>
           <w:cols w:space="720"/>
@@ -37267,7 +39402,7 @@
         <w:keepNext/>
         <w:keepLines/>
       </w:pPr>
-      <w:bookmarkStart w:id="22" w:name="_Toc242014157"/>
+      <w:bookmarkStart w:id="22" w:name="_Toc242014672"/>
       <w:r>
         <w:t>6. Quản lý rủi ro</w:t>
       </w:r>
@@ -41871,7 +44006,7 @@
     <w:p>
       <w:pPr>
         <w:sectPr>
-          <w:footerReference w:type="default" r:id="rId17"/>
+          <w:footerReference w:type="default" r:id="rId22"/>
           <w:pgSz w:w="16838" w:h="11906" w:orient="landscape"/>
           <w:pgMar w:top="1134" w:right="1134" w:bottom="1134" w:left="1134" w:header="708" w:footer="708" w:gutter="0"/>
           <w:cols w:space="720"/>
@@ -41885,7 +44020,7 @@
         <w:keepNext/>
         <w:keepLines/>
       </w:pPr>
-      <w:bookmarkStart w:id="23" w:name="_Toc242014158"/>
+      <w:bookmarkStart w:id="23" w:name="_Toc242014673"/>
       <w:r>
         <w:t>6.1 Ma trận xác suất – tác động</w:t>
       </w:r>
@@ -41919,7 +44054,7 @@
                     </pic:cNvPicPr>
                   </pic:nvPicPr>
                   <pic:blipFill>
-                    <a:blip r:embed="rId18"/>
+                    <a:blip r:embed="rId23"/>
                     <a:srcRect/>
                     <a:stretch>
                       <a:fillRect/>
@@ -41963,7 +44098,7 @@
         <w:keepNext/>
         <w:keepLines/>
       </w:pPr>
-      <w:bookmarkStart w:id="24" w:name="_Toc242014159"/>
+      <w:bookmarkStart w:id="24" w:name="_Toc242014674"/>
       <w:r>
         <w:t>6.2 Kế hoạch dự phòng cho rủi ro điểm cao nhất – R01</w:t>
       </w:r>
@@ -42531,7 +44666,7 @@
         <w:keepNext/>
         <w:keepLines/>
       </w:pPr>
-      <w:bookmarkStart w:id="25" w:name="_Toc242014160"/>
+      <w:bookmarkStart w:id="25" w:name="_Toc242014675"/>
       <w:r>
         <w:t>7. Phản biện đầu ra AI</w:t>
       </w:r>
@@ -43162,7 +45297,7 @@
         <w:keepNext/>
         <w:keepLines/>
       </w:pPr>
-      <w:bookmarkStart w:id="26" w:name="_Toc242014161"/>
+      <w:bookmarkStart w:id="26" w:name="_Toc242014676"/>
       <w:r>
         <w:t>7.1 Phản tư</w:t>
       </w:r>
@@ -43226,7 +45361,7 @@
         <w:keepNext/>
         <w:keepLines/>
       </w:pPr>
-      <w:bookmarkStart w:id="27" w:name="_Toc242014162"/>
+      <w:bookmarkStart w:id="27" w:name="_Toc242014677"/>
       <w:r>
         <w:t>8. Nhật ký sử dụng AI</w:t>
       </w:r>
@@ -43680,7 +45815,7 @@
               <w:rPr>
                 <w:sz w:val="18"/>
               </w:rPr>
-              <w:t>Claude Code: rà soát và viết lại mục tiêu SMART (1, 2, 4), đối chiếu phạm vi, chọn 3 câu hỏi ưu tiên, vẽ sơ đồ cây WBS, đề xuất phương án nén lịch và lập sheet NenLich; nhập TE của Claude Project vào cột S sheet PERT và soạn bảng so sánh 4.4</w:t>
+              <w:t>Claude Code: rà soát và viết lại mục tiêu SMART (1, 2, 4), đối chiếu phạm vi, chọn 3 câu hỏi ưu tiên, vẽ sơ đồ cây WBS, đề xuất phương án nén lịch và lập sheet NenLich; nhập TE của Claude Project vào Excel; soạn phần đối chiếu Bài 1, Bài 2 và bảng so sánh 4.4</w:t>
             </w:r>
           </w:p>
         </w:tc>
@@ -43860,12 +45995,9 @@
             </w:pPr>
             <w:r>
               <w:rPr>
-                <w:i/>
-                <w:iCs/>
-                <w:color w:val="7A5C00"/>
-                <w:highlight w:val="yellow"/>
-              </w:rPr>
-              <w:t>[NHÓM ĐIỀN: …]</w:t>
+                <w:sz w:val="18"/>
+              </w:rPr>
+              <w:t>Đủ 8 mục; tách lợi ích kinh doanh khỏi mục tiêu nghiệm thu; ghi rõ con số nào là đề xuất cần khách hàng xác nhận; hỏi thêm cách tính giá vốn (FIFO/bình quân).</w:t>
             </w:r>
           </w:p>
         </w:tc>
@@ -43891,12 +46023,9 @@
             </w:pPr>
             <w:r>
               <w:rPr>
-                <w:i/>
-                <w:iCs/>
-                <w:color w:val="7A5C00"/>
-                <w:highlight w:val="yellow"/>
-              </w:rPr>
-              <w:t>[NHÓM ĐIỀN: …]</w:t>
+                <w:sz w:val="18"/>
+              </w:rPr>
+              <w:t>Mục tiêu 1 của Claude thiếu thời hạn → bản nhóm ghi rõ 31/12/2026. Giữ FR09–FR10 trong phạm vi nhưng gắn với phương án nén lịch 4.5. Bổ sung Q10 về giá vốn.</w:t>
             </w:r>
           </w:p>
         </w:tc>
@@ -44014,12 +46143,9 @@
             </w:pPr>
             <w:r>
               <w:rPr>
-                <w:i/>
-                <w:iCs/>
-                <w:color w:val="7A5C00"/>
-                <w:highlight w:val="yellow"/>
-              </w:rPr>
-              <w:t>[NHÓM ĐIỀN: …]</w:t>
+                <w:sz w:val="18"/>
+              </w:rPr>
+              <w:t>Đúng 3 cấp, đủ 4 cột, đạt quy tắc 8/80; tự kiểm tra năng lực đội và phát hiện backend quá tải.</w:t>
             </w:r>
           </w:p>
         </w:tc>
@@ -44045,12 +46171,9 @@
             </w:pPr>
             <w:r>
               <w:rPr>
-                <w:i/>
-                <w:iCs/>
-                <w:color w:val="7A5C00"/>
-                <w:highlight w:val="yellow"/>
-              </w:rPr>
-              <w:t>[NHÓM ĐIỀN: …]</w:t>
+                <w:sz w:val="18"/>
+              </w:rPr>
+              <w:t>Không dùng WBS 1.912 giờ của Claude vì vượt ngân sách 250 triệu; giữ WBS 1.364 giờ của nhóm, giữ FR09–FR10 theo Charter.</w:t>
             </w:r>
           </w:p>
         </w:tc>
@@ -44672,7 +46795,7 @@
     </w:tbl>
     <w:p/>
     <w:sectPr>
-      <w:footerReference w:type="default" r:id="rId19"/>
+      <w:footerReference w:type="default" r:id="rId24"/>
       <w:pgSz w:w="11906" w:h="16838"/>
       <w:pgMar w:top="1134" w:right="1134" w:bottom="1134" w:left="1134" w:header="708" w:footer="708" w:gutter="0"/>
       <w:cols w:space="720"/>

</xml_diff>

<commit_message>
Báo cáo lab: chèn kết quả Claude Project Bài 4 (risk register, ma trận, câu hỏi) và đối chiếu
Co-Authored-By: Claude Opus 5.5 <noreply@anthropic.com>
</commit_message>
<xml_diff>
--- a/docs/lab/QLDA_Nhom_PharmaDash_Lab.docx
+++ b/docs/lab/QLDA_Nhom_PharmaDash_Lab.docx
@@ -998,7 +998,7 @@
           <w:r>
             <w:fldChar w:fldCharType="separate"/>
           </w:r>
-          <w:hyperlink w:anchor="_Toc242014650" w:history="1">
+          <w:hyperlink w:anchor="_Toc242015334" w:history="1">
             <w:r>
               <w:rPr>
                 <w:rStyle w:val="Hyperlink"/>
@@ -1022,7 +1022,7 @@
               <w:rPr>
                 <w:noProof/>
               </w:rPr>
-              <w:instrText xml:space="preserve"> PAGEREF _Toc242014650 \h </w:instrText>
+              <w:instrText xml:space="preserve"> PAGEREF _Toc242015334 \h </w:instrText>
             </w:r>
             <w:r>
               <w:rPr>
@@ -1064,7 +1064,7 @@
               <w14:ligatures w14:val="standardContextual"/>
             </w:rPr>
           </w:pPr>
-          <w:hyperlink w:anchor="_Toc242014651" w:history="1">
+          <w:hyperlink w:anchor="_Toc242015335" w:history="1">
             <w:r>
               <w:rPr>
                 <w:rStyle w:val="Hyperlink"/>
@@ -1088,7 +1088,7 @@
               <w:rPr>
                 <w:noProof/>
               </w:rPr>
-              <w:instrText xml:space="preserve"> PAGEREF _Toc242014651 \h </w:instrText>
+              <w:instrText xml:space="preserve"> PAGEREF _Toc242015335 \h </w:instrText>
             </w:r>
             <w:r>
               <w:rPr>
@@ -1130,7 +1130,7 @@
               <w14:ligatures w14:val="standardContextual"/>
             </w:rPr>
           </w:pPr>
-          <w:hyperlink w:anchor="_Toc242014652" w:history="1">
+          <w:hyperlink w:anchor="_Toc242015336" w:history="1">
             <w:r>
               <w:rPr>
                 <w:rStyle w:val="Hyperlink"/>
@@ -1154,7 +1154,7 @@
               <w:rPr>
                 <w:noProof/>
               </w:rPr>
-              <w:instrText xml:space="preserve"> PAGEREF _Toc242014652 \h </w:instrText>
+              <w:instrText xml:space="preserve"> PAGEREF _Toc242015336 \h </w:instrText>
             </w:r>
             <w:r>
               <w:rPr>
@@ -1196,7 +1196,7 @@
               <w14:ligatures w14:val="standardContextual"/>
             </w:rPr>
           </w:pPr>
-          <w:hyperlink w:anchor="_Toc242014653" w:history="1">
+          <w:hyperlink w:anchor="_Toc242015337" w:history="1">
             <w:r>
               <w:rPr>
                 <w:rStyle w:val="Hyperlink"/>
@@ -1220,7 +1220,7 @@
               <w:rPr>
                 <w:noProof/>
               </w:rPr>
-              <w:instrText xml:space="preserve"> PAGEREF _Toc242014653 \h </w:instrText>
+              <w:instrText xml:space="preserve"> PAGEREF _Toc242015337 \h </w:instrText>
             </w:r>
             <w:r>
               <w:rPr>
@@ -1262,7 +1262,7 @@
               <w14:ligatures w14:val="standardContextual"/>
             </w:rPr>
           </w:pPr>
-          <w:hyperlink w:anchor="_Toc242014654" w:history="1">
+          <w:hyperlink w:anchor="_Toc242015338" w:history="1">
             <w:r>
               <w:rPr>
                 <w:rStyle w:val="Hyperlink"/>
@@ -1286,7 +1286,7 @@
               <w:rPr>
                 <w:noProof/>
               </w:rPr>
-              <w:instrText xml:space="preserve"> PAGEREF _Toc242014654 \h </w:instrText>
+              <w:instrText xml:space="preserve"> PAGEREF _Toc242015338 \h </w:instrText>
             </w:r>
             <w:r>
               <w:rPr>
@@ -1328,7 +1328,7 @@
               <w14:ligatures w14:val="standardContextual"/>
             </w:rPr>
           </w:pPr>
-          <w:hyperlink w:anchor="_Toc242014655" w:history="1">
+          <w:hyperlink w:anchor="_Toc242015339" w:history="1">
             <w:r>
               <w:rPr>
                 <w:rStyle w:val="Hyperlink"/>
@@ -1352,7 +1352,7 @@
               <w:rPr>
                 <w:noProof/>
               </w:rPr>
-              <w:instrText xml:space="preserve"> PAGEREF _Toc242014655 \h </w:instrText>
+              <w:instrText xml:space="preserve"> PAGEREF _Toc242015339 \h </w:instrText>
             </w:r>
             <w:r>
               <w:rPr>
@@ -1394,7 +1394,7 @@
               <w14:ligatures w14:val="standardContextual"/>
             </w:rPr>
           </w:pPr>
-          <w:hyperlink w:anchor="_Toc242014656" w:history="1">
+          <w:hyperlink w:anchor="_Toc242015340" w:history="1">
             <w:r>
               <w:rPr>
                 <w:rStyle w:val="Hyperlink"/>
@@ -1418,7 +1418,7 @@
               <w:rPr>
                 <w:noProof/>
               </w:rPr>
-              <w:instrText xml:space="preserve"> PAGEREF _Toc242014656 \h </w:instrText>
+              <w:instrText xml:space="preserve"> PAGEREF _Toc242015340 \h </w:instrText>
             </w:r>
             <w:r>
               <w:rPr>
@@ -1460,7 +1460,7 @@
               <w14:ligatures w14:val="standardContextual"/>
             </w:rPr>
           </w:pPr>
-          <w:hyperlink w:anchor="_Toc242014657" w:history="1">
+          <w:hyperlink w:anchor="_Toc242015341" w:history="1">
             <w:r>
               <w:rPr>
                 <w:rStyle w:val="Hyperlink"/>
@@ -1484,7 +1484,7 @@
               <w:rPr>
                 <w:noProof/>
               </w:rPr>
-              <w:instrText xml:space="preserve"> PAGEREF _Toc242014657 \h </w:instrText>
+              <w:instrText xml:space="preserve"> PAGEREF _Toc242015341 \h </w:instrText>
             </w:r>
             <w:r>
               <w:rPr>
@@ -1526,7 +1526,7 @@
               <w14:ligatures w14:val="standardContextual"/>
             </w:rPr>
           </w:pPr>
-          <w:hyperlink w:anchor="_Toc242014658" w:history="1">
+          <w:hyperlink w:anchor="_Toc242015342" w:history="1">
             <w:r>
               <w:rPr>
                 <w:rStyle w:val="Hyperlink"/>
@@ -1550,7 +1550,7 @@
               <w:rPr>
                 <w:noProof/>
               </w:rPr>
-              <w:instrText xml:space="preserve"> PAGEREF _Toc242014658 \h </w:instrText>
+              <w:instrText xml:space="preserve"> PAGEREF _Toc242015342 \h </w:instrText>
             </w:r>
             <w:r>
               <w:rPr>
@@ -1592,7 +1592,7 @@
               <w14:ligatures w14:val="standardContextual"/>
             </w:rPr>
           </w:pPr>
-          <w:hyperlink w:anchor="_Toc242014659" w:history="1">
+          <w:hyperlink w:anchor="_Toc242015343" w:history="1">
             <w:r>
               <w:rPr>
                 <w:rStyle w:val="Hyperlink"/>
@@ -1616,7 +1616,7 @@
               <w:rPr>
                 <w:noProof/>
               </w:rPr>
-              <w:instrText xml:space="preserve"> PAGEREF _Toc242014659 \h </w:instrText>
+              <w:instrText xml:space="preserve"> PAGEREF _Toc242015343 \h </w:instrText>
             </w:r>
             <w:r>
               <w:rPr>
@@ -1658,7 +1658,7 @@
               <w14:ligatures w14:val="standardContextual"/>
             </w:rPr>
           </w:pPr>
-          <w:hyperlink w:anchor="_Toc242014660" w:history="1">
+          <w:hyperlink w:anchor="_Toc242015344" w:history="1">
             <w:r>
               <w:rPr>
                 <w:rStyle w:val="Hyperlink"/>
@@ -1682,7 +1682,7 @@
               <w:rPr>
                 <w:noProof/>
               </w:rPr>
-              <w:instrText xml:space="preserve"> PAGEREF _Toc242014660 \h </w:instrText>
+              <w:instrText xml:space="preserve"> PAGEREF _Toc242015344 \h </w:instrText>
             </w:r>
             <w:r>
               <w:rPr>
@@ -1724,7 +1724,7 @@
               <w14:ligatures w14:val="standardContextual"/>
             </w:rPr>
           </w:pPr>
-          <w:hyperlink w:anchor="_Toc242014661" w:history="1">
+          <w:hyperlink w:anchor="_Toc242015345" w:history="1">
             <w:r>
               <w:rPr>
                 <w:rStyle w:val="Hyperlink"/>
@@ -1748,7 +1748,7 @@
               <w:rPr>
                 <w:noProof/>
               </w:rPr>
-              <w:instrText xml:space="preserve"> PAGEREF _Toc242014661 \h </w:instrText>
+              <w:instrText xml:space="preserve"> PAGEREF _Toc242015345 \h </w:instrText>
             </w:r>
             <w:r>
               <w:rPr>
@@ -1790,7 +1790,7 @@
               <w14:ligatures w14:val="standardContextual"/>
             </w:rPr>
           </w:pPr>
-          <w:hyperlink w:anchor="_Toc242014662" w:history="1">
+          <w:hyperlink w:anchor="_Toc242015346" w:history="1">
             <w:r>
               <w:rPr>
                 <w:rStyle w:val="Hyperlink"/>
@@ -1814,7 +1814,7 @@
               <w:rPr>
                 <w:noProof/>
               </w:rPr>
-              <w:instrText xml:space="preserve"> PAGEREF _Toc242014662 \h </w:instrText>
+              <w:instrText xml:space="preserve"> PAGEREF _Toc242015346 \h </w:instrText>
             </w:r>
             <w:r>
               <w:rPr>
@@ -1856,7 +1856,7 @@
               <w14:ligatures w14:val="standardContextual"/>
             </w:rPr>
           </w:pPr>
-          <w:hyperlink w:anchor="_Toc242014663" w:history="1">
+          <w:hyperlink w:anchor="_Toc242015347" w:history="1">
             <w:r>
               <w:rPr>
                 <w:rStyle w:val="Hyperlink"/>
@@ -1880,7 +1880,7 @@
               <w:rPr>
                 <w:noProof/>
               </w:rPr>
-              <w:instrText xml:space="preserve"> PAGEREF _Toc242014663 \h </w:instrText>
+              <w:instrText xml:space="preserve"> PAGEREF _Toc242015347 \h </w:instrText>
             </w:r>
             <w:r>
               <w:rPr>
@@ -1922,7 +1922,7 @@
               <w14:ligatures w14:val="standardContextual"/>
             </w:rPr>
           </w:pPr>
-          <w:hyperlink w:anchor="_Toc242014664" w:history="1">
+          <w:hyperlink w:anchor="_Toc242015348" w:history="1">
             <w:r>
               <w:rPr>
                 <w:rStyle w:val="Hyperlink"/>
@@ -1946,7 +1946,7 @@
               <w:rPr>
                 <w:noProof/>
               </w:rPr>
-              <w:instrText xml:space="preserve"> PAGEREF _Toc242014664 \h </w:instrText>
+              <w:instrText xml:space="preserve"> PAGEREF _Toc242015348 \h </w:instrText>
             </w:r>
             <w:r>
               <w:rPr>
@@ -1988,7 +1988,7 @@
               <w14:ligatures w14:val="standardContextual"/>
             </w:rPr>
           </w:pPr>
-          <w:hyperlink w:anchor="_Toc242014665" w:history="1">
+          <w:hyperlink w:anchor="_Toc242015349" w:history="1">
             <w:r>
               <w:rPr>
                 <w:rStyle w:val="Hyperlink"/>
@@ -2012,7 +2012,7 @@
               <w:rPr>
                 <w:noProof/>
               </w:rPr>
-              <w:instrText xml:space="preserve"> PAGEREF _Toc242014665 \h </w:instrText>
+              <w:instrText xml:space="preserve"> PAGEREF _Toc242015349 \h </w:instrText>
             </w:r>
             <w:r>
               <w:rPr>
@@ -2054,7 +2054,7 @@
               <w14:ligatures w14:val="standardContextual"/>
             </w:rPr>
           </w:pPr>
-          <w:hyperlink w:anchor="_Toc242014666" w:history="1">
+          <w:hyperlink w:anchor="_Toc242015350" w:history="1">
             <w:r>
               <w:rPr>
                 <w:rStyle w:val="Hyperlink"/>
@@ -2078,7 +2078,7 @@
               <w:rPr>
                 <w:noProof/>
               </w:rPr>
-              <w:instrText xml:space="preserve"> PAGEREF _Toc242014666 \h </w:instrText>
+              <w:instrText xml:space="preserve"> PAGEREF _Toc242015350 \h </w:instrText>
             </w:r>
             <w:r>
               <w:rPr>
@@ -2120,7 +2120,7 @@
               <w14:ligatures w14:val="standardContextual"/>
             </w:rPr>
           </w:pPr>
-          <w:hyperlink w:anchor="_Toc242014667" w:history="1">
+          <w:hyperlink w:anchor="_Toc242015351" w:history="1">
             <w:r>
               <w:rPr>
                 <w:rStyle w:val="Hyperlink"/>
@@ -2144,7 +2144,7 @@
               <w:rPr>
                 <w:noProof/>
               </w:rPr>
-              <w:instrText xml:space="preserve"> PAGEREF _Toc242014667 \h </w:instrText>
+              <w:instrText xml:space="preserve"> PAGEREF _Toc242015351 \h </w:instrText>
             </w:r>
             <w:r>
               <w:rPr>
@@ -2186,7 +2186,7 @@
               <w14:ligatures w14:val="standardContextual"/>
             </w:rPr>
           </w:pPr>
-          <w:hyperlink w:anchor="_Toc242014668" w:history="1">
+          <w:hyperlink w:anchor="_Toc242015352" w:history="1">
             <w:r>
               <w:rPr>
                 <w:rStyle w:val="Hyperlink"/>
@@ -2210,7 +2210,7 @@
               <w:rPr>
                 <w:noProof/>
               </w:rPr>
-              <w:instrText xml:space="preserve"> PAGEREF _Toc242014668 \h </w:instrText>
+              <w:instrText xml:space="preserve"> PAGEREF _Toc242015352 \h </w:instrText>
             </w:r>
             <w:r>
               <w:rPr>
@@ -2252,7 +2252,7 @@
               <w14:ligatures w14:val="standardContextual"/>
             </w:rPr>
           </w:pPr>
-          <w:hyperlink w:anchor="_Toc242014669" w:history="1">
+          <w:hyperlink w:anchor="_Toc242015353" w:history="1">
             <w:r>
               <w:rPr>
                 <w:rStyle w:val="Hyperlink"/>
@@ -2276,7 +2276,7 @@
               <w:rPr>
                 <w:noProof/>
               </w:rPr>
-              <w:instrText xml:space="preserve"> PAGEREF _Toc242014669 \h </w:instrText>
+              <w:instrText xml:space="preserve"> PAGEREF _Toc242015353 \h </w:instrText>
             </w:r>
             <w:r>
               <w:rPr>
@@ -2318,7 +2318,7 @@
               <w14:ligatures w14:val="standardContextual"/>
             </w:rPr>
           </w:pPr>
-          <w:hyperlink w:anchor="_Toc242014670" w:history="1">
+          <w:hyperlink w:anchor="_Toc242015354" w:history="1">
             <w:r>
               <w:rPr>
                 <w:rStyle w:val="Hyperlink"/>
@@ -2342,7 +2342,7 @@
               <w:rPr>
                 <w:noProof/>
               </w:rPr>
-              <w:instrText xml:space="preserve"> PAGEREF _Toc242014670 \h </w:instrText>
+              <w:instrText xml:space="preserve"> PAGEREF _Toc242015354 \h </w:instrText>
             </w:r>
             <w:r>
               <w:rPr>
@@ -2384,7 +2384,7 @@
               <w14:ligatures w14:val="standardContextual"/>
             </w:rPr>
           </w:pPr>
-          <w:hyperlink w:anchor="_Toc242014671" w:history="1">
+          <w:hyperlink w:anchor="_Toc242015355" w:history="1">
             <w:r>
               <w:rPr>
                 <w:rStyle w:val="Hyperlink"/>
@@ -2408,7 +2408,7 @@
               <w:rPr>
                 <w:noProof/>
               </w:rPr>
-              <w:instrText xml:space="preserve"> PAGEREF _Toc242014671 \h </w:instrText>
+              <w:instrText xml:space="preserve"> PAGEREF _Toc242015355 \h </w:instrText>
             </w:r>
             <w:r>
               <w:rPr>
@@ -2450,7 +2450,7 @@
               <w14:ligatures w14:val="standardContextual"/>
             </w:rPr>
           </w:pPr>
-          <w:hyperlink w:anchor="_Toc242014672" w:history="1">
+          <w:hyperlink w:anchor="_Toc242015356" w:history="1">
             <w:r>
               <w:rPr>
                 <w:rStyle w:val="Hyperlink"/>
@@ -2474,7 +2474,7 @@
               <w:rPr>
                 <w:noProof/>
               </w:rPr>
-              <w:instrText xml:space="preserve"> PAGEREF _Toc242014672 \h </w:instrText>
+              <w:instrText xml:space="preserve"> PAGEREF _Toc242015356 \h </w:instrText>
             </w:r>
             <w:r>
               <w:rPr>
@@ -2516,7 +2516,7 @@
               <w14:ligatures w14:val="standardContextual"/>
             </w:rPr>
           </w:pPr>
-          <w:hyperlink w:anchor="_Toc242014673" w:history="1">
+          <w:hyperlink w:anchor="_Toc242015357" w:history="1">
             <w:r>
               <w:rPr>
                 <w:rStyle w:val="Hyperlink"/>
@@ -2540,7 +2540,7 @@
               <w:rPr>
                 <w:noProof/>
               </w:rPr>
-              <w:instrText xml:space="preserve"> PAGEREF _Toc242014673 \h </w:instrText>
+              <w:instrText xml:space="preserve"> PAGEREF _Toc242015357 \h </w:instrText>
             </w:r>
             <w:r>
               <w:rPr>
@@ -2557,7 +2557,7 @@
               <w:rPr>
                 <w:noProof/>
               </w:rPr>
-              <w:t>25</w:t>
+              <w:t>28</w:t>
             </w:r>
             <w:r>
               <w:rPr>
@@ -2582,7 +2582,7 @@
               <w14:ligatures w14:val="standardContextual"/>
             </w:rPr>
           </w:pPr>
-          <w:hyperlink w:anchor="_Toc242014674" w:history="1">
+          <w:hyperlink w:anchor="_Toc242015358" w:history="1">
             <w:r>
               <w:rPr>
                 <w:rStyle w:val="Hyperlink"/>
@@ -2606,7 +2606,7 @@
               <w:rPr>
                 <w:noProof/>
               </w:rPr>
-              <w:instrText xml:space="preserve"> PAGEREF _Toc242014674 \h </w:instrText>
+              <w:instrText xml:space="preserve"> PAGEREF _Toc242015358 \h </w:instrText>
             </w:r>
             <w:r>
               <w:rPr>
@@ -2623,7 +2623,7 @@
               <w:rPr>
                 <w:noProof/>
               </w:rPr>
-              <w:t>25</w:t>
+              <w:t>28</w:t>
             </w:r>
             <w:r>
               <w:rPr>
@@ -2648,7 +2648,7 @@
               <w14:ligatures w14:val="standardContextual"/>
             </w:rPr>
           </w:pPr>
-          <w:hyperlink w:anchor="_Toc242014675" w:history="1">
+          <w:hyperlink w:anchor="_Toc242015359" w:history="1">
             <w:r>
               <w:rPr>
                 <w:rStyle w:val="Hyperlink"/>
@@ -2672,7 +2672,7 @@
               <w:rPr>
                 <w:noProof/>
               </w:rPr>
-              <w:instrText xml:space="preserve"> PAGEREF _Toc242014675 \h </w:instrText>
+              <w:instrText xml:space="preserve"> PAGEREF _Toc242015359 \h </w:instrText>
             </w:r>
             <w:r>
               <w:rPr>
@@ -2689,7 +2689,7 @@
               <w:rPr>
                 <w:noProof/>
               </w:rPr>
-              <w:t>26</w:t>
+              <w:t>29</w:t>
             </w:r>
             <w:r>
               <w:rPr>
@@ -2714,7 +2714,7 @@
               <w14:ligatures w14:val="standardContextual"/>
             </w:rPr>
           </w:pPr>
-          <w:hyperlink w:anchor="_Toc242014676" w:history="1">
+          <w:hyperlink w:anchor="_Toc242015360" w:history="1">
             <w:r>
               <w:rPr>
                 <w:rStyle w:val="Hyperlink"/>
@@ -2738,7 +2738,7 @@
               <w:rPr>
                 <w:noProof/>
               </w:rPr>
-              <w:instrText xml:space="preserve"> PAGEREF _Toc242014676 \h </w:instrText>
+              <w:instrText xml:space="preserve"> PAGEREF _Toc242015360 \h </w:instrText>
             </w:r>
             <w:r>
               <w:rPr>
@@ -2755,7 +2755,7 @@
               <w:rPr>
                 <w:noProof/>
               </w:rPr>
-              <w:t>26</w:t>
+              <w:t>29</w:t>
             </w:r>
             <w:r>
               <w:rPr>
@@ -2780,7 +2780,7 @@
               <w14:ligatures w14:val="standardContextual"/>
             </w:rPr>
           </w:pPr>
-          <w:hyperlink w:anchor="_Toc242014677" w:history="1">
+          <w:hyperlink w:anchor="_Toc242015361" w:history="1">
             <w:r>
               <w:rPr>
                 <w:rStyle w:val="Hyperlink"/>
@@ -2804,7 +2804,7 @@
               <w:rPr>
                 <w:noProof/>
               </w:rPr>
-              <w:instrText xml:space="preserve"> PAGEREF _Toc242014677 \h </w:instrText>
+              <w:instrText xml:space="preserve"> PAGEREF _Toc242015361 \h </w:instrText>
             </w:r>
             <w:r>
               <w:rPr>
@@ -2821,7 +2821,7 @@
               <w:rPr>
                 <w:noProof/>
               </w:rPr>
-              <w:t>26</w:t>
+              <w:t>29</w:t>
             </w:r>
             <w:r>
               <w:rPr>
@@ -2864,7 +2864,7 @@
         <w:keepNext/>
         <w:keepLines/>
       </w:pPr>
-      <w:bookmarkStart w:id="0" w:name="_Toc242014650"/>
+      <w:bookmarkStart w:id="0" w:name="_Toc242015334"/>
       <w:r>
         <w:lastRenderedPageBreak/>
         <w:t>1. Thiết lập Claude Project</w:t>
@@ -3683,7 +3683,7 @@
         <w:keepNext/>
         <w:keepLines/>
       </w:pPr>
-      <w:bookmarkStart w:id="1" w:name="_Toc242014651"/>
+      <w:bookmarkStart w:id="1" w:name="_Toc242015335"/>
       <w:r>
         <w:t>2. Project Charter (Tuyên bố dự án)</w:t>
       </w:r>
@@ -4169,7 +4169,7 @@
         <w:keepNext/>
         <w:keepLines/>
       </w:pPr>
-      <w:bookmarkStart w:id="2" w:name="_Toc242014652"/>
+      <w:bookmarkStart w:id="2" w:name="_Toc242015336"/>
       <w:r>
         <w:t>2.1 Mục tiêu SMART</w:t>
       </w:r>
@@ -5194,7 +5194,7 @@
         <w:keepNext/>
         <w:keepLines/>
       </w:pPr>
-      <w:bookmarkStart w:id="3" w:name="_Toc242014653"/>
+      <w:bookmarkStart w:id="3" w:name="_Toc242015337"/>
       <w:r>
         <w:t>2.2 Phạm vi</w:t>
       </w:r>
@@ -5604,7 +5604,7 @@
         <w:keepNext/>
         <w:keepLines/>
       </w:pPr>
-      <w:bookmarkStart w:id="4" w:name="_Toc242014654"/>
+      <w:bookmarkStart w:id="4" w:name="_Toc242015338"/>
       <w:r>
         <w:t>2.3 Sản phẩm bàn giao chính</w:t>
       </w:r>
@@ -5668,7 +5668,7 @@
         <w:keepNext/>
         <w:keepLines/>
       </w:pPr>
-      <w:bookmarkStart w:id="5" w:name="_Toc242014655"/>
+      <w:bookmarkStart w:id="5" w:name="_Toc242015339"/>
       <w:r>
         <w:t>2.4 Các bên liên quan</w:t>
       </w:r>
@@ -6455,7 +6455,7 @@
         <w:keepNext/>
         <w:keepLines/>
       </w:pPr>
-      <w:bookmarkStart w:id="6" w:name="_Toc242014656"/>
+      <w:bookmarkStart w:id="6" w:name="_Toc242015340"/>
       <w:r>
         <w:t>2.5 Mốc thời gian chính (mục tiêu)</w:t>
       </w:r>
@@ -7501,7 +7501,7 @@
         <w:keepNext/>
         <w:keepLines/>
       </w:pPr>
-      <w:bookmarkStart w:id="7" w:name="_Toc242014657"/>
+      <w:bookmarkStart w:id="7" w:name="_Toc242015341"/>
       <w:r>
         <w:t>2.6 Giả định và ràng buộc</w:t>
       </w:r>
@@ -7768,7 +7768,7 @@
         <w:keepNext/>
         <w:keepLines/>
       </w:pPr>
-      <w:bookmarkStart w:id="8" w:name="_Toc242014658"/>
+      <w:bookmarkStart w:id="8" w:name="_Toc242015342"/>
       <w:r>
         <w:t>2.7 Rủi ro cấp cao</w:t>
       </w:r>
@@ -7832,7 +7832,7 @@
         <w:keepNext/>
         <w:keepLines/>
       </w:pPr>
-      <w:bookmarkStart w:id="9" w:name="_Toc242014659"/>
+      <w:bookmarkStart w:id="9" w:name="_Toc242015343"/>
       <w:r>
         <w:t>2.8 Tiêu chí thành công và nghiệm thu</w:t>
       </w:r>
@@ -7909,7 +7909,7 @@
         <w:keepNext/>
         <w:keepLines/>
       </w:pPr>
-      <w:bookmarkStart w:id="10" w:name="_Toc242014660"/>
+      <w:bookmarkStart w:id="10" w:name="_Toc242015344"/>
       <w:r>
         <w:t>2.9 Thông tin còn thiếu – câu hỏi làm rõ với khách hàng</w:t>
       </w:r>
@@ -9267,31 +9267,7 @@
         <w:keepNext/>
       </w:pPr>
       <w:r>
-        <w:t>2.10 K</w:t>
-      </w:r>
-      <w:r>
-        <w:t>ế</w:t>
-      </w:r>
-      <w:r>
-        <w:t>t qu</w:t>
-      </w:r>
-      <w:r>
-        <w:t>ả</w:t>
-      </w:r>
-      <w:r>
-        <w:t xml:space="preserve"> Claude Project (Bài 1) và đ</w:t>
-      </w:r>
-      <w:r>
-        <w:t>ố</w:t>
-      </w:r>
-      <w:r>
-        <w:t>i chi</w:t>
-      </w:r>
-      <w:r>
-        <w:t>ế</w:t>
-      </w:r>
-      <w:r>
-        <w:t>u</w:t>
+        <w:t>2.10 Kết quả Claude Project (Bài 1) và đối chiếu</w:t>
       </w:r>
     </w:p>
     <w:p>
@@ -9299,19 +9275,7 @@
         <w:spacing w:after="60"/>
       </w:pPr>
       <w:r>
-        <w:t>Charter do Claude so</w:t>
-      </w:r>
-      <w:r>
-        <w:t>ạ</w:t>
-      </w:r>
-      <w:r>
-        <w:t>n trong chat Bài 1 (tài li</w:t>
-      </w:r>
-      <w:r>
-        <w:t>ệ</w:t>
-      </w:r>
-      <w:r>
-        <w:t>u "Project Charter PharmaDash" trong Claude Project):</w:t>
+        <w:t>Charter do Claude soạn trong chat Bài 1 (tài liệu "Project Charter PharmaDash" trong Claude Project):</w:t>
       </w:r>
     </w:p>
     <w:p>
@@ -9370,55 +9334,7 @@
           <w:color w:val="595959"/>
           <w:sz w:val="18"/>
         </w:rPr>
-        <w:t>Hình 2.1 – Project Charter do Claude Project so</w:t>
-      </w:r>
-      <w:r>
-        <w:rPr>
-          <w:i/>
-          <w:color w:val="595959"/>
-          <w:sz w:val="18"/>
-        </w:rPr>
-        <w:t>ạ</w:t>
-      </w:r>
-      <w:r>
-        <w:rPr>
-          <w:i/>
-          <w:color w:val="595959"/>
-          <w:sz w:val="18"/>
-        </w:rPr>
-        <w:t>n: m</w:t>
-      </w:r>
-      <w:r>
-        <w:rPr>
-          <w:i/>
-          <w:color w:val="595959"/>
-          <w:sz w:val="18"/>
-        </w:rPr>
-        <w:t>ụ</w:t>
-      </w:r>
-      <w:r>
-        <w:rPr>
-          <w:i/>
-          <w:color w:val="595959"/>
-          <w:sz w:val="18"/>
-        </w:rPr>
-        <w:t>c đích d</w:t>
-      </w:r>
-      <w:r>
-        <w:rPr>
-          <w:i/>
-          <w:color w:val="595959"/>
-          <w:sz w:val="18"/>
-        </w:rPr>
-        <w:t>ự</w:t>
-      </w:r>
-      <w:r>
-        <w:rPr>
-          <w:i/>
-          <w:color w:val="595959"/>
-          <w:sz w:val="18"/>
-        </w:rPr>
-        <w:t xml:space="preserve"> án</w:t>
+        <w:t>Hình 2.1 – Project Charter do Claude Project soạn: mục đích dự án</w:t>
       </w:r>
     </w:p>
     <w:p>
@@ -9477,39 +9393,7 @@
           <w:color w:val="595959"/>
           <w:sz w:val="18"/>
         </w:rPr>
-        <w:t>Hình 2.2 – M</w:t>
-      </w:r>
-      <w:r>
-        <w:rPr>
-          <w:i/>
-          <w:color w:val="595959"/>
-          <w:sz w:val="18"/>
-        </w:rPr>
-        <w:t>ụ</w:t>
-      </w:r>
-      <w:r>
-        <w:rPr>
-          <w:i/>
-          <w:color w:val="595959"/>
-          <w:sz w:val="18"/>
-        </w:rPr>
-        <w:t>c tiêu SMART trong Charter c</w:t>
-      </w:r>
-      <w:r>
-        <w:rPr>
-          <w:i/>
-          <w:color w:val="595959"/>
-          <w:sz w:val="18"/>
-        </w:rPr>
-        <w:t>ủ</w:t>
-      </w:r>
-      <w:r>
-        <w:rPr>
-          <w:i/>
-          <w:color w:val="595959"/>
-          <w:sz w:val="18"/>
-        </w:rPr>
-        <w:t>a Claude</w:t>
+        <w:t>Hình 2.2 – Mục tiêu SMART trong Charter của Claude</w:t>
       </w:r>
     </w:p>
     <w:p>
@@ -9568,39 +9452,7 @@
           <w:color w:val="595959"/>
           <w:sz w:val="18"/>
         </w:rPr>
-        <w:t>Hình 2.3 – Ph</w:t>
-      </w:r>
-      <w:r>
-        <w:rPr>
-          <w:i/>
-          <w:color w:val="595959"/>
-          <w:sz w:val="18"/>
-        </w:rPr>
-        <w:t>ạ</w:t>
-      </w:r>
-      <w:r>
-        <w:rPr>
-          <w:i/>
-          <w:color w:val="595959"/>
-          <w:sz w:val="18"/>
-        </w:rPr>
-        <w:t>m vi trong Charter c</w:t>
-      </w:r>
-      <w:r>
-        <w:rPr>
-          <w:i/>
-          <w:color w:val="595959"/>
-          <w:sz w:val="18"/>
-        </w:rPr>
-        <w:t>ủ</w:t>
-      </w:r>
-      <w:r>
-        <w:rPr>
-          <w:i/>
-          <w:color w:val="595959"/>
-          <w:sz w:val="18"/>
-        </w:rPr>
-        <w:t>a Claude</w:t>
+        <w:t>Hình 2.3 – Phạm vi trong Charter của Claude</w:t>
       </w:r>
     </w:p>
     <w:p>
@@ -9608,37 +9460,7 @@
         <w:spacing w:after="60"/>
       </w:pPr>
       <w:r>
-        <w:t>Đ</w:t>
-      </w:r>
-      <w:r>
-        <w:t>ố</w:t>
-      </w:r>
-      <w:r>
-        <w:t>i chi</w:t>
-      </w:r>
-      <w:r>
-        <w:t>ế</w:t>
-      </w:r>
-      <w:r>
-        <w:t>u v</w:t>
-      </w:r>
-      <w:r>
-        <w:t>ớ</w:t>
-      </w:r>
-      <w:r>
-        <w:t>i Charter c</w:t>
-      </w:r>
-      <w:r>
-        <w:t>ủ</w:t>
-      </w:r>
-      <w:r>
-        <w:t>a nhóm (m</w:t>
-      </w:r>
-      <w:r>
-        <w:t>ụ</w:t>
-      </w:r>
-      <w:r>
-        <w:t>c 2.1–2.9):</w:t>
+        <w:t>Đối chiếu với Charter của nhóm (mục 2.1–2.9):</w:t>
       </w:r>
     </w:p>
     <w:p>
@@ -9650,163 +9472,7 @@
         <w:rPr>
           <w:sz w:val="20"/>
         </w:rPr>
-        <w:t>• Gi</w:t>
-      </w:r>
-      <w:r>
-        <w:rPr>
-          <w:sz w:val="20"/>
-        </w:rPr>
-        <w:t>ố</w:t>
-      </w:r>
-      <w:r>
-        <w:rPr>
-          <w:sz w:val="20"/>
-        </w:rPr>
-        <w:t>ng nhau: Claude cũng tách "gi</w:t>
-      </w:r>
-      <w:r>
-        <w:rPr>
-          <w:sz w:val="20"/>
-        </w:rPr>
-        <w:t>ả</w:t>
-      </w:r>
-      <w:r>
-        <w:rPr>
-          <w:sz w:val="20"/>
-        </w:rPr>
-        <w:t>m thu</w:t>
-      </w:r>
-      <w:r>
-        <w:rPr>
-          <w:sz w:val="20"/>
-        </w:rPr>
-        <w:t>ố</w:t>
-      </w:r>
-      <w:r>
-        <w:rPr>
-          <w:sz w:val="20"/>
-        </w:rPr>
-        <w:t>c h</w:t>
-      </w:r>
-      <w:r>
-        <w:rPr>
-          <w:sz w:val="20"/>
-        </w:rPr>
-        <w:t>ủ</w:t>
-      </w:r>
-      <w:r>
-        <w:rPr>
-          <w:sz w:val="20"/>
-        </w:rPr>
-        <w:t>y" và "rút ng</w:t>
-      </w:r>
-      <w:r>
-        <w:rPr>
-          <w:sz w:val="20"/>
-        </w:rPr>
-        <w:t>ắ</w:t>
-      </w:r>
-      <w:r>
-        <w:rPr>
-          <w:sz w:val="20"/>
-        </w:rPr>
-        <w:t>n l</w:t>
-      </w:r>
-      <w:r>
-        <w:rPr>
-          <w:sz w:val="20"/>
-        </w:rPr>
-        <w:t>ậ</w:t>
-      </w:r>
-      <w:r>
-        <w:rPr>
-          <w:sz w:val="20"/>
-        </w:rPr>
-        <w:t>p báo cáo" thành l</w:t>
-      </w:r>
-      <w:r>
-        <w:rPr>
-          <w:sz w:val="20"/>
-        </w:rPr>
-        <w:t>ợ</w:t>
-      </w:r>
-      <w:r>
-        <w:rPr>
-          <w:sz w:val="20"/>
-        </w:rPr>
-        <w:t>i ích kinh doanh, không dùng đ</w:t>
-      </w:r>
-      <w:r>
-        <w:rPr>
-          <w:sz w:val="20"/>
-        </w:rPr>
-        <w:t>ể</w:t>
-      </w:r>
-      <w:r>
-        <w:rPr>
-          <w:sz w:val="20"/>
-        </w:rPr>
-        <w:t xml:space="preserve"> nghi</w:t>
-      </w:r>
-      <w:r>
-        <w:rPr>
-          <w:sz w:val="20"/>
-        </w:rPr>
-        <w:t>ệ</w:t>
-      </w:r>
-      <w:r>
-        <w:rPr>
-          <w:sz w:val="20"/>
-        </w:rPr>
-        <w:t>m thu – trùng v</w:t>
-      </w:r>
-      <w:r>
-        <w:rPr>
-          <w:sz w:val="20"/>
-        </w:rPr>
-        <w:t>ớ</w:t>
-      </w:r>
-      <w:r>
-        <w:rPr>
-          <w:sz w:val="20"/>
-        </w:rPr>
-        <w:t>i cách nhóm vi</w:t>
-      </w:r>
-      <w:r>
-        <w:rPr>
-          <w:sz w:val="20"/>
-        </w:rPr>
-        <w:t>ế</w:t>
-      </w:r>
-      <w:r>
-        <w:rPr>
-          <w:sz w:val="20"/>
-        </w:rPr>
-        <w:t>t l</w:t>
-      </w:r>
-      <w:r>
-        <w:rPr>
-          <w:sz w:val="20"/>
-        </w:rPr>
-        <w:t>ạ</w:t>
-      </w:r>
-      <w:r>
-        <w:rPr>
-          <w:sz w:val="20"/>
-        </w:rPr>
-        <w:t>i m</w:t>
-      </w:r>
-      <w:r>
-        <w:rPr>
-          <w:sz w:val="20"/>
-        </w:rPr>
-        <w:t>ụ</w:t>
-      </w:r>
-      <w:r>
-        <w:rPr>
-          <w:sz w:val="20"/>
-        </w:rPr>
-        <w:t>c tiêu 2.</w:t>
+        <w:t>• Giống nhau: Claude cũng tách "giảm thuốc hủy" và "rút ngắn lập báo cáo" thành lợi ích kinh doanh, không dùng để nghiệm thu – trùng với cách nhóm viết lại mục tiêu 2.</w:t>
       </w:r>
     </w:p>
     <w:p>
@@ -9818,151 +9484,7 @@
         <w:rPr>
           <w:sz w:val="20"/>
         </w:rPr>
-        <w:t>• M</w:t>
-      </w:r>
-      <w:r>
-        <w:rPr>
-          <w:sz w:val="20"/>
-        </w:rPr>
-        <w:t>ụ</w:t>
-      </w:r>
-      <w:r>
-        <w:rPr>
-          <w:sz w:val="20"/>
-        </w:rPr>
-        <w:t>c tiêu 1 c</w:t>
-      </w:r>
-      <w:r>
-        <w:rPr>
-          <w:sz w:val="20"/>
-        </w:rPr>
-        <w:t>ủ</w:t>
-      </w:r>
-      <w:r>
-        <w:rPr>
-          <w:sz w:val="20"/>
-        </w:rPr>
-        <w:t>a Claude chưa có th</w:t>
-      </w:r>
-      <w:r>
-        <w:rPr>
-          <w:sz w:val="20"/>
-        </w:rPr>
-        <w:t>ờ</w:t>
-      </w:r>
-      <w:r>
-        <w:rPr>
-          <w:sz w:val="20"/>
-        </w:rPr>
-        <w:t>i h</w:t>
-      </w:r>
-      <w:r>
-        <w:rPr>
-          <w:sz w:val="20"/>
-        </w:rPr>
-        <w:t>ạ</w:t>
-      </w:r>
-      <w:r>
-        <w:rPr>
-          <w:sz w:val="20"/>
-        </w:rPr>
-        <w:t>n (ch</w:t>
-      </w:r>
-      <w:r>
-        <w:rPr>
-          <w:sz w:val="20"/>
-        </w:rPr>
-        <w:t>ỉ</w:t>
-      </w:r>
-      <w:r>
-        <w:rPr>
-          <w:sz w:val="20"/>
-        </w:rPr>
-        <w:t xml:space="preserve"> ghi "go-live", không ghi 31/12/2026) nên chưa đ</w:t>
-      </w:r>
-      <w:r>
-        <w:rPr>
-          <w:sz w:val="20"/>
-        </w:rPr>
-        <w:t>ạ</w:t>
-      </w:r>
-      <w:r>
-        <w:rPr>
-          <w:sz w:val="20"/>
-        </w:rPr>
-        <w:t>t ch</w:t>
-      </w:r>
-      <w:r>
-        <w:rPr>
-          <w:sz w:val="20"/>
-        </w:rPr>
-        <w:t>ữ</w:t>
-      </w:r>
-      <w:r>
-        <w:rPr>
-          <w:sz w:val="20"/>
-        </w:rPr>
-        <w:t xml:space="preserve"> T trong SMART; b</w:t>
-      </w:r>
-      <w:r>
-        <w:rPr>
-          <w:sz w:val="20"/>
-        </w:rPr>
-        <w:t>ả</w:t>
-      </w:r>
-      <w:r>
-        <w:rPr>
-          <w:sz w:val="20"/>
-        </w:rPr>
-        <w:t>n c</w:t>
-      </w:r>
-      <w:r>
-        <w:rPr>
-          <w:sz w:val="20"/>
-        </w:rPr>
-        <w:t>ủ</w:t>
-      </w:r>
-      <w:r>
-        <w:rPr>
-          <w:sz w:val="20"/>
-        </w:rPr>
-        <w:t>a nhóm có h</w:t>
-      </w:r>
-      <w:r>
-        <w:rPr>
-          <w:sz w:val="20"/>
-        </w:rPr>
-        <w:t>ạ</w:t>
-      </w:r>
-      <w:r>
-        <w:rPr>
-          <w:sz w:val="20"/>
-        </w:rPr>
-        <w:t>n chót c</w:t>
-      </w:r>
-      <w:r>
-        <w:rPr>
-          <w:sz w:val="20"/>
-        </w:rPr>
-        <w:t>ụ</w:t>
-      </w:r>
-      <w:r>
-        <w:rPr>
-          <w:sz w:val="20"/>
-        </w:rPr>
-        <w:t xml:space="preserve"> th</w:t>
-      </w:r>
-      <w:r>
-        <w:rPr>
-          <w:sz w:val="20"/>
-        </w:rPr>
-        <w:t>ể</w:t>
-      </w:r>
-      <w:r>
-        <w:rPr>
-          <w:sz w:val="20"/>
-        </w:rPr>
-        <w:t>.</w:t>
+        <w:t>• Mục tiêu 1 của Claude chưa có thời hạn (chỉ ghi "go-live", không ghi 31/12/2026) nên chưa đạt chữ T trong SMART; bản của nhóm có hạn chót cụ thể.</w:t>
       </w:r>
     </w:p>
     <w:p>
@@ -9974,175 +9496,7 @@
         <w:rPr>
           <w:sz w:val="20"/>
         </w:rPr>
-        <w:t>• Ph</w:t>
-      </w:r>
-      <w:r>
-        <w:rPr>
-          <w:sz w:val="20"/>
-        </w:rPr>
-        <w:t>ạ</w:t>
-      </w:r>
-      <w:r>
-        <w:rPr>
-          <w:sz w:val="20"/>
-        </w:rPr>
-        <w:t>m vi: Claude x</w:t>
-      </w:r>
-      <w:r>
-        <w:rPr>
-          <w:sz w:val="20"/>
-        </w:rPr>
-        <w:t>ế</w:t>
-      </w:r>
-      <w:r>
-        <w:rPr>
-          <w:sz w:val="20"/>
-        </w:rPr>
-        <w:t>p FR09–FR11 ra ngoài ph</w:t>
-      </w:r>
-      <w:r>
-        <w:rPr>
-          <w:sz w:val="20"/>
-        </w:rPr>
-        <w:t>ạ</w:t>
-      </w:r>
-      <w:r>
-        <w:rPr>
-          <w:sz w:val="20"/>
-        </w:rPr>
-        <w:t>m vi cam k</w:t>
-      </w:r>
-      <w:r>
-        <w:rPr>
-          <w:sz w:val="20"/>
-        </w:rPr>
-        <w:t>ế</w:t>
-      </w:r>
-      <w:r>
-        <w:rPr>
-          <w:sz w:val="20"/>
-        </w:rPr>
-        <w:t>t, còn Charter nhóm gi</w:t>
-      </w:r>
-      <w:r>
-        <w:rPr>
-          <w:sz w:val="20"/>
-        </w:rPr>
-        <w:t>ữ</w:t>
-      </w:r>
-      <w:r>
-        <w:rPr>
-          <w:sz w:val="20"/>
-        </w:rPr>
-        <w:t xml:space="preserve"> FR09–FR10 trong ph</w:t>
-      </w:r>
-      <w:r>
-        <w:rPr>
-          <w:sz w:val="20"/>
-        </w:rPr>
-        <w:t>ạ</w:t>
-      </w:r>
-      <w:r>
-        <w:rPr>
-          <w:sz w:val="20"/>
-        </w:rPr>
-        <w:t>m vi. Hai cách nhìn th</w:t>
-      </w:r>
-      <w:r>
-        <w:rPr>
-          <w:sz w:val="20"/>
-        </w:rPr>
-        <w:t>ố</w:t>
-      </w:r>
-      <w:r>
-        <w:rPr>
-          <w:sz w:val="20"/>
-        </w:rPr>
-        <w:t>ng nh</w:t>
-      </w:r>
-      <w:r>
-        <w:rPr>
-          <w:sz w:val="20"/>
-        </w:rPr>
-        <w:t>ấ</w:t>
-      </w:r>
-      <w:r>
-        <w:rPr>
-          <w:sz w:val="20"/>
-        </w:rPr>
-        <w:t xml:space="preserve">t </w:t>
-      </w:r>
-      <w:r>
-        <w:rPr>
-          <w:sz w:val="20"/>
-        </w:rPr>
-        <w:t>ở</w:t>
-      </w:r>
-      <w:r>
-        <w:rPr>
-          <w:sz w:val="20"/>
-        </w:rPr>
-        <w:t xml:space="preserve"> phương án nén l</w:t>
-      </w:r>
-      <w:r>
-        <w:rPr>
-          <w:sz w:val="20"/>
-        </w:rPr>
-        <w:t>ị</w:t>
-      </w:r>
-      <w:r>
-        <w:rPr>
-          <w:sz w:val="20"/>
-        </w:rPr>
-        <w:t>ch 4.5: d</w:t>
-      </w:r>
-      <w:r>
-        <w:rPr>
-          <w:sz w:val="20"/>
-        </w:rPr>
-        <w:t>ờ</w:t>
-      </w:r>
-      <w:r>
-        <w:rPr>
-          <w:sz w:val="20"/>
-        </w:rPr>
-        <w:t>i FR09–FR10 sang giai đo</w:t>
-      </w:r>
-      <w:r>
-        <w:rPr>
-          <w:sz w:val="20"/>
-        </w:rPr>
-        <w:t>ạ</w:t>
-      </w:r>
-      <w:r>
-        <w:rPr>
-          <w:sz w:val="20"/>
-        </w:rPr>
-        <w:t>n 2 n</w:t>
-      </w:r>
-      <w:r>
-        <w:rPr>
-          <w:sz w:val="20"/>
-        </w:rPr>
-        <w:t>ế</w:t>
-      </w:r>
-      <w:r>
-        <w:rPr>
-          <w:sz w:val="20"/>
-        </w:rPr>
-        <w:t>u Sponsor đ</w:t>
-      </w:r>
-      <w:r>
-        <w:rPr>
-          <w:sz w:val="20"/>
-        </w:rPr>
-        <w:t>ồ</w:t>
-      </w:r>
-      <w:r>
-        <w:rPr>
-          <w:sz w:val="20"/>
-        </w:rPr>
-        <w:t>ng ý.</w:t>
+        <w:t>• Phạm vi: Claude xếp FR09–FR11 ra ngoài phạm vi cam kết, còn Charter nhóm giữ FR09–FR10 trong phạm vi. Hai cách nhìn thống nhất ở phương án nén lịch 4.5: dời FR09–FR10 sang giai đoạn 2 nếu Sponsor đồng ý.</w:t>
       </w:r>
     </w:p>
     <w:p>
@@ -10154,151 +9508,7 @@
         <w:rPr>
           <w:sz w:val="20"/>
         </w:rPr>
-        <w:t>• Con s</w:t>
-      </w:r>
-      <w:r>
-        <w:rPr>
-          <w:sz w:val="20"/>
-        </w:rPr>
-        <w:t>ố</w:t>
-      </w:r>
-      <w:r>
-        <w:rPr>
-          <w:sz w:val="20"/>
-        </w:rPr>
-        <w:t xml:space="preserve"> đích c</w:t>
-      </w:r>
-      <w:r>
-        <w:rPr>
-          <w:sz w:val="20"/>
-        </w:rPr>
-        <w:t>ủ</w:t>
-      </w:r>
-      <w:r>
-        <w:rPr>
-          <w:sz w:val="20"/>
-        </w:rPr>
-        <w:t>a m</w:t>
-      </w:r>
-      <w:r>
-        <w:rPr>
-          <w:sz w:val="20"/>
-        </w:rPr>
-        <w:t>ụ</w:t>
-      </w:r>
-      <w:r>
-        <w:rPr>
-          <w:sz w:val="20"/>
-        </w:rPr>
-        <w:t>c tiêu báo cáo khác nhau (Claude: dư</w:t>
-      </w:r>
-      <w:r>
-        <w:rPr>
-          <w:sz w:val="20"/>
-        </w:rPr>
-        <w:t>ớ</w:t>
-      </w:r>
-      <w:r>
-        <w:rPr>
-          <w:sz w:val="20"/>
-        </w:rPr>
-        <w:t>i 1 gi</w:t>
-      </w:r>
-      <w:r>
-        <w:rPr>
-          <w:sz w:val="20"/>
-        </w:rPr>
-        <w:t>ờ</w:t>
-      </w:r>
-      <w:r>
-        <w:rPr>
-          <w:sz w:val="20"/>
-        </w:rPr>
-        <w:t>; nhóm: dư</w:t>
-      </w:r>
-      <w:r>
-        <w:rPr>
-          <w:sz w:val="20"/>
-        </w:rPr>
-        <w:t>ớ</w:t>
-      </w:r>
-      <w:r>
-        <w:rPr>
-          <w:sz w:val="20"/>
-        </w:rPr>
-        <w:t>i 10 phút). C</w:t>
-      </w:r>
-      <w:r>
-        <w:rPr>
-          <w:sz w:val="20"/>
-        </w:rPr>
-        <w:t>ả</w:t>
-      </w:r>
-      <w:r>
-        <w:rPr>
-          <w:sz w:val="20"/>
-        </w:rPr>
-        <w:t xml:space="preserve"> hai đ</w:t>
-      </w:r>
-      <w:r>
-        <w:rPr>
-          <w:sz w:val="20"/>
-        </w:rPr>
-        <w:t>ề</w:t>
-      </w:r>
-      <w:r>
-        <w:rPr>
-          <w:sz w:val="20"/>
-        </w:rPr>
-        <w:t>u là đ</w:t>
-      </w:r>
-      <w:r>
-        <w:rPr>
-          <w:sz w:val="20"/>
-        </w:rPr>
-        <w:t>ề</w:t>
-      </w:r>
-      <w:r>
-        <w:rPr>
-          <w:sz w:val="20"/>
-        </w:rPr>
-        <w:t xml:space="preserve"> xu</w:t>
-      </w:r>
-      <w:r>
-        <w:rPr>
-          <w:sz w:val="20"/>
-        </w:rPr>
-        <w:t>ấ</w:t>
-      </w:r>
-      <w:r>
-        <w:rPr>
-          <w:sz w:val="20"/>
-        </w:rPr>
-        <w:t>t, c</w:t>
-      </w:r>
-      <w:r>
-        <w:rPr>
-          <w:sz w:val="20"/>
-        </w:rPr>
-        <w:t>ầ</w:t>
-      </w:r>
-      <w:r>
-        <w:rPr>
-          <w:sz w:val="20"/>
-        </w:rPr>
-        <w:t>n khách hàng xác nh</w:t>
-      </w:r>
-      <w:r>
-        <w:rPr>
-          <w:sz w:val="20"/>
-        </w:rPr>
-        <w:t>ậ</w:t>
-      </w:r>
-      <w:r>
-        <w:rPr>
-          <w:sz w:val="20"/>
-        </w:rPr>
-        <w:t>n.</w:t>
+        <w:t>• Con số đích của mục tiêu báo cáo khác nhau (Claude: dưới 1 giờ; nhóm: dưới 10 phút). Cả hai đều là đề xuất, cần khách hàng xác nhận.</w:t>
       </w:r>
     </w:p>
     <w:p>
@@ -10310,55 +9520,7 @@
         <w:rPr>
           <w:sz w:val="20"/>
         </w:rPr>
-        <w:t>• Claude h</w:t>
-      </w:r>
-      <w:r>
-        <w:rPr>
-          <w:sz w:val="20"/>
-        </w:rPr>
-        <w:t>ỏ</w:t>
-      </w:r>
-      <w:r>
-        <w:rPr>
-          <w:sz w:val="20"/>
-        </w:rPr>
-        <w:t>i thêm câu v</w:t>
-      </w:r>
-      <w:r>
-        <w:rPr>
-          <w:sz w:val="20"/>
-        </w:rPr>
-        <w:t>ề</w:t>
-      </w:r>
-      <w:r>
-        <w:rPr>
-          <w:sz w:val="20"/>
-        </w:rPr>
-        <w:t xml:space="preserve"> cách tính giá v</w:t>
-      </w:r>
-      <w:r>
-        <w:rPr>
-          <w:sz w:val="20"/>
-        </w:rPr>
-        <w:t>ố</w:t>
-      </w:r>
-      <w:r>
-        <w:rPr>
-          <w:sz w:val="20"/>
-        </w:rPr>
-        <w:t>n (FIFO theo lô hay bình quân) – chưa có trong Q1–Q9, đã b</w:t>
-      </w:r>
-      <w:r>
-        <w:rPr>
-          <w:sz w:val="20"/>
-        </w:rPr>
-        <w:t>ổ</w:t>
-      </w:r>
-      <w:r>
-        <w:rPr>
-          <w:sz w:val="20"/>
-        </w:rPr>
-        <w:t xml:space="preserve"> sung thành Q10.</w:t>
+        <w:t>• Claude hỏi thêm câu về cách tính giá vốn (FIFO theo lô hay bình quân) – chưa có trong Q1–Q9, đã bổ sung thành Q10.</w:t>
       </w:r>
     </w:p>
     <w:p>
@@ -10372,7 +9534,7 @@
         <w:keepNext/>
         <w:keepLines/>
       </w:pPr>
-      <w:bookmarkStart w:id="11" w:name="_Toc242014661"/>
+      <w:bookmarkStart w:id="11" w:name="_Toc242015345"/>
       <w:r>
         <w:t>3. Phạm vi và WBS</w:t>
       </w:r>
@@ -10403,7 +9565,7 @@
         <w:keepNext/>
         <w:keepLines/>
       </w:pPr>
-      <w:bookmarkStart w:id="12" w:name="_Toc242014662"/>
+      <w:bookmarkStart w:id="12" w:name="_Toc242015346"/>
       <w:r>
         <w:t>3.1 Sơ đồ cây WBS</w:t>
       </w:r>
@@ -10492,7 +9654,7 @@
         <w:keepNext/>
         <w:keepLines/>
       </w:pPr>
-      <w:bookmarkStart w:id="13" w:name="_Toc242014663"/>
+      <w:bookmarkStart w:id="13" w:name="_Toc242015347"/>
       <w:r>
         <w:t>3.2 Bảng WBS</w:t>
       </w:r>
@@ -22398,31 +21560,7 @@
         <w:keepNext/>
       </w:pPr>
       <w:r>
-        <w:t>Đ</w:t>
-      </w:r>
-      <w:r>
-        <w:t>ố</w:t>
-      </w:r>
-      <w:r>
-        <w:t>i chi</w:t>
-      </w:r>
-      <w:r>
-        <w:t>ế</w:t>
-      </w:r>
-      <w:r>
-        <w:t>u v</w:t>
-      </w:r>
-      <w:r>
-        <w:t>ớ</w:t>
-      </w:r>
-      <w:r>
-        <w:t>i WBS c</w:t>
-      </w:r>
-      <w:r>
-        <w:t>ủ</w:t>
-      </w:r>
-      <w:r>
-        <w:t>a Claude Project (Bài 2)</w:t>
+        <w:t>Đối chiếu với WBS của Claude Project (Bài 2)</w:t>
       </w:r>
     </w:p>
     <w:p>
@@ -22481,39 +21619,7 @@
           <w:color w:val="595959"/>
           <w:sz w:val="18"/>
         </w:rPr>
-        <w:t>Hình 3.2 – Tóm t</w:t>
-      </w:r>
-      <w:r>
-        <w:rPr>
-          <w:i/>
-          <w:color w:val="595959"/>
-          <w:sz w:val="18"/>
-        </w:rPr>
-        <w:t>ắ</w:t>
-      </w:r>
-      <w:r>
-        <w:rPr>
-          <w:i/>
-          <w:color w:val="595959"/>
-          <w:sz w:val="18"/>
-        </w:rPr>
-        <w:t>t WBS do Claude Project l</w:t>
-      </w:r>
-      <w:r>
-        <w:rPr>
-          <w:i/>
-          <w:color w:val="595959"/>
-          <w:sz w:val="18"/>
-        </w:rPr>
-        <w:t>ậ</w:t>
-      </w:r>
-      <w:r>
-        <w:rPr>
-          <w:i/>
-          <w:color w:val="595959"/>
-          <w:sz w:val="18"/>
-        </w:rPr>
-        <w:t>p trong chat Bài 2</w:t>
+        <w:t>Hình 3.2 – Tóm tắt WBS do Claude Project lập trong chat Bài 2</w:t>
       </w:r>
     </w:p>
     <w:p>
@@ -22525,103 +21631,7 @@
         <w:rPr>
           <w:sz w:val="20"/>
         </w:rPr>
-        <w:t>• Quy mô: Claude 46 gói công vi</w:t>
-      </w:r>
-      <w:r>
-        <w:rPr>
-          <w:sz w:val="20"/>
-        </w:rPr>
-        <w:t>ệ</w:t>
-      </w:r>
-      <w:r>
-        <w:rPr>
-          <w:sz w:val="20"/>
-        </w:rPr>
-        <w:t>c, 1.912 gi</w:t>
-      </w:r>
-      <w:r>
-        <w:rPr>
-          <w:sz w:val="20"/>
-        </w:rPr>
-        <w:t>ờ</w:t>
-      </w:r>
-      <w:r>
-        <w:rPr>
-          <w:sz w:val="20"/>
-        </w:rPr>
-        <w:t xml:space="preserve"> công; WBS c</w:t>
-      </w:r>
-      <w:r>
-        <w:rPr>
-          <w:sz w:val="20"/>
-        </w:rPr>
-        <w:t>ủ</w:t>
-      </w:r>
-      <w:r>
-        <w:rPr>
-          <w:sz w:val="20"/>
-        </w:rPr>
-        <w:t>a nhóm 47 gói, 1.364 gi</w:t>
-      </w:r>
-      <w:r>
-        <w:rPr>
-          <w:sz w:val="20"/>
-        </w:rPr>
-        <w:t>ờ</w:t>
-      </w:r>
-      <w:r>
-        <w:rPr>
-          <w:sz w:val="20"/>
-        </w:rPr>
-        <w:t>. Claude ư</w:t>
-      </w:r>
-      <w:r>
-        <w:rPr>
-          <w:sz w:val="20"/>
-        </w:rPr>
-        <w:t>ớ</w:t>
-      </w:r>
-      <w:r>
-        <w:rPr>
-          <w:sz w:val="20"/>
-        </w:rPr>
-        <w:t>c lư</w:t>
-      </w:r>
-      <w:r>
-        <w:rPr>
-          <w:sz w:val="20"/>
-        </w:rPr>
-        <w:t>ợ</w:t>
-      </w:r>
-      <w:r>
-        <w:rPr>
-          <w:sz w:val="20"/>
-        </w:rPr>
-        <w:t>ng nhi</w:t>
-      </w:r>
-      <w:r>
-        <w:rPr>
-          <w:sz w:val="20"/>
-        </w:rPr>
-        <w:t>ề</w:t>
-      </w:r>
-      <w:r>
-        <w:rPr>
-          <w:sz w:val="20"/>
-        </w:rPr>
-        <w:t>u hơn kho</w:t>
-      </w:r>
-      <w:r>
-        <w:rPr>
-          <w:sz w:val="20"/>
-        </w:rPr>
-        <w:t>ả</w:t>
-      </w:r>
-      <w:r>
-        <w:rPr>
-          <w:sz w:val="20"/>
-        </w:rPr>
-        <w:t>ng 40%.</w:t>
+        <w:t>• Quy mô: Claude 46 gói công việc, 1.912 giờ công; WBS của nhóm 47 gói, 1.364 giờ. Claude ước lượng nhiều hơn khoảng 40%.</w:t>
       </w:r>
     </w:p>
     <w:p>
@@ -22633,211 +21643,7 @@
         <w:rPr>
           <w:sz w:val="20"/>
         </w:rPr>
-        <w:t>• Chi phí: 1.912 gi</w:t>
-      </w:r>
-      <w:r>
-        <w:rPr>
-          <w:sz w:val="20"/>
-        </w:rPr>
-        <w:t>ờ</w:t>
-      </w:r>
-      <w:r>
-        <w:rPr>
-          <w:sz w:val="20"/>
-        </w:rPr>
-        <w:t xml:space="preserve"> × đơn giá trung bình c</w:t>
-      </w:r>
-      <w:r>
-        <w:rPr>
-          <w:sz w:val="20"/>
-        </w:rPr>
-        <w:t>ủ</w:t>
-      </w:r>
-      <w:r>
-        <w:rPr>
-          <w:sz w:val="20"/>
-        </w:rPr>
-        <w:t>a nhóm (kho</w:t>
-      </w:r>
-      <w:r>
-        <w:rPr>
-          <w:sz w:val="20"/>
-        </w:rPr>
-        <w:t>ả</w:t>
-      </w:r>
-      <w:r>
-        <w:rPr>
-          <w:sz w:val="20"/>
-        </w:rPr>
-        <w:t>ng 153.000 đ/gi</w:t>
-      </w:r>
-      <w:r>
-        <w:rPr>
-          <w:sz w:val="20"/>
-        </w:rPr>
-        <w:t>ờ</w:t>
-      </w:r>
-      <w:r>
-        <w:rPr>
-          <w:sz w:val="20"/>
-        </w:rPr>
-        <w:t>) ≈ 293 tri</w:t>
-      </w:r>
-      <w:r>
-        <w:rPr>
-          <w:sz w:val="20"/>
-        </w:rPr>
-        <w:t>ệ</w:t>
-      </w:r>
-      <w:r>
-        <w:rPr>
-          <w:sz w:val="20"/>
-        </w:rPr>
-        <w:t>u đ</w:t>
-      </w:r>
-      <w:r>
-        <w:rPr>
-          <w:sz w:val="20"/>
-        </w:rPr>
-        <w:t>ồ</w:t>
-      </w:r>
-      <w:r>
-        <w:rPr>
-          <w:sz w:val="20"/>
-        </w:rPr>
-        <w:t>ng ti</w:t>
-      </w:r>
-      <w:r>
-        <w:rPr>
-          <w:sz w:val="20"/>
-        </w:rPr>
-        <w:t>ề</w:t>
-      </w:r>
-      <w:r>
-        <w:rPr>
-          <w:sz w:val="20"/>
-        </w:rPr>
-        <w:t>n công, c</w:t>
-      </w:r>
-      <w:r>
-        <w:rPr>
-          <w:sz w:val="20"/>
-        </w:rPr>
-        <w:t>ộ</w:t>
-      </w:r>
-      <w:r>
-        <w:rPr>
-          <w:sz w:val="20"/>
-        </w:rPr>
-        <w:t>ng d</w:t>
-      </w:r>
-      <w:r>
-        <w:rPr>
-          <w:sz w:val="20"/>
-        </w:rPr>
-        <w:t>ự</w:t>
-      </w:r>
-      <w:r>
-        <w:rPr>
-          <w:sz w:val="20"/>
-        </w:rPr>
-        <w:t xml:space="preserve"> phòng thì vư</w:t>
-      </w:r>
-      <w:r>
-        <w:rPr>
-          <w:sz w:val="20"/>
-        </w:rPr>
-        <w:t>ợ</w:t>
-      </w:r>
-      <w:r>
-        <w:rPr>
-          <w:sz w:val="20"/>
-        </w:rPr>
-        <w:t>t ngân sách 250 tri</w:t>
-      </w:r>
-      <w:r>
-        <w:rPr>
-          <w:sz w:val="20"/>
-        </w:rPr>
-        <w:t>ệ</w:t>
-      </w:r>
-      <w:r>
-        <w:rPr>
-          <w:sz w:val="20"/>
-        </w:rPr>
-        <w:t>u. Claude ch</w:t>
-      </w:r>
-      <w:r>
-        <w:rPr>
-          <w:sz w:val="20"/>
-        </w:rPr>
-        <w:t>ỉ</w:t>
-      </w:r>
-      <w:r>
-        <w:rPr>
-          <w:sz w:val="20"/>
-        </w:rPr>
-        <w:t xml:space="preserve"> ki</w:t>
-      </w:r>
-      <w:r>
-        <w:rPr>
-          <w:sz w:val="20"/>
-        </w:rPr>
-        <w:t>ể</w:t>
-      </w:r>
-      <w:r>
-        <w:rPr>
-          <w:sz w:val="20"/>
-        </w:rPr>
-        <w:t>m tra năng l</w:t>
-      </w:r>
-      <w:r>
-        <w:rPr>
-          <w:sz w:val="20"/>
-        </w:rPr>
-        <w:t>ự</w:t>
-      </w:r>
-      <w:r>
-        <w:rPr>
-          <w:sz w:val="20"/>
-        </w:rPr>
-        <w:t>c đ</w:t>
-      </w:r>
-      <w:r>
-        <w:rPr>
-          <w:sz w:val="20"/>
-        </w:rPr>
-        <w:t>ộ</w:t>
-      </w:r>
-      <w:r>
-        <w:rPr>
-          <w:sz w:val="20"/>
-        </w:rPr>
-        <w:t>i, không đ</w:t>
-      </w:r>
-      <w:r>
-        <w:rPr>
-          <w:sz w:val="20"/>
-        </w:rPr>
-        <w:t>ố</w:t>
-      </w:r>
-      <w:r>
-        <w:rPr>
-          <w:sz w:val="20"/>
-        </w:rPr>
-        <w:t>i chi</w:t>
-      </w:r>
-      <w:r>
-        <w:rPr>
-          <w:sz w:val="20"/>
-        </w:rPr>
-        <w:t>ế</w:t>
-      </w:r>
-      <w:r>
-        <w:rPr>
-          <w:sz w:val="20"/>
-        </w:rPr>
-        <w:t>u ngân sách.</w:t>
+        <w:t>• Chi phí: 1.912 giờ × đơn giá trung bình của nhóm (khoảng 153.000 đ/giờ) ≈ 293 triệu đồng tiền công, cộng dự phòng thì vượt ngân sách 250 triệu. Claude chỉ kiểm tra năng lực đội, không đối chiếu ngân sách.</w:t>
       </w:r>
     </w:p>
     <w:p>
@@ -22849,103 +21655,7 @@
         <w:rPr>
           <w:sz w:val="20"/>
         </w:rPr>
-        <w:t>• Ph</w:t>
-      </w:r>
-      <w:r>
-        <w:rPr>
-          <w:sz w:val="20"/>
-        </w:rPr>
-        <w:t>ạ</w:t>
-      </w:r>
-      <w:r>
-        <w:rPr>
-          <w:sz w:val="20"/>
-        </w:rPr>
-        <w:t>m vi: WBS c</w:t>
-      </w:r>
-      <w:r>
-        <w:rPr>
-          <w:sz w:val="20"/>
-        </w:rPr>
-        <w:t>ủ</w:t>
-      </w:r>
-      <w:r>
-        <w:rPr>
-          <w:sz w:val="20"/>
-        </w:rPr>
-        <w:t>a Claude không có FR09–FR12 (nh</w:t>
-      </w:r>
-      <w:r>
-        <w:rPr>
-          <w:sz w:val="20"/>
-        </w:rPr>
-        <w:t>ấ</w:t>
-      </w:r>
-      <w:r>
-        <w:rPr>
-          <w:sz w:val="20"/>
-        </w:rPr>
-        <w:t>t quán v</w:t>
-      </w:r>
-      <w:r>
-        <w:rPr>
-          <w:sz w:val="20"/>
-        </w:rPr>
-        <w:t>ớ</w:t>
-      </w:r>
-      <w:r>
-        <w:rPr>
-          <w:sz w:val="20"/>
-        </w:rPr>
-        <w:t>i Charter c</w:t>
-      </w:r>
-      <w:r>
-        <w:rPr>
-          <w:sz w:val="20"/>
-        </w:rPr>
-        <w:t>ủ</w:t>
-      </w:r>
-      <w:r>
-        <w:rPr>
-          <w:sz w:val="20"/>
-        </w:rPr>
-        <w:t>a Claude) nhưng l</w:t>
-      </w:r>
-      <w:r>
-        <w:rPr>
-          <w:sz w:val="20"/>
-        </w:rPr>
-        <w:t>ệ</w:t>
-      </w:r>
-      <w:r>
-        <w:rPr>
-          <w:sz w:val="20"/>
-        </w:rPr>
-        <w:t>ch so v</w:t>
-      </w:r>
-      <w:r>
-        <w:rPr>
-          <w:sz w:val="20"/>
-        </w:rPr>
-        <w:t>ớ</w:t>
-      </w:r>
-      <w:r>
-        <w:rPr>
-          <w:sz w:val="20"/>
-        </w:rPr>
-        <w:t>i Charter c</w:t>
-      </w:r>
-      <w:r>
-        <w:rPr>
-          <w:sz w:val="20"/>
-        </w:rPr>
-        <w:t>ủ</w:t>
-      </w:r>
-      <w:r>
-        <w:rPr>
-          <w:sz w:val="20"/>
-        </w:rPr>
-        <w:t>a nhóm.</w:t>
+        <w:t>• Phạm vi: WBS của Claude không có FR09–FR12 (nhất quán với Charter của Claude) nhưng lệch so với Charter của nhóm.</w:t>
       </w:r>
     </w:p>
     <w:p>
@@ -22957,103 +21667,7 @@
         <w:rPr>
           <w:sz w:val="20"/>
         </w:rPr>
-        <w:t>• Nhân l</w:t>
-      </w:r>
-      <w:r>
-        <w:rPr>
-          <w:sz w:val="20"/>
-        </w:rPr>
-        <w:t>ự</w:t>
-      </w:r>
-      <w:r>
-        <w:rPr>
-          <w:sz w:val="20"/>
-        </w:rPr>
-        <w:t>c: c</w:t>
-      </w:r>
-      <w:r>
-        <w:rPr>
-          <w:sz w:val="20"/>
-        </w:rPr>
-        <w:t>ả</w:t>
-      </w:r>
-      <w:r>
-        <w:rPr>
-          <w:sz w:val="20"/>
-        </w:rPr>
-        <w:t xml:space="preserve"> hai cùng phát hi</w:t>
-      </w:r>
-      <w:r>
-        <w:rPr>
-          <w:sz w:val="20"/>
-        </w:rPr>
-        <w:t>ệ</w:t>
-      </w:r>
-      <w:r>
-        <w:rPr>
-          <w:sz w:val="20"/>
-        </w:rPr>
-        <w:t>n l</w:t>
-      </w:r>
-      <w:r>
-        <w:rPr>
-          <w:sz w:val="20"/>
-        </w:rPr>
-        <w:t>ậ</w:t>
-      </w:r>
-      <w:r>
-        <w:rPr>
-          <w:sz w:val="20"/>
-        </w:rPr>
-        <w:t>p trình viên backend quá t</w:t>
-      </w:r>
-      <w:r>
-        <w:rPr>
-          <w:sz w:val="20"/>
-        </w:rPr>
-        <w:t>ả</w:t>
-      </w:r>
-      <w:r>
-        <w:rPr>
-          <w:sz w:val="20"/>
-        </w:rPr>
-        <w:t>i (Claude: 572/480 gi</w:t>
-      </w:r>
-      <w:r>
-        <w:rPr>
-          <w:sz w:val="20"/>
-        </w:rPr>
-        <w:t>ờ</w:t>
-      </w:r>
-      <w:r>
-        <w:rPr>
-          <w:sz w:val="20"/>
-        </w:rPr>
-        <w:t>; nhóm: 460/512 gi</w:t>
-      </w:r>
-      <w:r>
-        <w:rPr>
-          <w:sz w:val="20"/>
-        </w:rPr>
-        <w:t>ờ</w:t>
-      </w:r>
-      <w:r>
-        <w:rPr>
-          <w:sz w:val="20"/>
-        </w:rPr>
-        <w:t xml:space="preserve"> – r</w:t>
-      </w:r>
-      <w:r>
-        <w:rPr>
-          <w:sz w:val="20"/>
-        </w:rPr>
-        <w:t>ủ</w:t>
-      </w:r>
-      <w:r>
-        <w:rPr>
-          <w:sz w:val="20"/>
-        </w:rPr>
-        <w:t>i ro R05).</w:t>
+        <w:t>• Nhân lực: cả hai cùng phát hiện lập trình viên backend quá tải (Claude: 572/480 giờ; nhóm: 460/512 giờ – rủi ro R05).</w:t>
       </w:r>
     </w:p>
     <w:p>
@@ -23065,103 +21679,7 @@
         <w:rPr>
           <w:sz w:val="20"/>
         </w:rPr>
-        <w:t>• Quy t</w:t>
-      </w:r>
-      <w:r>
-        <w:rPr>
-          <w:sz w:val="20"/>
-        </w:rPr>
-        <w:t>ắ</w:t>
-      </w:r>
-      <w:r>
-        <w:rPr>
-          <w:sz w:val="20"/>
-        </w:rPr>
-        <w:t>c 8/80 đ</w:t>
-      </w:r>
-      <w:r>
-        <w:rPr>
-          <w:sz w:val="20"/>
-        </w:rPr>
-        <w:t>ề</w:t>
-      </w:r>
-      <w:r>
-        <w:rPr>
-          <w:sz w:val="20"/>
-        </w:rPr>
-        <w:t>u đ</w:t>
-      </w:r>
-      <w:r>
-        <w:rPr>
-          <w:sz w:val="20"/>
-        </w:rPr>
-        <w:t>ạ</w:t>
-      </w:r>
-      <w:r>
-        <w:rPr>
-          <w:sz w:val="20"/>
-        </w:rPr>
-        <w:t>t (Claude: 12–72 gi</w:t>
-      </w:r>
-      <w:r>
-        <w:rPr>
-          <w:sz w:val="20"/>
-        </w:rPr>
-        <w:t>ờ</w:t>
-      </w:r>
-      <w:r>
-        <w:rPr>
-          <w:sz w:val="20"/>
-        </w:rPr>
-        <w:t>; nhóm: 8–80 gi</w:t>
-      </w:r>
-      <w:r>
-        <w:rPr>
-          <w:sz w:val="20"/>
-        </w:rPr>
-        <w:t>ờ</w:t>
-      </w:r>
-      <w:r>
-        <w:rPr>
-          <w:sz w:val="20"/>
-        </w:rPr>
-        <w:t>). Nhóm gi</w:t>
-      </w:r>
-      <w:r>
-        <w:rPr>
-          <w:sz w:val="20"/>
-        </w:rPr>
-        <w:t>ữ</w:t>
-      </w:r>
-      <w:r>
-        <w:rPr>
-          <w:sz w:val="20"/>
-        </w:rPr>
-        <w:t xml:space="preserve"> WBS 1.364 gi</w:t>
-      </w:r>
-      <w:r>
-        <w:rPr>
-          <w:sz w:val="20"/>
-        </w:rPr>
-        <w:t>ờ</w:t>
-      </w:r>
-      <w:r>
-        <w:rPr>
-          <w:sz w:val="20"/>
-        </w:rPr>
-        <w:t xml:space="preserve"> vì n</w:t>
-      </w:r>
-      <w:r>
-        <w:rPr>
-          <w:sz w:val="20"/>
-        </w:rPr>
-        <w:t>ằ</w:t>
-      </w:r>
-      <w:r>
-        <w:rPr>
-          <w:sz w:val="20"/>
-        </w:rPr>
-        <w:t>m trong ngân sách.</w:t>
+        <w:t>• Quy tắc 8/80 đều đạt (Claude: 12–72 giờ; nhóm: 8–80 giờ). Nhóm giữ WBS 1.364 giờ vì nằm trong ngân sách.</w:t>
       </w:r>
     </w:p>
     <w:p>
@@ -23170,7 +21688,7 @@
         <w:keepNext/>
         <w:keepLines/>
       </w:pPr>
-      <w:bookmarkStart w:id="14" w:name="_Toc242014664"/>
+      <w:bookmarkStart w:id="14" w:name="_Toc242015348"/>
       <w:r>
         <w:t>3.3 Từ điển WBS (3 gói công việc quan trọng nhất)</w:t>
       </w:r>
@@ -24876,7 +23394,7 @@
         <w:keepNext/>
         <w:keepLines/>
       </w:pPr>
-      <w:bookmarkStart w:id="15" w:name="_Toc242014665"/>
+      <w:bookmarkStart w:id="15" w:name="_Toc242015349"/>
       <w:r>
         <w:t>4. Ước lượng, lịch dự án và đường găng</w:t>
       </w:r>
@@ -24896,7 +23414,7 @@
         <w:keepNext/>
         <w:keepLines/>
       </w:pPr>
-      <w:bookmarkStart w:id="16" w:name="_Toc242014666"/>
+      <w:bookmarkStart w:id="16" w:name="_Toc242015350"/>
       <w:r>
         <w:t>4.1 Bảng PERT và CPM</w:t>
       </w:r>
@@ -32496,7 +31014,7 @@
         <w:keepNext/>
         <w:keepLines/>
       </w:pPr>
-      <w:bookmarkStart w:id="17" w:name="_Toc242014667"/>
+      <w:bookmarkStart w:id="17" w:name="_Toc242015351"/>
       <w:r>
         <w:t>4.2 Kết quả</w:t>
       </w:r>
@@ -33045,7 +31563,7 @@
         <w:keepNext/>
         <w:keepLines/>
       </w:pPr>
-      <w:bookmarkStart w:id="18" w:name="_Toc242014668"/>
+      <w:bookmarkStart w:id="18" w:name="_Toc242015352"/>
       <w:r>
         <w:t>4.3 Biểu đồ Gantt</w:t>
       </w:r>
@@ -33123,7 +31641,7 @@
         <w:keepNext/>
         <w:keepLines/>
       </w:pPr>
-      <w:bookmarkStart w:id="19" w:name="_Toc242014669"/>
+      <w:bookmarkStart w:id="19" w:name="_Toc242015353"/>
       <w:r>
         <w:t>4.4 So sánh kết quả Excel với câu trả lời của AI (Claude Project)</w:t>
       </w:r>
@@ -33949,119 +32467,7 @@
           <w:color w:val="595959"/>
           <w:sz w:val="18"/>
         </w:rPr>
-        <w:t>Hình 4.2 – K</w:t>
-      </w:r>
-      <w:r>
-        <w:rPr>
-          <w:i/>
-          <w:color w:val="595959"/>
-          <w:sz w:val="18"/>
-        </w:rPr>
-        <w:t>ế</w:t>
-      </w:r>
-      <w:r>
-        <w:rPr>
-          <w:i/>
-          <w:color w:val="595959"/>
-          <w:sz w:val="18"/>
-        </w:rPr>
-        <w:t>t qu</w:t>
-      </w:r>
-      <w:r>
-        <w:rPr>
-          <w:i/>
-          <w:color w:val="595959"/>
-          <w:sz w:val="18"/>
-        </w:rPr>
-        <w:t>ả</w:t>
-      </w:r>
-      <w:r>
-        <w:rPr>
-          <w:i/>
-          <w:color w:val="595959"/>
-          <w:sz w:val="18"/>
-        </w:rPr>
-        <w:t xml:space="preserve"> Bài 3 trong Claude Project: tài li</w:t>
-      </w:r>
-      <w:r>
-        <w:rPr>
-          <w:i/>
-          <w:color w:val="595959"/>
-          <w:sz w:val="18"/>
-        </w:rPr>
-        <w:t>ệ</w:t>
-      </w:r>
-      <w:r>
-        <w:rPr>
-          <w:i/>
-          <w:color w:val="595959"/>
-          <w:sz w:val="18"/>
-        </w:rPr>
-        <w:t>u PERT (trái) và b</w:t>
-      </w:r>
-      <w:r>
-        <w:rPr>
-          <w:i/>
-          <w:color w:val="595959"/>
-          <w:sz w:val="18"/>
-        </w:rPr>
-        <w:t>ả</w:t>
-      </w:r>
-      <w:r>
-        <w:rPr>
-          <w:i/>
-          <w:color w:val="595959"/>
-          <w:sz w:val="18"/>
-        </w:rPr>
-        <w:t>ng k</w:t>
-      </w:r>
-      <w:r>
-        <w:rPr>
-          <w:i/>
-          <w:color w:val="595959"/>
-          <w:sz w:val="18"/>
-        </w:rPr>
-        <w:t>ế</w:t>
-      </w:r>
-      <w:r>
-        <w:rPr>
-          <w:i/>
-          <w:color w:val="595959"/>
-          <w:sz w:val="18"/>
-        </w:rPr>
-        <w:t>t qu</w:t>
-      </w:r>
-      <w:r>
-        <w:rPr>
-          <w:i/>
-          <w:color w:val="595959"/>
-          <w:sz w:val="18"/>
-        </w:rPr>
-        <w:t>ả</w:t>
-      </w:r>
-      <w:r>
-        <w:rPr>
-          <w:i/>
-          <w:color w:val="595959"/>
-          <w:sz w:val="18"/>
-        </w:rPr>
-        <w:t xml:space="preserve"> (ph</w:t>
-      </w:r>
-      <w:r>
-        <w:rPr>
-          <w:i/>
-          <w:color w:val="595959"/>
-          <w:sz w:val="18"/>
-        </w:rPr>
-        <w:t>ả</w:t>
-      </w:r>
-      <w:r>
-        <w:rPr>
-          <w:i/>
-          <w:color w:val="595959"/>
-          <w:sz w:val="18"/>
-        </w:rPr>
-        <w:t>i)</w:t>
+        <w:t>Hình 4.2 – Kết quả Bài 3 trong Claude Project: tài liệu PERT (trái) và bảng kết quả (phải)</w:t>
       </w:r>
     </w:p>
     <w:p>
@@ -34070,7 +32476,7 @@
         <w:keepNext/>
         <w:keepLines/>
       </w:pPr>
-      <w:bookmarkStart w:id="20" w:name="_Toc242014670"/>
+      <w:bookmarkStart w:id="20" w:name="_Toc242015354"/>
       <w:r>
         <w:t>4.5 Phương án nén lịch (AI gợi ý – nhóm tự chọn và lý giải)</w:t>
       </w:r>
@@ -37068,7 +35474,7 @@
         <w:keepNext/>
         <w:keepLines/>
       </w:pPr>
-      <w:bookmarkStart w:id="21" w:name="_Toc242014671"/>
+      <w:bookmarkStart w:id="21" w:name="_Toc242015355"/>
       <w:r>
         <w:t>5. Ước lượng chi phí</w:t>
       </w:r>
@@ -39402,7 +37808,7 @@
         <w:keepNext/>
         <w:keepLines/>
       </w:pPr>
-      <w:bookmarkStart w:id="22" w:name="_Toc242014672"/>
+      <w:bookmarkStart w:id="22" w:name="_Toc242015356"/>
       <w:r>
         <w:t>6. Quản lý rủi ro</w:t>
       </w:r>
@@ -44005,8 +42411,1778 @@
     </w:p>
     <w:p>
       <w:pPr>
+        <w:pStyle w:val="Heading3"/>
+        <w:keepNext/>
+      </w:pPr>
+      <w:r>
+        <w:t>Đ</w:t>
+      </w:r>
+      <w:r>
+        <w:t>ố</w:t>
+      </w:r>
+      <w:r>
+        <w:t>i chi</w:t>
+      </w:r>
+      <w:r>
+        <w:t>ế</w:t>
+      </w:r>
+      <w:r>
+        <w:t>u v</w:t>
+      </w:r>
+      <w:r>
+        <w:t>ớ</w:t>
+      </w:r>
+      <w:r>
+        <w:t>i Risk Register c</w:t>
+      </w:r>
+      <w:r>
+        <w:t>ủ</w:t>
+      </w:r>
+      <w:r>
+        <w:t>a Claude Project (Bài 4)</w:t>
+      </w:r>
+    </w:p>
+    <w:p>
+      <w:pPr>
+        <w:keepNext/>
+        <w:jc w:val="center"/>
+      </w:pPr>
+      <w:r>
+        <w:rPr>
+          <w:noProof/>
+        </w:rPr>
+        <w:drawing>
+          <wp:inline distT="0" distB="0" distL="0" distR="0" wp14:anchorId="2F485152" wp14:editId="04649188">
+            <wp:extent cx="6120000" cy="3585727"/>
+            <wp:effectExtent l="0" t="0" r="0" b="0"/>
+            <wp:docPr id="12" name="Picture 12"/>
+            <wp:cNvGraphicFramePr>
+              <a:graphicFrameLocks xmlns:a="http://schemas.openxmlformats.org/drawingml/2006/main" noChangeAspect="1"/>
+            </wp:cNvGraphicFramePr>
+            <a:graphic xmlns:a="http://schemas.openxmlformats.org/drawingml/2006/main">
+              <a:graphicData uri="http://schemas.openxmlformats.org/drawingml/2006/picture">
+                <pic:pic xmlns:pic="http://schemas.openxmlformats.org/drawingml/2006/picture">
+                  <pic:nvPicPr>
+                    <pic:cNvPr id="0" name="b4_register.png"/>
+                    <pic:cNvPicPr/>
+                  </pic:nvPicPr>
+                  <pic:blipFill>
+                    <a:blip r:embed="rId22"/>
+                    <a:stretch>
+                      <a:fillRect/>
+                    </a:stretch>
+                  </pic:blipFill>
+                  <pic:spPr>
+                    <a:xfrm>
+                      <a:off x="0" y="0"/>
+                      <a:ext cx="6120000" cy="3585727"/>
+                    </a:xfrm>
+                    <a:prstGeom prst="rect">
+                      <a:avLst/>
+                    </a:prstGeom>
+                  </pic:spPr>
+                </pic:pic>
+              </a:graphicData>
+            </a:graphic>
+          </wp:inline>
+        </w:drawing>
+      </w:r>
+    </w:p>
+    <w:p>
+      <w:pPr>
+        <w:jc w:val="center"/>
+      </w:pPr>
+      <w:r>
+        <w:rPr>
+          <w:i/>
+          <w:color w:val="595959"/>
+          <w:sz w:val="18"/>
+        </w:rPr>
+        <w:t>Hình 6.1a – S</w:t>
+      </w:r>
+      <w:r>
+        <w:rPr>
+          <w:i/>
+          <w:color w:val="595959"/>
+          <w:sz w:val="18"/>
+        </w:rPr>
+        <w:t>ổ</w:t>
+      </w:r>
+      <w:r>
+        <w:rPr>
+          <w:i/>
+          <w:color w:val="595959"/>
+          <w:sz w:val="18"/>
+        </w:rPr>
+        <w:t xml:space="preserve"> đăng ký r</w:t>
+      </w:r>
+      <w:r>
+        <w:rPr>
+          <w:i/>
+          <w:color w:val="595959"/>
+          <w:sz w:val="18"/>
+        </w:rPr>
+        <w:t>ủ</w:t>
+      </w:r>
+      <w:r>
+        <w:rPr>
+          <w:i/>
+          <w:color w:val="595959"/>
+          <w:sz w:val="18"/>
+        </w:rPr>
+        <w:t>i ro do Claude Project l</w:t>
+      </w:r>
+      <w:r>
+        <w:rPr>
+          <w:i/>
+          <w:color w:val="595959"/>
+          <w:sz w:val="18"/>
+        </w:rPr>
+        <w:t>ậ</w:t>
+      </w:r>
+      <w:r>
+        <w:rPr>
+          <w:i/>
+          <w:color w:val="595959"/>
+          <w:sz w:val="18"/>
+        </w:rPr>
+        <w:t>p trong chat Bài 4 (trích các r</w:t>
+      </w:r>
+      <w:r>
+        <w:rPr>
+          <w:i/>
+          <w:color w:val="595959"/>
+          <w:sz w:val="18"/>
+        </w:rPr>
+        <w:t>ủ</w:t>
+      </w:r>
+      <w:r>
+        <w:rPr>
+          <w:i/>
+          <w:color w:val="595959"/>
+          <w:sz w:val="18"/>
+        </w:rPr>
+        <w:t>i ro đi</w:t>
+      </w:r>
+      <w:r>
+        <w:rPr>
+          <w:i/>
+          <w:color w:val="595959"/>
+          <w:sz w:val="18"/>
+        </w:rPr>
+        <w:t>ể</w:t>
+      </w:r>
+      <w:r>
+        <w:rPr>
+          <w:i/>
+          <w:color w:val="595959"/>
+          <w:sz w:val="18"/>
+        </w:rPr>
+        <w:t>m cao nh</w:t>
+      </w:r>
+      <w:r>
+        <w:rPr>
+          <w:i/>
+          <w:color w:val="595959"/>
+          <w:sz w:val="18"/>
+        </w:rPr>
+        <w:t>ấ</w:t>
+      </w:r>
+      <w:r>
+        <w:rPr>
+          <w:i/>
+          <w:color w:val="595959"/>
+          <w:sz w:val="18"/>
+        </w:rPr>
+        <w:t>t)</w:t>
+      </w:r>
+    </w:p>
+    <w:p>
+      <w:pPr>
+        <w:keepNext/>
+        <w:jc w:val="center"/>
+      </w:pPr>
+      <w:r>
+        <w:rPr>
+          <w:noProof/>
+        </w:rPr>
+        <w:drawing>
+          <wp:inline distT="0" distB="0" distL="0" distR="0" wp14:anchorId="212FC09C" wp14:editId="3FFCEEF9">
+            <wp:extent cx="4680000" cy="3214286"/>
+            <wp:effectExtent l="0" t="0" r="0" b="0"/>
+            <wp:docPr id="13" name="Picture 13"/>
+            <wp:cNvGraphicFramePr>
+              <a:graphicFrameLocks xmlns:a="http://schemas.openxmlformats.org/drawingml/2006/main" noChangeAspect="1"/>
+            </wp:cNvGraphicFramePr>
+            <a:graphic xmlns:a="http://schemas.openxmlformats.org/drawingml/2006/main">
+              <a:graphicData uri="http://schemas.openxmlformats.org/drawingml/2006/picture">
+                <pic:pic xmlns:pic="http://schemas.openxmlformats.org/drawingml/2006/picture">
+                  <pic:nvPicPr>
+                    <pic:cNvPr id="0" name="b4_matrix.png"/>
+                    <pic:cNvPicPr/>
+                  </pic:nvPicPr>
+                  <pic:blipFill>
+                    <a:blip r:embed="rId23"/>
+                    <a:stretch>
+                      <a:fillRect/>
+                    </a:stretch>
+                  </pic:blipFill>
+                  <pic:spPr>
+                    <a:xfrm>
+                      <a:off x="0" y="0"/>
+                      <a:ext cx="4680000" cy="3214286"/>
+                    </a:xfrm>
+                    <a:prstGeom prst="rect">
+                      <a:avLst/>
+                    </a:prstGeom>
+                  </pic:spPr>
+                </pic:pic>
+              </a:graphicData>
+            </a:graphic>
+          </wp:inline>
+        </w:drawing>
+      </w:r>
+    </w:p>
+    <w:p>
+      <w:pPr>
+        <w:jc w:val="center"/>
+      </w:pPr>
+      <w:r>
+        <w:rPr>
+          <w:i/>
+          <w:color w:val="595959"/>
+          <w:sz w:val="18"/>
+        </w:rPr>
+        <w:t>Hình 6.1b – Ma tr</w:t>
+      </w:r>
+      <w:r>
+        <w:rPr>
+          <w:i/>
+          <w:color w:val="595959"/>
+          <w:sz w:val="18"/>
+        </w:rPr>
+        <w:t>ậ</w:t>
+      </w:r>
+      <w:r>
+        <w:rPr>
+          <w:i/>
+          <w:color w:val="595959"/>
+          <w:sz w:val="18"/>
+        </w:rPr>
+        <w:t>n xác su</w:t>
+      </w:r>
+      <w:r>
+        <w:rPr>
+          <w:i/>
+          <w:color w:val="595959"/>
+          <w:sz w:val="18"/>
+        </w:rPr>
+        <w:t>ấ</w:t>
+      </w:r>
+      <w:r>
+        <w:rPr>
+          <w:i/>
+          <w:color w:val="595959"/>
+          <w:sz w:val="18"/>
+        </w:rPr>
+        <w:t>t – tác đ</w:t>
+      </w:r>
+      <w:r>
+        <w:rPr>
+          <w:i/>
+          <w:color w:val="595959"/>
+          <w:sz w:val="18"/>
+        </w:rPr>
+        <w:t>ộ</w:t>
+      </w:r>
+      <w:r>
+        <w:rPr>
+          <w:i/>
+          <w:color w:val="595959"/>
+          <w:sz w:val="18"/>
+        </w:rPr>
+        <w:t>ng c</w:t>
+      </w:r>
+      <w:r>
+        <w:rPr>
+          <w:i/>
+          <w:color w:val="595959"/>
+          <w:sz w:val="18"/>
+        </w:rPr>
+        <w:t>ủ</w:t>
+      </w:r>
+      <w:r>
+        <w:rPr>
+          <w:i/>
+          <w:color w:val="595959"/>
+          <w:sz w:val="18"/>
+        </w:rPr>
+        <w:t>a Claude</w:t>
+      </w:r>
+    </w:p>
+    <w:p>
+      <w:pPr>
+        <w:keepNext/>
+        <w:jc w:val="center"/>
+      </w:pPr>
+      <w:r>
+        <w:rPr>
+          <w:noProof/>
+        </w:rPr>
+        <w:drawing>
+          <wp:inline distT="0" distB="0" distL="0" distR="0" wp14:anchorId="6568992D" wp14:editId="78C94190">
+            <wp:extent cx="3960000" cy="3265714"/>
+            <wp:effectExtent l="0" t="0" r="0" b="0"/>
+            <wp:docPr id="14" name="Picture 14"/>
+            <wp:cNvGraphicFramePr>
+              <a:graphicFrameLocks xmlns:a="http://schemas.openxmlformats.org/drawingml/2006/main" noChangeAspect="1"/>
+            </wp:cNvGraphicFramePr>
+            <a:graphic xmlns:a="http://schemas.openxmlformats.org/drawingml/2006/main">
+              <a:graphicData uri="http://schemas.openxmlformats.org/drawingml/2006/picture">
+                <pic:pic xmlns:pic="http://schemas.openxmlformats.org/drawingml/2006/picture">
+                  <pic:nvPicPr>
+                    <pic:cNvPr id="0" name="b4_questions.png"/>
+                    <pic:cNvPicPr/>
+                  </pic:nvPicPr>
+                  <pic:blipFill>
+                    <a:blip r:embed="rId24"/>
+                    <a:stretch>
+                      <a:fillRect/>
+                    </a:stretch>
+                  </pic:blipFill>
+                  <pic:spPr>
+                    <a:xfrm>
+                      <a:off x="0" y="0"/>
+                      <a:ext cx="3960000" cy="3265714"/>
+                    </a:xfrm>
+                    <a:prstGeom prst="rect">
+                      <a:avLst/>
+                    </a:prstGeom>
+                  </pic:spPr>
+                </pic:pic>
+              </a:graphicData>
+            </a:graphic>
+          </wp:inline>
+        </w:drawing>
+      </w:r>
+    </w:p>
+    <w:p>
+      <w:pPr>
+        <w:jc w:val="center"/>
+      </w:pPr>
+      <w:r>
+        <w:rPr>
+          <w:i/>
+          <w:color w:val="595959"/>
+          <w:sz w:val="18"/>
+        </w:rPr>
+        <w:t>Hình 6.1c – Câu h</w:t>
+      </w:r>
+      <w:r>
+        <w:rPr>
+          <w:i/>
+          <w:color w:val="595959"/>
+          <w:sz w:val="18"/>
+        </w:rPr>
+        <w:t>ỏ</w:t>
+      </w:r>
+      <w:r>
+        <w:rPr>
+          <w:i/>
+          <w:color w:val="595959"/>
+          <w:sz w:val="18"/>
+        </w:rPr>
+        <w:t>i c</w:t>
+      </w:r>
+      <w:r>
+        <w:rPr>
+          <w:i/>
+          <w:color w:val="595959"/>
+          <w:sz w:val="18"/>
+        </w:rPr>
+        <w:t>ầ</w:t>
+      </w:r>
+      <w:r>
+        <w:rPr>
+          <w:i/>
+          <w:color w:val="595959"/>
+          <w:sz w:val="18"/>
+        </w:rPr>
+        <w:t>n làm rõ v</w:t>
+      </w:r>
+      <w:r>
+        <w:rPr>
+          <w:i/>
+          <w:color w:val="595959"/>
+          <w:sz w:val="18"/>
+        </w:rPr>
+        <w:t>ớ</w:t>
+      </w:r>
+      <w:r>
+        <w:rPr>
+          <w:i/>
+          <w:color w:val="595959"/>
+          <w:sz w:val="18"/>
+        </w:rPr>
+        <w:t>i khách hàng do Claude đ</w:t>
+      </w:r>
+      <w:r>
+        <w:rPr>
+          <w:i/>
+          <w:color w:val="595959"/>
+          <w:sz w:val="18"/>
+        </w:rPr>
+        <w:t>ề</w:t>
+      </w:r>
+      <w:r>
+        <w:rPr>
+          <w:i/>
+          <w:color w:val="595959"/>
+          <w:sz w:val="18"/>
+        </w:rPr>
+        <w:t xml:space="preserve"> xu</w:t>
+      </w:r>
+      <w:r>
+        <w:rPr>
+          <w:i/>
+          <w:color w:val="595959"/>
+          <w:sz w:val="18"/>
+        </w:rPr>
+        <w:t>ấ</w:t>
+      </w:r>
+      <w:r>
+        <w:rPr>
+          <w:i/>
+          <w:color w:val="595959"/>
+          <w:sz w:val="18"/>
+        </w:rPr>
+        <w:t>t</w:t>
+      </w:r>
+    </w:p>
+    <w:p>
+      <w:pPr>
+        <w:spacing w:after="60"/>
+        <w:ind w:left="340" w:hanging="227"/>
+      </w:pPr>
+      <w:r>
+        <w:rPr>
+          <w:sz w:val="20"/>
+        </w:rPr>
+        <w:t>• S</w:t>
+      </w:r>
+      <w:r>
+        <w:rPr>
+          <w:sz w:val="20"/>
+        </w:rPr>
+        <w:t>ố</w:t>
+      </w:r>
+      <w:r>
+        <w:rPr>
+          <w:sz w:val="20"/>
+        </w:rPr>
+        <w:t xml:space="preserve"> lư</w:t>
+      </w:r>
+      <w:r>
+        <w:rPr>
+          <w:sz w:val="20"/>
+        </w:rPr>
+        <w:t>ợ</w:t>
+      </w:r>
+      <w:r>
+        <w:rPr>
+          <w:sz w:val="20"/>
+        </w:rPr>
+        <w:t>ng: Claude l</w:t>
+      </w:r>
+      <w:r>
+        <w:rPr>
+          <w:sz w:val="20"/>
+        </w:rPr>
+        <w:t>ậ</w:t>
+      </w:r>
+      <w:r>
+        <w:rPr>
+          <w:sz w:val="20"/>
+        </w:rPr>
+        <w:t>p 14 r</w:t>
+      </w:r>
+      <w:r>
+        <w:rPr>
+          <w:sz w:val="20"/>
+        </w:rPr>
+        <w:t>ủ</w:t>
+      </w:r>
+      <w:r>
+        <w:rPr>
+          <w:sz w:val="20"/>
+        </w:rPr>
+        <w:t>i ro và 1 cơ h</w:t>
+      </w:r>
+      <w:r>
+        <w:rPr>
+          <w:sz w:val="20"/>
+        </w:rPr>
+        <w:t>ộ</w:t>
+      </w:r>
+      <w:r>
+        <w:rPr>
+          <w:sz w:val="20"/>
+        </w:rPr>
+        <w:t>i (CH01); b</w:t>
+      </w:r>
+      <w:r>
+        <w:rPr>
+          <w:sz w:val="20"/>
+        </w:rPr>
+        <w:t>ả</w:t>
+      </w:r>
+      <w:r>
+        <w:rPr>
+          <w:sz w:val="20"/>
+        </w:rPr>
+        <w:t>n c</w:t>
+      </w:r>
+      <w:r>
+        <w:rPr>
+          <w:sz w:val="20"/>
+        </w:rPr>
+        <w:t>ủ</w:t>
+      </w:r>
+      <w:r>
+        <w:rPr>
+          <w:sz w:val="20"/>
+        </w:rPr>
+        <w:t>a nhóm có 10 r</w:t>
+      </w:r>
+      <w:r>
+        <w:rPr>
+          <w:sz w:val="20"/>
+        </w:rPr>
+        <w:t>ủ</w:t>
+      </w:r>
+      <w:r>
+        <w:rPr>
+          <w:sz w:val="20"/>
+        </w:rPr>
+        <w:t>i ro, c</w:t>
+      </w:r>
+      <w:r>
+        <w:rPr>
+          <w:sz w:val="20"/>
+        </w:rPr>
+        <w:t>ộ</w:t>
+      </w:r>
+      <w:r>
+        <w:rPr>
+          <w:sz w:val="20"/>
+        </w:rPr>
+        <w:t>ng 2 r</w:t>
+      </w:r>
+      <w:r>
+        <w:rPr>
+          <w:sz w:val="20"/>
+        </w:rPr>
+        <w:t>ủ</w:t>
+      </w:r>
+      <w:r>
+        <w:rPr>
+          <w:sz w:val="20"/>
+        </w:rPr>
+        <w:t>i ro nhóm t</w:t>
+      </w:r>
+      <w:r>
+        <w:rPr>
+          <w:sz w:val="20"/>
+        </w:rPr>
+        <w:t>ự</w:t>
+      </w:r>
+      <w:r>
+        <w:rPr>
+          <w:sz w:val="20"/>
+        </w:rPr>
+        <w:t xml:space="preserve"> b</w:t>
+      </w:r>
+      <w:r>
+        <w:rPr>
+          <w:sz w:val="20"/>
+        </w:rPr>
+        <w:t>ổ</w:t>
+      </w:r>
+      <w:r>
+        <w:rPr>
+          <w:sz w:val="20"/>
+        </w:rPr>
+        <w:t xml:space="preserve"> sung. Claude có thêm r</w:t>
+      </w:r>
+      <w:r>
+        <w:rPr>
+          <w:sz w:val="20"/>
+        </w:rPr>
+        <w:t>ủ</w:t>
+      </w:r>
+      <w:r>
+        <w:rPr>
+          <w:sz w:val="20"/>
+        </w:rPr>
+        <w:t>i ro tích c</w:t>
+      </w:r>
+      <w:r>
+        <w:rPr>
+          <w:sz w:val="20"/>
+        </w:rPr>
+        <w:t>ự</w:t>
+      </w:r>
+      <w:r>
+        <w:rPr>
+          <w:sz w:val="20"/>
+        </w:rPr>
+        <w:t>c (cơ h</w:t>
+      </w:r>
+      <w:r>
+        <w:rPr>
+          <w:sz w:val="20"/>
+        </w:rPr>
+        <w:t>ộ</w:t>
+      </w:r>
+      <w:r>
+        <w:rPr>
+          <w:sz w:val="20"/>
+        </w:rPr>
+        <w:t>i) theo PMBOK – b</w:t>
+      </w:r>
+      <w:r>
+        <w:rPr>
+          <w:sz w:val="20"/>
+        </w:rPr>
+        <w:t>ả</w:t>
+      </w:r>
+      <w:r>
+        <w:rPr>
+          <w:sz w:val="20"/>
+        </w:rPr>
+        <w:t>n nhóm chưa có.</w:t>
+      </w:r>
+    </w:p>
+    <w:p>
+      <w:pPr>
+        <w:spacing w:after="60"/>
+        <w:ind w:left="340" w:hanging="227"/>
+      </w:pPr>
+      <w:r>
+        <w:rPr>
+          <w:sz w:val="20"/>
+        </w:rPr>
+        <w:t>• Hai b</w:t>
+      </w:r>
+      <w:r>
+        <w:rPr>
+          <w:sz w:val="20"/>
+        </w:rPr>
+        <w:t>ả</w:t>
+      </w:r>
+      <w:r>
+        <w:rPr>
+          <w:sz w:val="20"/>
+        </w:rPr>
+        <w:t>n cùng xác đ</w:t>
+      </w:r>
+      <w:r>
+        <w:rPr>
+          <w:sz w:val="20"/>
+        </w:rPr>
+        <w:t>ị</w:t>
+      </w:r>
+      <w:r>
+        <w:rPr>
+          <w:sz w:val="20"/>
+        </w:rPr>
+        <w:t>nh 4 r</w:t>
+      </w:r>
+      <w:r>
+        <w:rPr>
+          <w:sz w:val="20"/>
+        </w:rPr>
+        <w:t>ủ</w:t>
+      </w:r>
+      <w:r>
+        <w:rPr>
+          <w:sz w:val="20"/>
+        </w:rPr>
+        <w:t>i ro đi</w:t>
+      </w:r>
+      <w:r>
+        <w:rPr>
+          <w:sz w:val="20"/>
+        </w:rPr>
+        <w:t>ể</w:t>
+      </w:r>
+      <w:r>
+        <w:rPr>
+          <w:sz w:val="20"/>
+        </w:rPr>
+        <w:t>m cao nh</w:t>
+      </w:r>
+      <w:r>
+        <w:rPr>
+          <w:sz w:val="20"/>
+        </w:rPr>
+        <w:t>ấ</w:t>
+      </w:r>
+      <w:r>
+        <w:rPr>
+          <w:sz w:val="20"/>
+        </w:rPr>
+        <w:t>t xoay quanh: k</w:t>
+      </w:r>
+      <w:r>
+        <w:rPr>
+          <w:sz w:val="20"/>
+        </w:rPr>
+        <w:t>ế</w:t>
+      </w:r>
+      <w:r>
+        <w:rPr>
+          <w:sz w:val="20"/>
+        </w:rPr>
+        <w:t>t n</w:t>
+      </w:r>
+      <w:r>
+        <w:rPr>
+          <w:sz w:val="20"/>
+        </w:rPr>
+        <w:t>ố</w:t>
+      </w:r>
+      <w:r>
+        <w:rPr>
+          <w:sz w:val="20"/>
+        </w:rPr>
+        <w:t>i ph</w:t>
+      </w:r>
+      <w:r>
+        <w:rPr>
+          <w:sz w:val="20"/>
+        </w:rPr>
+        <w:t>ầ</w:t>
+      </w:r>
+      <w:r>
+        <w:rPr>
+          <w:sz w:val="20"/>
+        </w:rPr>
+        <w:t>n m</w:t>
+      </w:r>
+      <w:r>
+        <w:rPr>
+          <w:sz w:val="20"/>
+        </w:rPr>
+        <w:t>ề</w:t>
+      </w:r>
+      <w:r>
+        <w:rPr>
+          <w:sz w:val="20"/>
+        </w:rPr>
+        <w:t>m bán hàng, tr</w:t>
+      </w:r>
+      <w:r>
+        <w:rPr>
+          <w:sz w:val="20"/>
+        </w:rPr>
+        <w:t>ễ</w:t>
+      </w:r>
+      <w:r>
+        <w:rPr>
+          <w:sz w:val="20"/>
+        </w:rPr>
+        <w:t xml:space="preserve"> ti</w:t>
+      </w:r>
+      <w:r>
+        <w:rPr>
+          <w:sz w:val="20"/>
+        </w:rPr>
+        <w:t>ế</w:t>
+      </w:r>
+      <w:r>
+        <w:rPr>
+          <w:sz w:val="20"/>
+        </w:rPr>
+        <w:t>n đ</w:t>
+      </w:r>
+      <w:r>
+        <w:rPr>
+          <w:sz w:val="20"/>
+        </w:rPr>
+        <w:t>ộ</w:t>
+      </w:r>
+      <w:r>
+        <w:rPr>
+          <w:sz w:val="20"/>
+        </w:rPr>
+        <w:t>, backend quá t</w:t>
+      </w:r>
+      <w:r>
+        <w:rPr>
+          <w:sz w:val="20"/>
+        </w:rPr>
+        <w:t>ả</w:t>
+      </w:r>
+      <w:r>
+        <w:rPr>
+          <w:sz w:val="20"/>
+        </w:rPr>
+        <w:t>i, d</w:t>
+      </w:r>
+      <w:r>
+        <w:rPr>
+          <w:sz w:val="20"/>
+        </w:rPr>
+        <w:t>ữ</w:t>
+      </w:r>
+      <w:r>
+        <w:rPr>
+          <w:sz w:val="20"/>
+        </w:rPr>
+        <w:t xml:space="preserve"> li</w:t>
+      </w:r>
+      <w:r>
+        <w:rPr>
+          <w:sz w:val="20"/>
+        </w:rPr>
+        <w:t>ệ</w:t>
+      </w:r>
+      <w:r>
+        <w:rPr>
+          <w:sz w:val="20"/>
+        </w:rPr>
+        <w:t>u cũ l</w:t>
+      </w:r>
+      <w:r>
+        <w:rPr>
+          <w:sz w:val="20"/>
+        </w:rPr>
+        <w:t>ỗ</w:t>
+      </w:r>
+      <w:r>
+        <w:rPr>
+          <w:sz w:val="20"/>
+        </w:rPr>
+        <w:t>i khi chuy</w:t>
+      </w:r>
+      <w:r>
+        <w:rPr>
+          <w:sz w:val="20"/>
+        </w:rPr>
+        <w:t>ể</w:t>
+      </w:r>
+      <w:r>
+        <w:rPr>
+          <w:sz w:val="20"/>
+        </w:rPr>
+        <w:t>n đ</w:t>
+      </w:r>
+      <w:r>
+        <w:rPr>
+          <w:sz w:val="20"/>
+        </w:rPr>
+        <w:t>ổ</w:t>
+      </w:r>
+      <w:r>
+        <w:rPr>
+          <w:sz w:val="20"/>
+        </w:rPr>
+        <w:t>i.</w:t>
+      </w:r>
+    </w:p>
+    <w:p>
+      <w:pPr>
+        <w:spacing w:after="60"/>
+        <w:ind w:left="340" w:hanging="227"/>
+      </w:pPr>
+      <w:r>
+        <w:rPr>
+          <w:sz w:val="20"/>
+        </w:rPr>
+        <w:t>• Claude ch</w:t>
+      </w:r>
+      <w:r>
+        <w:rPr>
+          <w:sz w:val="20"/>
+        </w:rPr>
+        <w:t>ấ</w:t>
+      </w:r>
+      <w:r>
+        <w:rPr>
+          <w:sz w:val="20"/>
+        </w:rPr>
+        <w:t>m "tr</w:t>
+      </w:r>
+      <w:r>
+        <w:rPr>
+          <w:sz w:val="20"/>
+        </w:rPr>
+        <w:t>ễ</w:t>
+      </w:r>
+      <w:r>
+        <w:rPr>
+          <w:sz w:val="20"/>
+        </w:rPr>
+        <w:t xml:space="preserve"> go-live" (R02) 25 đi</w:t>
+      </w:r>
+      <w:r>
+        <w:rPr>
+          <w:sz w:val="20"/>
+        </w:rPr>
+        <w:t>ể</w:t>
+      </w:r>
+      <w:r>
+        <w:rPr>
+          <w:sz w:val="20"/>
+        </w:rPr>
+        <w:t>m (P5 × I5) d</w:t>
+      </w:r>
+      <w:r>
+        <w:rPr>
+          <w:sz w:val="20"/>
+        </w:rPr>
+        <w:t>ự</w:t>
+      </w:r>
+      <w:r>
+        <w:rPr>
+          <w:sz w:val="20"/>
+        </w:rPr>
+        <w:t>a trên xác su</w:t>
+      </w:r>
+      <w:r>
+        <w:rPr>
+          <w:sz w:val="20"/>
+        </w:rPr>
+        <w:t>ấ</w:t>
+      </w:r>
+      <w:r>
+        <w:rPr>
+          <w:sz w:val="20"/>
+        </w:rPr>
+        <w:t>t k</w:t>
+      </w:r>
+      <w:r>
+        <w:rPr>
+          <w:sz w:val="20"/>
+        </w:rPr>
+        <w:t>ị</w:t>
+      </w:r>
+      <w:r>
+        <w:rPr>
+          <w:sz w:val="20"/>
+        </w:rPr>
+        <w:t>p h</w:t>
+      </w:r>
+      <w:r>
+        <w:rPr>
+          <w:sz w:val="20"/>
+        </w:rPr>
+        <w:t>ạ</w:t>
+      </w:r>
+      <w:r>
+        <w:rPr>
+          <w:sz w:val="20"/>
+        </w:rPr>
+        <w:t>n 0,09% c</w:t>
+      </w:r>
+      <w:r>
+        <w:rPr>
+          <w:sz w:val="20"/>
+        </w:rPr>
+        <w:t>ủ</w:t>
+      </w:r>
+      <w:r>
+        <w:rPr>
+          <w:sz w:val="20"/>
+        </w:rPr>
+        <w:t>a l</w:t>
+      </w:r>
+      <w:r>
+        <w:rPr>
+          <w:sz w:val="20"/>
+        </w:rPr>
+        <w:t>ị</w:t>
+      </w:r>
+      <w:r>
+        <w:rPr>
+          <w:sz w:val="20"/>
+        </w:rPr>
+        <w:t>ch g</w:t>
+      </w:r>
+      <w:r>
+        <w:rPr>
+          <w:sz w:val="20"/>
+        </w:rPr>
+        <w:t>ố</w:t>
+      </w:r>
+      <w:r>
+        <w:rPr>
+          <w:sz w:val="20"/>
+        </w:rPr>
+        <w:t>c; b</w:t>
+      </w:r>
+      <w:r>
+        <w:rPr>
+          <w:sz w:val="20"/>
+        </w:rPr>
+        <w:t>ả</w:t>
+      </w:r>
+      <w:r>
+        <w:rPr>
+          <w:sz w:val="20"/>
+        </w:rPr>
+        <w:t>n nhóm ch</w:t>
+      </w:r>
+      <w:r>
+        <w:rPr>
+          <w:sz w:val="20"/>
+        </w:rPr>
+        <w:t>ấ</w:t>
+      </w:r>
+      <w:r>
+        <w:rPr>
+          <w:sz w:val="20"/>
+        </w:rPr>
+        <w:t>m 16 vì đã tính phương án nén l</w:t>
+      </w:r>
+      <w:r>
+        <w:rPr>
+          <w:sz w:val="20"/>
+        </w:rPr>
+        <w:t>ị</w:t>
+      </w:r>
+      <w:r>
+        <w:rPr>
+          <w:sz w:val="20"/>
+        </w:rPr>
+        <w:t xml:space="preserve">ch </w:t>
+      </w:r>
+      <w:r>
+        <w:rPr>
+          <w:sz w:val="20"/>
+        </w:rPr>
+        <w:t>ở</w:t>
+      </w:r>
+      <w:r>
+        <w:rPr>
+          <w:sz w:val="20"/>
+        </w:rPr>
+        <w:t xml:space="preserve"> m</w:t>
+      </w:r>
+      <w:r>
+        <w:rPr>
+          <w:sz w:val="20"/>
+        </w:rPr>
+        <w:t>ụ</w:t>
+      </w:r>
+      <w:r>
+        <w:rPr>
+          <w:sz w:val="20"/>
+        </w:rPr>
+        <w:t>c 4.5. Khác bi</w:t>
+      </w:r>
+      <w:r>
+        <w:rPr>
+          <w:sz w:val="20"/>
+        </w:rPr>
+        <w:t>ệ</w:t>
+      </w:r>
+      <w:r>
+        <w:rPr>
+          <w:sz w:val="20"/>
+        </w:rPr>
+        <w:t>t do m</w:t>
+      </w:r>
+      <w:r>
+        <w:rPr>
+          <w:sz w:val="20"/>
+        </w:rPr>
+        <w:t>ố</w:t>
+      </w:r>
+      <w:r>
+        <w:rPr>
+          <w:sz w:val="20"/>
+        </w:rPr>
+        <w:t>c đánh giá trư</w:t>
+      </w:r>
+      <w:r>
+        <w:rPr>
+          <w:sz w:val="20"/>
+        </w:rPr>
+        <w:t>ớ</w:t>
+      </w:r>
+      <w:r>
+        <w:rPr>
+          <w:sz w:val="20"/>
+        </w:rPr>
+        <w:t>c/sau khi nén l</w:t>
+      </w:r>
+      <w:r>
+        <w:rPr>
+          <w:sz w:val="20"/>
+        </w:rPr>
+        <w:t>ị</w:t>
+      </w:r>
+      <w:r>
+        <w:rPr>
+          <w:sz w:val="20"/>
+        </w:rPr>
+        <w:t>ch.</w:t>
+      </w:r>
+    </w:p>
+    <w:p>
+      <w:pPr>
+        <w:spacing w:after="60"/>
+        <w:ind w:left="340" w:hanging="227"/>
+      </w:pPr>
+      <w:r>
+        <w:rPr>
+          <w:sz w:val="20"/>
+        </w:rPr>
+        <w:t>• Claude có b</w:t>
+      </w:r>
+      <w:r>
+        <w:rPr>
+          <w:sz w:val="20"/>
+        </w:rPr>
+        <w:t>ả</w:t>
+      </w:r>
+      <w:r>
+        <w:rPr>
+          <w:sz w:val="20"/>
+        </w:rPr>
+        <w:t>ng đ</w:t>
+      </w:r>
+      <w:r>
+        <w:rPr>
+          <w:sz w:val="20"/>
+        </w:rPr>
+        <w:t>ị</w:t>
+      </w:r>
+      <w:r>
+        <w:rPr>
+          <w:sz w:val="20"/>
+        </w:rPr>
+        <w:t>nh nghĩa thang đo 1–5 theo ti</w:t>
+      </w:r>
+      <w:r>
+        <w:rPr>
+          <w:sz w:val="20"/>
+        </w:rPr>
+        <w:t>ế</w:t>
+      </w:r>
+      <w:r>
+        <w:rPr>
+          <w:sz w:val="20"/>
+        </w:rPr>
+        <w:t>n đ</w:t>
+      </w:r>
+      <w:r>
+        <w:rPr>
+          <w:sz w:val="20"/>
+        </w:rPr>
+        <w:t>ộ</w:t>
+      </w:r>
+      <w:r>
+        <w:rPr>
+          <w:sz w:val="20"/>
+        </w:rPr>
+        <w:t>, chi phí, ph</w:t>
+      </w:r>
+      <w:r>
+        <w:rPr>
+          <w:sz w:val="20"/>
+        </w:rPr>
+        <w:t>ạ</w:t>
+      </w:r>
+      <w:r>
+        <w:rPr>
+          <w:sz w:val="20"/>
+        </w:rPr>
+        <w:t>m vi nên ch</w:t>
+      </w:r>
+      <w:r>
+        <w:rPr>
+          <w:sz w:val="20"/>
+        </w:rPr>
+        <w:t>ấ</w:t>
+      </w:r>
+      <w:r>
+        <w:rPr>
+          <w:sz w:val="20"/>
+        </w:rPr>
+        <w:t>m đi</w:t>
+      </w:r>
+      <w:r>
+        <w:rPr>
+          <w:sz w:val="20"/>
+        </w:rPr>
+        <w:t>ể</w:t>
+      </w:r>
+      <w:r>
+        <w:rPr>
+          <w:sz w:val="20"/>
+        </w:rPr>
+        <w:t>m nh</w:t>
+      </w:r>
+      <w:r>
+        <w:rPr>
+          <w:sz w:val="20"/>
+        </w:rPr>
+        <w:t>ấ</w:t>
+      </w:r>
+      <w:r>
+        <w:rPr>
+          <w:sz w:val="20"/>
+        </w:rPr>
+        <w:t>t quán hơn; b</w:t>
+      </w:r>
+      <w:r>
+        <w:rPr>
+          <w:sz w:val="20"/>
+        </w:rPr>
+        <w:t>ả</w:t>
+      </w:r>
+      <w:r>
+        <w:rPr>
+          <w:sz w:val="20"/>
+        </w:rPr>
+        <w:t>n nhóm chưa có thang đo chi ti</w:t>
+      </w:r>
+      <w:r>
+        <w:rPr>
+          <w:sz w:val="20"/>
+        </w:rPr>
+        <w:t>ế</w:t>
+      </w:r>
+      <w:r>
+        <w:rPr>
+          <w:sz w:val="20"/>
+        </w:rPr>
+        <w:t>t.</w:t>
+      </w:r>
+    </w:p>
+    <w:p>
+      <w:pPr>
+        <w:spacing w:after="60"/>
+        <w:ind w:left="340" w:hanging="227"/>
+      </w:pPr>
+      <w:r>
+        <w:rPr>
+          <w:sz w:val="20"/>
+        </w:rPr>
+        <w:t>• Claude nêu thêm r</w:t>
+      </w:r>
+      <w:r>
+        <w:rPr>
+          <w:sz w:val="20"/>
+        </w:rPr>
+        <w:t>ủ</w:t>
+      </w:r>
+      <w:r>
+        <w:rPr>
+          <w:sz w:val="20"/>
+        </w:rPr>
+        <w:t>i ro b</w:t>
+      </w:r>
+      <w:r>
+        <w:rPr>
+          <w:sz w:val="20"/>
+        </w:rPr>
+        <w:t>ả</w:t>
+      </w:r>
+      <w:r>
+        <w:rPr>
+          <w:sz w:val="20"/>
+        </w:rPr>
+        <w:t>n nhóm chưa có, ví d</w:t>
+      </w:r>
+      <w:r>
+        <w:rPr>
+          <w:sz w:val="20"/>
+        </w:rPr>
+        <w:t>ụ</w:t>
+      </w:r>
+      <w:r>
+        <w:rPr>
+          <w:sz w:val="20"/>
+        </w:rPr>
+        <w:t xml:space="preserve"> R05 tranh ch</w:t>
+      </w:r>
+      <w:r>
+        <w:rPr>
+          <w:sz w:val="20"/>
+        </w:rPr>
+        <w:t>ấ</w:t>
+      </w:r>
+      <w:r>
+        <w:rPr>
+          <w:sz w:val="20"/>
+        </w:rPr>
+        <w:t>p nghi</w:t>
+      </w:r>
+      <w:r>
+        <w:rPr>
+          <w:sz w:val="20"/>
+        </w:rPr>
+        <w:t>ệ</w:t>
+      </w:r>
+      <w:r>
+        <w:rPr>
+          <w:sz w:val="20"/>
+        </w:rPr>
+        <w:t>m thu "g</w:t>
+      </w:r>
+      <w:r>
+        <w:rPr>
+          <w:sz w:val="20"/>
+        </w:rPr>
+        <w:t>ầ</w:t>
+      </w:r>
+      <w:r>
+        <w:rPr>
+          <w:sz w:val="20"/>
+        </w:rPr>
+        <w:t>n như th</w:t>
+      </w:r>
+      <w:r>
+        <w:rPr>
+          <w:sz w:val="20"/>
+        </w:rPr>
+        <w:t>ờ</w:t>
+      </w:r>
+      <w:r>
+        <w:rPr>
+          <w:sz w:val="20"/>
+        </w:rPr>
+        <w:t>i gian th</w:t>
+      </w:r>
+      <w:r>
+        <w:rPr>
+          <w:sz w:val="20"/>
+        </w:rPr>
+        <w:t>ự</w:t>
+      </w:r>
+      <w:r>
+        <w:rPr>
+          <w:sz w:val="20"/>
+        </w:rPr>
+        <w:t>c" và R11 phía khách hàng ch</w:t>
+      </w:r>
+      <w:r>
+        <w:rPr>
+          <w:sz w:val="20"/>
+        </w:rPr>
+        <w:t>ậ</w:t>
+      </w:r>
+      <w:r>
+        <w:rPr>
+          <w:sz w:val="20"/>
+        </w:rPr>
+        <w:t>m duy</w:t>
+      </w:r>
+      <w:r>
+        <w:rPr>
+          <w:sz w:val="20"/>
+        </w:rPr>
+        <w:t>ệ</w:t>
+      </w:r>
+      <w:r>
+        <w:rPr>
+          <w:sz w:val="20"/>
+        </w:rPr>
+        <w:t>t khi ch</w:t>
+      </w:r>
+      <w:r>
+        <w:rPr>
+          <w:sz w:val="20"/>
+        </w:rPr>
+        <w:t>ủ</w:t>
+      </w:r>
+      <w:r>
+        <w:rPr>
+          <w:sz w:val="20"/>
+        </w:rPr>
+        <w:t xml:space="preserve"> nhà thu</w:t>
+      </w:r>
+      <w:r>
+        <w:rPr>
+          <w:sz w:val="20"/>
+        </w:rPr>
+        <w:t>ố</w:t>
+      </w:r>
+      <w:r>
+        <w:rPr>
+          <w:sz w:val="20"/>
+        </w:rPr>
+        <w:t>c v</w:t>
+      </w:r>
+      <w:r>
+        <w:rPr>
+          <w:sz w:val="20"/>
+        </w:rPr>
+        <w:t>ắ</w:t>
+      </w:r>
+      <w:r>
+        <w:rPr>
+          <w:sz w:val="20"/>
+        </w:rPr>
+        <w:t>ng. Vì v</w:t>
+      </w:r>
+      <w:r>
+        <w:rPr>
+          <w:sz w:val="20"/>
+        </w:rPr>
+        <w:t>ậ</w:t>
+      </w:r>
+      <w:r>
+        <w:rPr>
+          <w:sz w:val="20"/>
+        </w:rPr>
+        <w:t>y 2 r</w:t>
+      </w:r>
+      <w:r>
+        <w:rPr>
+          <w:sz w:val="20"/>
+        </w:rPr>
+        <w:t>ủ</w:t>
+      </w:r>
+      <w:r>
+        <w:rPr>
+          <w:sz w:val="20"/>
+        </w:rPr>
+        <w:t>i ro nhóm t</w:t>
+      </w:r>
+      <w:r>
+        <w:rPr>
+          <w:sz w:val="20"/>
+        </w:rPr>
+        <w:t>ự</w:t>
+      </w:r>
+      <w:r>
+        <w:rPr>
+          <w:sz w:val="20"/>
+        </w:rPr>
+        <w:t xml:space="preserve"> b</w:t>
+      </w:r>
+      <w:r>
+        <w:rPr>
+          <w:sz w:val="20"/>
+        </w:rPr>
+        <w:t>ổ</w:t>
+      </w:r>
+      <w:r>
+        <w:rPr>
+          <w:sz w:val="20"/>
+        </w:rPr>
+        <w:t xml:space="preserve"> sung (R11, R12 </w:t>
+      </w:r>
+      <w:r>
+        <w:rPr>
+          <w:sz w:val="20"/>
+        </w:rPr>
+        <w:t>ở</w:t>
+      </w:r>
+      <w:r>
+        <w:rPr>
+          <w:sz w:val="20"/>
+        </w:rPr>
+        <w:t xml:space="preserve"> b</w:t>
+      </w:r>
+      <w:r>
+        <w:rPr>
+          <w:sz w:val="20"/>
+        </w:rPr>
+        <w:t>ả</w:t>
+      </w:r>
+      <w:r>
+        <w:rPr>
+          <w:sz w:val="20"/>
+        </w:rPr>
+        <w:t>ng trên) ph</w:t>
+      </w:r>
+      <w:r>
+        <w:rPr>
+          <w:sz w:val="20"/>
+        </w:rPr>
+        <w:t>ả</w:t>
+      </w:r>
+      <w:r>
+        <w:rPr>
+          <w:sz w:val="20"/>
+        </w:rPr>
+        <w:t>i khác c</w:t>
+      </w:r>
+      <w:r>
+        <w:rPr>
+          <w:sz w:val="20"/>
+        </w:rPr>
+        <w:t>ả</w:t>
+      </w:r>
+      <w:r>
+        <w:rPr>
+          <w:sz w:val="20"/>
+        </w:rPr>
+        <w:t xml:space="preserve"> 14 r</w:t>
+      </w:r>
+      <w:r>
+        <w:rPr>
+          <w:sz w:val="20"/>
+        </w:rPr>
+        <w:t>ủ</w:t>
+      </w:r>
+      <w:r>
+        <w:rPr>
+          <w:sz w:val="20"/>
+        </w:rPr>
+        <w:t>i ro c</w:t>
+      </w:r>
+      <w:r>
+        <w:rPr>
+          <w:sz w:val="20"/>
+        </w:rPr>
+        <w:t>ủ</w:t>
+      </w:r>
+      <w:r>
+        <w:rPr>
+          <w:sz w:val="20"/>
+        </w:rPr>
+        <w:t>a Claude.</w:t>
+      </w:r>
+    </w:p>
+    <w:p>
+      <w:pPr>
+        <w:spacing w:after="60"/>
+        <w:ind w:left="340" w:hanging="227"/>
+      </w:pPr>
+      <w:r>
+        <w:rPr>
+          <w:sz w:val="20"/>
+        </w:rPr>
+        <w:t>• Lưu ý: prompt Bài 4 g</w:t>
+      </w:r>
+      <w:r>
+        <w:rPr>
+          <w:sz w:val="20"/>
+        </w:rPr>
+        <w:t>ử</w:t>
+      </w:r>
+      <w:r>
+        <w:rPr>
+          <w:sz w:val="20"/>
+        </w:rPr>
+        <w:t>i thi</w:t>
+      </w:r>
+      <w:r>
+        <w:rPr>
+          <w:sz w:val="20"/>
+        </w:rPr>
+        <w:t>ế</w:t>
+      </w:r>
+      <w:r>
+        <w:rPr>
+          <w:sz w:val="20"/>
+        </w:rPr>
+        <w:t>u n</w:t>
+      </w:r>
+      <w:r>
+        <w:rPr>
+          <w:sz w:val="20"/>
+        </w:rPr>
+        <w:t>ộ</w:t>
+      </w:r>
+      <w:r>
+        <w:rPr>
+          <w:sz w:val="20"/>
+        </w:rPr>
+        <w:t>i dung chi ti</w:t>
+      </w:r>
+      <w:r>
+        <w:rPr>
+          <w:sz w:val="20"/>
+        </w:rPr>
+        <w:t>ế</w:t>
+      </w:r>
+      <w:r>
+        <w:rPr>
+          <w:sz w:val="20"/>
+        </w:rPr>
+        <w:t>t nên Claude dùng khung PMBOK m</w:t>
+      </w:r>
+      <w:r>
+        <w:rPr>
+          <w:sz w:val="20"/>
+        </w:rPr>
+        <w:t>ặ</w:t>
+      </w:r>
+      <w:r>
+        <w:rPr>
+          <w:sz w:val="20"/>
+        </w:rPr>
+        <w:t>c đ</w:t>
+      </w:r>
+      <w:r>
+        <w:rPr>
+          <w:sz w:val="20"/>
+        </w:rPr>
+        <w:t>ị</w:t>
+      </w:r>
+      <w:r>
+        <w:rPr>
+          <w:sz w:val="20"/>
+        </w:rPr>
+        <w:t>nh; c</w:t>
+      </w:r>
+      <w:r>
+        <w:rPr>
+          <w:sz w:val="20"/>
+        </w:rPr>
+        <w:t>ầ</w:t>
+      </w:r>
+      <w:r>
+        <w:rPr>
+          <w:sz w:val="20"/>
+        </w:rPr>
+        <w:t>n ki</w:t>
+      </w:r>
+      <w:r>
+        <w:rPr>
+          <w:sz w:val="20"/>
+        </w:rPr>
+        <w:t>ể</w:t>
+      </w:r>
+      <w:r>
+        <w:rPr>
+          <w:sz w:val="20"/>
+        </w:rPr>
+        <w:t>m tra b</w:t>
+      </w:r>
+      <w:r>
+        <w:rPr>
+          <w:sz w:val="20"/>
+        </w:rPr>
+        <w:t>ả</w:t>
+      </w:r>
+      <w:r>
+        <w:rPr>
+          <w:sz w:val="20"/>
+        </w:rPr>
+        <w:t>ng c</w:t>
+      </w:r>
+      <w:r>
+        <w:rPr>
+          <w:sz w:val="20"/>
+        </w:rPr>
+        <w:t>ủ</w:t>
+      </w:r>
+      <w:r>
+        <w:rPr>
+          <w:sz w:val="20"/>
+        </w:rPr>
+        <w:t>a Claude có đ</w:t>
+      </w:r>
+      <w:r>
+        <w:rPr>
+          <w:sz w:val="20"/>
+        </w:rPr>
+        <w:t>ủ</w:t>
+      </w:r>
+      <w:r>
+        <w:rPr>
+          <w:sz w:val="20"/>
+        </w:rPr>
+        <w:t xml:space="preserve"> c</w:t>
+      </w:r>
+      <w:r>
+        <w:rPr>
+          <w:sz w:val="20"/>
+        </w:rPr>
+        <w:t>ộ</w:t>
+      </w:r>
+      <w:r>
+        <w:rPr>
+          <w:sz w:val="20"/>
+        </w:rPr>
+        <w:t>t Chi</w:t>
+      </w:r>
+      <w:r>
+        <w:rPr>
+          <w:sz w:val="20"/>
+        </w:rPr>
+        <w:t>ế</w:t>
+      </w:r>
+      <w:r>
+        <w:rPr>
+          <w:sz w:val="20"/>
+        </w:rPr>
+        <w:t>n lư</w:t>
+      </w:r>
+      <w:r>
+        <w:rPr>
+          <w:sz w:val="20"/>
+        </w:rPr>
+        <w:t>ợ</w:t>
+      </w:r>
+      <w:r>
+        <w:rPr>
+          <w:sz w:val="20"/>
+        </w:rPr>
+        <w:t>c và Ngư</w:t>
+      </w:r>
+      <w:r>
+        <w:rPr>
+          <w:sz w:val="20"/>
+        </w:rPr>
+        <w:t>ờ</w:t>
+      </w:r>
+      <w:r>
+        <w:rPr>
+          <w:sz w:val="20"/>
+        </w:rPr>
+        <w:t>i ph</w:t>
+      </w:r>
+      <w:r>
+        <w:rPr>
+          <w:sz w:val="20"/>
+        </w:rPr>
+        <w:t>ụ</w:t>
+      </w:r>
+      <w:r>
+        <w:rPr>
+          <w:sz w:val="20"/>
+        </w:rPr>
+        <w:t xml:space="preserve"> trách như đ</w:t>
+      </w:r>
+      <w:r>
+        <w:rPr>
+          <w:sz w:val="20"/>
+        </w:rPr>
+        <w:t>ề</w:t>
+      </w:r>
+      <w:r>
+        <w:rPr>
+          <w:sz w:val="20"/>
+        </w:rPr>
+        <w:t xml:space="preserve"> yêu c</w:t>
+      </w:r>
+      <w:r>
+        <w:rPr>
+          <w:sz w:val="20"/>
+        </w:rPr>
+        <w:t>ầ</w:t>
+      </w:r>
+      <w:r>
+        <w:rPr>
+          <w:sz w:val="20"/>
+        </w:rPr>
+        <w:t>u.</w:t>
+      </w:r>
+    </w:p>
+    <w:p>
+      <w:pPr>
         <w:sectPr>
-          <w:footerReference w:type="default" r:id="rId22"/>
+          <w:footerReference w:type="default" r:id="rId25"/>
           <w:pgSz w:w="16838" w:h="11906" w:orient="landscape"/>
           <w:pgMar w:top="1134" w:right="1134" w:bottom="1134" w:left="1134" w:header="708" w:footer="708" w:gutter="0"/>
           <w:cols w:space="720"/>
@@ -44020,7 +44196,7 @@
         <w:keepNext/>
         <w:keepLines/>
       </w:pPr>
-      <w:bookmarkStart w:id="23" w:name="_Toc242014673"/>
+      <w:bookmarkStart w:id="23" w:name="_Toc242015357"/>
       <w:r>
         <w:t>6.1 Ma trận xác suất – tác động</w:t>
       </w:r>
@@ -44054,7 +44230,7 @@
                     </pic:cNvPicPr>
                   </pic:nvPicPr>
                   <pic:blipFill>
-                    <a:blip r:embed="rId23"/>
+                    <a:blip r:embed="rId26"/>
                     <a:srcRect/>
                     <a:stretch>
                       <a:fillRect/>
@@ -44098,7 +44274,7 @@
         <w:keepNext/>
         <w:keepLines/>
       </w:pPr>
-      <w:bookmarkStart w:id="24" w:name="_Toc242014674"/>
+      <w:bookmarkStart w:id="24" w:name="_Toc242015358"/>
       <w:r>
         <w:t>6.2 Kế hoạch dự phòng cho rủi ro điểm cao nhất – R01</w:t>
       </w:r>
@@ -44666,7 +44842,7 @@
         <w:keepNext/>
         <w:keepLines/>
       </w:pPr>
-      <w:bookmarkStart w:id="25" w:name="_Toc242014675"/>
+      <w:bookmarkStart w:id="25" w:name="_Toc242015359"/>
       <w:r>
         <w:t>7. Phản biện đầu ra AI</w:t>
       </w:r>
@@ -45297,7 +45473,7 @@
         <w:keepNext/>
         <w:keepLines/>
       </w:pPr>
-      <w:bookmarkStart w:id="26" w:name="_Toc242014676"/>
+      <w:bookmarkStart w:id="26" w:name="_Toc242015360"/>
       <w:r>
         <w:t>7.1 Phản tư</w:t>
       </w:r>
@@ -45361,7 +45537,7 @@
         <w:keepNext/>
         <w:keepLines/>
       </w:pPr>
-      <w:bookmarkStart w:id="27" w:name="_Toc242014677"/>
+      <w:bookmarkStart w:id="27" w:name="_Toc242015361"/>
       <w:r>
         <w:t>8. Nhật ký sử dụng AI</w:t>
       </w:r>
@@ -45815,7 +45991,7 @@
               <w:rPr>
                 <w:sz w:val="18"/>
               </w:rPr>
-              <w:t>Claude Code: rà soát và viết lại mục tiêu SMART (1, 2, 4), đối chiếu phạm vi, chọn 3 câu hỏi ưu tiên, vẽ sơ đồ cây WBS, đề xuất phương án nén lịch và lập sheet NenLich; nhập TE của Claude Project vào Excel; soạn phần đối chiếu Bài 1, Bài 2 và bảng so sánh 4.4</w:t>
+              <w:t>Claude Code: rà soát và viết lại mục tiêu SMART (1, 2, 4), đối chiếu phạm vi, chọn 3 câu hỏi ưu tiên, vẽ sơ đồ cây WBS, đề xuất phương án nén lịch và lập sheet NenLich; nhập TE của Claude Project vào Excel; soạn phần đối chiếu Bài 1, 2, 4 và bảng so sánh 4.4</w:t>
             </w:r>
           </w:p>
         </w:tc>
@@ -46411,9 +46587,8 @@
             <w:r>
               <w:rPr>
                 <w:sz w:val="18"/>
-                <w:szCs w:val="18"/>
-              </w:rPr>
-              <w:t>Lập Risk Register ≥ 8 rủi ro, cấu trúc Nguyên nhân – Sự kiện – Hậu quả, sắp theo điểm</w:t>
+              </w:rPr>
+              <w:t>Bai4_RuiRo – gửi thiếu nội dung chi tiết của đề, Claude tự dùng khung Risk Register mặc định theo PMBOK (thang 1–5, ma trận P×I)</w:t>
             </w:r>
           </w:p>
         </w:tc>
@@ -46439,12 +46614,9 @@
             </w:pPr>
             <w:r>
               <w:rPr>
-                <w:i/>
-                <w:iCs/>
-                <w:color w:val="7A5C00"/>
-                <w:highlight w:val="yellow"/>
-              </w:rPr>
-              <w:t>[NHÓM ĐIỀN: …]</w:t>
+                <w:sz w:val="18"/>
+              </w:rPr>
+              <w:t>14 rủi ro + 1 cơ hội; thang đo 1–5 được định nghĩa rõ theo tiến độ/chi phí/phạm vi; căn cứ số liệu từ Bài 2, Bài 3; có ma trận và câu hỏi cho khách hàng.</w:t>
             </w:r>
           </w:p>
         </w:tc>
@@ -46470,12 +46642,9 @@
             </w:pPr>
             <w:r>
               <w:rPr>
-                <w:i/>
-                <w:iCs/>
-                <w:color w:val="7A5C00"/>
-                <w:highlight w:val="yellow"/>
-              </w:rPr>
-              <w:t>[NHÓM ĐIỀN: …]</w:t>
+                <w:sz w:val="18"/>
+              </w:rPr>
+              <w:t>Giữ bảng rủi ro của nhóm (đã tính phương án nén lịch, nên R02 = 16 thay vì 25); ghi nhận thang đo 1–5 và rủi ro nghiệm thu "thời gian thực" của Claude để cân nhắc bổ sung.</w:t>
             </w:r>
           </w:p>
         </w:tc>
@@ -46795,7 +46964,7 @@
     </w:tbl>
     <w:p/>
     <w:sectPr>
-      <w:footerReference w:type="default" r:id="rId24"/>
+      <w:footerReference w:type="default" r:id="rId27"/>
       <w:pgSz w:w="11906" w:h="16838"/>
       <w:pgMar w:top="1134" w:right="1134" w:bottom="1134" w:left="1134" w:header="708" w:footer="708" w:gutter="0"/>
       <w:cols w:space="720"/>

</xml_diff>

<commit_message>
Báo cáo lab: chèn 5 câu hỏi Sponsor (Claude Project Bài 5) và ảnh minh chứng
Co-Authored-By: Claude Opus 5.5 <noreply@anthropic.com>
</commit_message>
<xml_diff>
--- a/docs/lab/QLDA_Nhom_PharmaDash_Lab.docx
+++ b/docs/lab/QLDA_Nhom_PharmaDash_Lab.docx
@@ -998,7 +998,7 @@
           <w:r>
             <w:fldChar w:fldCharType="separate"/>
           </w:r>
-          <w:hyperlink w:anchor="_Toc242015334" w:history="1">
+          <w:hyperlink w:anchor="_Toc242015900" w:history="1">
             <w:r>
               <w:rPr>
                 <w:rStyle w:val="Hyperlink"/>
@@ -1022,7 +1022,7 @@
               <w:rPr>
                 <w:noProof/>
               </w:rPr>
-              <w:instrText xml:space="preserve"> PAGEREF _Toc242015334 \h </w:instrText>
+              <w:instrText xml:space="preserve"> PAGEREF _Toc242015900 \h </w:instrText>
             </w:r>
             <w:r>
               <w:rPr>
@@ -1064,7 +1064,7 @@
               <w14:ligatures w14:val="standardContextual"/>
             </w:rPr>
           </w:pPr>
-          <w:hyperlink w:anchor="_Toc242015335" w:history="1">
+          <w:hyperlink w:anchor="_Toc242015901" w:history="1">
             <w:r>
               <w:rPr>
                 <w:rStyle w:val="Hyperlink"/>
@@ -1088,7 +1088,7 @@
               <w:rPr>
                 <w:noProof/>
               </w:rPr>
-              <w:instrText xml:space="preserve"> PAGEREF _Toc242015335 \h </w:instrText>
+              <w:instrText xml:space="preserve"> PAGEREF _Toc242015901 \h </w:instrText>
             </w:r>
             <w:r>
               <w:rPr>
@@ -1130,7 +1130,7 @@
               <w14:ligatures w14:val="standardContextual"/>
             </w:rPr>
           </w:pPr>
-          <w:hyperlink w:anchor="_Toc242015336" w:history="1">
+          <w:hyperlink w:anchor="_Toc242015902" w:history="1">
             <w:r>
               <w:rPr>
                 <w:rStyle w:val="Hyperlink"/>
@@ -1154,7 +1154,7 @@
               <w:rPr>
                 <w:noProof/>
               </w:rPr>
-              <w:instrText xml:space="preserve"> PAGEREF _Toc242015336 \h </w:instrText>
+              <w:instrText xml:space="preserve"> PAGEREF _Toc242015902 \h </w:instrText>
             </w:r>
             <w:r>
               <w:rPr>
@@ -1196,7 +1196,7 @@
               <w14:ligatures w14:val="standardContextual"/>
             </w:rPr>
           </w:pPr>
-          <w:hyperlink w:anchor="_Toc242015337" w:history="1">
+          <w:hyperlink w:anchor="_Toc242015903" w:history="1">
             <w:r>
               <w:rPr>
                 <w:rStyle w:val="Hyperlink"/>
@@ -1220,7 +1220,7 @@
               <w:rPr>
                 <w:noProof/>
               </w:rPr>
-              <w:instrText xml:space="preserve"> PAGEREF _Toc242015337 \h </w:instrText>
+              <w:instrText xml:space="preserve"> PAGEREF _Toc242015903 \h </w:instrText>
             </w:r>
             <w:r>
               <w:rPr>
@@ -1262,7 +1262,7 @@
               <w14:ligatures w14:val="standardContextual"/>
             </w:rPr>
           </w:pPr>
-          <w:hyperlink w:anchor="_Toc242015338" w:history="1">
+          <w:hyperlink w:anchor="_Toc242015904" w:history="1">
             <w:r>
               <w:rPr>
                 <w:rStyle w:val="Hyperlink"/>
@@ -1286,7 +1286,7 @@
               <w:rPr>
                 <w:noProof/>
               </w:rPr>
-              <w:instrText xml:space="preserve"> PAGEREF _Toc242015338 \h </w:instrText>
+              <w:instrText xml:space="preserve"> PAGEREF _Toc242015904 \h </w:instrText>
             </w:r>
             <w:r>
               <w:rPr>
@@ -1328,7 +1328,7 @@
               <w14:ligatures w14:val="standardContextual"/>
             </w:rPr>
           </w:pPr>
-          <w:hyperlink w:anchor="_Toc242015339" w:history="1">
+          <w:hyperlink w:anchor="_Toc242015905" w:history="1">
             <w:r>
               <w:rPr>
                 <w:rStyle w:val="Hyperlink"/>
@@ -1352,7 +1352,7 @@
               <w:rPr>
                 <w:noProof/>
               </w:rPr>
-              <w:instrText xml:space="preserve"> PAGEREF _Toc242015339 \h </w:instrText>
+              <w:instrText xml:space="preserve"> PAGEREF _Toc242015905 \h </w:instrText>
             </w:r>
             <w:r>
               <w:rPr>
@@ -1394,7 +1394,7 @@
               <w14:ligatures w14:val="standardContextual"/>
             </w:rPr>
           </w:pPr>
-          <w:hyperlink w:anchor="_Toc242015340" w:history="1">
+          <w:hyperlink w:anchor="_Toc242015906" w:history="1">
             <w:r>
               <w:rPr>
                 <w:rStyle w:val="Hyperlink"/>
@@ -1418,7 +1418,7 @@
               <w:rPr>
                 <w:noProof/>
               </w:rPr>
-              <w:instrText xml:space="preserve"> PAGEREF _Toc242015340 \h </w:instrText>
+              <w:instrText xml:space="preserve"> PAGEREF _Toc242015906 \h </w:instrText>
             </w:r>
             <w:r>
               <w:rPr>
@@ -1460,7 +1460,7 @@
               <w14:ligatures w14:val="standardContextual"/>
             </w:rPr>
           </w:pPr>
-          <w:hyperlink w:anchor="_Toc242015341" w:history="1">
+          <w:hyperlink w:anchor="_Toc242015907" w:history="1">
             <w:r>
               <w:rPr>
                 <w:rStyle w:val="Hyperlink"/>
@@ -1484,7 +1484,7 @@
               <w:rPr>
                 <w:noProof/>
               </w:rPr>
-              <w:instrText xml:space="preserve"> PAGEREF _Toc242015341 \h </w:instrText>
+              <w:instrText xml:space="preserve"> PAGEREF _Toc242015907 \h </w:instrText>
             </w:r>
             <w:r>
               <w:rPr>
@@ -1526,7 +1526,7 @@
               <w14:ligatures w14:val="standardContextual"/>
             </w:rPr>
           </w:pPr>
-          <w:hyperlink w:anchor="_Toc242015342" w:history="1">
+          <w:hyperlink w:anchor="_Toc242015908" w:history="1">
             <w:r>
               <w:rPr>
                 <w:rStyle w:val="Hyperlink"/>
@@ -1550,7 +1550,7 @@
               <w:rPr>
                 <w:noProof/>
               </w:rPr>
-              <w:instrText xml:space="preserve"> PAGEREF _Toc242015342 \h </w:instrText>
+              <w:instrText xml:space="preserve"> PAGEREF _Toc242015908 \h </w:instrText>
             </w:r>
             <w:r>
               <w:rPr>
@@ -1592,7 +1592,7 @@
               <w14:ligatures w14:val="standardContextual"/>
             </w:rPr>
           </w:pPr>
-          <w:hyperlink w:anchor="_Toc242015343" w:history="1">
+          <w:hyperlink w:anchor="_Toc242015909" w:history="1">
             <w:r>
               <w:rPr>
                 <w:rStyle w:val="Hyperlink"/>
@@ -1616,7 +1616,7 @@
               <w:rPr>
                 <w:noProof/>
               </w:rPr>
-              <w:instrText xml:space="preserve"> PAGEREF _Toc242015343 \h </w:instrText>
+              <w:instrText xml:space="preserve"> PAGEREF _Toc242015909 \h </w:instrText>
             </w:r>
             <w:r>
               <w:rPr>
@@ -1658,7 +1658,7 @@
               <w14:ligatures w14:val="standardContextual"/>
             </w:rPr>
           </w:pPr>
-          <w:hyperlink w:anchor="_Toc242015344" w:history="1">
+          <w:hyperlink w:anchor="_Toc242015910" w:history="1">
             <w:r>
               <w:rPr>
                 <w:rStyle w:val="Hyperlink"/>
@@ -1682,7 +1682,7 @@
               <w:rPr>
                 <w:noProof/>
               </w:rPr>
-              <w:instrText xml:space="preserve"> PAGEREF _Toc242015344 \h </w:instrText>
+              <w:instrText xml:space="preserve"> PAGEREF _Toc242015910 \h </w:instrText>
             </w:r>
             <w:r>
               <w:rPr>
@@ -1724,7 +1724,7 @@
               <w14:ligatures w14:val="standardContextual"/>
             </w:rPr>
           </w:pPr>
-          <w:hyperlink w:anchor="_Toc242015345" w:history="1">
+          <w:hyperlink w:anchor="_Toc242015911" w:history="1">
             <w:r>
               <w:rPr>
                 <w:rStyle w:val="Hyperlink"/>
@@ -1748,7 +1748,7 @@
               <w:rPr>
                 <w:noProof/>
               </w:rPr>
-              <w:instrText xml:space="preserve"> PAGEREF _Toc242015345 \h </w:instrText>
+              <w:instrText xml:space="preserve"> PAGEREF _Toc242015911 \h </w:instrText>
             </w:r>
             <w:r>
               <w:rPr>
@@ -1790,7 +1790,7 @@
               <w14:ligatures w14:val="standardContextual"/>
             </w:rPr>
           </w:pPr>
-          <w:hyperlink w:anchor="_Toc242015346" w:history="1">
+          <w:hyperlink w:anchor="_Toc242015912" w:history="1">
             <w:r>
               <w:rPr>
                 <w:rStyle w:val="Hyperlink"/>
@@ -1814,7 +1814,7 @@
               <w:rPr>
                 <w:noProof/>
               </w:rPr>
-              <w:instrText xml:space="preserve"> PAGEREF _Toc242015346 \h </w:instrText>
+              <w:instrText xml:space="preserve"> PAGEREF _Toc242015912 \h </w:instrText>
             </w:r>
             <w:r>
               <w:rPr>
@@ -1856,7 +1856,7 @@
               <w14:ligatures w14:val="standardContextual"/>
             </w:rPr>
           </w:pPr>
-          <w:hyperlink w:anchor="_Toc242015347" w:history="1">
+          <w:hyperlink w:anchor="_Toc242015913" w:history="1">
             <w:r>
               <w:rPr>
                 <w:rStyle w:val="Hyperlink"/>
@@ -1880,7 +1880,7 @@
               <w:rPr>
                 <w:noProof/>
               </w:rPr>
-              <w:instrText xml:space="preserve"> PAGEREF _Toc242015347 \h </w:instrText>
+              <w:instrText xml:space="preserve"> PAGEREF _Toc242015913 \h </w:instrText>
             </w:r>
             <w:r>
               <w:rPr>
@@ -1922,7 +1922,7 @@
               <w14:ligatures w14:val="standardContextual"/>
             </w:rPr>
           </w:pPr>
-          <w:hyperlink w:anchor="_Toc242015348" w:history="1">
+          <w:hyperlink w:anchor="_Toc242015914" w:history="1">
             <w:r>
               <w:rPr>
                 <w:rStyle w:val="Hyperlink"/>
@@ -1946,7 +1946,7 @@
               <w:rPr>
                 <w:noProof/>
               </w:rPr>
-              <w:instrText xml:space="preserve"> PAGEREF _Toc242015348 \h </w:instrText>
+              <w:instrText xml:space="preserve"> PAGEREF _Toc242015914 \h </w:instrText>
             </w:r>
             <w:r>
               <w:rPr>
@@ -1988,7 +1988,7 @@
               <w14:ligatures w14:val="standardContextual"/>
             </w:rPr>
           </w:pPr>
-          <w:hyperlink w:anchor="_Toc242015349" w:history="1">
+          <w:hyperlink w:anchor="_Toc242015915" w:history="1">
             <w:r>
               <w:rPr>
                 <w:rStyle w:val="Hyperlink"/>
@@ -2012,7 +2012,7 @@
               <w:rPr>
                 <w:noProof/>
               </w:rPr>
-              <w:instrText xml:space="preserve"> PAGEREF _Toc242015349 \h </w:instrText>
+              <w:instrText xml:space="preserve"> PAGEREF _Toc242015915 \h </w:instrText>
             </w:r>
             <w:r>
               <w:rPr>
@@ -2054,7 +2054,7 @@
               <w14:ligatures w14:val="standardContextual"/>
             </w:rPr>
           </w:pPr>
-          <w:hyperlink w:anchor="_Toc242015350" w:history="1">
+          <w:hyperlink w:anchor="_Toc242015916" w:history="1">
             <w:r>
               <w:rPr>
                 <w:rStyle w:val="Hyperlink"/>
@@ -2078,7 +2078,7 @@
               <w:rPr>
                 <w:noProof/>
               </w:rPr>
-              <w:instrText xml:space="preserve"> PAGEREF _Toc242015350 \h </w:instrText>
+              <w:instrText xml:space="preserve"> PAGEREF _Toc242015916 \h </w:instrText>
             </w:r>
             <w:r>
               <w:rPr>
@@ -2120,7 +2120,7 @@
               <w14:ligatures w14:val="standardContextual"/>
             </w:rPr>
           </w:pPr>
-          <w:hyperlink w:anchor="_Toc242015351" w:history="1">
+          <w:hyperlink w:anchor="_Toc242015917" w:history="1">
             <w:r>
               <w:rPr>
                 <w:rStyle w:val="Hyperlink"/>
@@ -2144,7 +2144,7 @@
               <w:rPr>
                 <w:noProof/>
               </w:rPr>
-              <w:instrText xml:space="preserve"> PAGEREF _Toc242015351 \h </w:instrText>
+              <w:instrText xml:space="preserve"> PAGEREF _Toc242015917 \h </w:instrText>
             </w:r>
             <w:r>
               <w:rPr>
@@ -2186,7 +2186,7 @@
               <w14:ligatures w14:val="standardContextual"/>
             </w:rPr>
           </w:pPr>
-          <w:hyperlink w:anchor="_Toc242015352" w:history="1">
+          <w:hyperlink w:anchor="_Toc242015918" w:history="1">
             <w:r>
               <w:rPr>
                 <w:rStyle w:val="Hyperlink"/>
@@ -2210,7 +2210,7 @@
               <w:rPr>
                 <w:noProof/>
               </w:rPr>
-              <w:instrText xml:space="preserve"> PAGEREF _Toc242015352 \h </w:instrText>
+              <w:instrText xml:space="preserve"> PAGEREF _Toc242015918 \h </w:instrText>
             </w:r>
             <w:r>
               <w:rPr>
@@ -2252,7 +2252,7 @@
               <w14:ligatures w14:val="standardContextual"/>
             </w:rPr>
           </w:pPr>
-          <w:hyperlink w:anchor="_Toc242015353" w:history="1">
+          <w:hyperlink w:anchor="_Toc242015919" w:history="1">
             <w:r>
               <w:rPr>
                 <w:rStyle w:val="Hyperlink"/>
@@ -2276,7 +2276,7 @@
               <w:rPr>
                 <w:noProof/>
               </w:rPr>
-              <w:instrText xml:space="preserve"> PAGEREF _Toc242015353 \h </w:instrText>
+              <w:instrText xml:space="preserve"> PAGEREF _Toc242015919 \h </w:instrText>
             </w:r>
             <w:r>
               <w:rPr>
@@ -2318,7 +2318,7 @@
               <w14:ligatures w14:val="standardContextual"/>
             </w:rPr>
           </w:pPr>
-          <w:hyperlink w:anchor="_Toc242015354" w:history="1">
+          <w:hyperlink w:anchor="_Toc242015920" w:history="1">
             <w:r>
               <w:rPr>
                 <w:rStyle w:val="Hyperlink"/>
@@ -2342,7 +2342,7 @@
               <w:rPr>
                 <w:noProof/>
               </w:rPr>
-              <w:instrText xml:space="preserve"> PAGEREF _Toc242015354 \h </w:instrText>
+              <w:instrText xml:space="preserve"> PAGEREF _Toc242015920 \h </w:instrText>
             </w:r>
             <w:r>
               <w:rPr>
@@ -2384,7 +2384,7 @@
               <w14:ligatures w14:val="standardContextual"/>
             </w:rPr>
           </w:pPr>
-          <w:hyperlink w:anchor="_Toc242015355" w:history="1">
+          <w:hyperlink w:anchor="_Toc242015921" w:history="1">
             <w:r>
               <w:rPr>
                 <w:rStyle w:val="Hyperlink"/>
@@ -2408,7 +2408,7 @@
               <w:rPr>
                 <w:noProof/>
               </w:rPr>
-              <w:instrText xml:space="preserve"> PAGEREF _Toc242015355 \h </w:instrText>
+              <w:instrText xml:space="preserve"> PAGEREF _Toc242015921 \h </w:instrText>
             </w:r>
             <w:r>
               <w:rPr>
@@ -2450,7 +2450,7 @@
               <w14:ligatures w14:val="standardContextual"/>
             </w:rPr>
           </w:pPr>
-          <w:hyperlink w:anchor="_Toc242015356" w:history="1">
+          <w:hyperlink w:anchor="_Toc242015922" w:history="1">
             <w:r>
               <w:rPr>
                 <w:rStyle w:val="Hyperlink"/>
@@ -2474,7 +2474,7 @@
               <w:rPr>
                 <w:noProof/>
               </w:rPr>
-              <w:instrText xml:space="preserve"> PAGEREF _Toc242015356 \h </w:instrText>
+              <w:instrText xml:space="preserve"> PAGEREF _Toc242015922 \h </w:instrText>
             </w:r>
             <w:r>
               <w:rPr>
@@ -2516,7 +2516,7 @@
               <w14:ligatures w14:val="standardContextual"/>
             </w:rPr>
           </w:pPr>
-          <w:hyperlink w:anchor="_Toc242015357" w:history="1">
+          <w:hyperlink w:anchor="_Toc242015923" w:history="1">
             <w:r>
               <w:rPr>
                 <w:rStyle w:val="Hyperlink"/>
@@ -2540,7 +2540,7 @@
               <w:rPr>
                 <w:noProof/>
               </w:rPr>
-              <w:instrText xml:space="preserve"> PAGEREF _Toc242015357 \h </w:instrText>
+              <w:instrText xml:space="preserve"> PAGEREF _Toc242015923 \h </w:instrText>
             </w:r>
             <w:r>
               <w:rPr>
@@ -2582,7 +2582,7 @@
               <w14:ligatures w14:val="standardContextual"/>
             </w:rPr>
           </w:pPr>
-          <w:hyperlink w:anchor="_Toc242015358" w:history="1">
+          <w:hyperlink w:anchor="_Toc242015924" w:history="1">
             <w:r>
               <w:rPr>
                 <w:rStyle w:val="Hyperlink"/>
@@ -2606,7 +2606,7 @@
               <w:rPr>
                 <w:noProof/>
               </w:rPr>
-              <w:instrText xml:space="preserve"> PAGEREF _Toc242015358 \h </w:instrText>
+              <w:instrText xml:space="preserve"> PAGEREF _Toc242015924 \h </w:instrText>
             </w:r>
             <w:r>
               <w:rPr>
@@ -2648,7 +2648,7 @@
               <w14:ligatures w14:val="standardContextual"/>
             </w:rPr>
           </w:pPr>
-          <w:hyperlink w:anchor="_Toc242015359" w:history="1">
+          <w:hyperlink w:anchor="_Toc242015925" w:history="1">
             <w:r>
               <w:rPr>
                 <w:rStyle w:val="Hyperlink"/>
@@ -2672,7 +2672,7 @@
               <w:rPr>
                 <w:noProof/>
               </w:rPr>
-              <w:instrText xml:space="preserve"> PAGEREF _Toc242015359 \h </w:instrText>
+              <w:instrText xml:space="preserve"> PAGEREF _Toc242015925 \h </w:instrText>
             </w:r>
             <w:r>
               <w:rPr>
@@ -2714,7 +2714,7 @@
               <w14:ligatures w14:val="standardContextual"/>
             </w:rPr>
           </w:pPr>
-          <w:hyperlink w:anchor="_Toc242015360" w:history="1">
+          <w:hyperlink w:anchor="_Toc242015926" w:history="1">
             <w:r>
               <w:rPr>
                 <w:rStyle w:val="Hyperlink"/>
@@ -2738,7 +2738,7 @@
               <w:rPr>
                 <w:noProof/>
               </w:rPr>
-              <w:instrText xml:space="preserve"> PAGEREF _Toc242015360 \h </w:instrText>
+              <w:instrText xml:space="preserve"> PAGEREF _Toc242015926 \h </w:instrText>
             </w:r>
             <w:r>
               <w:rPr>
@@ -2755,7 +2755,7 @@
               <w:rPr>
                 <w:noProof/>
               </w:rPr>
-              <w:t>29</w:t>
+              <w:t>30</w:t>
             </w:r>
             <w:r>
               <w:rPr>
@@ -2780,7 +2780,7 @@
               <w14:ligatures w14:val="standardContextual"/>
             </w:rPr>
           </w:pPr>
-          <w:hyperlink w:anchor="_Toc242015361" w:history="1">
+          <w:hyperlink w:anchor="_Toc242015927" w:history="1">
             <w:r>
               <w:rPr>
                 <w:rStyle w:val="Hyperlink"/>
@@ -2804,7 +2804,7 @@
               <w:rPr>
                 <w:noProof/>
               </w:rPr>
-              <w:instrText xml:space="preserve"> PAGEREF _Toc242015361 \h </w:instrText>
+              <w:instrText xml:space="preserve"> PAGEREF _Toc242015927 \h </w:instrText>
             </w:r>
             <w:r>
               <w:rPr>
@@ -2821,7 +2821,7 @@
               <w:rPr>
                 <w:noProof/>
               </w:rPr>
-              <w:t>29</w:t>
+              <w:t>30</w:t>
             </w:r>
             <w:r>
               <w:rPr>
@@ -2864,7 +2864,7 @@
         <w:keepNext/>
         <w:keepLines/>
       </w:pPr>
-      <w:bookmarkStart w:id="0" w:name="_Toc242015334"/>
+      <w:bookmarkStart w:id="0" w:name="_Toc242015900"/>
       <w:r>
         <w:lastRenderedPageBreak/>
         <w:t>1. Thiết lập Claude Project</w:t>
@@ -3683,7 +3683,7 @@
         <w:keepNext/>
         <w:keepLines/>
       </w:pPr>
-      <w:bookmarkStart w:id="1" w:name="_Toc242015335"/>
+      <w:bookmarkStart w:id="1" w:name="_Toc242015901"/>
       <w:r>
         <w:t>2. Project Charter (Tuyên bố dự án)</w:t>
       </w:r>
@@ -4169,7 +4169,7 @@
         <w:keepNext/>
         <w:keepLines/>
       </w:pPr>
-      <w:bookmarkStart w:id="2" w:name="_Toc242015336"/>
+      <w:bookmarkStart w:id="2" w:name="_Toc242015902"/>
       <w:r>
         <w:t>2.1 Mục tiêu SMART</w:t>
       </w:r>
@@ -5194,7 +5194,7 @@
         <w:keepNext/>
         <w:keepLines/>
       </w:pPr>
-      <w:bookmarkStart w:id="3" w:name="_Toc242015337"/>
+      <w:bookmarkStart w:id="3" w:name="_Toc242015903"/>
       <w:r>
         <w:t>2.2 Phạm vi</w:t>
       </w:r>
@@ -5604,7 +5604,7 @@
         <w:keepNext/>
         <w:keepLines/>
       </w:pPr>
-      <w:bookmarkStart w:id="4" w:name="_Toc242015338"/>
+      <w:bookmarkStart w:id="4" w:name="_Toc242015904"/>
       <w:r>
         <w:t>2.3 Sản phẩm bàn giao chính</w:t>
       </w:r>
@@ -5668,7 +5668,7 @@
         <w:keepNext/>
         <w:keepLines/>
       </w:pPr>
-      <w:bookmarkStart w:id="5" w:name="_Toc242015339"/>
+      <w:bookmarkStart w:id="5" w:name="_Toc242015905"/>
       <w:r>
         <w:t>2.4 Các bên liên quan</w:t>
       </w:r>
@@ -6455,7 +6455,7 @@
         <w:keepNext/>
         <w:keepLines/>
       </w:pPr>
-      <w:bookmarkStart w:id="6" w:name="_Toc242015340"/>
+      <w:bookmarkStart w:id="6" w:name="_Toc242015906"/>
       <w:r>
         <w:t>2.5 Mốc thời gian chính (mục tiêu)</w:t>
       </w:r>
@@ -7501,7 +7501,7 @@
         <w:keepNext/>
         <w:keepLines/>
       </w:pPr>
-      <w:bookmarkStart w:id="7" w:name="_Toc242015341"/>
+      <w:bookmarkStart w:id="7" w:name="_Toc242015907"/>
       <w:r>
         <w:t>2.6 Giả định và ràng buộc</w:t>
       </w:r>
@@ -7768,7 +7768,7 @@
         <w:keepNext/>
         <w:keepLines/>
       </w:pPr>
-      <w:bookmarkStart w:id="8" w:name="_Toc242015342"/>
+      <w:bookmarkStart w:id="8" w:name="_Toc242015908"/>
       <w:r>
         <w:t>2.7 Rủi ro cấp cao</w:t>
       </w:r>
@@ -7832,7 +7832,7 @@
         <w:keepNext/>
         <w:keepLines/>
       </w:pPr>
-      <w:bookmarkStart w:id="9" w:name="_Toc242015343"/>
+      <w:bookmarkStart w:id="9" w:name="_Toc242015909"/>
       <w:r>
         <w:t>2.8 Tiêu chí thành công và nghiệm thu</w:t>
       </w:r>
@@ -7909,7 +7909,7 @@
         <w:keepNext/>
         <w:keepLines/>
       </w:pPr>
-      <w:bookmarkStart w:id="10" w:name="_Toc242015344"/>
+      <w:bookmarkStart w:id="10" w:name="_Toc242015910"/>
       <w:r>
         <w:t>2.9 Thông tin còn thiếu – câu hỏi làm rõ với khách hàng</w:t>
       </w:r>
@@ -9534,7 +9534,7 @@
         <w:keepNext/>
         <w:keepLines/>
       </w:pPr>
-      <w:bookmarkStart w:id="11" w:name="_Toc242015345"/>
+      <w:bookmarkStart w:id="11" w:name="_Toc242015911"/>
       <w:r>
         <w:t>3. Phạm vi và WBS</w:t>
       </w:r>
@@ -9565,7 +9565,7 @@
         <w:keepNext/>
         <w:keepLines/>
       </w:pPr>
-      <w:bookmarkStart w:id="12" w:name="_Toc242015346"/>
+      <w:bookmarkStart w:id="12" w:name="_Toc242015912"/>
       <w:r>
         <w:t>3.1 Sơ đồ cây WBS</w:t>
       </w:r>
@@ -9654,7 +9654,7 @@
         <w:keepNext/>
         <w:keepLines/>
       </w:pPr>
-      <w:bookmarkStart w:id="13" w:name="_Toc242015347"/>
+      <w:bookmarkStart w:id="13" w:name="_Toc242015913"/>
       <w:r>
         <w:t>3.2 Bảng WBS</w:t>
       </w:r>
@@ -21688,7 +21688,7 @@
         <w:keepNext/>
         <w:keepLines/>
       </w:pPr>
-      <w:bookmarkStart w:id="14" w:name="_Toc242015348"/>
+      <w:bookmarkStart w:id="14" w:name="_Toc242015914"/>
       <w:r>
         <w:t>3.3 Từ điển WBS (3 gói công việc quan trọng nhất)</w:t>
       </w:r>
@@ -23394,7 +23394,7 @@
         <w:keepNext/>
         <w:keepLines/>
       </w:pPr>
-      <w:bookmarkStart w:id="15" w:name="_Toc242015349"/>
+      <w:bookmarkStart w:id="15" w:name="_Toc242015915"/>
       <w:r>
         <w:t>4. Ước lượng, lịch dự án và đường găng</w:t>
       </w:r>
@@ -23414,7 +23414,7 @@
         <w:keepNext/>
         <w:keepLines/>
       </w:pPr>
-      <w:bookmarkStart w:id="16" w:name="_Toc242015350"/>
+      <w:bookmarkStart w:id="16" w:name="_Toc242015916"/>
       <w:r>
         <w:t>4.1 Bảng PERT và CPM</w:t>
       </w:r>
@@ -31014,7 +31014,7 @@
         <w:keepNext/>
         <w:keepLines/>
       </w:pPr>
-      <w:bookmarkStart w:id="17" w:name="_Toc242015351"/>
+      <w:bookmarkStart w:id="17" w:name="_Toc242015917"/>
       <w:r>
         <w:t>4.2 Kết quả</w:t>
       </w:r>
@@ -31563,7 +31563,7 @@
         <w:keepNext/>
         <w:keepLines/>
       </w:pPr>
-      <w:bookmarkStart w:id="18" w:name="_Toc242015352"/>
+      <w:bookmarkStart w:id="18" w:name="_Toc242015918"/>
       <w:r>
         <w:t>4.3 Biểu đồ Gantt</w:t>
       </w:r>
@@ -31641,7 +31641,7 @@
         <w:keepNext/>
         <w:keepLines/>
       </w:pPr>
-      <w:bookmarkStart w:id="19" w:name="_Toc242015353"/>
+      <w:bookmarkStart w:id="19" w:name="_Toc242015919"/>
       <w:r>
         <w:t>4.4 So sánh kết quả Excel với câu trả lời của AI (Claude Project)</w:t>
       </w:r>
@@ -32476,7 +32476,7 @@
         <w:keepNext/>
         <w:keepLines/>
       </w:pPr>
-      <w:bookmarkStart w:id="20" w:name="_Toc242015354"/>
+      <w:bookmarkStart w:id="20" w:name="_Toc242015920"/>
       <w:r>
         <w:t>4.5 Phương án nén lịch (AI gợi ý – nhóm tự chọn và lý giải)</w:t>
       </w:r>
@@ -35474,7 +35474,7 @@
         <w:keepNext/>
         <w:keepLines/>
       </w:pPr>
-      <w:bookmarkStart w:id="21" w:name="_Toc242015355"/>
+      <w:bookmarkStart w:id="21" w:name="_Toc242015921"/>
       <w:r>
         <w:t>5. Ước lượng chi phí</w:t>
       </w:r>
@@ -37808,7 +37808,7 @@
         <w:keepNext/>
         <w:keepLines/>
       </w:pPr>
-      <w:bookmarkStart w:id="22" w:name="_Toc242015356"/>
+      <w:bookmarkStart w:id="22" w:name="_Toc242015922"/>
       <w:r>
         <w:t>6. Quản lý rủi ro</w:t>
       </w:r>
@@ -42415,31 +42415,7 @@
         <w:keepNext/>
       </w:pPr>
       <w:r>
-        <w:t>Đ</w:t>
-      </w:r>
-      <w:r>
-        <w:t>ố</w:t>
-      </w:r>
-      <w:r>
-        <w:t>i chi</w:t>
-      </w:r>
-      <w:r>
-        <w:t>ế</w:t>
-      </w:r>
-      <w:r>
-        <w:t>u v</w:t>
-      </w:r>
-      <w:r>
-        <w:t>ớ</w:t>
-      </w:r>
-      <w:r>
-        <w:t>i Risk Register c</w:t>
-      </w:r>
-      <w:r>
-        <w:t>ủ</w:t>
-      </w:r>
-      <w:r>
-        <w:t>a Claude Project (Bài 4)</w:t>
+        <w:t>Đối chiếu với Risk Register của Claude Project (Bài 4)</w:t>
       </w:r>
     </w:p>
     <w:p>
@@ -42498,103 +42474,7 @@
           <w:color w:val="595959"/>
           <w:sz w:val="18"/>
         </w:rPr>
-        <w:t>Hình 6.1a – S</w:t>
-      </w:r>
-      <w:r>
-        <w:rPr>
-          <w:i/>
-          <w:color w:val="595959"/>
-          <w:sz w:val="18"/>
-        </w:rPr>
-        <w:t>ổ</w:t>
-      </w:r>
-      <w:r>
-        <w:rPr>
-          <w:i/>
-          <w:color w:val="595959"/>
-          <w:sz w:val="18"/>
-        </w:rPr>
-        <w:t xml:space="preserve"> đăng ký r</w:t>
-      </w:r>
-      <w:r>
-        <w:rPr>
-          <w:i/>
-          <w:color w:val="595959"/>
-          <w:sz w:val="18"/>
-        </w:rPr>
-        <w:t>ủ</w:t>
-      </w:r>
-      <w:r>
-        <w:rPr>
-          <w:i/>
-          <w:color w:val="595959"/>
-          <w:sz w:val="18"/>
-        </w:rPr>
-        <w:t>i ro do Claude Project l</w:t>
-      </w:r>
-      <w:r>
-        <w:rPr>
-          <w:i/>
-          <w:color w:val="595959"/>
-          <w:sz w:val="18"/>
-        </w:rPr>
-        <w:t>ậ</w:t>
-      </w:r>
-      <w:r>
-        <w:rPr>
-          <w:i/>
-          <w:color w:val="595959"/>
-          <w:sz w:val="18"/>
-        </w:rPr>
-        <w:t>p trong chat Bài 4 (trích các r</w:t>
-      </w:r>
-      <w:r>
-        <w:rPr>
-          <w:i/>
-          <w:color w:val="595959"/>
-          <w:sz w:val="18"/>
-        </w:rPr>
-        <w:t>ủ</w:t>
-      </w:r>
-      <w:r>
-        <w:rPr>
-          <w:i/>
-          <w:color w:val="595959"/>
-          <w:sz w:val="18"/>
-        </w:rPr>
-        <w:t>i ro đi</w:t>
-      </w:r>
-      <w:r>
-        <w:rPr>
-          <w:i/>
-          <w:color w:val="595959"/>
-          <w:sz w:val="18"/>
-        </w:rPr>
-        <w:t>ể</w:t>
-      </w:r>
-      <w:r>
-        <w:rPr>
-          <w:i/>
-          <w:color w:val="595959"/>
-          <w:sz w:val="18"/>
-        </w:rPr>
-        <w:t>m cao nh</w:t>
-      </w:r>
-      <w:r>
-        <w:rPr>
-          <w:i/>
-          <w:color w:val="595959"/>
-          <w:sz w:val="18"/>
-        </w:rPr>
-        <w:t>ấ</w:t>
-      </w:r>
-      <w:r>
-        <w:rPr>
-          <w:i/>
-          <w:color w:val="595959"/>
-          <w:sz w:val="18"/>
-        </w:rPr>
-        <w:t>t)</w:t>
+        <w:t>Hình 6.1a – Sổ đăng ký rủi ro do Claude Project lập trong chat Bài 4 (trích các rủi ro điểm cao nhất)</w:t>
       </w:r>
     </w:p>
     <w:p>
@@ -42653,71 +42533,7 @@
           <w:color w:val="595959"/>
           <w:sz w:val="18"/>
         </w:rPr>
-        <w:t>Hình 6.1b – Ma tr</w:t>
-      </w:r>
-      <w:r>
-        <w:rPr>
-          <w:i/>
-          <w:color w:val="595959"/>
-          <w:sz w:val="18"/>
-        </w:rPr>
-        <w:t>ậ</w:t>
-      </w:r>
-      <w:r>
-        <w:rPr>
-          <w:i/>
-          <w:color w:val="595959"/>
-          <w:sz w:val="18"/>
-        </w:rPr>
-        <w:t>n xác su</w:t>
-      </w:r>
-      <w:r>
-        <w:rPr>
-          <w:i/>
-          <w:color w:val="595959"/>
-          <w:sz w:val="18"/>
-        </w:rPr>
-        <w:t>ấ</w:t>
-      </w:r>
-      <w:r>
-        <w:rPr>
-          <w:i/>
-          <w:color w:val="595959"/>
-          <w:sz w:val="18"/>
-        </w:rPr>
-        <w:t>t – tác đ</w:t>
-      </w:r>
-      <w:r>
-        <w:rPr>
-          <w:i/>
-          <w:color w:val="595959"/>
-          <w:sz w:val="18"/>
-        </w:rPr>
-        <w:t>ộ</w:t>
-      </w:r>
-      <w:r>
-        <w:rPr>
-          <w:i/>
-          <w:color w:val="595959"/>
-          <w:sz w:val="18"/>
-        </w:rPr>
-        <w:t>ng c</w:t>
-      </w:r>
-      <w:r>
-        <w:rPr>
-          <w:i/>
-          <w:color w:val="595959"/>
-          <w:sz w:val="18"/>
-        </w:rPr>
-        <w:t>ủ</w:t>
-      </w:r>
-      <w:r>
-        <w:rPr>
-          <w:i/>
-          <w:color w:val="595959"/>
-          <w:sz w:val="18"/>
-        </w:rPr>
-        <w:t>a Claude</w:t>
+        <w:t>Hình 6.1b – Ma trận xác suất – tác động của Claude</w:t>
       </w:r>
     </w:p>
     <w:p>
@@ -42776,87 +42592,7 @@
           <w:color w:val="595959"/>
           <w:sz w:val="18"/>
         </w:rPr>
-        <w:t>Hình 6.1c – Câu h</w:t>
-      </w:r>
-      <w:r>
-        <w:rPr>
-          <w:i/>
-          <w:color w:val="595959"/>
-          <w:sz w:val="18"/>
-        </w:rPr>
-        <w:t>ỏ</w:t>
-      </w:r>
-      <w:r>
-        <w:rPr>
-          <w:i/>
-          <w:color w:val="595959"/>
-          <w:sz w:val="18"/>
-        </w:rPr>
-        <w:t>i c</w:t>
-      </w:r>
-      <w:r>
-        <w:rPr>
-          <w:i/>
-          <w:color w:val="595959"/>
-          <w:sz w:val="18"/>
-        </w:rPr>
-        <w:t>ầ</w:t>
-      </w:r>
-      <w:r>
-        <w:rPr>
-          <w:i/>
-          <w:color w:val="595959"/>
-          <w:sz w:val="18"/>
-        </w:rPr>
-        <w:t>n làm rõ v</w:t>
-      </w:r>
-      <w:r>
-        <w:rPr>
-          <w:i/>
-          <w:color w:val="595959"/>
-          <w:sz w:val="18"/>
-        </w:rPr>
-        <w:t>ớ</w:t>
-      </w:r>
-      <w:r>
-        <w:rPr>
-          <w:i/>
-          <w:color w:val="595959"/>
-          <w:sz w:val="18"/>
-        </w:rPr>
-        <w:t>i khách hàng do Claude đ</w:t>
-      </w:r>
-      <w:r>
-        <w:rPr>
-          <w:i/>
-          <w:color w:val="595959"/>
-          <w:sz w:val="18"/>
-        </w:rPr>
-        <w:t>ề</w:t>
-      </w:r>
-      <w:r>
-        <w:rPr>
-          <w:i/>
-          <w:color w:val="595959"/>
-          <w:sz w:val="18"/>
-        </w:rPr>
-        <w:t xml:space="preserve"> xu</w:t>
-      </w:r>
-      <w:r>
-        <w:rPr>
-          <w:i/>
-          <w:color w:val="595959"/>
-          <w:sz w:val="18"/>
-        </w:rPr>
-        <w:t>ấ</w:t>
-      </w:r>
-      <w:r>
-        <w:rPr>
-          <w:i/>
-          <w:color w:val="595959"/>
-          <w:sz w:val="18"/>
-        </w:rPr>
-        <w:t>t</w:t>
+        <w:t>Hình 6.1c – Câu hỏi cần làm rõ với khách hàng do Claude đề xuất</w:t>
       </w:r>
     </w:p>
     <w:p>
@@ -42868,199 +42604,7 @@
         <w:rPr>
           <w:sz w:val="20"/>
         </w:rPr>
-        <w:t>• S</w:t>
-      </w:r>
-      <w:r>
-        <w:rPr>
-          <w:sz w:val="20"/>
-        </w:rPr>
-        <w:t>ố</w:t>
-      </w:r>
-      <w:r>
-        <w:rPr>
-          <w:sz w:val="20"/>
-        </w:rPr>
-        <w:t xml:space="preserve"> lư</w:t>
-      </w:r>
-      <w:r>
-        <w:rPr>
-          <w:sz w:val="20"/>
-        </w:rPr>
-        <w:t>ợ</w:t>
-      </w:r>
-      <w:r>
-        <w:rPr>
-          <w:sz w:val="20"/>
-        </w:rPr>
-        <w:t>ng: Claude l</w:t>
-      </w:r>
-      <w:r>
-        <w:rPr>
-          <w:sz w:val="20"/>
-        </w:rPr>
-        <w:t>ậ</w:t>
-      </w:r>
-      <w:r>
-        <w:rPr>
-          <w:sz w:val="20"/>
-        </w:rPr>
-        <w:t>p 14 r</w:t>
-      </w:r>
-      <w:r>
-        <w:rPr>
-          <w:sz w:val="20"/>
-        </w:rPr>
-        <w:t>ủ</w:t>
-      </w:r>
-      <w:r>
-        <w:rPr>
-          <w:sz w:val="20"/>
-        </w:rPr>
-        <w:t>i ro và 1 cơ h</w:t>
-      </w:r>
-      <w:r>
-        <w:rPr>
-          <w:sz w:val="20"/>
-        </w:rPr>
-        <w:t>ộ</w:t>
-      </w:r>
-      <w:r>
-        <w:rPr>
-          <w:sz w:val="20"/>
-        </w:rPr>
-        <w:t>i (CH01); b</w:t>
-      </w:r>
-      <w:r>
-        <w:rPr>
-          <w:sz w:val="20"/>
-        </w:rPr>
-        <w:t>ả</w:t>
-      </w:r>
-      <w:r>
-        <w:rPr>
-          <w:sz w:val="20"/>
-        </w:rPr>
-        <w:t>n c</w:t>
-      </w:r>
-      <w:r>
-        <w:rPr>
-          <w:sz w:val="20"/>
-        </w:rPr>
-        <w:t>ủ</w:t>
-      </w:r>
-      <w:r>
-        <w:rPr>
-          <w:sz w:val="20"/>
-        </w:rPr>
-        <w:t>a nhóm có 10 r</w:t>
-      </w:r>
-      <w:r>
-        <w:rPr>
-          <w:sz w:val="20"/>
-        </w:rPr>
-        <w:t>ủ</w:t>
-      </w:r>
-      <w:r>
-        <w:rPr>
-          <w:sz w:val="20"/>
-        </w:rPr>
-        <w:t>i ro, c</w:t>
-      </w:r>
-      <w:r>
-        <w:rPr>
-          <w:sz w:val="20"/>
-        </w:rPr>
-        <w:t>ộ</w:t>
-      </w:r>
-      <w:r>
-        <w:rPr>
-          <w:sz w:val="20"/>
-        </w:rPr>
-        <w:t>ng 2 r</w:t>
-      </w:r>
-      <w:r>
-        <w:rPr>
-          <w:sz w:val="20"/>
-        </w:rPr>
-        <w:t>ủ</w:t>
-      </w:r>
-      <w:r>
-        <w:rPr>
-          <w:sz w:val="20"/>
-        </w:rPr>
-        <w:t>i ro nhóm t</w:t>
-      </w:r>
-      <w:r>
-        <w:rPr>
-          <w:sz w:val="20"/>
-        </w:rPr>
-        <w:t>ự</w:t>
-      </w:r>
-      <w:r>
-        <w:rPr>
-          <w:sz w:val="20"/>
-        </w:rPr>
-        <w:t xml:space="preserve"> b</w:t>
-      </w:r>
-      <w:r>
-        <w:rPr>
-          <w:sz w:val="20"/>
-        </w:rPr>
-        <w:t>ổ</w:t>
-      </w:r>
-      <w:r>
-        <w:rPr>
-          <w:sz w:val="20"/>
-        </w:rPr>
-        <w:t xml:space="preserve"> sung. Claude có thêm r</w:t>
-      </w:r>
-      <w:r>
-        <w:rPr>
-          <w:sz w:val="20"/>
-        </w:rPr>
-        <w:t>ủ</w:t>
-      </w:r>
-      <w:r>
-        <w:rPr>
-          <w:sz w:val="20"/>
-        </w:rPr>
-        <w:t>i ro tích c</w:t>
-      </w:r>
-      <w:r>
-        <w:rPr>
-          <w:sz w:val="20"/>
-        </w:rPr>
-        <w:t>ự</w:t>
-      </w:r>
-      <w:r>
-        <w:rPr>
-          <w:sz w:val="20"/>
-        </w:rPr>
-        <w:t>c (cơ h</w:t>
-      </w:r>
-      <w:r>
-        <w:rPr>
-          <w:sz w:val="20"/>
-        </w:rPr>
-        <w:t>ộ</w:t>
-      </w:r>
-      <w:r>
-        <w:rPr>
-          <w:sz w:val="20"/>
-        </w:rPr>
-        <w:t>i) theo PMBOK – b</w:t>
-      </w:r>
-      <w:r>
-        <w:rPr>
-          <w:sz w:val="20"/>
-        </w:rPr>
-        <w:t>ả</w:t>
-      </w:r>
-      <w:r>
-        <w:rPr>
-          <w:sz w:val="20"/>
-        </w:rPr>
-        <w:t>n nhóm chưa có.</w:t>
+        <w:t>• Số lượng: Claude lập 14 rủi ro và 1 cơ hội (CH01); bản của nhóm có 10 rủi ro, cộng 2 rủi ro nhóm tự bổ sung. Claude có thêm rủi ro tích cực (cơ hội) theo PMBOK – bản nhóm chưa có.</w:t>
       </w:r>
     </w:p>
     <w:p>
@@ -43072,223 +42616,7 @@
         <w:rPr>
           <w:sz w:val="20"/>
         </w:rPr>
-        <w:t>• Hai b</w:t>
-      </w:r>
-      <w:r>
-        <w:rPr>
-          <w:sz w:val="20"/>
-        </w:rPr>
-        <w:t>ả</w:t>
-      </w:r>
-      <w:r>
-        <w:rPr>
-          <w:sz w:val="20"/>
-        </w:rPr>
-        <w:t>n cùng xác đ</w:t>
-      </w:r>
-      <w:r>
-        <w:rPr>
-          <w:sz w:val="20"/>
-        </w:rPr>
-        <w:t>ị</w:t>
-      </w:r>
-      <w:r>
-        <w:rPr>
-          <w:sz w:val="20"/>
-        </w:rPr>
-        <w:t>nh 4 r</w:t>
-      </w:r>
-      <w:r>
-        <w:rPr>
-          <w:sz w:val="20"/>
-        </w:rPr>
-        <w:t>ủ</w:t>
-      </w:r>
-      <w:r>
-        <w:rPr>
-          <w:sz w:val="20"/>
-        </w:rPr>
-        <w:t>i ro đi</w:t>
-      </w:r>
-      <w:r>
-        <w:rPr>
-          <w:sz w:val="20"/>
-        </w:rPr>
-        <w:t>ể</w:t>
-      </w:r>
-      <w:r>
-        <w:rPr>
-          <w:sz w:val="20"/>
-        </w:rPr>
-        <w:t>m cao nh</w:t>
-      </w:r>
-      <w:r>
-        <w:rPr>
-          <w:sz w:val="20"/>
-        </w:rPr>
-        <w:t>ấ</w:t>
-      </w:r>
-      <w:r>
-        <w:rPr>
-          <w:sz w:val="20"/>
-        </w:rPr>
-        <w:t>t xoay quanh: k</w:t>
-      </w:r>
-      <w:r>
-        <w:rPr>
-          <w:sz w:val="20"/>
-        </w:rPr>
-        <w:t>ế</w:t>
-      </w:r>
-      <w:r>
-        <w:rPr>
-          <w:sz w:val="20"/>
-        </w:rPr>
-        <w:t>t n</w:t>
-      </w:r>
-      <w:r>
-        <w:rPr>
-          <w:sz w:val="20"/>
-        </w:rPr>
-        <w:t>ố</w:t>
-      </w:r>
-      <w:r>
-        <w:rPr>
-          <w:sz w:val="20"/>
-        </w:rPr>
-        <w:t>i ph</w:t>
-      </w:r>
-      <w:r>
-        <w:rPr>
-          <w:sz w:val="20"/>
-        </w:rPr>
-        <w:t>ầ</w:t>
-      </w:r>
-      <w:r>
-        <w:rPr>
-          <w:sz w:val="20"/>
-        </w:rPr>
-        <w:t>n m</w:t>
-      </w:r>
-      <w:r>
-        <w:rPr>
-          <w:sz w:val="20"/>
-        </w:rPr>
-        <w:t>ề</w:t>
-      </w:r>
-      <w:r>
-        <w:rPr>
-          <w:sz w:val="20"/>
-        </w:rPr>
-        <w:t>m bán hàng, tr</w:t>
-      </w:r>
-      <w:r>
-        <w:rPr>
-          <w:sz w:val="20"/>
-        </w:rPr>
-        <w:t>ễ</w:t>
-      </w:r>
-      <w:r>
-        <w:rPr>
-          <w:sz w:val="20"/>
-        </w:rPr>
-        <w:t xml:space="preserve"> ti</w:t>
-      </w:r>
-      <w:r>
-        <w:rPr>
-          <w:sz w:val="20"/>
-        </w:rPr>
-        <w:t>ế</w:t>
-      </w:r>
-      <w:r>
-        <w:rPr>
-          <w:sz w:val="20"/>
-        </w:rPr>
-        <w:t>n đ</w:t>
-      </w:r>
-      <w:r>
-        <w:rPr>
-          <w:sz w:val="20"/>
-        </w:rPr>
-        <w:t>ộ</w:t>
-      </w:r>
-      <w:r>
-        <w:rPr>
-          <w:sz w:val="20"/>
-        </w:rPr>
-        <w:t>, backend quá t</w:t>
-      </w:r>
-      <w:r>
-        <w:rPr>
-          <w:sz w:val="20"/>
-        </w:rPr>
-        <w:t>ả</w:t>
-      </w:r>
-      <w:r>
-        <w:rPr>
-          <w:sz w:val="20"/>
-        </w:rPr>
-        <w:t>i, d</w:t>
-      </w:r>
-      <w:r>
-        <w:rPr>
-          <w:sz w:val="20"/>
-        </w:rPr>
-        <w:t>ữ</w:t>
-      </w:r>
-      <w:r>
-        <w:rPr>
-          <w:sz w:val="20"/>
-        </w:rPr>
-        <w:t xml:space="preserve"> li</w:t>
-      </w:r>
-      <w:r>
-        <w:rPr>
-          <w:sz w:val="20"/>
-        </w:rPr>
-        <w:t>ệ</w:t>
-      </w:r>
-      <w:r>
-        <w:rPr>
-          <w:sz w:val="20"/>
-        </w:rPr>
-        <w:t>u cũ l</w:t>
-      </w:r>
-      <w:r>
-        <w:rPr>
-          <w:sz w:val="20"/>
-        </w:rPr>
-        <w:t>ỗ</w:t>
-      </w:r>
-      <w:r>
-        <w:rPr>
-          <w:sz w:val="20"/>
-        </w:rPr>
-        <w:t>i khi chuy</w:t>
-      </w:r>
-      <w:r>
-        <w:rPr>
-          <w:sz w:val="20"/>
-        </w:rPr>
-        <w:t>ể</w:t>
-      </w:r>
-      <w:r>
-        <w:rPr>
-          <w:sz w:val="20"/>
-        </w:rPr>
-        <w:t>n đ</w:t>
-      </w:r>
-      <w:r>
-        <w:rPr>
-          <w:sz w:val="20"/>
-        </w:rPr>
-        <w:t>ổ</w:t>
-      </w:r>
-      <w:r>
-        <w:rPr>
-          <w:sz w:val="20"/>
-        </w:rPr>
-        <w:t>i.</w:t>
+        <w:t>• Hai bản cùng xác định 4 rủi ro điểm cao nhất xoay quanh: kết nối phần mềm bán hàng, trễ tiến độ, backend quá tải, dữ liệu cũ lỗi khi chuyển đổi.</w:t>
       </w:r>
     </w:p>
     <w:p>
@@ -43300,235 +42628,7 @@
         <w:rPr>
           <w:sz w:val="20"/>
         </w:rPr>
-        <w:t>• Claude ch</w:t>
-      </w:r>
-      <w:r>
-        <w:rPr>
-          <w:sz w:val="20"/>
-        </w:rPr>
-        <w:t>ấ</w:t>
-      </w:r>
-      <w:r>
-        <w:rPr>
-          <w:sz w:val="20"/>
-        </w:rPr>
-        <w:t>m "tr</w:t>
-      </w:r>
-      <w:r>
-        <w:rPr>
-          <w:sz w:val="20"/>
-        </w:rPr>
-        <w:t>ễ</w:t>
-      </w:r>
-      <w:r>
-        <w:rPr>
-          <w:sz w:val="20"/>
-        </w:rPr>
-        <w:t xml:space="preserve"> go-live" (R02) 25 đi</w:t>
-      </w:r>
-      <w:r>
-        <w:rPr>
-          <w:sz w:val="20"/>
-        </w:rPr>
-        <w:t>ể</w:t>
-      </w:r>
-      <w:r>
-        <w:rPr>
-          <w:sz w:val="20"/>
-        </w:rPr>
-        <w:t>m (P5 × I5) d</w:t>
-      </w:r>
-      <w:r>
-        <w:rPr>
-          <w:sz w:val="20"/>
-        </w:rPr>
-        <w:t>ự</w:t>
-      </w:r>
-      <w:r>
-        <w:rPr>
-          <w:sz w:val="20"/>
-        </w:rPr>
-        <w:t>a trên xác su</w:t>
-      </w:r>
-      <w:r>
-        <w:rPr>
-          <w:sz w:val="20"/>
-        </w:rPr>
-        <w:t>ấ</w:t>
-      </w:r>
-      <w:r>
-        <w:rPr>
-          <w:sz w:val="20"/>
-        </w:rPr>
-        <w:t>t k</w:t>
-      </w:r>
-      <w:r>
-        <w:rPr>
-          <w:sz w:val="20"/>
-        </w:rPr>
-        <w:t>ị</w:t>
-      </w:r>
-      <w:r>
-        <w:rPr>
-          <w:sz w:val="20"/>
-        </w:rPr>
-        <w:t>p h</w:t>
-      </w:r>
-      <w:r>
-        <w:rPr>
-          <w:sz w:val="20"/>
-        </w:rPr>
-        <w:t>ạ</w:t>
-      </w:r>
-      <w:r>
-        <w:rPr>
-          <w:sz w:val="20"/>
-        </w:rPr>
-        <w:t>n 0,09% c</w:t>
-      </w:r>
-      <w:r>
-        <w:rPr>
-          <w:sz w:val="20"/>
-        </w:rPr>
-        <w:t>ủ</w:t>
-      </w:r>
-      <w:r>
-        <w:rPr>
-          <w:sz w:val="20"/>
-        </w:rPr>
-        <w:t>a l</w:t>
-      </w:r>
-      <w:r>
-        <w:rPr>
-          <w:sz w:val="20"/>
-        </w:rPr>
-        <w:t>ị</w:t>
-      </w:r>
-      <w:r>
-        <w:rPr>
-          <w:sz w:val="20"/>
-        </w:rPr>
-        <w:t>ch g</w:t>
-      </w:r>
-      <w:r>
-        <w:rPr>
-          <w:sz w:val="20"/>
-        </w:rPr>
-        <w:t>ố</w:t>
-      </w:r>
-      <w:r>
-        <w:rPr>
-          <w:sz w:val="20"/>
-        </w:rPr>
-        <w:t>c; b</w:t>
-      </w:r>
-      <w:r>
-        <w:rPr>
-          <w:sz w:val="20"/>
-        </w:rPr>
-        <w:t>ả</w:t>
-      </w:r>
-      <w:r>
-        <w:rPr>
-          <w:sz w:val="20"/>
-        </w:rPr>
-        <w:t>n nhóm ch</w:t>
-      </w:r>
-      <w:r>
-        <w:rPr>
-          <w:sz w:val="20"/>
-        </w:rPr>
-        <w:t>ấ</w:t>
-      </w:r>
-      <w:r>
-        <w:rPr>
-          <w:sz w:val="20"/>
-        </w:rPr>
-        <w:t>m 16 vì đã tính phương án nén l</w:t>
-      </w:r>
-      <w:r>
-        <w:rPr>
-          <w:sz w:val="20"/>
-        </w:rPr>
-        <w:t>ị</w:t>
-      </w:r>
-      <w:r>
-        <w:rPr>
-          <w:sz w:val="20"/>
-        </w:rPr>
-        <w:t xml:space="preserve">ch </w:t>
-      </w:r>
-      <w:r>
-        <w:rPr>
-          <w:sz w:val="20"/>
-        </w:rPr>
-        <w:t>ở</w:t>
-      </w:r>
-      <w:r>
-        <w:rPr>
-          <w:sz w:val="20"/>
-        </w:rPr>
-        <w:t xml:space="preserve"> m</w:t>
-      </w:r>
-      <w:r>
-        <w:rPr>
-          <w:sz w:val="20"/>
-        </w:rPr>
-        <w:t>ụ</w:t>
-      </w:r>
-      <w:r>
-        <w:rPr>
-          <w:sz w:val="20"/>
-        </w:rPr>
-        <w:t>c 4.5. Khác bi</w:t>
-      </w:r>
-      <w:r>
-        <w:rPr>
-          <w:sz w:val="20"/>
-        </w:rPr>
-        <w:t>ệ</w:t>
-      </w:r>
-      <w:r>
-        <w:rPr>
-          <w:sz w:val="20"/>
-        </w:rPr>
-        <w:t>t do m</w:t>
-      </w:r>
-      <w:r>
-        <w:rPr>
-          <w:sz w:val="20"/>
-        </w:rPr>
-        <w:t>ố</w:t>
-      </w:r>
-      <w:r>
-        <w:rPr>
-          <w:sz w:val="20"/>
-        </w:rPr>
-        <w:t>c đánh giá trư</w:t>
-      </w:r>
-      <w:r>
-        <w:rPr>
-          <w:sz w:val="20"/>
-        </w:rPr>
-        <w:t>ớ</w:t>
-      </w:r>
-      <w:r>
-        <w:rPr>
-          <w:sz w:val="20"/>
-        </w:rPr>
-        <w:t>c/sau khi nén l</w:t>
-      </w:r>
-      <w:r>
-        <w:rPr>
-          <w:sz w:val="20"/>
-        </w:rPr>
-        <w:t>ị</w:t>
-      </w:r>
-      <w:r>
-        <w:rPr>
-          <w:sz w:val="20"/>
-        </w:rPr>
-        <w:t>ch.</w:t>
+        <w:t>• Claude chấm "trễ go-live" (R02) 25 điểm (P5 × I5) dựa trên xác suất kịp hạn 0,09% của lịch gốc; bản nhóm chấm 16 vì đã tính phương án nén lịch ở mục 4.5. Khác biệt do mốc đánh giá trước/sau khi nén lịch.</w:t>
       </w:r>
     </w:p>
     <w:p>
@@ -43540,127 +42640,7 @@
         <w:rPr>
           <w:sz w:val="20"/>
         </w:rPr>
-        <w:t>• Claude có b</w:t>
-      </w:r>
-      <w:r>
-        <w:rPr>
-          <w:sz w:val="20"/>
-        </w:rPr>
-        <w:t>ả</w:t>
-      </w:r>
-      <w:r>
-        <w:rPr>
-          <w:sz w:val="20"/>
-        </w:rPr>
-        <w:t>ng đ</w:t>
-      </w:r>
-      <w:r>
-        <w:rPr>
-          <w:sz w:val="20"/>
-        </w:rPr>
-        <w:t>ị</w:t>
-      </w:r>
-      <w:r>
-        <w:rPr>
-          <w:sz w:val="20"/>
-        </w:rPr>
-        <w:t>nh nghĩa thang đo 1–5 theo ti</w:t>
-      </w:r>
-      <w:r>
-        <w:rPr>
-          <w:sz w:val="20"/>
-        </w:rPr>
-        <w:t>ế</w:t>
-      </w:r>
-      <w:r>
-        <w:rPr>
-          <w:sz w:val="20"/>
-        </w:rPr>
-        <w:t>n đ</w:t>
-      </w:r>
-      <w:r>
-        <w:rPr>
-          <w:sz w:val="20"/>
-        </w:rPr>
-        <w:t>ộ</w:t>
-      </w:r>
-      <w:r>
-        <w:rPr>
-          <w:sz w:val="20"/>
-        </w:rPr>
-        <w:t>, chi phí, ph</w:t>
-      </w:r>
-      <w:r>
-        <w:rPr>
-          <w:sz w:val="20"/>
-        </w:rPr>
-        <w:t>ạ</w:t>
-      </w:r>
-      <w:r>
-        <w:rPr>
-          <w:sz w:val="20"/>
-        </w:rPr>
-        <w:t>m vi nên ch</w:t>
-      </w:r>
-      <w:r>
-        <w:rPr>
-          <w:sz w:val="20"/>
-        </w:rPr>
-        <w:t>ấ</w:t>
-      </w:r>
-      <w:r>
-        <w:rPr>
-          <w:sz w:val="20"/>
-        </w:rPr>
-        <w:t>m đi</w:t>
-      </w:r>
-      <w:r>
-        <w:rPr>
-          <w:sz w:val="20"/>
-        </w:rPr>
-        <w:t>ể</w:t>
-      </w:r>
-      <w:r>
-        <w:rPr>
-          <w:sz w:val="20"/>
-        </w:rPr>
-        <w:t>m nh</w:t>
-      </w:r>
-      <w:r>
-        <w:rPr>
-          <w:sz w:val="20"/>
-        </w:rPr>
-        <w:t>ấ</w:t>
-      </w:r>
-      <w:r>
-        <w:rPr>
-          <w:sz w:val="20"/>
-        </w:rPr>
-        <w:t>t quán hơn; b</w:t>
-      </w:r>
-      <w:r>
-        <w:rPr>
-          <w:sz w:val="20"/>
-        </w:rPr>
-        <w:t>ả</w:t>
-      </w:r>
-      <w:r>
-        <w:rPr>
-          <w:sz w:val="20"/>
-        </w:rPr>
-        <w:t>n nhóm chưa có thang đo chi ti</w:t>
-      </w:r>
-      <w:r>
-        <w:rPr>
-          <w:sz w:val="20"/>
-        </w:rPr>
-        <w:t>ế</w:t>
-      </w:r>
-      <w:r>
-        <w:rPr>
-          <w:sz w:val="20"/>
-        </w:rPr>
-        <w:t>t.</w:t>
+        <w:t>• Claude có bảng định nghĩa thang đo 1–5 theo tiến độ, chi phí, phạm vi nên chấm điểm nhất quán hơn; bản nhóm chưa có thang đo chi tiết.</w:t>
       </w:r>
     </w:p>
     <w:p>
@@ -43672,283 +42652,7 @@
         <w:rPr>
           <w:sz w:val="20"/>
         </w:rPr>
-        <w:t>• Claude nêu thêm r</w:t>
-      </w:r>
-      <w:r>
-        <w:rPr>
-          <w:sz w:val="20"/>
-        </w:rPr>
-        <w:t>ủ</w:t>
-      </w:r>
-      <w:r>
-        <w:rPr>
-          <w:sz w:val="20"/>
-        </w:rPr>
-        <w:t>i ro b</w:t>
-      </w:r>
-      <w:r>
-        <w:rPr>
-          <w:sz w:val="20"/>
-        </w:rPr>
-        <w:t>ả</w:t>
-      </w:r>
-      <w:r>
-        <w:rPr>
-          <w:sz w:val="20"/>
-        </w:rPr>
-        <w:t>n nhóm chưa có, ví d</w:t>
-      </w:r>
-      <w:r>
-        <w:rPr>
-          <w:sz w:val="20"/>
-        </w:rPr>
-        <w:t>ụ</w:t>
-      </w:r>
-      <w:r>
-        <w:rPr>
-          <w:sz w:val="20"/>
-        </w:rPr>
-        <w:t xml:space="preserve"> R05 tranh ch</w:t>
-      </w:r>
-      <w:r>
-        <w:rPr>
-          <w:sz w:val="20"/>
-        </w:rPr>
-        <w:t>ấ</w:t>
-      </w:r>
-      <w:r>
-        <w:rPr>
-          <w:sz w:val="20"/>
-        </w:rPr>
-        <w:t>p nghi</w:t>
-      </w:r>
-      <w:r>
-        <w:rPr>
-          <w:sz w:val="20"/>
-        </w:rPr>
-        <w:t>ệ</w:t>
-      </w:r>
-      <w:r>
-        <w:rPr>
-          <w:sz w:val="20"/>
-        </w:rPr>
-        <w:t>m thu "g</w:t>
-      </w:r>
-      <w:r>
-        <w:rPr>
-          <w:sz w:val="20"/>
-        </w:rPr>
-        <w:t>ầ</w:t>
-      </w:r>
-      <w:r>
-        <w:rPr>
-          <w:sz w:val="20"/>
-        </w:rPr>
-        <w:t>n như th</w:t>
-      </w:r>
-      <w:r>
-        <w:rPr>
-          <w:sz w:val="20"/>
-        </w:rPr>
-        <w:t>ờ</w:t>
-      </w:r>
-      <w:r>
-        <w:rPr>
-          <w:sz w:val="20"/>
-        </w:rPr>
-        <w:t>i gian th</w:t>
-      </w:r>
-      <w:r>
-        <w:rPr>
-          <w:sz w:val="20"/>
-        </w:rPr>
-        <w:t>ự</w:t>
-      </w:r>
-      <w:r>
-        <w:rPr>
-          <w:sz w:val="20"/>
-        </w:rPr>
-        <w:t>c" và R11 phía khách hàng ch</w:t>
-      </w:r>
-      <w:r>
-        <w:rPr>
-          <w:sz w:val="20"/>
-        </w:rPr>
-        <w:t>ậ</w:t>
-      </w:r>
-      <w:r>
-        <w:rPr>
-          <w:sz w:val="20"/>
-        </w:rPr>
-        <w:t>m duy</w:t>
-      </w:r>
-      <w:r>
-        <w:rPr>
-          <w:sz w:val="20"/>
-        </w:rPr>
-        <w:t>ệ</w:t>
-      </w:r>
-      <w:r>
-        <w:rPr>
-          <w:sz w:val="20"/>
-        </w:rPr>
-        <w:t>t khi ch</w:t>
-      </w:r>
-      <w:r>
-        <w:rPr>
-          <w:sz w:val="20"/>
-        </w:rPr>
-        <w:t>ủ</w:t>
-      </w:r>
-      <w:r>
-        <w:rPr>
-          <w:sz w:val="20"/>
-        </w:rPr>
-        <w:t xml:space="preserve"> nhà thu</w:t>
-      </w:r>
-      <w:r>
-        <w:rPr>
-          <w:sz w:val="20"/>
-        </w:rPr>
-        <w:t>ố</w:t>
-      </w:r>
-      <w:r>
-        <w:rPr>
-          <w:sz w:val="20"/>
-        </w:rPr>
-        <w:t>c v</w:t>
-      </w:r>
-      <w:r>
-        <w:rPr>
-          <w:sz w:val="20"/>
-        </w:rPr>
-        <w:t>ắ</w:t>
-      </w:r>
-      <w:r>
-        <w:rPr>
-          <w:sz w:val="20"/>
-        </w:rPr>
-        <w:t>ng. Vì v</w:t>
-      </w:r>
-      <w:r>
-        <w:rPr>
-          <w:sz w:val="20"/>
-        </w:rPr>
-        <w:t>ậ</w:t>
-      </w:r>
-      <w:r>
-        <w:rPr>
-          <w:sz w:val="20"/>
-        </w:rPr>
-        <w:t>y 2 r</w:t>
-      </w:r>
-      <w:r>
-        <w:rPr>
-          <w:sz w:val="20"/>
-        </w:rPr>
-        <w:t>ủ</w:t>
-      </w:r>
-      <w:r>
-        <w:rPr>
-          <w:sz w:val="20"/>
-        </w:rPr>
-        <w:t>i ro nhóm t</w:t>
-      </w:r>
-      <w:r>
-        <w:rPr>
-          <w:sz w:val="20"/>
-        </w:rPr>
-        <w:t>ự</w:t>
-      </w:r>
-      <w:r>
-        <w:rPr>
-          <w:sz w:val="20"/>
-        </w:rPr>
-        <w:t xml:space="preserve"> b</w:t>
-      </w:r>
-      <w:r>
-        <w:rPr>
-          <w:sz w:val="20"/>
-        </w:rPr>
-        <w:t>ổ</w:t>
-      </w:r>
-      <w:r>
-        <w:rPr>
-          <w:sz w:val="20"/>
-        </w:rPr>
-        <w:t xml:space="preserve"> sung (R11, R12 </w:t>
-      </w:r>
-      <w:r>
-        <w:rPr>
-          <w:sz w:val="20"/>
-        </w:rPr>
-        <w:t>ở</w:t>
-      </w:r>
-      <w:r>
-        <w:rPr>
-          <w:sz w:val="20"/>
-        </w:rPr>
-        <w:t xml:space="preserve"> b</w:t>
-      </w:r>
-      <w:r>
-        <w:rPr>
-          <w:sz w:val="20"/>
-        </w:rPr>
-        <w:t>ả</w:t>
-      </w:r>
-      <w:r>
-        <w:rPr>
-          <w:sz w:val="20"/>
-        </w:rPr>
-        <w:t>ng trên) ph</w:t>
-      </w:r>
-      <w:r>
-        <w:rPr>
-          <w:sz w:val="20"/>
-        </w:rPr>
-        <w:t>ả</w:t>
-      </w:r>
-      <w:r>
-        <w:rPr>
-          <w:sz w:val="20"/>
-        </w:rPr>
-        <w:t>i khác c</w:t>
-      </w:r>
-      <w:r>
-        <w:rPr>
-          <w:sz w:val="20"/>
-        </w:rPr>
-        <w:t>ả</w:t>
-      </w:r>
-      <w:r>
-        <w:rPr>
-          <w:sz w:val="20"/>
-        </w:rPr>
-        <w:t xml:space="preserve"> 14 r</w:t>
-      </w:r>
-      <w:r>
-        <w:rPr>
-          <w:sz w:val="20"/>
-        </w:rPr>
-        <w:t>ủ</w:t>
-      </w:r>
-      <w:r>
-        <w:rPr>
-          <w:sz w:val="20"/>
-        </w:rPr>
-        <w:t>i ro c</w:t>
-      </w:r>
-      <w:r>
-        <w:rPr>
-          <w:sz w:val="20"/>
-        </w:rPr>
-        <w:t>ủ</w:t>
-      </w:r>
-      <w:r>
-        <w:rPr>
-          <w:sz w:val="20"/>
-        </w:rPr>
-        <w:t>a Claude.</w:t>
+        <w:t>• Claude nêu thêm rủi ro bản nhóm chưa có, ví dụ R05 tranh chấp nghiệm thu "gần như thời gian thực" và R11 phía khách hàng chậm duyệt khi chủ nhà thuốc vắng. Vì vậy 2 rủi ro nhóm tự bổ sung (R11, R12 ở bảng trên) phải khác cả 14 rủi ro của Claude.</w:t>
       </w:r>
     </w:p>
     <w:p>
@@ -43960,223 +42664,7 @@
         <w:rPr>
           <w:sz w:val="20"/>
         </w:rPr>
-        <w:t>• Lưu ý: prompt Bài 4 g</w:t>
-      </w:r>
-      <w:r>
-        <w:rPr>
-          <w:sz w:val="20"/>
-        </w:rPr>
-        <w:t>ử</w:t>
-      </w:r>
-      <w:r>
-        <w:rPr>
-          <w:sz w:val="20"/>
-        </w:rPr>
-        <w:t>i thi</w:t>
-      </w:r>
-      <w:r>
-        <w:rPr>
-          <w:sz w:val="20"/>
-        </w:rPr>
-        <w:t>ế</w:t>
-      </w:r>
-      <w:r>
-        <w:rPr>
-          <w:sz w:val="20"/>
-        </w:rPr>
-        <w:t>u n</w:t>
-      </w:r>
-      <w:r>
-        <w:rPr>
-          <w:sz w:val="20"/>
-        </w:rPr>
-        <w:t>ộ</w:t>
-      </w:r>
-      <w:r>
-        <w:rPr>
-          <w:sz w:val="20"/>
-        </w:rPr>
-        <w:t>i dung chi ti</w:t>
-      </w:r>
-      <w:r>
-        <w:rPr>
-          <w:sz w:val="20"/>
-        </w:rPr>
-        <w:t>ế</w:t>
-      </w:r>
-      <w:r>
-        <w:rPr>
-          <w:sz w:val="20"/>
-        </w:rPr>
-        <w:t>t nên Claude dùng khung PMBOK m</w:t>
-      </w:r>
-      <w:r>
-        <w:rPr>
-          <w:sz w:val="20"/>
-        </w:rPr>
-        <w:t>ặ</w:t>
-      </w:r>
-      <w:r>
-        <w:rPr>
-          <w:sz w:val="20"/>
-        </w:rPr>
-        <w:t>c đ</w:t>
-      </w:r>
-      <w:r>
-        <w:rPr>
-          <w:sz w:val="20"/>
-        </w:rPr>
-        <w:t>ị</w:t>
-      </w:r>
-      <w:r>
-        <w:rPr>
-          <w:sz w:val="20"/>
-        </w:rPr>
-        <w:t>nh; c</w:t>
-      </w:r>
-      <w:r>
-        <w:rPr>
-          <w:sz w:val="20"/>
-        </w:rPr>
-        <w:t>ầ</w:t>
-      </w:r>
-      <w:r>
-        <w:rPr>
-          <w:sz w:val="20"/>
-        </w:rPr>
-        <w:t>n ki</w:t>
-      </w:r>
-      <w:r>
-        <w:rPr>
-          <w:sz w:val="20"/>
-        </w:rPr>
-        <w:t>ể</w:t>
-      </w:r>
-      <w:r>
-        <w:rPr>
-          <w:sz w:val="20"/>
-        </w:rPr>
-        <w:t>m tra b</w:t>
-      </w:r>
-      <w:r>
-        <w:rPr>
-          <w:sz w:val="20"/>
-        </w:rPr>
-        <w:t>ả</w:t>
-      </w:r>
-      <w:r>
-        <w:rPr>
-          <w:sz w:val="20"/>
-        </w:rPr>
-        <w:t>ng c</w:t>
-      </w:r>
-      <w:r>
-        <w:rPr>
-          <w:sz w:val="20"/>
-        </w:rPr>
-        <w:t>ủ</w:t>
-      </w:r>
-      <w:r>
-        <w:rPr>
-          <w:sz w:val="20"/>
-        </w:rPr>
-        <w:t>a Claude có đ</w:t>
-      </w:r>
-      <w:r>
-        <w:rPr>
-          <w:sz w:val="20"/>
-        </w:rPr>
-        <w:t>ủ</w:t>
-      </w:r>
-      <w:r>
-        <w:rPr>
-          <w:sz w:val="20"/>
-        </w:rPr>
-        <w:t xml:space="preserve"> c</w:t>
-      </w:r>
-      <w:r>
-        <w:rPr>
-          <w:sz w:val="20"/>
-        </w:rPr>
-        <w:t>ộ</w:t>
-      </w:r>
-      <w:r>
-        <w:rPr>
-          <w:sz w:val="20"/>
-        </w:rPr>
-        <w:t>t Chi</w:t>
-      </w:r>
-      <w:r>
-        <w:rPr>
-          <w:sz w:val="20"/>
-        </w:rPr>
-        <w:t>ế</w:t>
-      </w:r>
-      <w:r>
-        <w:rPr>
-          <w:sz w:val="20"/>
-        </w:rPr>
-        <w:t>n lư</w:t>
-      </w:r>
-      <w:r>
-        <w:rPr>
-          <w:sz w:val="20"/>
-        </w:rPr>
-        <w:t>ợ</w:t>
-      </w:r>
-      <w:r>
-        <w:rPr>
-          <w:sz w:val="20"/>
-        </w:rPr>
-        <w:t>c và Ngư</w:t>
-      </w:r>
-      <w:r>
-        <w:rPr>
-          <w:sz w:val="20"/>
-        </w:rPr>
-        <w:t>ờ</w:t>
-      </w:r>
-      <w:r>
-        <w:rPr>
-          <w:sz w:val="20"/>
-        </w:rPr>
-        <w:t>i ph</w:t>
-      </w:r>
-      <w:r>
-        <w:rPr>
-          <w:sz w:val="20"/>
-        </w:rPr>
-        <w:t>ụ</w:t>
-      </w:r>
-      <w:r>
-        <w:rPr>
-          <w:sz w:val="20"/>
-        </w:rPr>
-        <w:t xml:space="preserve"> trách như đ</w:t>
-      </w:r>
-      <w:r>
-        <w:rPr>
-          <w:sz w:val="20"/>
-        </w:rPr>
-        <w:t>ề</w:t>
-      </w:r>
-      <w:r>
-        <w:rPr>
-          <w:sz w:val="20"/>
-        </w:rPr>
-        <w:t xml:space="preserve"> yêu c</w:t>
-      </w:r>
-      <w:r>
-        <w:rPr>
-          <w:sz w:val="20"/>
-        </w:rPr>
-        <w:t>ầ</w:t>
-      </w:r>
-      <w:r>
-        <w:rPr>
-          <w:sz w:val="20"/>
-        </w:rPr>
-        <w:t>u.</w:t>
+        <w:t>• Lưu ý: prompt Bài 4 gửi thiếu nội dung chi tiết nên Claude dùng khung PMBOK mặc định; cần kiểm tra bảng của Claude có đủ cột Chiến lược và Người phụ trách như đề yêu cầu.</w:t>
       </w:r>
     </w:p>
     <w:p>
@@ -44196,7 +42684,7 @@
         <w:keepNext/>
         <w:keepLines/>
       </w:pPr>
-      <w:bookmarkStart w:id="23" w:name="_Toc242015357"/>
+      <w:bookmarkStart w:id="23" w:name="_Toc242015923"/>
       <w:r>
         <w:t>6.1 Ma trận xác suất – tác động</w:t>
       </w:r>
@@ -44274,7 +42762,7 @@
         <w:keepNext/>
         <w:keepLines/>
       </w:pPr>
-      <w:bookmarkStart w:id="24" w:name="_Toc242015358"/>
+      <w:bookmarkStart w:id="24" w:name="_Toc242015924"/>
       <w:r>
         <w:t>6.2 Kế hoạch dự phòng cho rủi ro điểm cao nhất – R01</w:t>
       </w:r>
@@ -44842,7 +43330,7 @@
         <w:keepNext/>
         <w:keepLines/>
       </w:pPr>
-      <w:bookmarkStart w:id="25" w:name="_Toc242015359"/>
+      <w:bookmarkStart w:id="25" w:name="_Toc242015925"/>
       <w:r>
         <w:t>7. Phản biện đầu ra AI</w:t>
       </w:r>
@@ -45041,12 +43529,9 @@
             </w:pPr>
             <w:r>
               <w:rPr>
-                <w:i/>
-                <w:iCs/>
-                <w:color w:val="7A5C00"/>
-                <w:highlight w:val="yellow"/>
-              </w:rPr>
-              <w:t>[NHÓM ĐIỀN: câu hỏi]</w:t>
+                <w:sz w:val="18"/>
+              </w:rPr>
+              <w:t>“Charter hứa go-live 21/12 và còn chừa 10 ngày dự phòng. Nhưng lịch PERT của chính các bạn nói dự án xong khoảng 18/01/2027, xác suất kịp 31/12 chỉ 0,09%. Vậy 10 ngày dự phòng đó tính từ đâu ra, và tôi đang ký vào ngày nào?”</w:t>
             </w:r>
           </w:p>
         </w:tc>
@@ -45137,12 +43622,9 @@
             </w:pPr>
             <w:r>
               <w:rPr>
-                <w:i/>
-                <w:iCs/>
-                <w:color w:val="7A5C00"/>
-                <w:highlight w:val="yellow"/>
-              </w:rPr>
-              <w:t>[NHÓM ĐIỀN: câu hỏi]</w:t>
+                <w:sz w:val="18"/>
+              </w:rPr>
+              <w:t>“Backend cần 572 giờ mà chỉ có 480 giờ. Lịch PERT lại cho phát triển API (G) và tích hợp POS, chuyển dữ liệu (H) chạy cùng lúc, như thể tôi có hai Backend. Nếu một người làm lần lượt thì dự án kéo dài bao lâu? Và nếu bạn Backend ốm một tuần thì ai làm thay?”</w:t>
             </w:r>
           </w:p>
         </w:tc>
@@ -45233,12 +43715,9 @@
             </w:pPr>
             <w:r>
               <w:rPr>
-                <w:i/>
-                <w:iCs/>
-                <w:color w:val="7A5C00"/>
-                <w:highlight w:val="yellow"/>
-              </w:rPr>
-              <w:t>[NHÓM ĐIỀN: câu hỏi]</w:t>
+                <w:sz w:val="18"/>
+              </w:rPr>
+              <w:t>“Charter ghi ‘Chưa phân bổ’ cho cả phát triển, hosting, đào tạo và dự phòng. Tức là các bạn xin tôi ký một con số mà chưa ai tính. Sổ rủi ro còn đề xuất thuê ngoài ‘nếu ngân sách cho phép’. Tiền thuê ngoài, tiền làm thêm giờ, phí kết nối POS lấy từ đâu, khi 250 triệu là trần cứng?”</w:t>
             </w:r>
           </w:p>
         </w:tc>
@@ -45329,12 +43808,9 @@
             </w:pPr>
             <w:r>
               <w:rPr>
-                <w:i/>
-                <w:iCs/>
-                <w:color w:val="7A5C00"/>
-                <w:highlight w:val="yellow"/>
-              </w:rPr>
-              <w:t>[NHÓM ĐIỀN: câu hỏi]</w:t>
+                <w:sz w:val="18"/>
+              </w:rPr>
+              <w:t>“Toàn bộ màn hình doanh thu của tôi lấy dữ liệu từ phần mềm bán hàng, mà chính tài liệu yêu cầu ghi là chưa biết có kết nối được không. Các bạn chỉ dành 40 giờ và giả định là có API. Nếu phương án dự phòng là nhập file theo lịch, thì ‘gần thời gian thực’ còn không? Và nếu hóa đơn không có số lô, cảnh báo hết hạn – lý do chính tôi bỏ tiền – còn đúng không?”</w:t>
             </w:r>
           </w:p>
         </w:tc>
@@ -45425,55 +43901,577 @@
             </w:pPr>
             <w:r>
               <w:rPr>
+                <w:sz w:val="18"/>
+              </w:rPr>
+              <w:t>“Xác suất đúng hạn 0,09% thì không còn là rủi ro nữa, đó là việc chắc chắn xảy ra. Vậy mà cách ứng phó chỉ là ‘trình khách hàng phương án trong tuần 1–2’. Hôm nay các bạn đề nghị tôi chọn gì: cắt chức năng nào, lùi đến ngày nào, hay thêm bao nhiêu tiền? Và nếu hệ thống mới lỗi đúng lúc tôi kiểm kê cuối năm thì quay về cách cũ thế nào?”</w:t>
+            </w:r>
+          </w:p>
+        </w:tc>
+        <w:tc>
+          <w:tcPr>
+            <w:tcW w:w="4838" w:type="dxa"/>
+            <w:tcBorders>
+              <w:top w:val="single" w:sz="4" w:space="0" w:color="BFBFBF"/>
+              <w:left w:val="single" w:sz="4" w:space="0" w:color="BFBFBF"/>
+              <w:bottom w:val="single" w:sz="4" w:space="0" w:color="BFBFBF"/>
+              <w:right w:val="single" w:sz="4" w:space="0" w:color="BFBFBF"/>
+            </w:tcBorders>
+            <w:tcMar>
+              <w:top w:w="50" w:type="dxa"/>
+              <w:left w:w="90" w:type="dxa"/>
+              <w:bottom w:w="50" w:type="dxa"/>
+              <w:right w:w="90" w:type="dxa"/>
+            </w:tcMar>
+          </w:tcPr>
+          <w:p>
+            <w:pPr>
+              <w:spacing w:after="20"/>
+            </w:pPr>
+            <w:r>
+              <w:rPr>
                 <w:i/>
                 <w:iCs/>
                 <w:color w:val="7A5C00"/>
                 <w:highlight w:val="yellow"/>
               </w:rPr>
-              <w:t>[NHÓM ĐIỀN: câu hỏi]</w:t>
-            </w:r>
-          </w:p>
-        </w:tc>
-        <w:tc>
-          <w:tcPr>
-            <w:tcW w:w="4838" w:type="dxa"/>
-            <w:tcBorders>
-              <w:top w:val="single" w:sz="4" w:space="0" w:color="BFBFBF"/>
-              <w:left w:val="single" w:sz="4" w:space="0" w:color="BFBFBF"/>
-              <w:bottom w:val="single" w:sz="4" w:space="0" w:color="BFBFBF"/>
-              <w:right w:val="single" w:sz="4" w:space="0" w:color="BFBFBF"/>
-            </w:tcBorders>
-            <w:tcMar>
-              <w:top w:w="50" w:type="dxa"/>
-              <w:left w:w="90" w:type="dxa"/>
-              <w:bottom w:w="50" w:type="dxa"/>
-              <w:right w:w="90" w:type="dxa"/>
-            </w:tcMar>
-          </w:tcPr>
-          <w:p>
-            <w:pPr>
-              <w:spacing w:after="20"/>
-            </w:pPr>
-            <w:r>
-              <w:rPr>
-                <w:i/>
-                <w:iCs/>
-                <w:color w:val="7A5C00"/>
-                <w:highlight w:val="yellow"/>
-              </w:rPr>
               <w:t>[NHÓM ĐIỀN: câu trả lời có lập luận, dẫn số liệu từ kế hoạch]</w:t>
             </w:r>
           </w:p>
         </w:tc>
       </w:tr>
     </w:tbl>
+    <w:p>
+      <w:r>
+        <w:rPr>
+          <w:i/>
+          <w:sz w:val="19"/>
+        </w:rPr>
+        <w:t>Ngu</w:t>
+      </w:r>
+      <w:r>
+        <w:rPr>
+          <w:i/>
+          <w:sz w:val="19"/>
+        </w:rPr>
+        <w:t>ồ</w:t>
+      </w:r>
+      <w:r>
+        <w:rPr>
+          <w:i/>
+          <w:sz w:val="19"/>
+        </w:rPr>
+        <w:t>n: chat Bai5_PhanBien trong Claude Project (04/10/2026), câu h</w:t>
+      </w:r>
+      <w:r>
+        <w:rPr>
+          <w:i/>
+          <w:sz w:val="19"/>
+        </w:rPr>
+        <w:t>ỏ</w:t>
+      </w:r>
+      <w:r>
+        <w:rPr>
+          <w:i/>
+          <w:sz w:val="19"/>
+        </w:rPr>
+        <w:t>i dán nguyên văn. Lưu ý: Sponsor c</w:t>
+      </w:r>
+      <w:r>
+        <w:rPr>
+          <w:i/>
+          <w:sz w:val="19"/>
+        </w:rPr>
+        <w:t>ủ</w:t>
+      </w:r>
+      <w:r>
+        <w:rPr>
+          <w:i/>
+          <w:sz w:val="19"/>
+        </w:rPr>
+        <w:t>a Claude ch</w:t>
+      </w:r>
+      <w:r>
+        <w:rPr>
+          <w:i/>
+          <w:sz w:val="19"/>
+        </w:rPr>
+        <w:t>ấ</w:t>
+      </w:r>
+      <w:r>
+        <w:rPr>
+          <w:i/>
+          <w:sz w:val="19"/>
+        </w:rPr>
+        <w:t>t v</w:t>
+      </w:r>
+      <w:r>
+        <w:rPr>
+          <w:i/>
+          <w:sz w:val="19"/>
+        </w:rPr>
+        <w:t>ấ</w:t>
+      </w:r>
+      <w:r>
+        <w:rPr>
+          <w:i/>
+          <w:sz w:val="19"/>
+        </w:rPr>
+        <w:t>n d</w:t>
+      </w:r>
+      <w:r>
+        <w:rPr>
+          <w:i/>
+          <w:sz w:val="19"/>
+        </w:rPr>
+        <w:t>ự</w:t>
+      </w:r>
+      <w:r>
+        <w:rPr>
+          <w:i/>
+          <w:sz w:val="19"/>
+        </w:rPr>
+        <w:t>a trên Charter, WBS, l</w:t>
+      </w:r>
+      <w:r>
+        <w:rPr>
+          <w:i/>
+          <w:sz w:val="19"/>
+        </w:rPr>
+        <w:t>ị</w:t>
+      </w:r>
+      <w:r>
+        <w:rPr>
+          <w:i/>
+          <w:sz w:val="19"/>
+        </w:rPr>
+        <w:t>ch và s</w:t>
+      </w:r>
+      <w:r>
+        <w:rPr>
+          <w:i/>
+          <w:sz w:val="19"/>
+        </w:rPr>
+        <w:t>ổ</w:t>
+      </w:r>
+      <w:r>
+        <w:rPr>
+          <w:i/>
+          <w:sz w:val="19"/>
+        </w:rPr>
+        <w:t xml:space="preserve"> r</w:t>
+      </w:r>
+      <w:r>
+        <w:rPr>
+          <w:i/>
+          <w:sz w:val="19"/>
+        </w:rPr>
+        <w:t>ủ</w:t>
+      </w:r>
+      <w:r>
+        <w:rPr>
+          <w:i/>
+          <w:sz w:val="19"/>
+        </w:rPr>
+        <w:t>i ro do chính Claude so</w:t>
+      </w:r>
+      <w:r>
+        <w:rPr>
+          <w:i/>
+          <w:sz w:val="19"/>
+        </w:rPr>
+        <w:t>ạ</w:t>
+      </w:r>
+      <w:r>
+        <w:rPr>
+          <w:i/>
+          <w:sz w:val="19"/>
+        </w:rPr>
+        <w:t>n trong project (go-live 21/12, WBS 1.912 gi</w:t>
+      </w:r>
+      <w:r>
+        <w:rPr>
+          <w:i/>
+          <w:sz w:val="19"/>
+        </w:rPr>
+        <w:t>ờ</w:t>
+      </w:r>
+      <w:r>
+        <w:rPr>
+          <w:i/>
+          <w:sz w:val="19"/>
+        </w:rPr>
+        <w:t>, R02 = 25 đi</w:t>
+      </w:r>
+      <w:r>
+        <w:rPr>
+          <w:i/>
+          <w:sz w:val="19"/>
+        </w:rPr>
+        <w:t>ể</w:t>
+      </w:r>
+      <w:r>
+        <w:rPr>
+          <w:i/>
+          <w:sz w:val="19"/>
+        </w:rPr>
+        <w:t>m), không ph</w:t>
+      </w:r>
+      <w:r>
+        <w:rPr>
+          <w:i/>
+          <w:sz w:val="19"/>
+        </w:rPr>
+        <w:t>ả</w:t>
+      </w:r>
+      <w:r>
+        <w:rPr>
+          <w:i/>
+          <w:sz w:val="19"/>
+        </w:rPr>
+        <w:t>i b</w:t>
+      </w:r>
+      <w:r>
+        <w:rPr>
+          <w:i/>
+          <w:sz w:val="19"/>
+        </w:rPr>
+        <w:t>ả</w:t>
+      </w:r>
+      <w:r>
+        <w:rPr>
+          <w:i/>
+          <w:sz w:val="19"/>
+        </w:rPr>
+        <w:t>n k</w:t>
+      </w:r>
+      <w:r>
+        <w:rPr>
+          <w:i/>
+          <w:sz w:val="19"/>
+        </w:rPr>
+        <w:t>ế</w:t>
+      </w:r>
+      <w:r>
+        <w:rPr>
+          <w:i/>
+          <w:sz w:val="19"/>
+        </w:rPr>
+        <w:t xml:space="preserve"> ho</w:t>
+      </w:r>
+      <w:r>
+        <w:rPr>
+          <w:i/>
+          <w:sz w:val="19"/>
+        </w:rPr>
+        <w:t>ạ</w:t>
+      </w:r>
+      <w:r>
+        <w:rPr>
+          <w:i/>
+          <w:sz w:val="19"/>
+        </w:rPr>
+        <w:t>ch c</w:t>
+      </w:r>
+      <w:r>
+        <w:rPr>
+          <w:i/>
+          <w:sz w:val="19"/>
+        </w:rPr>
+        <w:t>ủ</w:t>
+      </w:r>
+      <w:r>
+        <w:rPr>
+          <w:i/>
+          <w:sz w:val="19"/>
+        </w:rPr>
+        <w:t>a nhóm trong báo cáo này.</w:t>
+      </w:r>
+    </w:p>
+    <w:p>
+      <w:pPr>
+        <w:keepNext/>
+        <w:jc w:val="center"/>
+      </w:pPr>
+      <w:r>
+        <w:rPr>
+          <w:noProof/>
+        </w:rPr>
+        <w:drawing>
+          <wp:inline distT="0" distB="0" distL="0" distR="0" wp14:anchorId="03DDA488" wp14:editId="68FDAFEC">
+            <wp:extent cx="5760000" cy="3695575"/>
+            <wp:effectExtent l="0" t="0" r="0" b="0"/>
+            <wp:docPr id="15" name="Picture 15"/>
+            <wp:cNvGraphicFramePr>
+              <a:graphicFrameLocks xmlns:a="http://schemas.openxmlformats.org/drawingml/2006/main" noChangeAspect="1"/>
+            </wp:cNvGraphicFramePr>
+            <a:graphic xmlns:a="http://schemas.openxmlformats.org/drawingml/2006/main">
+              <a:graphicData uri="http://schemas.openxmlformats.org/drawingml/2006/picture">
+                <pic:pic xmlns:pic="http://schemas.openxmlformats.org/drawingml/2006/picture">
+                  <pic:nvPicPr>
+                    <pic:cNvPr id="0" name="b5_tomtat.png"/>
+                    <pic:cNvPicPr/>
+                  </pic:nvPicPr>
+                  <pic:blipFill>
+                    <a:blip r:embed="rId27"/>
+                    <a:stretch>
+                      <a:fillRect/>
+                    </a:stretch>
+                  </pic:blipFill>
+                  <pic:spPr>
+                    <a:xfrm>
+                      <a:off x="0" y="0"/>
+                      <a:ext cx="5760000" cy="3695575"/>
+                    </a:xfrm>
+                    <a:prstGeom prst="rect">
+                      <a:avLst/>
+                    </a:prstGeom>
+                  </pic:spPr>
+                </pic:pic>
+              </a:graphicData>
+            </a:graphic>
+          </wp:inline>
+        </w:drawing>
+      </w:r>
+    </w:p>
+    <w:p>
+      <w:pPr>
+        <w:jc w:val="center"/>
+      </w:pPr>
+      <w:r>
+        <w:rPr>
+          <w:i/>
+          <w:color w:val="595959"/>
+          <w:sz w:val="18"/>
+        </w:rPr>
+        <w:t>Hình 7.1 – Tóm t</w:t>
+      </w:r>
+      <w:r>
+        <w:rPr>
+          <w:i/>
+          <w:color w:val="595959"/>
+          <w:sz w:val="18"/>
+        </w:rPr>
+        <w:t>ắ</w:t>
+      </w:r>
+      <w:r>
+        <w:rPr>
+          <w:i/>
+          <w:color w:val="595959"/>
+          <w:sz w:val="18"/>
+        </w:rPr>
+        <w:t>t 5 câu ch</w:t>
+      </w:r>
+      <w:r>
+        <w:rPr>
+          <w:i/>
+          <w:color w:val="595959"/>
+          <w:sz w:val="18"/>
+        </w:rPr>
+        <w:t>ấ</w:t>
+      </w:r>
+      <w:r>
+        <w:rPr>
+          <w:i/>
+          <w:color w:val="595959"/>
+          <w:sz w:val="18"/>
+        </w:rPr>
+        <w:t>t v</w:t>
+      </w:r>
+      <w:r>
+        <w:rPr>
+          <w:i/>
+          <w:color w:val="595959"/>
+          <w:sz w:val="18"/>
+        </w:rPr>
+        <w:t>ấ</w:t>
+      </w:r>
+      <w:r>
+        <w:rPr>
+          <w:i/>
+          <w:color w:val="595959"/>
+          <w:sz w:val="18"/>
+        </w:rPr>
+        <w:t>n c</w:t>
+      </w:r>
+      <w:r>
+        <w:rPr>
+          <w:i/>
+          <w:color w:val="595959"/>
+          <w:sz w:val="18"/>
+        </w:rPr>
+        <w:t>ủ</w:t>
+      </w:r>
+      <w:r>
+        <w:rPr>
+          <w:i/>
+          <w:color w:val="595959"/>
+          <w:sz w:val="18"/>
+        </w:rPr>
+        <w:t>a Sponsor (Claude Project, Bài 5)</w:t>
+      </w:r>
+    </w:p>
+    <w:p>
+      <w:pPr>
+        <w:keepNext/>
+        <w:jc w:val="center"/>
+      </w:pPr>
+      <w:r>
+        <w:rPr>
+          <w:noProof/>
+        </w:rPr>
+        <w:drawing>
+          <wp:inline distT="0" distB="0" distL="0" distR="0" wp14:anchorId="6752EB9D" wp14:editId="7325E20A">
+            <wp:extent cx="5400000" cy="3111429"/>
+            <wp:effectExtent l="0" t="0" r="0" b="0"/>
+            <wp:docPr id="16" name="Picture 16"/>
+            <wp:cNvGraphicFramePr>
+              <a:graphicFrameLocks xmlns:a="http://schemas.openxmlformats.org/drawingml/2006/main" noChangeAspect="1"/>
+            </wp:cNvGraphicFramePr>
+            <a:graphic xmlns:a="http://schemas.openxmlformats.org/drawingml/2006/main">
+              <a:graphicData uri="http://schemas.openxmlformats.org/drawingml/2006/picture">
+                <pic:pic xmlns:pic="http://schemas.openxmlformats.org/drawingml/2006/picture">
+                  <pic:nvPicPr>
+                    <pic:cNvPr id="0" name="b5_cau1.png"/>
+                    <pic:cNvPicPr/>
+                  </pic:nvPicPr>
+                  <pic:blipFill>
+                    <a:blip r:embed="rId28"/>
+                    <a:stretch>
+                      <a:fillRect/>
+                    </a:stretch>
+                  </pic:blipFill>
+                  <pic:spPr>
+                    <a:xfrm>
+                      <a:off x="0" y="0"/>
+                      <a:ext cx="5400000" cy="3111429"/>
+                    </a:xfrm>
+                    <a:prstGeom prst="rect">
+                      <a:avLst/>
+                    </a:prstGeom>
+                  </pic:spPr>
+                </pic:pic>
+              </a:graphicData>
+            </a:graphic>
+          </wp:inline>
+        </w:drawing>
+      </w:r>
+    </w:p>
+    <w:p>
+      <w:pPr>
+        <w:jc w:val="center"/>
+      </w:pPr>
+      <w:r>
+        <w:rPr>
+          <w:i/>
+          <w:color w:val="595959"/>
+          <w:sz w:val="18"/>
+        </w:rPr>
+        <w:t>Hình 7.2 – Ví d</w:t>
+      </w:r>
+      <w:r>
+        <w:rPr>
+          <w:i/>
+          <w:color w:val="595959"/>
+          <w:sz w:val="18"/>
+        </w:rPr>
+        <w:t>ụ</w:t>
+      </w:r>
+      <w:r>
+        <w:rPr>
+          <w:i/>
+          <w:color w:val="595959"/>
+          <w:sz w:val="18"/>
+        </w:rPr>
+        <w:t xml:space="preserve"> chi ti</w:t>
+      </w:r>
+      <w:r>
+        <w:rPr>
+          <w:i/>
+          <w:color w:val="595959"/>
+          <w:sz w:val="18"/>
+        </w:rPr>
+        <w:t>ế</w:t>
+      </w:r>
+      <w:r>
+        <w:rPr>
+          <w:i/>
+          <w:color w:val="595959"/>
+          <w:sz w:val="18"/>
+        </w:rPr>
+        <w:t>t câu 1: câu h</w:t>
+      </w:r>
+      <w:r>
+        <w:rPr>
+          <w:i/>
+          <w:color w:val="595959"/>
+          <w:sz w:val="18"/>
+        </w:rPr>
+        <w:t>ỏ</w:t>
+      </w:r>
+      <w:r>
+        <w:rPr>
+          <w:i/>
+          <w:color w:val="595959"/>
+          <w:sz w:val="18"/>
+        </w:rPr>
+        <w:t>i, căn c</w:t>
+      </w:r>
+      <w:r>
+        <w:rPr>
+          <w:i/>
+          <w:color w:val="595959"/>
+          <w:sz w:val="18"/>
+        </w:rPr>
+        <w:t>ứ</w:t>
+      </w:r>
+      <w:r>
+        <w:rPr>
+          <w:i/>
+          <w:color w:val="595959"/>
+          <w:sz w:val="18"/>
+        </w:rPr>
+        <w:t xml:space="preserve"> và đi</w:t>
+      </w:r>
+      <w:r>
+        <w:rPr>
+          <w:i/>
+          <w:color w:val="595959"/>
+          <w:sz w:val="18"/>
+        </w:rPr>
+        <w:t>ề</w:t>
+      </w:r>
+      <w:r>
+        <w:rPr>
+          <w:i/>
+          <w:color w:val="595959"/>
+          <w:sz w:val="18"/>
+        </w:rPr>
+        <w:t>u Sponsor c</w:t>
+      </w:r>
+      <w:r>
+        <w:rPr>
+          <w:i/>
+          <w:color w:val="595959"/>
+          <w:sz w:val="18"/>
+        </w:rPr>
+        <w:t>ầ</w:t>
+      </w:r>
+      <w:r>
+        <w:rPr>
+          <w:i/>
+          <w:color w:val="595959"/>
+          <w:sz w:val="18"/>
+        </w:rPr>
+        <w:t>n nghe</w:t>
+      </w:r>
+    </w:p>
     <w:p>
       <w:pPr>
         <w:pStyle w:val="Heading2"/>
         <w:keepNext/>
         <w:keepLines/>
       </w:pPr>
-      <w:bookmarkStart w:id="26" w:name="_Toc242015360"/>
+      <w:bookmarkStart w:id="26" w:name="_Toc242015926"/>
       <w:r>
         <w:t>7.1 Phản tư</w:t>
       </w:r>
@@ -45537,7 +44535,7 @@
         <w:keepNext/>
         <w:keepLines/>
       </w:pPr>
-      <w:bookmarkStart w:id="27" w:name="_Toc242015361"/>
+      <w:bookmarkStart w:id="27" w:name="_Toc242015927"/>
       <w:r>
         <w:t>8. Nhật ký sử dụng AI</w:t>
       </w:r>
@@ -46762,12 +45760,9 @@
             </w:pPr>
             <w:r>
               <w:rPr>
-                <w:i/>
-                <w:iCs/>
-                <w:color w:val="7A5C00"/>
-                <w:highlight w:val="yellow"/>
-              </w:rPr>
-              <w:t>[NHÓM ĐIỀN: …]</w:t>
+                <w:sz w:val="18"/>
+              </w:rPr>
+              <w:t>Đóng vai Sponsor sắc sảo; mỗi câu có căn cứ trích từ tài liệu và nêu rõ "Sponsor cần nghe gì"; phát hiện mâu thuẫn giữa các ngày kết thúc và giả định 2 Backend.</w:t>
             </w:r>
           </w:p>
         </w:tc>
@@ -46964,7 +45959,7 @@
     </w:tbl>
     <w:p/>
     <w:sectPr>
-      <w:footerReference w:type="default" r:id="rId27"/>
+      <w:footerReference w:type="default" r:id="rId29"/>
       <w:pgSz w:w="11906" w:h="16838"/>
       <w:pgMar w:top="1134" w:right="1134" w:bottom="1134" w:left="1134" w:header="708" w:footer="708" w:gutter="0"/>
       <w:cols w:space="720"/>

</xml_diff>

<commit_message>
Lab: thêm rủi ro R11 (thành viên nghỉ đột xuất vì việc gia đình) do nhóm bổ sung
Co-Authored-By: Claude Opus 5.5 <noreply@anthropic.com>
</commit_message>
<xml_diff>
--- a/docs/lab/QLDA_Nhom_PharmaDash_Lab.docx
+++ b/docs/lab/QLDA_Nhom_PharmaDash_Lab.docx
@@ -998,7 +998,7 @@
           <w:r>
             <w:fldChar w:fldCharType="separate"/>
           </w:r>
-          <w:hyperlink w:anchor="_Toc242015900" w:history="1">
+          <w:hyperlink w:anchor="_Toc242016279" w:history="1">
             <w:r>
               <w:rPr>
                 <w:rStyle w:val="Hyperlink"/>
@@ -1022,7 +1022,7 @@
               <w:rPr>
                 <w:noProof/>
               </w:rPr>
-              <w:instrText xml:space="preserve"> PAGEREF _Toc242015900 \h </w:instrText>
+              <w:instrText xml:space="preserve"> PAGEREF _Toc242016279 \h </w:instrText>
             </w:r>
             <w:r>
               <w:rPr>
@@ -1064,7 +1064,7 @@
               <w14:ligatures w14:val="standardContextual"/>
             </w:rPr>
           </w:pPr>
-          <w:hyperlink w:anchor="_Toc242015901" w:history="1">
+          <w:hyperlink w:anchor="_Toc242016280" w:history="1">
             <w:r>
               <w:rPr>
                 <w:rStyle w:val="Hyperlink"/>
@@ -1088,7 +1088,7 @@
               <w:rPr>
                 <w:noProof/>
               </w:rPr>
-              <w:instrText xml:space="preserve"> PAGEREF _Toc242015901 \h </w:instrText>
+              <w:instrText xml:space="preserve"> PAGEREF _Toc242016280 \h </w:instrText>
             </w:r>
             <w:r>
               <w:rPr>
@@ -1130,7 +1130,7 @@
               <w14:ligatures w14:val="standardContextual"/>
             </w:rPr>
           </w:pPr>
-          <w:hyperlink w:anchor="_Toc242015902" w:history="1">
+          <w:hyperlink w:anchor="_Toc242016281" w:history="1">
             <w:r>
               <w:rPr>
                 <w:rStyle w:val="Hyperlink"/>
@@ -1154,7 +1154,7 @@
               <w:rPr>
                 <w:noProof/>
               </w:rPr>
-              <w:instrText xml:space="preserve"> PAGEREF _Toc242015902 \h </w:instrText>
+              <w:instrText xml:space="preserve"> PAGEREF _Toc242016281 \h </w:instrText>
             </w:r>
             <w:r>
               <w:rPr>
@@ -1196,7 +1196,7 @@
               <w14:ligatures w14:val="standardContextual"/>
             </w:rPr>
           </w:pPr>
-          <w:hyperlink w:anchor="_Toc242015903" w:history="1">
+          <w:hyperlink w:anchor="_Toc242016282" w:history="1">
             <w:r>
               <w:rPr>
                 <w:rStyle w:val="Hyperlink"/>
@@ -1220,7 +1220,7 @@
               <w:rPr>
                 <w:noProof/>
               </w:rPr>
-              <w:instrText xml:space="preserve"> PAGEREF _Toc242015903 \h </w:instrText>
+              <w:instrText xml:space="preserve"> PAGEREF _Toc242016282 \h </w:instrText>
             </w:r>
             <w:r>
               <w:rPr>
@@ -1262,7 +1262,7 @@
               <w14:ligatures w14:val="standardContextual"/>
             </w:rPr>
           </w:pPr>
-          <w:hyperlink w:anchor="_Toc242015904" w:history="1">
+          <w:hyperlink w:anchor="_Toc242016283" w:history="1">
             <w:r>
               <w:rPr>
                 <w:rStyle w:val="Hyperlink"/>
@@ -1286,7 +1286,7 @@
               <w:rPr>
                 <w:noProof/>
               </w:rPr>
-              <w:instrText xml:space="preserve"> PAGEREF _Toc242015904 \h </w:instrText>
+              <w:instrText xml:space="preserve"> PAGEREF _Toc242016283 \h </w:instrText>
             </w:r>
             <w:r>
               <w:rPr>
@@ -1328,7 +1328,7 @@
               <w14:ligatures w14:val="standardContextual"/>
             </w:rPr>
           </w:pPr>
-          <w:hyperlink w:anchor="_Toc242015905" w:history="1">
+          <w:hyperlink w:anchor="_Toc242016284" w:history="1">
             <w:r>
               <w:rPr>
                 <w:rStyle w:val="Hyperlink"/>
@@ -1352,7 +1352,7 @@
               <w:rPr>
                 <w:noProof/>
               </w:rPr>
-              <w:instrText xml:space="preserve"> PAGEREF _Toc242015905 \h </w:instrText>
+              <w:instrText xml:space="preserve"> PAGEREF _Toc242016284 \h </w:instrText>
             </w:r>
             <w:r>
               <w:rPr>
@@ -1394,7 +1394,7 @@
               <w14:ligatures w14:val="standardContextual"/>
             </w:rPr>
           </w:pPr>
-          <w:hyperlink w:anchor="_Toc242015906" w:history="1">
+          <w:hyperlink w:anchor="_Toc242016285" w:history="1">
             <w:r>
               <w:rPr>
                 <w:rStyle w:val="Hyperlink"/>
@@ -1418,7 +1418,7 @@
               <w:rPr>
                 <w:noProof/>
               </w:rPr>
-              <w:instrText xml:space="preserve"> PAGEREF _Toc242015906 \h </w:instrText>
+              <w:instrText xml:space="preserve"> PAGEREF _Toc242016285 \h </w:instrText>
             </w:r>
             <w:r>
               <w:rPr>
@@ -1460,7 +1460,7 @@
               <w14:ligatures w14:val="standardContextual"/>
             </w:rPr>
           </w:pPr>
-          <w:hyperlink w:anchor="_Toc242015907" w:history="1">
+          <w:hyperlink w:anchor="_Toc242016286" w:history="1">
             <w:r>
               <w:rPr>
                 <w:rStyle w:val="Hyperlink"/>
@@ -1484,7 +1484,7 @@
               <w:rPr>
                 <w:noProof/>
               </w:rPr>
-              <w:instrText xml:space="preserve"> PAGEREF _Toc242015907 \h </w:instrText>
+              <w:instrText xml:space="preserve"> PAGEREF _Toc242016286 \h </w:instrText>
             </w:r>
             <w:r>
               <w:rPr>
@@ -1526,7 +1526,7 @@
               <w14:ligatures w14:val="standardContextual"/>
             </w:rPr>
           </w:pPr>
-          <w:hyperlink w:anchor="_Toc242015908" w:history="1">
+          <w:hyperlink w:anchor="_Toc242016287" w:history="1">
             <w:r>
               <w:rPr>
                 <w:rStyle w:val="Hyperlink"/>
@@ -1550,7 +1550,7 @@
               <w:rPr>
                 <w:noProof/>
               </w:rPr>
-              <w:instrText xml:space="preserve"> PAGEREF _Toc242015908 \h </w:instrText>
+              <w:instrText xml:space="preserve"> PAGEREF _Toc242016287 \h </w:instrText>
             </w:r>
             <w:r>
               <w:rPr>
@@ -1592,7 +1592,7 @@
               <w14:ligatures w14:val="standardContextual"/>
             </w:rPr>
           </w:pPr>
-          <w:hyperlink w:anchor="_Toc242015909" w:history="1">
+          <w:hyperlink w:anchor="_Toc242016288" w:history="1">
             <w:r>
               <w:rPr>
                 <w:rStyle w:val="Hyperlink"/>
@@ -1616,7 +1616,7 @@
               <w:rPr>
                 <w:noProof/>
               </w:rPr>
-              <w:instrText xml:space="preserve"> PAGEREF _Toc242015909 \h </w:instrText>
+              <w:instrText xml:space="preserve"> PAGEREF _Toc242016288 \h </w:instrText>
             </w:r>
             <w:r>
               <w:rPr>
@@ -1658,7 +1658,7 @@
               <w14:ligatures w14:val="standardContextual"/>
             </w:rPr>
           </w:pPr>
-          <w:hyperlink w:anchor="_Toc242015910" w:history="1">
+          <w:hyperlink w:anchor="_Toc242016289" w:history="1">
             <w:r>
               <w:rPr>
                 <w:rStyle w:val="Hyperlink"/>
@@ -1682,7 +1682,7 @@
               <w:rPr>
                 <w:noProof/>
               </w:rPr>
-              <w:instrText xml:space="preserve"> PAGEREF _Toc242015910 \h </w:instrText>
+              <w:instrText xml:space="preserve"> PAGEREF _Toc242016289 \h </w:instrText>
             </w:r>
             <w:r>
               <w:rPr>
@@ -1724,7 +1724,7 @@
               <w14:ligatures w14:val="standardContextual"/>
             </w:rPr>
           </w:pPr>
-          <w:hyperlink w:anchor="_Toc242015911" w:history="1">
+          <w:hyperlink w:anchor="_Toc242016290" w:history="1">
             <w:r>
               <w:rPr>
                 <w:rStyle w:val="Hyperlink"/>
@@ -1748,7 +1748,7 @@
               <w:rPr>
                 <w:noProof/>
               </w:rPr>
-              <w:instrText xml:space="preserve"> PAGEREF _Toc242015911 \h </w:instrText>
+              <w:instrText xml:space="preserve"> PAGEREF _Toc242016290 \h </w:instrText>
             </w:r>
             <w:r>
               <w:rPr>
@@ -1790,7 +1790,7 @@
               <w14:ligatures w14:val="standardContextual"/>
             </w:rPr>
           </w:pPr>
-          <w:hyperlink w:anchor="_Toc242015912" w:history="1">
+          <w:hyperlink w:anchor="_Toc242016291" w:history="1">
             <w:r>
               <w:rPr>
                 <w:rStyle w:val="Hyperlink"/>
@@ -1814,7 +1814,7 @@
               <w:rPr>
                 <w:noProof/>
               </w:rPr>
-              <w:instrText xml:space="preserve"> PAGEREF _Toc242015912 \h </w:instrText>
+              <w:instrText xml:space="preserve"> PAGEREF _Toc242016291 \h </w:instrText>
             </w:r>
             <w:r>
               <w:rPr>
@@ -1856,7 +1856,7 @@
               <w14:ligatures w14:val="standardContextual"/>
             </w:rPr>
           </w:pPr>
-          <w:hyperlink w:anchor="_Toc242015913" w:history="1">
+          <w:hyperlink w:anchor="_Toc242016292" w:history="1">
             <w:r>
               <w:rPr>
                 <w:rStyle w:val="Hyperlink"/>
@@ -1880,7 +1880,7 @@
               <w:rPr>
                 <w:noProof/>
               </w:rPr>
-              <w:instrText xml:space="preserve"> PAGEREF _Toc242015913 \h </w:instrText>
+              <w:instrText xml:space="preserve"> PAGEREF _Toc242016292 \h </w:instrText>
             </w:r>
             <w:r>
               <w:rPr>
@@ -1922,7 +1922,7 @@
               <w14:ligatures w14:val="standardContextual"/>
             </w:rPr>
           </w:pPr>
-          <w:hyperlink w:anchor="_Toc242015914" w:history="1">
+          <w:hyperlink w:anchor="_Toc242016293" w:history="1">
             <w:r>
               <w:rPr>
                 <w:rStyle w:val="Hyperlink"/>
@@ -1946,7 +1946,7 @@
               <w:rPr>
                 <w:noProof/>
               </w:rPr>
-              <w:instrText xml:space="preserve"> PAGEREF _Toc242015914 \h </w:instrText>
+              <w:instrText xml:space="preserve"> PAGEREF _Toc242016293 \h </w:instrText>
             </w:r>
             <w:r>
               <w:rPr>
@@ -1988,7 +1988,7 @@
               <w14:ligatures w14:val="standardContextual"/>
             </w:rPr>
           </w:pPr>
-          <w:hyperlink w:anchor="_Toc242015915" w:history="1">
+          <w:hyperlink w:anchor="_Toc242016294" w:history="1">
             <w:r>
               <w:rPr>
                 <w:rStyle w:val="Hyperlink"/>
@@ -2012,7 +2012,7 @@
               <w:rPr>
                 <w:noProof/>
               </w:rPr>
-              <w:instrText xml:space="preserve"> PAGEREF _Toc242015915 \h </w:instrText>
+              <w:instrText xml:space="preserve"> PAGEREF _Toc242016294 \h </w:instrText>
             </w:r>
             <w:r>
               <w:rPr>
@@ -2054,7 +2054,7 @@
               <w14:ligatures w14:val="standardContextual"/>
             </w:rPr>
           </w:pPr>
-          <w:hyperlink w:anchor="_Toc242015916" w:history="1">
+          <w:hyperlink w:anchor="_Toc242016295" w:history="1">
             <w:r>
               <w:rPr>
                 <w:rStyle w:val="Hyperlink"/>
@@ -2078,7 +2078,7 @@
               <w:rPr>
                 <w:noProof/>
               </w:rPr>
-              <w:instrText xml:space="preserve"> PAGEREF _Toc242015916 \h </w:instrText>
+              <w:instrText xml:space="preserve"> PAGEREF _Toc242016295 \h </w:instrText>
             </w:r>
             <w:r>
               <w:rPr>
@@ -2120,7 +2120,7 @@
               <w14:ligatures w14:val="standardContextual"/>
             </w:rPr>
           </w:pPr>
-          <w:hyperlink w:anchor="_Toc242015917" w:history="1">
+          <w:hyperlink w:anchor="_Toc242016296" w:history="1">
             <w:r>
               <w:rPr>
                 <w:rStyle w:val="Hyperlink"/>
@@ -2144,7 +2144,7 @@
               <w:rPr>
                 <w:noProof/>
               </w:rPr>
-              <w:instrText xml:space="preserve"> PAGEREF _Toc242015917 \h </w:instrText>
+              <w:instrText xml:space="preserve"> PAGEREF _Toc242016296 \h </w:instrText>
             </w:r>
             <w:r>
               <w:rPr>
@@ -2186,7 +2186,7 @@
               <w14:ligatures w14:val="standardContextual"/>
             </w:rPr>
           </w:pPr>
-          <w:hyperlink w:anchor="_Toc242015918" w:history="1">
+          <w:hyperlink w:anchor="_Toc242016297" w:history="1">
             <w:r>
               <w:rPr>
                 <w:rStyle w:val="Hyperlink"/>
@@ -2210,7 +2210,7 @@
               <w:rPr>
                 <w:noProof/>
               </w:rPr>
-              <w:instrText xml:space="preserve"> PAGEREF _Toc242015918 \h </w:instrText>
+              <w:instrText xml:space="preserve"> PAGEREF _Toc242016297 \h </w:instrText>
             </w:r>
             <w:r>
               <w:rPr>
@@ -2252,7 +2252,7 @@
               <w14:ligatures w14:val="standardContextual"/>
             </w:rPr>
           </w:pPr>
-          <w:hyperlink w:anchor="_Toc242015919" w:history="1">
+          <w:hyperlink w:anchor="_Toc242016298" w:history="1">
             <w:r>
               <w:rPr>
                 <w:rStyle w:val="Hyperlink"/>
@@ -2276,7 +2276,7 @@
               <w:rPr>
                 <w:noProof/>
               </w:rPr>
-              <w:instrText xml:space="preserve"> PAGEREF _Toc242015919 \h </w:instrText>
+              <w:instrText xml:space="preserve"> PAGEREF _Toc242016298 \h </w:instrText>
             </w:r>
             <w:r>
               <w:rPr>
@@ -2318,7 +2318,7 @@
               <w14:ligatures w14:val="standardContextual"/>
             </w:rPr>
           </w:pPr>
-          <w:hyperlink w:anchor="_Toc242015920" w:history="1">
+          <w:hyperlink w:anchor="_Toc242016299" w:history="1">
             <w:r>
               <w:rPr>
                 <w:rStyle w:val="Hyperlink"/>
@@ -2342,7 +2342,7 @@
               <w:rPr>
                 <w:noProof/>
               </w:rPr>
-              <w:instrText xml:space="preserve"> PAGEREF _Toc242015920 \h </w:instrText>
+              <w:instrText xml:space="preserve"> PAGEREF _Toc242016299 \h </w:instrText>
             </w:r>
             <w:r>
               <w:rPr>
@@ -2384,7 +2384,7 @@
               <w14:ligatures w14:val="standardContextual"/>
             </w:rPr>
           </w:pPr>
-          <w:hyperlink w:anchor="_Toc242015921" w:history="1">
+          <w:hyperlink w:anchor="_Toc242016300" w:history="1">
             <w:r>
               <w:rPr>
                 <w:rStyle w:val="Hyperlink"/>
@@ -2408,7 +2408,7 @@
               <w:rPr>
                 <w:noProof/>
               </w:rPr>
-              <w:instrText xml:space="preserve"> PAGEREF _Toc242015921 \h </w:instrText>
+              <w:instrText xml:space="preserve"> PAGEREF _Toc242016300 \h </w:instrText>
             </w:r>
             <w:r>
               <w:rPr>
@@ -2450,7 +2450,7 @@
               <w14:ligatures w14:val="standardContextual"/>
             </w:rPr>
           </w:pPr>
-          <w:hyperlink w:anchor="_Toc242015922" w:history="1">
+          <w:hyperlink w:anchor="_Toc242016301" w:history="1">
             <w:r>
               <w:rPr>
                 <w:rStyle w:val="Hyperlink"/>
@@ -2474,7 +2474,7 @@
               <w:rPr>
                 <w:noProof/>
               </w:rPr>
-              <w:instrText xml:space="preserve"> PAGEREF _Toc242015922 \h </w:instrText>
+              <w:instrText xml:space="preserve"> PAGEREF _Toc242016301 \h </w:instrText>
             </w:r>
             <w:r>
               <w:rPr>
@@ -2516,7 +2516,7 @@
               <w14:ligatures w14:val="standardContextual"/>
             </w:rPr>
           </w:pPr>
-          <w:hyperlink w:anchor="_Toc242015923" w:history="1">
+          <w:hyperlink w:anchor="_Toc242016302" w:history="1">
             <w:r>
               <w:rPr>
                 <w:rStyle w:val="Hyperlink"/>
@@ -2540,7 +2540,7 @@
               <w:rPr>
                 <w:noProof/>
               </w:rPr>
-              <w:instrText xml:space="preserve"> PAGEREF _Toc242015923 \h </w:instrText>
+              <w:instrText xml:space="preserve"> PAGEREF _Toc242016302 \h </w:instrText>
             </w:r>
             <w:r>
               <w:rPr>
@@ -2582,7 +2582,7 @@
               <w14:ligatures w14:val="standardContextual"/>
             </w:rPr>
           </w:pPr>
-          <w:hyperlink w:anchor="_Toc242015924" w:history="1">
+          <w:hyperlink w:anchor="_Toc242016303" w:history="1">
             <w:r>
               <w:rPr>
                 <w:rStyle w:val="Hyperlink"/>
@@ -2606,7 +2606,7 @@
               <w:rPr>
                 <w:noProof/>
               </w:rPr>
-              <w:instrText xml:space="preserve"> PAGEREF _Toc242015924 \h </w:instrText>
+              <w:instrText xml:space="preserve"> PAGEREF _Toc242016303 \h </w:instrText>
             </w:r>
             <w:r>
               <w:rPr>
@@ -2648,7 +2648,7 @@
               <w14:ligatures w14:val="standardContextual"/>
             </w:rPr>
           </w:pPr>
-          <w:hyperlink w:anchor="_Toc242015925" w:history="1">
+          <w:hyperlink w:anchor="_Toc242016304" w:history="1">
             <w:r>
               <w:rPr>
                 <w:rStyle w:val="Hyperlink"/>
@@ -2672,7 +2672,7 @@
               <w:rPr>
                 <w:noProof/>
               </w:rPr>
-              <w:instrText xml:space="preserve"> PAGEREF _Toc242015925 \h </w:instrText>
+              <w:instrText xml:space="preserve"> PAGEREF _Toc242016304 \h </w:instrText>
             </w:r>
             <w:r>
               <w:rPr>
@@ -2714,7 +2714,7 @@
               <w14:ligatures w14:val="standardContextual"/>
             </w:rPr>
           </w:pPr>
-          <w:hyperlink w:anchor="_Toc242015926" w:history="1">
+          <w:hyperlink w:anchor="_Toc242016305" w:history="1">
             <w:r>
               <w:rPr>
                 <w:rStyle w:val="Hyperlink"/>
@@ -2738,7 +2738,7 @@
               <w:rPr>
                 <w:noProof/>
               </w:rPr>
-              <w:instrText xml:space="preserve"> PAGEREF _Toc242015926 \h </w:instrText>
+              <w:instrText xml:space="preserve"> PAGEREF _Toc242016305 \h </w:instrText>
             </w:r>
             <w:r>
               <w:rPr>
@@ -2780,7 +2780,7 @@
               <w14:ligatures w14:val="standardContextual"/>
             </w:rPr>
           </w:pPr>
-          <w:hyperlink w:anchor="_Toc242015927" w:history="1">
+          <w:hyperlink w:anchor="_Toc242016306" w:history="1">
             <w:r>
               <w:rPr>
                 <w:rStyle w:val="Hyperlink"/>
@@ -2804,7 +2804,7 @@
               <w:rPr>
                 <w:noProof/>
               </w:rPr>
-              <w:instrText xml:space="preserve"> PAGEREF _Toc242015927 \h </w:instrText>
+              <w:instrText xml:space="preserve"> PAGEREF _Toc242016306 \h </w:instrText>
             </w:r>
             <w:r>
               <w:rPr>
@@ -2864,7 +2864,7 @@
         <w:keepNext/>
         <w:keepLines/>
       </w:pPr>
-      <w:bookmarkStart w:id="0" w:name="_Toc242015900"/>
+      <w:bookmarkStart w:id="0" w:name="_Toc242016279"/>
       <w:r>
         <w:lastRenderedPageBreak/>
         <w:t>1. Thiết lập Claude Project</w:t>
@@ -3683,7 +3683,7 @@
         <w:keepNext/>
         <w:keepLines/>
       </w:pPr>
-      <w:bookmarkStart w:id="1" w:name="_Toc242015901"/>
+      <w:bookmarkStart w:id="1" w:name="_Toc242016280"/>
       <w:r>
         <w:t>2. Project Charter (Tuyên bố dự án)</w:t>
       </w:r>
@@ -4169,7 +4169,7 @@
         <w:keepNext/>
         <w:keepLines/>
       </w:pPr>
-      <w:bookmarkStart w:id="2" w:name="_Toc242015902"/>
+      <w:bookmarkStart w:id="2" w:name="_Toc242016281"/>
       <w:r>
         <w:t>2.1 Mục tiêu SMART</w:t>
       </w:r>
@@ -5194,7 +5194,7 @@
         <w:keepNext/>
         <w:keepLines/>
       </w:pPr>
-      <w:bookmarkStart w:id="3" w:name="_Toc242015903"/>
+      <w:bookmarkStart w:id="3" w:name="_Toc242016282"/>
       <w:r>
         <w:t>2.2 Phạm vi</w:t>
       </w:r>
@@ -5604,7 +5604,7 @@
         <w:keepNext/>
         <w:keepLines/>
       </w:pPr>
-      <w:bookmarkStart w:id="4" w:name="_Toc242015904"/>
+      <w:bookmarkStart w:id="4" w:name="_Toc242016283"/>
       <w:r>
         <w:t>2.3 Sản phẩm bàn giao chính</w:t>
       </w:r>
@@ -5668,7 +5668,7 @@
         <w:keepNext/>
         <w:keepLines/>
       </w:pPr>
-      <w:bookmarkStart w:id="5" w:name="_Toc242015905"/>
+      <w:bookmarkStart w:id="5" w:name="_Toc242016284"/>
       <w:r>
         <w:t>2.4 Các bên liên quan</w:t>
       </w:r>
@@ -6455,7 +6455,7 @@
         <w:keepNext/>
         <w:keepLines/>
       </w:pPr>
-      <w:bookmarkStart w:id="6" w:name="_Toc242015906"/>
+      <w:bookmarkStart w:id="6" w:name="_Toc242016285"/>
       <w:r>
         <w:t>2.5 Mốc thời gian chính (mục tiêu)</w:t>
       </w:r>
@@ -7501,7 +7501,7 @@
         <w:keepNext/>
         <w:keepLines/>
       </w:pPr>
-      <w:bookmarkStart w:id="7" w:name="_Toc242015907"/>
+      <w:bookmarkStart w:id="7" w:name="_Toc242016286"/>
       <w:r>
         <w:t>2.6 Giả định và ràng buộc</w:t>
       </w:r>
@@ -7768,7 +7768,7 @@
         <w:keepNext/>
         <w:keepLines/>
       </w:pPr>
-      <w:bookmarkStart w:id="8" w:name="_Toc242015908"/>
+      <w:bookmarkStart w:id="8" w:name="_Toc242016287"/>
       <w:r>
         <w:t>2.7 Rủi ro cấp cao</w:t>
       </w:r>
@@ -7832,7 +7832,7 @@
         <w:keepNext/>
         <w:keepLines/>
       </w:pPr>
-      <w:bookmarkStart w:id="9" w:name="_Toc242015909"/>
+      <w:bookmarkStart w:id="9" w:name="_Toc242016288"/>
       <w:r>
         <w:t>2.8 Tiêu chí thành công và nghiệm thu</w:t>
       </w:r>
@@ -7909,7 +7909,7 @@
         <w:keepNext/>
         <w:keepLines/>
       </w:pPr>
-      <w:bookmarkStart w:id="10" w:name="_Toc242015910"/>
+      <w:bookmarkStart w:id="10" w:name="_Toc242016289"/>
       <w:r>
         <w:t>2.9 Thông tin còn thiếu – câu hỏi làm rõ với khách hàng</w:t>
       </w:r>
@@ -9534,7 +9534,7 @@
         <w:keepNext/>
         <w:keepLines/>
       </w:pPr>
-      <w:bookmarkStart w:id="11" w:name="_Toc242015911"/>
+      <w:bookmarkStart w:id="11" w:name="_Toc242016290"/>
       <w:r>
         <w:t>3. Phạm vi và WBS</w:t>
       </w:r>
@@ -9565,7 +9565,7 @@
         <w:keepNext/>
         <w:keepLines/>
       </w:pPr>
-      <w:bookmarkStart w:id="12" w:name="_Toc242015912"/>
+      <w:bookmarkStart w:id="12" w:name="_Toc242016291"/>
       <w:r>
         <w:t>3.1 Sơ đồ cây WBS</w:t>
       </w:r>
@@ -9654,7 +9654,7 @@
         <w:keepNext/>
         <w:keepLines/>
       </w:pPr>
-      <w:bookmarkStart w:id="13" w:name="_Toc242015913"/>
+      <w:bookmarkStart w:id="13" w:name="_Toc242016292"/>
       <w:r>
         <w:t>3.2 Bảng WBS</w:t>
       </w:r>
@@ -21688,7 +21688,7 @@
         <w:keepNext/>
         <w:keepLines/>
       </w:pPr>
-      <w:bookmarkStart w:id="14" w:name="_Toc242015914"/>
+      <w:bookmarkStart w:id="14" w:name="_Toc242016293"/>
       <w:r>
         <w:t>3.3 Từ điển WBS (3 gói công việc quan trọng nhất)</w:t>
       </w:r>
@@ -23394,7 +23394,7 @@
         <w:keepNext/>
         <w:keepLines/>
       </w:pPr>
-      <w:bookmarkStart w:id="15" w:name="_Toc242015915"/>
+      <w:bookmarkStart w:id="15" w:name="_Toc242016294"/>
       <w:r>
         <w:t>4. Ước lượng, lịch dự án và đường găng</w:t>
       </w:r>
@@ -23414,7 +23414,7 @@
         <w:keepNext/>
         <w:keepLines/>
       </w:pPr>
-      <w:bookmarkStart w:id="16" w:name="_Toc242015916"/>
+      <w:bookmarkStart w:id="16" w:name="_Toc242016295"/>
       <w:r>
         <w:t>4.1 Bảng PERT và CPM</w:t>
       </w:r>
@@ -31014,7 +31014,7 @@
         <w:keepNext/>
         <w:keepLines/>
       </w:pPr>
-      <w:bookmarkStart w:id="17" w:name="_Toc242015917"/>
+      <w:bookmarkStart w:id="17" w:name="_Toc242016296"/>
       <w:r>
         <w:t>4.2 Kết quả</w:t>
       </w:r>
@@ -31563,7 +31563,7 @@
         <w:keepNext/>
         <w:keepLines/>
       </w:pPr>
-      <w:bookmarkStart w:id="18" w:name="_Toc242015918"/>
+      <w:bookmarkStart w:id="18" w:name="_Toc242016297"/>
       <w:r>
         <w:t>4.3 Biểu đồ Gantt</w:t>
       </w:r>
@@ -31641,7 +31641,7 @@
         <w:keepNext/>
         <w:keepLines/>
       </w:pPr>
-      <w:bookmarkStart w:id="19" w:name="_Toc242015919"/>
+      <w:bookmarkStart w:id="19" w:name="_Toc242016298"/>
       <w:r>
         <w:t>4.4 So sánh kết quả Excel với câu trả lời của AI (Claude Project)</w:t>
       </w:r>
@@ -32476,7 +32476,7 @@
         <w:keepNext/>
         <w:keepLines/>
       </w:pPr>
-      <w:bookmarkStart w:id="20" w:name="_Toc242015920"/>
+      <w:bookmarkStart w:id="20" w:name="_Toc242016299"/>
       <w:r>
         <w:t>4.5 Phương án nén lịch (AI gợi ý – nhóm tự chọn và lý giải)</w:t>
       </w:r>
@@ -35474,7 +35474,7 @@
         <w:keepNext/>
         <w:keepLines/>
       </w:pPr>
-      <w:bookmarkStart w:id="21" w:name="_Toc242015921"/>
+      <w:bookmarkStart w:id="21" w:name="_Toc242016300"/>
       <w:r>
         <w:t>5. Ước lượng chi phí</w:t>
       </w:r>
@@ -37808,7 +37808,7 @@
         <w:keepNext/>
         <w:keepLines/>
       </w:pPr>
-      <w:bookmarkStart w:id="22" w:name="_Toc242015922"/>
+      <w:bookmarkStart w:id="22" w:name="_Toc242016301"/>
       <w:r>
         <w:t>6. Quản lý rủi ro</w:t>
       </w:r>
@@ -39994,11 +39994,9 @@
             <w:r>
               <w:rPr>
                 <w:b/>
-                <w:bCs/>
                 <w:sz w:val="16"/>
-                <w:szCs w:val="16"/>
-              </w:rPr>
-              <w:t>R06</w:t>
+              </w:rPr>
+              <w:t>R11</w:t>
             </w:r>
           </w:p>
         </w:tc>
@@ -40025,9 +40023,8 @@
             <w:r>
               <w:rPr>
                 <w:sz w:val="16"/>
-                <w:szCs w:val="16"/>
-              </w:rPr>
-              <w:t>Hệ thống chứa thông tin khách hàng (họ tên, SĐT, lịch sử mua thuốc) và giá nhập, lợi nhuận</w:t>
+              </w:rPr>
+              <w:t>Thành viên có việc gia đình đột xuất (đồ án trước của nhóm từng bị trễ vì lý do này)</w:t>
             </w:r>
           </w:p>
         </w:tc>
@@ -40054,9 +40051,8 @@
             <w:r>
               <w:rPr>
                 <w:sz w:val="16"/>
-                <w:szCs w:val="16"/>
-              </w:rPr>
-              <w:t>Lộ dữ liệu do phân quyền sai hoặc tấn công</w:t>
+              </w:rPr>
+              <w:t>Một thành viên phải nghỉ vài ngày đến 1 tuần, không báo trước được</w:t>
             </w:r>
           </w:p>
         </w:tc>
@@ -40083,9 +40079,8 @@
             <w:r>
               <w:rPr>
                 <w:sz w:val="16"/>
-                <w:szCs w:val="16"/>
-              </w:rPr>
-              <w:t>Vi phạm quy định bảo vệ dữ liệu cá nhân, mất uy tín, rò rỉ bí mật kinh doanh</w:t>
+              </w:rPr>
+              <w:t>Gói việc của người đó bị dừng; nếu là việc trên đường găng (BE, FE) thì cả dự án trễ theo</w:t>
             </w:r>
           </w:p>
         </w:tc>
@@ -40112,9 +40107,8 @@
             <w:r>
               <w:rPr>
                 <w:sz w:val="16"/>
-                <w:szCs w:val="16"/>
-              </w:rPr>
-              <w:t>Bảo mật / Pháp lý</w:t>
+              </w:rPr>
+              <w:t>Con người</w:t>
             </w:r>
           </w:p>
         </w:tc>
@@ -40137,14 +40131,12 @@
           <w:p>
             <w:pPr>
               <w:spacing w:after="20"/>
-              <w:jc w:val="center"/>
             </w:pPr>
             <w:r>
               <w:rPr>
                 <w:sz w:val="16"/>
-                <w:szCs w:val="16"/>
-              </w:rPr>
-              <w:t>2</w:t>
+              </w:rPr>
+              <w:t>3</w:t>
             </w:r>
           </w:p>
         </w:tc>
@@ -40167,14 +40159,12 @@
           <w:p>
             <w:pPr>
               <w:spacing w:after="20"/>
-              <w:jc w:val="center"/>
             </w:pPr>
             <w:r>
               <w:rPr>
                 <w:sz w:val="16"/>
-                <w:szCs w:val="16"/>
-              </w:rPr>
-              <w:t>5</w:t>
+              </w:rPr>
+              <w:t>4</w:t>
             </w:r>
           </w:p>
         </w:tc>
@@ -40198,29 +40188,21 @@
           <w:p>
             <w:pPr>
               <w:spacing w:after="20"/>
-              <w:jc w:val="center"/>
             </w:pPr>
             <w:r>
               <w:rPr>
                 <w:b/>
-                <w:bCs/>
                 <w:sz w:val="16"/>
-                <w:szCs w:val="16"/>
-              </w:rPr>
-              <w:t>10</w:t>
-            </w:r>
-          </w:p>
-          <w:p>
-            <w:pPr>
-              <w:spacing w:after="20"/>
-              <w:jc w:val="center"/>
-            </w:pPr>
+              </w:rPr>
+              <w:t>12</w:t>
+            </w:r>
+            <w:r>
+              <w:br/>
+            </w:r>
             <w:r>
               <w:rPr>
                 <w:b/>
-                <w:bCs/>
                 <w:sz w:val="16"/>
-                <w:szCs w:val="16"/>
               </w:rPr>
               <w:t>Trung bình</w:t>
             </w:r>
@@ -40249,7 +40231,6 @@
             <w:r>
               <w:rPr>
                 <w:sz w:val="16"/>
-                <w:szCs w:val="16"/>
               </w:rPr>
               <w:t>Giảm</w:t>
             </w:r>
@@ -40278,9 +40259,8 @@
             <w:r>
               <w:rPr>
                 <w:sz w:val="16"/>
-                <w:szCs w:val="16"/>
-              </w:rPr>
-              <w:t>Phân quyền kiểm tra ở máy chủ; HTTPS; mã hóa mật khẩu; kiểm thử phân quyền riêng; sao lưu có mã hóa</w:t>
+              </w:rPr>
+              <w:t>Mỗi người có 1 "người đỡ" (buddy) nắm việc của mình; cập nhật tiến độ hằng ngày trên nhóm chat; đẩy code lên GitHub cuối mỗi ngày để người khác làm tiếp được</w:t>
             </w:r>
           </w:p>
         </w:tc>
@@ -40307,9 +40287,8 @@
             <w:r>
               <w:rPr>
                 <w:sz w:val="16"/>
-                <w:szCs w:val="16"/>
-              </w:rPr>
-              <w:t>BE + QA</w:t>
+              </w:rPr>
+              <w:t>PM</w:t>
             </w:r>
           </w:p>
         </w:tc>
@@ -40345,7 +40324,7 @@
                 <w:sz w:val="16"/>
                 <w:szCs w:val="16"/>
               </w:rPr>
-              <w:t>R07</w:t>
+              <w:t>R06</w:t>
             </w:r>
           </w:p>
         </w:tc>
@@ -40374,7 +40353,7 @@
                 <w:sz w:val="16"/>
                 <w:szCs w:val="16"/>
               </w:rPr>
-              <w:t>Nhân viên quen thao tác giấy và Excel, ít thời gian học phần mềm mới</w:t>
+              <w:t>Hệ thống chứa thông tin khách hàng (họ tên, SĐT, lịch sử mua thuốc) và giá nhập, lợi nhuận</w:t>
             </w:r>
           </w:p>
         </w:tc>
@@ -40403,7 +40382,7 @@
                 <w:sz w:val="16"/>
                 <w:szCs w:val="16"/>
               </w:rPr>
-              <w:t>Người dùng không sử dụng hoặc dùng sai hệ thống</w:t>
+              <w:t>Lộ dữ liệu do phân quyền sai hoặc tấn công</w:t>
             </w:r>
           </w:p>
         </w:tc>
@@ -40432,7 +40411,7 @@
                 <w:sz w:val="16"/>
                 <w:szCs w:val="16"/>
               </w:rPr>
-              <w:t>Dữ liệu không được cập nhật, hệ thống không mang lại giá trị</w:t>
+              <w:t>Vi phạm quy định bảo vệ dữ liệu cá nhân, mất uy tín, rò rỉ bí mật kinh doanh</w:t>
             </w:r>
           </w:p>
         </w:tc>
@@ -40461,7 +40440,7 @@
                 <w:sz w:val="16"/>
                 <w:szCs w:val="16"/>
               </w:rPr>
-              <w:t>Con người / Khách hàng</w:t>
+              <w:t>Bảo mật / Pháp lý</w:t>
             </w:r>
           </w:p>
         </w:tc>
@@ -40491,7 +40470,7 @@
                 <w:sz w:val="16"/>
                 <w:szCs w:val="16"/>
               </w:rPr>
-              <w:t>3</w:t>
+              <w:t>2</w:t>
             </w:r>
           </w:p>
         </w:tc>
@@ -40521,7 +40500,7 @@
                 <w:sz w:val="16"/>
                 <w:szCs w:val="16"/>
               </w:rPr>
-              <w:t>3</w:t>
+              <w:t>5</w:t>
             </w:r>
           </w:p>
         </w:tc>
@@ -40554,7 +40533,7 @@
                 <w:sz w:val="16"/>
                 <w:szCs w:val="16"/>
               </w:rPr>
-              <w:t>9</w:t>
+              <w:t>10</w:t>
             </w:r>
           </w:p>
           <w:p>
@@ -40627,7 +40606,7 @@
                 <w:sz w:val="16"/>
                 <w:szCs w:val="16"/>
               </w:rPr>
-              <w:t>Giao diện đơn giản; đào tạo tại từng chi nhánh; chọn 1 người dùng chủ chốt (key user) mỗi chi nhánh</w:t>
+              <w:t>Phân quyền kiểm tra ở máy chủ; HTTPS; mã hóa mật khẩu; kiểm thử phân quyền riêng; sao lưu có mã hóa</w:t>
             </w:r>
           </w:p>
         </w:tc>
@@ -40656,7 +40635,7 @@
                 <w:sz w:val="16"/>
                 <w:szCs w:val="16"/>
               </w:rPr>
-              <w:t>BA</w:t>
+              <w:t>BE + QA</w:t>
             </w:r>
           </w:p>
         </w:tc>
@@ -40692,7 +40671,7 @@
                 <w:sz w:val="16"/>
                 <w:szCs w:val="16"/>
               </w:rPr>
-              <w:t>R08</w:t>
+              <w:t>R07</w:t>
             </w:r>
           </w:p>
         </w:tc>
@@ -40721,7 +40700,7 @@
                 <w:sz w:val="16"/>
                 <w:szCs w:val="16"/>
               </w:rPr>
-              <w:t>Dữ liệu 2 năm bán hàng (hàng trăm nghìn dòng) và truy vấn thống kê phức tạp</w:t>
+              <w:t>Nhân viên quen thao tác giấy và Excel, ít thời gian học phần mềm mới</w:t>
             </w:r>
           </w:p>
         </w:tc>
@@ -40750,7 +40729,7 @@
                 <w:sz w:val="16"/>
                 <w:szCs w:val="16"/>
               </w:rPr>
-              <w:t>Dashboard phản hồi chậm hơn 2 giây</w:t>
+              <w:t>Người dùng không sử dụng hoặc dùng sai hệ thống</w:t>
             </w:r>
           </w:p>
         </w:tc>
@@ -40779,7 +40758,7 @@
                 <w:sz w:val="16"/>
                 <w:szCs w:val="16"/>
               </w:rPr>
-              <w:t>Trải nghiệm kém, không đạt yêu cầu phi chức năng</w:t>
+              <w:t>Dữ liệu không được cập nhật, hệ thống không mang lại giá trị</w:t>
             </w:r>
           </w:p>
         </w:tc>
@@ -40808,7 +40787,7 @@
                 <w:sz w:val="16"/>
                 <w:szCs w:val="16"/>
               </w:rPr>
-              <w:t>Kỹ thuật</w:t>
+              <w:t>Con người / Khách hàng</w:t>
             </w:r>
           </w:p>
         </w:tc>
@@ -40974,7 +40953,7 @@
                 <w:sz w:val="16"/>
                 <w:szCs w:val="16"/>
               </w:rPr>
-              <w:t>Tạo chỉ mục CSDL, bảng tổng hợp theo ngày; kiểm thử hiệu năng với dữ liệu thật từ sớm</w:t>
+              <w:t>Giao diện đơn giản; đào tạo tại từng chi nhánh; chọn 1 người dùng chủ chốt (key user) mỗi chi nhánh</w:t>
             </w:r>
           </w:p>
         </w:tc>
@@ -41003,7 +40982,7 @@
                 <w:sz w:val="16"/>
                 <w:szCs w:val="16"/>
               </w:rPr>
-              <w:t>BE</w:t>
+              <w:t>BA</w:t>
             </w:r>
           </w:p>
         </w:tc>
@@ -41039,7 +41018,7 @@
                 <w:sz w:val="16"/>
                 <w:szCs w:val="16"/>
               </w:rPr>
-              <w:t>R09</w:t>
+              <w:t>R08</w:t>
             </w:r>
           </w:p>
         </w:tc>
@@ -41068,7 +41047,7 @@
                 <w:sz w:val="16"/>
                 <w:szCs w:val="16"/>
               </w:rPr>
-              <w:t>Quy định ngành dược (GPP, thuốc kê đơn) có thể yêu cầu lưu trữ hoặc báo cáo đặc thù chưa nêu trong yêu cầu</w:t>
+              <w:t>Dữ liệu 2 năm bán hàng (hàng trăm nghìn dòng) và truy vấn thống kê phức tạp</w:t>
             </w:r>
           </w:p>
         </w:tc>
@@ -41097,7 +41076,7 @@
                 <w:sz w:val="16"/>
                 <w:szCs w:val="16"/>
               </w:rPr>
-              <w:t>Phát sinh yêu cầu bắt buộc muộn</w:t>
+              <w:t>Dashboard phản hồi chậm hơn 2 giây</w:t>
             </w:r>
           </w:p>
         </w:tc>
@@ -41126,7 +41105,7 @@
                 <w:sz w:val="16"/>
                 <w:szCs w:val="16"/>
               </w:rPr>
-              <w:t>Phải làm thêm chức năng, trễ tiến độ</w:t>
+              <w:t>Trải nghiệm kém, không đạt yêu cầu phi chức năng</w:t>
             </w:r>
           </w:p>
         </w:tc>
@@ -41155,7 +41134,7 @@
                 <w:sz w:val="16"/>
                 <w:szCs w:val="16"/>
               </w:rPr>
-              <w:t>Khách hàng / Pháp lý</w:t>
+              <w:t>Kỹ thuật</w:t>
             </w:r>
           </w:p>
         </w:tc>
@@ -41185,7 +41164,7 @@
                 <w:sz w:val="16"/>
                 <w:szCs w:val="16"/>
               </w:rPr>
-              <w:t>2</w:t>
+              <w:t>3</w:t>
             </w:r>
           </w:p>
         </w:tc>
@@ -41215,7 +41194,7 @@
                 <w:sz w:val="16"/>
                 <w:szCs w:val="16"/>
               </w:rPr>
-              <w:t>4</w:t>
+              <w:t>3</w:t>
             </w:r>
           </w:p>
         </w:tc>
@@ -41248,7 +41227,7 @@
                 <w:sz w:val="16"/>
                 <w:szCs w:val="16"/>
               </w:rPr>
-              <w:t>8</w:t>
+              <w:t>9</w:t>
             </w:r>
           </w:p>
           <w:p>
@@ -41321,7 +41300,7 @@
                 <w:sz w:val="16"/>
                 <w:szCs w:val="16"/>
               </w:rPr>
-              <w:t>Hỏi rõ với chủ nhà thuốc và dược sĩ phụ trách chuyên môn ngay khi khảo sát; ghi nhận vào SRS</w:t>
+              <w:t>Tạo chỉ mục CSDL, bảng tổng hợp theo ngày; kiểm thử hiệu năng với dữ liệu thật từ sớm</w:t>
             </w:r>
           </w:p>
         </w:tc>
@@ -41350,7 +41329,7 @@
                 <w:sz w:val="16"/>
                 <w:szCs w:val="16"/>
               </w:rPr>
-              <w:t>BA</w:t>
+              <w:t>BE</w:t>
             </w:r>
           </w:p>
         </w:tc>
@@ -41386,7 +41365,7 @@
                 <w:sz w:val="16"/>
                 <w:szCs w:val="16"/>
               </w:rPr>
-              <w:t>R10</w:t>
+              <w:t>R09</w:t>
             </w:r>
           </w:p>
         </w:tc>
@@ -41415,7 +41394,7 @@
                 <w:sz w:val="16"/>
                 <w:szCs w:val="16"/>
               </w:rPr>
-              <w:t>Hệ thống chạy trên máy chủ thuê ngoài, mạng Internet tại chi nhánh không ổn định</w:t>
+              <w:t>Quy định ngành dược (GPP, thuốc kê đơn) có thể yêu cầu lưu trữ hoặc báo cáo đặc thù chưa nêu trong yêu cầu</w:t>
             </w:r>
           </w:p>
         </w:tc>
@@ -41444,7 +41423,7 @@
                 <w:sz w:val="16"/>
                 <w:szCs w:val="16"/>
               </w:rPr>
-              <w:t>Máy chủ hoặc mạng gặp sự cố</w:t>
+              <w:t>Phát sinh yêu cầu bắt buộc muộn</w:t>
             </w:r>
           </w:p>
         </w:tc>
@@ -41473,7 +41452,7 @@
                 <w:sz w:val="16"/>
                 <w:szCs w:val="16"/>
               </w:rPr>
-              <w:t>Không truy cập được dashboard trong giờ bán hàng</w:t>
+              <w:t>Phải làm thêm chức năng, trễ tiến độ</w:t>
             </w:r>
           </w:p>
         </w:tc>
@@ -41502,7 +41481,7 @@
                 <w:sz w:val="16"/>
                 <w:szCs w:val="16"/>
               </w:rPr>
-              <w:t>Bên ngoài / Hạ tầng</w:t>
+              <w:t>Khách hàng / Pháp lý</w:t>
             </w:r>
           </w:p>
         </w:tc>
@@ -41562,7 +41541,7 @@
                 <w:sz w:val="16"/>
                 <w:szCs w:val="16"/>
               </w:rPr>
-              <w:t>3</w:t>
+              <w:t>4</w:t>
             </w:r>
           </w:p>
         </w:tc>
@@ -41575,7 +41554,7 @@
               <w:bottom w:val="single" w:sz="4" w:space="0" w:color="BFBFBF"/>
               <w:right w:val="single" w:sz="4" w:space="0" w:color="BFBFBF"/>
             </w:tcBorders>
-            <w:shd w:val="clear" w:color="auto" w:fill="D8F0DD"/>
+            <w:shd w:val="clear" w:color="auto" w:fill="FCE4C4"/>
             <w:tcMar>
               <w:top w:w="50" w:type="dxa"/>
               <w:left w:w="90" w:type="dxa"/>
@@ -41595,7 +41574,7 @@
                 <w:sz w:val="16"/>
                 <w:szCs w:val="16"/>
               </w:rPr>
-              <w:t>6</w:t>
+              <w:t>8</w:t>
             </w:r>
           </w:p>
           <w:p>
@@ -41610,7 +41589,7 @@
                 <w:sz w:val="16"/>
                 <w:szCs w:val="16"/>
               </w:rPr>
-              <w:t>Thấp</w:t>
+              <w:t>Trung bình</w:t>
             </w:r>
           </w:p>
         </w:tc>
@@ -41639,7 +41618,7 @@
                 <w:sz w:val="16"/>
                 <w:szCs w:val="16"/>
               </w:rPr>
-              <w:t>Chuyển giao</w:t>
+              <w:t>Giảm</w:t>
             </w:r>
           </w:p>
         </w:tc>
@@ -41668,7 +41647,7 @@
                 <w:sz w:val="16"/>
                 <w:szCs w:val="16"/>
               </w:rPr>
-              <w:t>Chọn nhà cung cấp VPS có cam kết SLA 99,9% trong hợp đồng; sao lưu hằng ngày; hướng dẫn phương án xử lý sự cố</w:t>
+              <w:t>Hỏi rõ với chủ nhà thuốc và dược sĩ phụ trách chuyên môn ngay khi khảo sát; ghi nhận vào SRS</w:t>
             </w:r>
           </w:p>
         </w:tc>
@@ -41697,7 +41676,7 @@
                 <w:sz w:val="16"/>
                 <w:szCs w:val="16"/>
               </w:rPr>
-              <w:t>BE</w:t>
+              <w:t>BA</w:t>
             </w:r>
           </w:p>
         </w:tc>
@@ -41733,7 +41712,7 @@
                 <w:sz w:val="16"/>
                 <w:szCs w:val="16"/>
               </w:rPr>
-              <w:t>R11</w:t>
+              <w:t>R10</w:t>
             </w:r>
           </w:p>
         </w:tc>
@@ -41759,12 +41738,10 @@
             </w:pPr>
             <w:r>
               <w:rPr>
-                <w:i/>
-                <w:iCs/>
-                <w:color w:val="7A5C00"/>
-                <w:highlight w:val="yellow"/>
-              </w:rPr>
-              <w:t>[NHÓM ĐIỀN: rủi ro nhóm tự bổ sung]</w:t>
+                <w:sz w:val="16"/>
+                <w:szCs w:val="16"/>
+              </w:rPr>
+              <w:t>Hệ thống chạy trên máy chủ thuê ngoài, mạng Internet tại chi nhánh không ổn định</w:t>
             </w:r>
           </w:p>
         </w:tc>
@@ -41790,12 +41767,10 @@
             </w:pPr>
             <w:r>
               <w:rPr>
-                <w:i/>
-                <w:iCs/>
-                <w:color w:val="7A5C00"/>
-                <w:highlight w:val="yellow"/>
-              </w:rPr>
-              <w:t>[NHÓM ĐIỀN: …]</w:t>
+                <w:sz w:val="16"/>
+                <w:szCs w:val="16"/>
+              </w:rPr>
+              <w:t>Máy chủ hoặc mạng gặp sự cố</w:t>
             </w:r>
           </w:p>
         </w:tc>
@@ -41821,12 +41796,10 @@
             </w:pPr>
             <w:r>
               <w:rPr>
-                <w:i/>
-                <w:iCs/>
-                <w:color w:val="7A5C00"/>
-                <w:highlight w:val="yellow"/>
-              </w:rPr>
-              <w:t>[NHÓM ĐIỀN: …]</w:t>
+                <w:sz w:val="16"/>
+                <w:szCs w:val="16"/>
+              </w:rPr>
+              <w:t>Không truy cập được dashboard trong giờ bán hàng</w:t>
             </w:r>
           </w:p>
         </w:tc>
@@ -41852,12 +41825,10 @@
             </w:pPr>
             <w:r>
               <w:rPr>
-                <w:i/>
-                <w:iCs/>
-                <w:color w:val="7A5C00"/>
-                <w:highlight w:val="yellow"/>
-              </w:rPr>
-              <w:t>[NHÓM ĐIỀN: …]</w:t>
+                <w:sz w:val="16"/>
+                <w:szCs w:val="16"/>
+              </w:rPr>
+              <w:t>Bên ngoài / Hạ tầng</w:t>
             </w:r>
           </w:p>
         </w:tc>
@@ -41880,15 +41851,14 @@
           <w:p>
             <w:pPr>
               <w:spacing w:after="20"/>
-            </w:pPr>
-            <w:r>
-              <w:rPr>
-                <w:i/>
-                <w:iCs/>
-                <w:color w:val="7A5C00"/>
-                <w:highlight w:val="yellow"/>
-              </w:rPr>
-              <w:t>[NHÓM ĐIỀN: …]</w:t>
+              <w:jc w:val="center"/>
+            </w:pPr>
+            <w:r>
+              <w:rPr>
+                <w:sz w:val="16"/>
+                <w:szCs w:val="16"/>
+              </w:rPr>
+              <w:t>2</w:t>
             </w:r>
           </w:p>
         </w:tc>
@@ -41911,15 +41881,14 @@
           <w:p>
             <w:pPr>
               <w:spacing w:after="20"/>
-            </w:pPr>
-            <w:r>
-              <w:rPr>
-                <w:i/>
-                <w:iCs/>
-                <w:color w:val="7A5C00"/>
-                <w:highlight w:val="yellow"/>
-              </w:rPr>
-              <w:t>[NHÓM ĐIỀN: …]</w:t>
+              <w:jc w:val="center"/>
+            </w:pPr>
+            <w:r>
+              <w:rPr>
+                <w:sz w:val="16"/>
+                <w:szCs w:val="16"/>
+              </w:rPr>
+              <w:t>3</w:t>
             </w:r>
           </w:p>
         </w:tc>
@@ -41932,25 +41901,42 @@
               <w:bottom w:val="single" w:sz="4" w:space="0" w:color="BFBFBF"/>
               <w:right w:val="single" w:sz="4" w:space="0" w:color="BFBFBF"/>
             </w:tcBorders>
-            <w:tcMar>
-              <w:top w:w="50" w:type="dxa"/>
-              <w:left w:w="90" w:type="dxa"/>
-              <w:bottom w:w="50" w:type="dxa"/>
-              <w:right w:w="90" w:type="dxa"/>
-            </w:tcMar>
-          </w:tcPr>
-          <w:p>
-            <w:pPr>
-              <w:spacing w:after="20"/>
-            </w:pPr>
-            <w:r>
-              <w:rPr>
-                <w:i/>
-                <w:iCs/>
-                <w:color w:val="7A5C00"/>
-                <w:highlight w:val="yellow"/>
-              </w:rPr>
-              <w:t>[NHÓM ĐIỀN: …]</w:t>
+            <w:shd w:val="clear" w:color="auto" w:fill="D8F0DD"/>
+            <w:tcMar>
+              <w:top w:w="50" w:type="dxa"/>
+              <w:left w:w="90" w:type="dxa"/>
+              <w:bottom w:w="50" w:type="dxa"/>
+              <w:right w:w="90" w:type="dxa"/>
+            </w:tcMar>
+          </w:tcPr>
+          <w:p>
+            <w:pPr>
+              <w:spacing w:after="20"/>
+              <w:jc w:val="center"/>
+            </w:pPr>
+            <w:r>
+              <w:rPr>
+                <w:b/>
+                <w:bCs/>
+                <w:sz w:val="16"/>
+                <w:szCs w:val="16"/>
+              </w:rPr>
+              <w:t>6</w:t>
+            </w:r>
+          </w:p>
+          <w:p>
+            <w:pPr>
+              <w:spacing w:after="20"/>
+              <w:jc w:val="center"/>
+            </w:pPr>
+            <w:r>
+              <w:rPr>
+                <w:b/>
+                <w:bCs/>
+                <w:sz w:val="16"/>
+                <w:szCs w:val="16"/>
+              </w:rPr>
+              <w:t>Thấp</w:t>
             </w:r>
           </w:p>
         </w:tc>
@@ -41976,12 +41962,10 @@
             </w:pPr>
             <w:r>
               <w:rPr>
-                <w:i/>
-                <w:iCs/>
-                <w:color w:val="7A5C00"/>
-                <w:highlight w:val="yellow"/>
-              </w:rPr>
-              <w:t>[NHÓM ĐIỀN: …]</w:t>
+                <w:sz w:val="16"/>
+                <w:szCs w:val="16"/>
+              </w:rPr>
+              <w:t>Chuyển giao</w:t>
             </w:r>
           </w:p>
         </w:tc>
@@ -42007,12 +41991,10 @@
             </w:pPr>
             <w:r>
               <w:rPr>
-                <w:i/>
-                <w:iCs/>
-                <w:color w:val="7A5C00"/>
-                <w:highlight w:val="yellow"/>
-              </w:rPr>
-              <w:t>[NHÓM ĐIỀN: …]</w:t>
+                <w:sz w:val="16"/>
+                <w:szCs w:val="16"/>
+              </w:rPr>
+              <w:t>Chọn nhà cung cấp VPS có cam kết SLA 99,9% trong hợp đồng; sao lưu hằng ngày; hướng dẫn phương án xử lý sự cố</w:t>
             </w:r>
           </w:p>
         </w:tc>
@@ -42038,12 +42020,10 @@
             </w:pPr>
             <w:r>
               <w:rPr>
-                <w:i/>
-                <w:iCs/>
-                <w:color w:val="7A5C00"/>
-                <w:highlight w:val="yellow"/>
-              </w:rPr>
-              <w:t>[NHÓM ĐIỀN: …]</w:t>
+                <w:sz w:val="16"/>
+                <w:szCs w:val="16"/>
+              </w:rPr>
+              <w:t>BE</w:t>
             </w:r>
           </w:p>
         </w:tc>
@@ -42684,7 +42664,7 @@
         <w:keepNext/>
         <w:keepLines/>
       </w:pPr>
-      <w:bookmarkStart w:id="23" w:name="_Toc242015923"/>
+      <w:bookmarkStart w:id="23" w:name="_Toc242016302"/>
       <w:r>
         <w:t>6.1 Ma trận xác suất – tác động</w:t>
       </w:r>
@@ -42762,7 +42742,7 @@
         <w:keepNext/>
         <w:keepLines/>
       </w:pPr>
-      <w:bookmarkStart w:id="24" w:name="_Toc242015924"/>
+      <w:bookmarkStart w:id="24" w:name="_Toc242016303"/>
       <w:r>
         <w:t>6.2 Kế hoạch dự phòng cho rủi ro điểm cao nhất – R01</w:t>
       </w:r>
@@ -43330,7 +43310,7 @@
         <w:keepNext/>
         <w:keepLines/>
       </w:pPr>
-      <w:bookmarkStart w:id="25" w:name="_Toc242015925"/>
+      <w:bookmarkStart w:id="25" w:name="_Toc242016304"/>
       <w:r>
         <w:t>7. Phản biện đầu ra AI</w:t>
       </w:r>
@@ -43946,245 +43926,7 @@
           <w:i/>
           <w:sz w:val="19"/>
         </w:rPr>
-        <w:t>Ngu</w:t>
-      </w:r>
-      <w:r>
-        <w:rPr>
-          <w:i/>
-          <w:sz w:val="19"/>
-        </w:rPr>
-        <w:t>ồ</w:t>
-      </w:r>
-      <w:r>
-        <w:rPr>
-          <w:i/>
-          <w:sz w:val="19"/>
-        </w:rPr>
-        <w:t>n: chat Bai5_PhanBien trong Claude Project (04/10/2026), câu h</w:t>
-      </w:r>
-      <w:r>
-        <w:rPr>
-          <w:i/>
-          <w:sz w:val="19"/>
-        </w:rPr>
-        <w:t>ỏ</w:t>
-      </w:r>
-      <w:r>
-        <w:rPr>
-          <w:i/>
-          <w:sz w:val="19"/>
-        </w:rPr>
-        <w:t>i dán nguyên văn. Lưu ý: Sponsor c</w:t>
-      </w:r>
-      <w:r>
-        <w:rPr>
-          <w:i/>
-          <w:sz w:val="19"/>
-        </w:rPr>
-        <w:t>ủ</w:t>
-      </w:r>
-      <w:r>
-        <w:rPr>
-          <w:i/>
-          <w:sz w:val="19"/>
-        </w:rPr>
-        <w:t>a Claude ch</w:t>
-      </w:r>
-      <w:r>
-        <w:rPr>
-          <w:i/>
-          <w:sz w:val="19"/>
-        </w:rPr>
-        <w:t>ấ</w:t>
-      </w:r>
-      <w:r>
-        <w:rPr>
-          <w:i/>
-          <w:sz w:val="19"/>
-        </w:rPr>
-        <w:t>t v</w:t>
-      </w:r>
-      <w:r>
-        <w:rPr>
-          <w:i/>
-          <w:sz w:val="19"/>
-        </w:rPr>
-        <w:t>ấ</w:t>
-      </w:r>
-      <w:r>
-        <w:rPr>
-          <w:i/>
-          <w:sz w:val="19"/>
-        </w:rPr>
-        <w:t>n d</w:t>
-      </w:r>
-      <w:r>
-        <w:rPr>
-          <w:i/>
-          <w:sz w:val="19"/>
-        </w:rPr>
-        <w:t>ự</w:t>
-      </w:r>
-      <w:r>
-        <w:rPr>
-          <w:i/>
-          <w:sz w:val="19"/>
-        </w:rPr>
-        <w:t>a trên Charter, WBS, l</w:t>
-      </w:r>
-      <w:r>
-        <w:rPr>
-          <w:i/>
-          <w:sz w:val="19"/>
-        </w:rPr>
-        <w:t>ị</w:t>
-      </w:r>
-      <w:r>
-        <w:rPr>
-          <w:i/>
-          <w:sz w:val="19"/>
-        </w:rPr>
-        <w:t>ch và s</w:t>
-      </w:r>
-      <w:r>
-        <w:rPr>
-          <w:i/>
-          <w:sz w:val="19"/>
-        </w:rPr>
-        <w:t>ổ</w:t>
-      </w:r>
-      <w:r>
-        <w:rPr>
-          <w:i/>
-          <w:sz w:val="19"/>
-        </w:rPr>
-        <w:t xml:space="preserve"> r</w:t>
-      </w:r>
-      <w:r>
-        <w:rPr>
-          <w:i/>
-          <w:sz w:val="19"/>
-        </w:rPr>
-        <w:t>ủ</w:t>
-      </w:r>
-      <w:r>
-        <w:rPr>
-          <w:i/>
-          <w:sz w:val="19"/>
-        </w:rPr>
-        <w:t>i ro do chính Claude so</w:t>
-      </w:r>
-      <w:r>
-        <w:rPr>
-          <w:i/>
-          <w:sz w:val="19"/>
-        </w:rPr>
-        <w:t>ạ</w:t>
-      </w:r>
-      <w:r>
-        <w:rPr>
-          <w:i/>
-          <w:sz w:val="19"/>
-        </w:rPr>
-        <w:t>n trong project (go-live 21/12, WBS 1.912 gi</w:t>
-      </w:r>
-      <w:r>
-        <w:rPr>
-          <w:i/>
-          <w:sz w:val="19"/>
-        </w:rPr>
-        <w:t>ờ</w:t>
-      </w:r>
-      <w:r>
-        <w:rPr>
-          <w:i/>
-          <w:sz w:val="19"/>
-        </w:rPr>
-        <w:t>, R02 = 25 đi</w:t>
-      </w:r>
-      <w:r>
-        <w:rPr>
-          <w:i/>
-          <w:sz w:val="19"/>
-        </w:rPr>
-        <w:t>ể</w:t>
-      </w:r>
-      <w:r>
-        <w:rPr>
-          <w:i/>
-          <w:sz w:val="19"/>
-        </w:rPr>
-        <w:t>m), không ph</w:t>
-      </w:r>
-      <w:r>
-        <w:rPr>
-          <w:i/>
-          <w:sz w:val="19"/>
-        </w:rPr>
-        <w:t>ả</w:t>
-      </w:r>
-      <w:r>
-        <w:rPr>
-          <w:i/>
-          <w:sz w:val="19"/>
-        </w:rPr>
-        <w:t>i b</w:t>
-      </w:r>
-      <w:r>
-        <w:rPr>
-          <w:i/>
-          <w:sz w:val="19"/>
-        </w:rPr>
-        <w:t>ả</w:t>
-      </w:r>
-      <w:r>
-        <w:rPr>
-          <w:i/>
-          <w:sz w:val="19"/>
-        </w:rPr>
-        <w:t>n k</w:t>
-      </w:r>
-      <w:r>
-        <w:rPr>
-          <w:i/>
-          <w:sz w:val="19"/>
-        </w:rPr>
-        <w:t>ế</w:t>
-      </w:r>
-      <w:r>
-        <w:rPr>
-          <w:i/>
-          <w:sz w:val="19"/>
-        </w:rPr>
-        <w:t xml:space="preserve"> ho</w:t>
-      </w:r>
-      <w:r>
-        <w:rPr>
-          <w:i/>
-          <w:sz w:val="19"/>
-        </w:rPr>
-        <w:t>ạ</w:t>
-      </w:r>
-      <w:r>
-        <w:rPr>
-          <w:i/>
-          <w:sz w:val="19"/>
-        </w:rPr>
-        <w:t>ch c</w:t>
-      </w:r>
-      <w:r>
-        <w:rPr>
-          <w:i/>
-          <w:sz w:val="19"/>
-        </w:rPr>
-        <w:t>ủ</w:t>
-      </w:r>
-      <w:r>
-        <w:rPr>
-          <w:i/>
-          <w:sz w:val="19"/>
-        </w:rPr>
-        <w:t>a nhóm trong báo cáo này.</w:t>
+        <w:t>Nguồn: chat Bai5_PhanBien trong Claude Project (04/10/2026), câu hỏi dán nguyên văn. Lưu ý: Sponsor của Claude chất vấn dựa trên Charter, WBS, lịch và sổ rủi ro do chính Claude soạn trong project (go-live 21/12, WBS 1.912 giờ, R02 = 25 điểm), không phải bản kế hoạch của nhóm trong báo cáo này.</w:t>
       </w:r>
     </w:p>
     <w:p>
@@ -44243,71 +43985,7 @@
           <w:color w:val="595959"/>
           <w:sz w:val="18"/>
         </w:rPr>
-        <w:t>Hình 7.1 – Tóm t</w:t>
-      </w:r>
-      <w:r>
-        <w:rPr>
-          <w:i/>
-          <w:color w:val="595959"/>
-          <w:sz w:val="18"/>
-        </w:rPr>
-        <w:t>ắ</w:t>
-      </w:r>
-      <w:r>
-        <w:rPr>
-          <w:i/>
-          <w:color w:val="595959"/>
-          <w:sz w:val="18"/>
-        </w:rPr>
-        <w:t>t 5 câu ch</w:t>
-      </w:r>
-      <w:r>
-        <w:rPr>
-          <w:i/>
-          <w:color w:val="595959"/>
-          <w:sz w:val="18"/>
-        </w:rPr>
-        <w:t>ấ</w:t>
-      </w:r>
-      <w:r>
-        <w:rPr>
-          <w:i/>
-          <w:color w:val="595959"/>
-          <w:sz w:val="18"/>
-        </w:rPr>
-        <w:t>t v</w:t>
-      </w:r>
-      <w:r>
-        <w:rPr>
-          <w:i/>
-          <w:color w:val="595959"/>
-          <w:sz w:val="18"/>
-        </w:rPr>
-        <w:t>ấ</w:t>
-      </w:r>
-      <w:r>
-        <w:rPr>
-          <w:i/>
-          <w:color w:val="595959"/>
-          <w:sz w:val="18"/>
-        </w:rPr>
-        <w:t>n c</w:t>
-      </w:r>
-      <w:r>
-        <w:rPr>
-          <w:i/>
-          <w:color w:val="595959"/>
-          <w:sz w:val="18"/>
-        </w:rPr>
-        <w:t>ủ</w:t>
-      </w:r>
-      <w:r>
-        <w:rPr>
-          <w:i/>
-          <w:color w:val="595959"/>
-          <w:sz w:val="18"/>
-        </w:rPr>
-        <w:t>a Sponsor (Claude Project, Bài 5)</w:t>
+        <w:t>Hình 7.1 – Tóm tắt 5 câu chất vấn của Sponsor (Claude Project, Bài 5)</w:t>
       </w:r>
     </w:p>
     <w:p>
@@ -44366,103 +44044,7 @@
           <w:color w:val="595959"/>
           <w:sz w:val="18"/>
         </w:rPr>
-        <w:t>Hình 7.2 – Ví d</w:t>
-      </w:r>
-      <w:r>
-        <w:rPr>
-          <w:i/>
-          <w:color w:val="595959"/>
-          <w:sz w:val="18"/>
-        </w:rPr>
-        <w:t>ụ</w:t>
-      </w:r>
-      <w:r>
-        <w:rPr>
-          <w:i/>
-          <w:color w:val="595959"/>
-          <w:sz w:val="18"/>
-        </w:rPr>
-        <w:t xml:space="preserve"> chi ti</w:t>
-      </w:r>
-      <w:r>
-        <w:rPr>
-          <w:i/>
-          <w:color w:val="595959"/>
-          <w:sz w:val="18"/>
-        </w:rPr>
-        <w:t>ế</w:t>
-      </w:r>
-      <w:r>
-        <w:rPr>
-          <w:i/>
-          <w:color w:val="595959"/>
-          <w:sz w:val="18"/>
-        </w:rPr>
-        <w:t>t câu 1: câu h</w:t>
-      </w:r>
-      <w:r>
-        <w:rPr>
-          <w:i/>
-          <w:color w:val="595959"/>
-          <w:sz w:val="18"/>
-        </w:rPr>
-        <w:t>ỏ</w:t>
-      </w:r>
-      <w:r>
-        <w:rPr>
-          <w:i/>
-          <w:color w:val="595959"/>
-          <w:sz w:val="18"/>
-        </w:rPr>
-        <w:t>i, căn c</w:t>
-      </w:r>
-      <w:r>
-        <w:rPr>
-          <w:i/>
-          <w:color w:val="595959"/>
-          <w:sz w:val="18"/>
-        </w:rPr>
-        <w:t>ứ</w:t>
-      </w:r>
-      <w:r>
-        <w:rPr>
-          <w:i/>
-          <w:color w:val="595959"/>
-          <w:sz w:val="18"/>
-        </w:rPr>
-        <w:t xml:space="preserve"> và đi</w:t>
-      </w:r>
-      <w:r>
-        <w:rPr>
-          <w:i/>
-          <w:color w:val="595959"/>
-          <w:sz w:val="18"/>
-        </w:rPr>
-        <w:t>ề</w:t>
-      </w:r>
-      <w:r>
-        <w:rPr>
-          <w:i/>
-          <w:color w:val="595959"/>
-          <w:sz w:val="18"/>
-        </w:rPr>
-        <w:t>u Sponsor c</w:t>
-      </w:r>
-      <w:r>
-        <w:rPr>
-          <w:i/>
-          <w:color w:val="595959"/>
-          <w:sz w:val="18"/>
-        </w:rPr>
-        <w:t>ầ</w:t>
-      </w:r>
-      <w:r>
-        <w:rPr>
-          <w:i/>
-          <w:color w:val="595959"/>
-          <w:sz w:val="18"/>
-        </w:rPr>
-        <w:t>n nghe</w:t>
+        <w:t>Hình 7.2 – Ví dụ chi tiết câu 1: câu hỏi, căn cứ và điều Sponsor cần nghe</w:t>
       </w:r>
     </w:p>
     <w:p>
@@ -44471,7 +44053,7 @@
         <w:keepNext/>
         <w:keepLines/>
       </w:pPr>
-      <w:bookmarkStart w:id="26" w:name="_Toc242015926"/>
+      <w:bookmarkStart w:id="26" w:name="_Toc242016305"/>
       <w:r>
         <w:t>7.1 Phản tư</w:t>
       </w:r>
@@ -44535,7 +44117,7 @@
         <w:keepNext/>
         <w:keepLines/>
       </w:pPr>
-      <w:bookmarkStart w:id="27" w:name="_Toc242015927"/>
+      <w:bookmarkStart w:id="27" w:name="_Toc242016306"/>
       <w:r>
         <w:t>8. Nhật ký sử dụng AI</w:t>
       </w:r>

</xml_diff>

<commit_message>
Lab: thêm rủi ro R12 (hiểu sai yêu cầu phải làm lại) do nhóm bổ sung
Co-Authored-By: Claude Opus 5.5 <noreply@anthropic.com>
</commit_message>
<xml_diff>
--- a/docs/lab/QLDA_Nhom_PharmaDash_Lab.docx
+++ b/docs/lab/QLDA_Nhom_PharmaDash_Lab.docx
@@ -998,7 +998,7 @@
           <w:r>
             <w:fldChar w:fldCharType="separate"/>
           </w:r>
-          <w:hyperlink w:anchor="_Toc242016279" w:history="1">
+          <w:hyperlink w:anchor="_Toc242016416" w:history="1">
             <w:r>
               <w:rPr>
                 <w:rStyle w:val="Hyperlink"/>
@@ -1022,7 +1022,7 @@
               <w:rPr>
                 <w:noProof/>
               </w:rPr>
-              <w:instrText xml:space="preserve"> PAGEREF _Toc242016279 \h </w:instrText>
+              <w:instrText xml:space="preserve"> PAGEREF _Toc242016416 \h </w:instrText>
             </w:r>
             <w:r>
               <w:rPr>
@@ -1064,7 +1064,7 @@
               <w14:ligatures w14:val="standardContextual"/>
             </w:rPr>
           </w:pPr>
-          <w:hyperlink w:anchor="_Toc242016280" w:history="1">
+          <w:hyperlink w:anchor="_Toc242016417" w:history="1">
             <w:r>
               <w:rPr>
                 <w:rStyle w:val="Hyperlink"/>
@@ -1088,7 +1088,7 @@
               <w:rPr>
                 <w:noProof/>
               </w:rPr>
-              <w:instrText xml:space="preserve"> PAGEREF _Toc242016280 \h </w:instrText>
+              <w:instrText xml:space="preserve"> PAGEREF _Toc242016417 \h </w:instrText>
             </w:r>
             <w:r>
               <w:rPr>
@@ -1130,7 +1130,7 @@
               <w14:ligatures w14:val="standardContextual"/>
             </w:rPr>
           </w:pPr>
-          <w:hyperlink w:anchor="_Toc242016281" w:history="1">
+          <w:hyperlink w:anchor="_Toc242016418" w:history="1">
             <w:r>
               <w:rPr>
                 <w:rStyle w:val="Hyperlink"/>
@@ -1154,7 +1154,7 @@
               <w:rPr>
                 <w:noProof/>
               </w:rPr>
-              <w:instrText xml:space="preserve"> PAGEREF _Toc242016281 \h </w:instrText>
+              <w:instrText xml:space="preserve"> PAGEREF _Toc242016418 \h </w:instrText>
             </w:r>
             <w:r>
               <w:rPr>
@@ -1196,7 +1196,7 @@
               <w14:ligatures w14:val="standardContextual"/>
             </w:rPr>
           </w:pPr>
-          <w:hyperlink w:anchor="_Toc242016282" w:history="1">
+          <w:hyperlink w:anchor="_Toc242016419" w:history="1">
             <w:r>
               <w:rPr>
                 <w:rStyle w:val="Hyperlink"/>
@@ -1220,7 +1220,7 @@
               <w:rPr>
                 <w:noProof/>
               </w:rPr>
-              <w:instrText xml:space="preserve"> PAGEREF _Toc242016282 \h </w:instrText>
+              <w:instrText xml:space="preserve"> PAGEREF _Toc242016419 \h </w:instrText>
             </w:r>
             <w:r>
               <w:rPr>
@@ -1262,7 +1262,7 @@
               <w14:ligatures w14:val="standardContextual"/>
             </w:rPr>
           </w:pPr>
-          <w:hyperlink w:anchor="_Toc242016283" w:history="1">
+          <w:hyperlink w:anchor="_Toc242016420" w:history="1">
             <w:r>
               <w:rPr>
                 <w:rStyle w:val="Hyperlink"/>
@@ -1286,7 +1286,7 @@
               <w:rPr>
                 <w:noProof/>
               </w:rPr>
-              <w:instrText xml:space="preserve"> PAGEREF _Toc242016283 \h </w:instrText>
+              <w:instrText xml:space="preserve"> PAGEREF _Toc242016420 \h </w:instrText>
             </w:r>
             <w:r>
               <w:rPr>
@@ -1328,7 +1328,7 @@
               <w14:ligatures w14:val="standardContextual"/>
             </w:rPr>
           </w:pPr>
-          <w:hyperlink w:anchor="_Toc242016284" w:history="1">
+          <w:hyperlink w:anchor="_Toc242016421" w:history="1">
             <w:r>
               <w:rPr>
                 <w:rStyle w:val="Hyperlink"/>
@@ -1352,7 +1352,7 @@
               <w:rPr>
                 <w:noProof/>
               </w:rPr>
-              <w:instrText xml:space="preserve"> PAGEREF _Toc242016284 \h </w:instrText>
+              <w:instrText xml:space="preserve"> PAGEREF _Toc242016421 \h </w:instrText>
             </w:r>
             <w:r>
               <w:rPr>
@@ -1394,7 +1394,7 @@
               <w14:ligatures w14:val="standardContextual"/>
             </w:rPr>
           </w:pPr>
-          <w:hyperlink w:anchor="_Toc242016285" w:history="1">
+          <w:hyperlink w:anchor="_Toc242016422" w:history="1">
             <w:r>
               <w:rPr>
                 <w:rStyle w:val="Hyperlink"/>
@@ -1418,7 +1418,7 @@
               <w:rPr>
                 <w:noProof/>
               </w:rPr>
-              <w:instrText xml:space="preserve"> PAGEREF _Toc242016285 \h </w:instrText>
+              <w:instrText xml:space="preserve"> PAGEREF _Toc242016422 \h </w:instrText>
             </w:r>
             <w:r>
               <w:rPr>
@@ -1460,7 +1460,7 @@
               <w14:ligatures w14:val="standardContextual"/>
             </w:rPr>
           </w:pPr>
-          <w:hyperlink w:anchor="_Toc242016286" w:history="1">
+          <w:hyperlink w:anchor="_Toc242016423" w:history="1">
             <w:r>
               <w:rPr>
                 <w:rStyle w:val="Hyperlink"/>
@@ -1484,7 +1484,7 @@
               <w:rPr>
                 <w:noProof/>
               </w:rPr>
-              <w:instrText xml:space="preserve"> PAGEREF _Toc242016286 \h </w:instrText>
+              <w:instrText xml:space="preserve"> PAGEREF _Toc242016423 \h </w:instrText>
             </w:r>
             <w:r>
               <w:rPr>
@@ -1526,7 +1526,7 @@
               <w14:ligatures w14:val="standardContextual"/>
             </w:rPr>
           </w:pPr>
-          <w:hyperlink w:anchor="_Toc242016287" w:history="1">
+          <w:hyperlink w:anchor="_Toc242016424" w:history="1">
             <w:r>
               <w:rPr>
                 <w:rStyle w:val="Hyperlink"/>
@@ -1550,7 +1550,7 @@
               <w:rPr>
                 <w:noProof/>
               </w:rPr>
-              <w:instrText xml:space="preserve"> PAGEREF _Toc242016287 \h </w:instrText>
+              <w:instrText xml:space="preserve"> PAGEREF _Toc242016424 \h </w:instrText>
             </w:r>
             <w:r>
               <w:rPr>
@@ -1592,7 +1592,7 @@
               <w14:ligatures w14:val="standardContextual"/>
             </w:rPr>
           </w:pPr>
-          <w:hyperlink w:anchor="_Toc242016288" w:history="1">
+          <w:hyperlink w:anchor="_Toc242016425" w:history="1">
             <w:r>
               <w:rPr>
                 <w:rStyle w:val="Hyperlink"/>
@@ -1616,7 +1616,7 @@
               <w:rPr>
                 <w:noProof/>
               </w:rPr>
-              <w:instrText xml:space="preserve"> PAGEREF _Toc242016288 \h </w:instrText>
+              <w:instrText xml:space="preserve"> PAGEREF _Toc242016425 \h </w:instrText>
             </w:r>
             <w:r>
               <w:rPr>
@@ -1658,7 +1658,7 @@
               <w14:ligatures w14:val="standardContextual"/>
             </w:rPr>
           </w:pPr>
-          <w:hyperlink w:anchor="_Toc242016289" w:history="1">
+          <w:hyperlink w:anchor="_Toc242016426" w:history="1">
             <w:r>
               <w:rPr>
                 <w:rStyle w:val="Hyperlink"/>
@@ -1682,7 +1682,7 @@
               <w:rPr>
                 <w:noProof/>
               </w:rPr>
-              <w:instrText xml:space="preserve"> PAGEREF _Toc242016289 \h </w:instrText>
+              <w:instrText xml:space="preserve"> PAGEREF _Toc242016426 \h </w:instrText>
             </w:r>
             <w:r>
               <w:rPr>
@@ -1724,7 +1724,7 @@
               <w14:ligatures w14:val="standardContextual"/>
             </w:rPr>
           </w:pPr>
-          <w:hyperlink w:anchor="_Toc242016290" w:history="1">
+          <w:hyperlink w:anchor="_Toc242016427" w:history="1">
             <w:r>
               <w:rPr>
                 <w:rStyle w:val="Hyperlink"/>
@@ -1748,7 +1748,7 @@
               <w:rPr>
                 <w:noProof/>
               </w:rPr>
-              <w:instrText xml:space="preserve"> PAGEREF _Toc242016290 \h </w:instrText>
+              <w:instrText xml:space="preserve"> PAGEREF _Toc242016427 \h </w:instrText>
             </w:r>
             <w:r>
               <w:rPr>
@@ -1790,7 +1790,7 @@
               <w14:ligatures w14:val="standardContextual"/>
             </w:rPr>
           </w:pPr>
-          <w:hyperlink w:anchor="_Toc242016291" w:history="1">
+          <w:hyperlink w:anchor="_Toc242016428" w:history="1">
             <w:r>
               <w:rPr>
                 <w:rStyle w:val="Hyperlink"/>
@@ -1814,7 +1814,7 @@
               <w:rPr>
                 <w:noProof/>
               </w:rPr>
-              <w:instrText xml:space="preserve"> PAGEREF _Toc242016291 \h </w:instrText>
+              <w:instrText xml:space="preserve"> PAGEREF _Toc242016428 \h </w:instrText>
             </w:r>
             <w:r>
               <w:rPr>
@@ -1856,7 +1856,7 @@
               <w14:ligatures w14:val="standardContextual"/>
             </w:rPr>
           </w:pPr>
-          <w:hyperlink w:anchor="_Toc242016292" w:history="1">
+          <w:hyperlink w:anchor="_Toc242016429" w:history="1">
             <w:r>
               <w:rPr>
                 <w:rStyle w:val="Hyperlink"/>
@@ -1880,7 +1880,7 @@
               <w:rPr>
                 <w:noProof/>
               </w:rPr>
-              <w:instrText xml:space="preserve"> PAGEREF _Toc242016292 \h </w:instrText>
+              <w:instrText xml:space="preserve"> PAGEREF _Toc242016429 \h </w:instrText>
             </w:r>
             <w:r>
               <w:rPr>
@@ -1922,7 +1922,7 @@
               <w14:ligatures w14:val="standardContextual"/>
             </w:rPr>
           </w:pPr>
-          <w:hyperlink w:anchor="_Toc242016293" w:history="1">
+          <w:hyperlink w:anchor="_Toc242016430" w:history="1">
             <w:r>
               <w:rPr>
                 <w:rStyle w:val="Hyperlink"/>
@@ -1946,7 +1946,7 @@
               <w:rPr>
                 <w:noProof/>
               </w:rPr>
-              <w:instrText xml:space="preserve"> PAGEREF _Toc242016293 \h </w:instrText>
+              <w:instrText xml:space="preserve"> PAGEREF _Toc242016430 \h </w:instrText>
             </w:r>
             <w:r>
               <w:rPr>
@@ -1988,7 +1988,7 @@
               <w14:ligatures w14:val="standardContextual"/>
             </w:rPr>
           </w:pPr>
-          <w:hyperlink w:anchor="_Toc242016294" w:history="1">
+          <w:hyperlink w:anchor="_Toc242016431" w:history="1">
             <w:r>
               <w:rPr>
                 <w:rStyle w:val="Hyperlink"/>
@@ -2012,7 +2012,7 @@
               <w:rPr>
                 <w:noProof/>
               </w:rPr>
-              <w:instrText xml:space="preserve"> PAGEREF _Toc242016294 \h </w:instrText>
+              <w:instrText xml:space="preserve"> PAGEREF _Toc242016431 \h </w:instrText>
             </w:r>
             <w:r>
               <w:rPr>
@@ -2054,7 +2054,7 @@
               <w14:ligatures w14:val="standardContextual"/>
             </w:rPr>
           </w:pPr>
-          <w:hyperlink w:anchor="_Toc242016295" w:history="1">
+          <w:hyperlink w:anchor="_Toc242016432" w:history="1">
             <w:r>
               <w:rPr>
                 <w:rStyle w:val="Hyperlink"/>
@@ -2078,7 +2078,7 @@
               <w:rPr>
                 <w:noProof/>
               </w:rPr>
-              <w:instrText xml:space="preserve"> PAGEREF _Toc242016295 \h </w:instrText>
+              <w:instrText xml:space="preserve"> PAGEREF _Toc242016432 \h </w:instrText>
             </w:r>
             <w:r>
               <w:rPr>
@@ -2120,7 +2120,7 @@
               <w14:ligatures w14:val="standardContextual"/>
             </w:rPr>
           </w:pPr>
-          <w:hyperlink w:anchor="_Toc242016296" w:history="1">
+          <w:hyperlink w:anchor="_Toc242016433" w:history="1">
             <w:r>
               <w:rPr>
                 <w:rStyle w:val="Hyperlink"/>
@@ -2144,7 +2144,7 @@
               <w:rPr>
                 <w:noProof/>
               </w:rPr>
-              <w:instrText xml:space="preserve"> PAGEREF _Toc242016296 \h </w:instrText>
+              <w:instrText xml:space="preserve"> PAGEREF _Toc242016433 \h </w:instrText>
             </w:r>
             <w:r>
               <w:rPr>
@@ -2186,7 +2186,7 @@
               <w14:ligatures w14:val="standardContextual"/>
             </w:rPr>
           </w:pPr>
-          <w:hyperlink w:anchor="_Toc242016297" w:history="1">
+          <w:hyperlink w:anchor="_Toc242016434" w:history="1">
             <w:r>
               <w:rPr>
                 <w:rStyle w:val="Hyperlink"/>
@@ -2210,7 +2210,7 @@
               <w:rPr>
                 <w:noProof/>
               </w:rPr>
-              <w:instrText xml:space="preserve"> PAGEREF _Toc242016297 \h </w:instrText>
+              <w:instrText xml:space="preserve"> PAGEREF _Toc242016434 \h </w:instrText>
             </w:r>
             <w:r>
               <w:rPr>
@@ -2252,7 +2252,7 @@
               <w14:ligatures w14:val="standardContextual"/>
             </w:rPr>
           </w:pPr>
-          <w:hyperlink w:anchor="_Toc242016298" w:history="1">
+          <w:hyperlink w:anchor="_Toc242016435" w:history="1">
             <w:r>
               <w:rPr>
                 <w:rStyle w:val="Hyperlink"/>
@@ -2276,7 +2276,7 @@
               <w:rPr>
                 <w:noProof/>
               </w:rPr>
-              <w:instrText xml:space="preserve"> PAGEREF _Toc242016298 \h </w:instrText>
+              <w:instrText xml:space="preserve"> PAGEREF _Toc242016435 \h </w:instrText>
             </w:r>
             <w:r>
               <w:rPr>
@@ -2318,7 +2318,7 @@
               <w14:ligatures w14:val="standardContextual"/>
             </w:rPr>
           </w:pPr>
-          <w:hyperlink w:anchor="_Toc242016299" w:history="1">
+          <w:hyperlink w:anchor="_Toc242016436" w:history="1">
             <w:r>
               <w:rPr>
                 <w:rStyle w:val="Hyperlink"/>
@@ -2342,7 +2342,7 @@
               <w:rPr>
                 <w:noProof/>
               </w:rPr>
-              <w:instrText xml:space="preserve"> PAGEREF _Toc242016299 \h </w:instrText>
+              <w:instrText xml:space="preserve"> PAGEREF _Toc242016436 \h </w:instrText>
             </w:r>
             <w:r>
               <w:rPr>
@@ -2384,7 +2384,7 @@
               <w14:ligatures w14:val="standardContextual"/>
             </w:rPr>
           </w:pPr>
-          <w:hyperlink w:anchor="_Toc242016300" w:history="1">
+          <w:hyperlink w:anchor="_Toc242016437" w:history="1">
             <w:r>
               <w:rPr>
                 <w:rStyle w:val="Hyperlink"/>
@@ -2408,7 +2408,7 @@
               <w:rPr>
                 <w:noProof/>
               </w:rPr>
-              <w:instrText xml:space="preserve"> PAGEREF _Toc242016300 \h </w:instrText>
+              <w:instrText xml:space="preserve"> PAGEREF _Toc242016437 \h </w:instrText>
             </w:r>
             <w:r>
               <w:rPr>
@@ -2450,7 +2450,7 @@
               <w14:ligatures w14:val="standardContextual"/>
             </w:rPr>
           </w:pPr>
-          <w:hyperlink w:anchor="_Toc242016301" w:history="1">
+          <w:hyperlink w:anchor="_Toc242016438" w:history="1">
             <w:r>
               <w:rPr>
                 <w:rStyle w:val="Hyperlink"/>
@@ -2474,7 +2474,7 @@
               <w:rPr>
                 <w:noProof/>
               </w:rPr>
-              <w:instrText xml:space="preserve"> PAGEREF _Toc242016301 \h </w:instrText>
+              <w:instrText xml:space="preserve"> PAGEREF _Toc242016438 \h </w:instrText>
             </w:r>
             <w:r>
               <w:rPr>
@@ -2516,7 +2516,7 @@
               <w14:ligatures w14:val="standardContextual"/>
             </w:rPr>
           </w:pPr>
-          <w:hyperlink w:anchor="_Toc242016302" w:history="1">
+          <w:hyperlink w:anchor="_Toc242016439" w:history="1">
             <w:r>
               <w:rPr>
                 <w:rStyle w:val="Hyperlink"/>
@@ -2540,7 +2540,7 @@
               <w:rPr>
                 <w:noProof/>
               </w:rPr>
-              <w:instrText xml:space="preserve"> PAGEREF _Toc242016302 \h </w:instrText>
+              <w:instrText xml:space="preserve"> PAGEREF _Toc242016439 \h </w:instrText>
             </w:r>
             <w:r>
               <w:rPr>
@@ -2582,7 +2582,7 @@
               <w14:ligatures w14:val="standardContextual"/>
             </w:rPr>
           </w:pPr>
-          <w:hyperlink w:anchor="_Toc242016303" w:history="1">
+          <w:hyperlink w:anchor="_Toc242016440" w:history="1">
             <w:r>
               <w:rPr>
                 <w:rStyle w:val="Hyperlink"/>
@@ -2606,7 +2606,7 @@
               <w:rPr>
                 <w:noProof/>
               </w:rPr>
-              <w:instrText xml:space="preserve"> PAGEREF _Toc242016303 \h </w:instrText>
+              <w:instrText xml:space="preserve"> PAGEREF _Toc242016440 \h </w:instrText>
             </w:r>
             <w:r>
               <w:rPr>
@@ -2648,7 +2648,7 @@
               <w14:ligatures w14:val="standardContextual"/>
             </w:rPr>
           </w:pPr>
-          <w:hyperlink w:anchor="_Toc242016304" w:history="1">
+          <w:hyperlink w:anchor="_Toc242016441" w:history="1">
             <w:r>
               <w:rPr>
                 <w:rStyle w:val="Hyperlink"/>
@@ -2672,7 +2672,7 @@
               <w:rPr>
                 <w:noProof/>
               </w:rPr>
-              <w:instrText xml:space="preserve"> PAGEREF _Toc242016304 \h </w:instrText>
+              <w:instrText xml:space="preserve"> PAGEREF _Toc242016441 \h </w:instrText>
             </w:r>
             <w:r>
               <w:rPr>
@@ -2714,7 +2714,7 @@
               <w14:ligatures w14:val="standardContextual"/>
             </w:rPr>
           </w:pPr>
-          <w:hyperlink w:anchor="_Toc242016305" w:history="1">
+          <w:hyperlink w:anchor="_Toc242016442" w:history="1">
             <w:r>
               <w:rPr>
                 <w:rStyle w:val="Hyperlink"/>
@@ -2738,7 +2738,7 @@
               <w:rPr>
                 <w:noProof/>
               </w:rPr>
-              <w:instrText xml:space="preserve"> PAGEREF _Toc242016305 \h </w:instrText>
+              <w:instrText xml:space="preserve"> PAGEREF _Toc242016442 \h </w:instrText>
             </w:r>
             <w:r>
               <w:rPr>
@@ -2780,7 +2780,7 @@
               <w14:ligatures w14:val="standardContextual"/>
             </w:rPr>
           </w:pPr>
-          <w:hyperlink w:anchor="_Toc242016306" w:history="1">
+          <w:hyperlink w:anchor="_Toc242016443" w:history="1">
             <w:r>
               <w:rPr>
                 <w:rStyle w:val="Hyperlink"/>
@@ -2804,7 +2804,7 @@
               <w:rPr>
                 <w:noProof/>
               </w:rPr>
-              <w:instrText xml:space="preserve"> PAGEREF _Toc242016306 \h </w:instrText>
+              <w:instrText xml:space="preserve"> PAGEREF _Toc242016443 \h </w:instrText>
             </w:r>
             <w:r>
               <w:rPr>
@@ -2864,7 +2864,7 @@
         <w:keepNext/>
         <w:keepLines/>
       </w:pPr>
-      <w:bookmarkStart w:id="0" w:name="_Toc242016279"/>
+      <w:bookmarkStart w:id="0" w:name="_Toc242016416"/>
       <w:r>
         <w:lastRenderedPageBreak/>
         <w:t>1. Thiết lập Claude Project</w:t>
@@ -3683,7 +3683,7 @@
         <w:keepNext/>
         <w:keepLines/>
       </w:pPr>
-      <w:bookmarkStart w:id="1" w:name="_Toc242016280"/>
+      <w:bookmarkStart w:id="1" w:name="_Toc242016417"/>
       <w:r>
         <w:t>2. Project Charter (Tuyên bố dự án)</w:t>
       </w:r>
@@ -4169,7 +4169,7 @@
         <w:keepNext/>
         <w:keepLines/>
       </w:pPr>
-      <w:bookmarkStart w:id="2" w:name="_Toc242016281"/>
+      <w:bookmarkStart w:id="2" w:name="_Toc242016418"/>
       <w:r>
         <w:t>2.1 Mục tiêu SMART</w:t>
       </w:r>
@@ -5194,7 +5194,7 @@
         <w:keepNext/>
         <w:keepLines/>
       </w:pPr>
-      <w:bookmarkStart w:id="3" w:name="_Toc242016282"/>
+      <w:bookmarkStart w:id="3" w:name="_Toc242016419"/>
       <w:r>
         <w:t>2.2 Phạm vi</w:t>
       </w:r>
@@ -5604,7 +5604,7 @@
         <w:keepNext/>
         <w:keepLines/>
       </w:pPr>
-      <w:bookmarkStart w:id="4" w:name="_Toc242016283"/>
+      <w:bookmarkStart w:id="4" w:name="_Toc242016420"/>
       <w:r>
         <w:t>2.3 Sản phẩm bàn giao chính</w:t>
       </w:r>
@@ -5668,7 +5668,7 @@
         <w:keepNext/>
         <w:keepLines/>
       </w:pPr>
-      <w:bookmarkStart w:id="5" w:name="_Toc242016284"/>
+      <w:bookmarkStart w:id="5" w:name="_Toc242016421"/>
       <w:r>
         <w:t>2.4 Các bên liên quan</w:t>
       </w:r>
@@ -6455,7 +6455,7 @@
         <w:keepNext/>
         <w:keepLines/>
       </w:pPr>
-      <w:bookmarkStart w:id="6" w:name="_Toc242016285"/>
+      <w:bookmarkStart w:id="6" w:name="_Toc242016422"/>
       <w:r>
         <w:t>2.5 Mốc thời gian chính (mục tiêu)</w:t>
       </w:r>
@@ -7501,7 +7501,7 @@
         <w:keepNext/>
         <w:keepLines/>
       </w:pPr>
-      <w:bookmarkStart w:id="7" w:name="_Toc242016286"/>
+      <w:bookmarkStart w:id="7" w:name="_Toc242016423"/>
       <w:r>
         <w:t>2.6 Giả định và ràng buộc</w:t>
       </w:r>
@@ -7768,7 +7768,7 @@
         <w:keepNext/>
         <w:keepLines/>
       </w:pPr>
-      <w:bookmarkStart w:id="8" w:name="_Toc242016287"/>
+      <w:bookmarkStart w:id="8" w:name="_Toc242016424"/>
       <w:r>
         <w:t>2.7 Rủi ro cấp cao</w:t>
       </w:r>
@@ -7832,7 +7832,7 @@
         <w:keepNext/>
         <w:keepLines/>
       </w:pPr>
-      <w:bookmarkStart w:id="9" w:name="_Toc242016288"/>
+      <w:bookmarkStart w:id="9" w:name="_Toc242016425"/>
       <w:r>
         <w:t>2.8 Tiêu chí thành công và nghiệm thu</w:t>
       </w:r>
@@ -7909,7 +7909,7 @@
         <w:keepNext/>
         <w:keepLines/>
       </w:pPr>
-      <w:bookmarkStart w:id="10" w:name="_Toc242016289"/>
+      <w:bookmarkStart w:id="10" w:name="_Toc242016426"/>
       <w:r>
         <w:t>2.9 Thông tin còn thiếu – câu hỏi làm rõ với khách hàng</w:t>
       </w:r>
@@ -9534,7 +9534,7 @@
         <w:keepNext/>
         <w:keepLines/>
       </w:pPr>
-      <w:bookmarkStart w:id="11" w:name="_Toc242016290"/>
+      <w:bookmarkStart w:id="11" w:name="_Toc242016427"/>
       <w:r>
         <w:t>3. Phạm vi và WBS</w:t>
       </w:r>
@@ -9565,7 +9565,7 @@
         <w:keepNext/>
         <w:keepLines/>
       </w:pPr>
-      <w:bookmarkStart w:id="12" w:name="_Toc242016291"/>
+      <w:bookmarkStart w:id="12" w:name="_Toc242016428"/>
       <w:r>
         <w:t>3.1 Sơ đồ cây WBS</w:t>
       </w:r>
@@ -9654,7 +9654,7 @@
         <w:keepNext/>
         <w:keepLines/>
       </w:pPr>
-      <w:bookmarkStart w:id="13" w:name="_Toc242016292"/>
+      <w:bookmarkStart w:id="13" w:name="_Toc242016429"/>
       <w:r>
         <w:t>3.2 Bảng WBS</w:t>
       </w:r>
@@ -21688,7 +21688,7 @@
         <w:keepNext/>
         <w:keepLines/>
       </w:pPr>
-      <w:bookmarkStart w:id="14" w:name="_Toc242016293"/>
+      <w:bookmarkStart w:id="14" w:name="_Toc242016430"/>
       <w:r>
         <w:t>3.3 Từ điển WBS (3 gói công việc quan trọng nhất)</w:t>
       </w:r>
@@ -23394,7 +23394,7 @@
         <w:keepNext/>
         <w:keepLines/>
       </w:pPr>
-      <w:bookmarkStart w:id="15" w:name="_Toc242016294"/>
+      <w:bookmarkStart w:id="15" w:name="_Toc242016431"/>
       <w:r>
         <w:t>4. Ước lượng, lịch dự án và đường găng</w:t>
       </w:r>
@@ -23414,7 +23414,7 @@
         <w:keepNext/>
         <w:keepLines/>
       </w:pPr>
-      <w:bookmarkStart w:id="16" w:name="_Toc242016295"/>
+      <w:bookmarkStart w:id="16" w:name="_Toc242016432"/>
       <w:r>
         <w:t>4.1 Bảng PERT và CPM</w:t>
       </w:r>
@@ -31014,7 +31014,7 @@
         <w:keepNext/>
         <w:keepLines/>
       </w:pPr>
-      <w:bookmarkStart w:id="17" w:name="_Toc242016296"/>
+      <w:bookmarkStart w:id="17" w:name="_Toc242016433"/>
       <w:r>
         <w:t>4.2 Kết quả</w:t>
       </w:r>
@@ -31563,7 +31563,7 @@
         <w:keepNext/>
         <w:keepLines/>
       </w:pPr>
-      <w:bookmarkStart w:id="18" w:name="_Toc242016297"/>
+      <w:bookmarkStart w:id="18" w:name="_Toc242016434"/>
       <w:r>
         <w:t>4.3 Biểu đồ Gantt</w:t>
       </w:r>
@@ -31641,7 +31641,7 @@
         <w:keepNext/>
         <w:keepLines/>
       </w:pPr>
-      <w:bookmarkStart w:id="19" w:name="_Toc242016298"/>
+      <w:bookmarkStart w:id="19" w:name="_Toc242016435"/>
       <w:r>
         <w:t>4.4 So sánh kết quả Excel với câu trả lời của AI (Claude Project)</w:t>
       </w:r>
@@ -32476,7 +32476,7 @@
         <w:keepNext/>
         <w:keepLines/>
       </w:pPr>
-      <w:bookmarkStart w:id="20" w:name="_Toc242016299"/>
+      <w:bookmarkStart w:id="20" w:name="_Toc242016436"/>
       <w:r>
         <w:t>4.5 Phương án nén lịch (AI gợi ý – nhóm tự chọn và lý giải)</w:t>
       </w:r>
@@ -35474,7 +35474,7 @@
         <w:keepNext/>
         <w:keepLines/>
       </w:pPr>
-      <w:bookmarkStart w:id="21" w:name="_Toc242016300"/>
+      <w:bookmarkStart w:id="21" w:name="_Toc242016437"/>
       <w:r>
         <w:t>5. Ước lượng chi phí</w:t>
       </w:r>
@@ -37808,7 +37808,7 @@
         <w:keepNext/>
         <w:keepLines/>
       </w:pPr>
-      <w:bookmarkStart w:id="22" w:name="_Toc242016301"/>
+      <w:bookmarkStart w:id="22" w:name="_Toc242016438"/>
       <w:r>
         <w:t>6. Quản lý rủi ro</w:t>
       </w:r>
@@ -37840,17 +37840,17 @@
         <w:tblLook w:val="0000" w:firstRow="0" w:lastRow="0" w:firstColumn="0" w:lastColumn="0" w:noHBand="0" w:noVBand="0"/>
       </w:tblPr>
       <w:tblGrid>
-        <w:gridCol w:w="543"/>
-        <w:gridCol w:w="1984"/>
-        <w:gridCol w:w="1747"/>
-        <w:gridCol w:w="1839"/>
-        <w:gridCol w:w="1138"/>
-        <w:gridCol w:w="880"/>
-        <w:gridCol w:w="880"/>
-        <w:gridCol w:w="880"/>
-        <w:gridCol w:w="977"/>
-        <w:gridCol w:w="2637"/>
-        <w:gridCol w:w="1065"/>
+        <w:gridCol w:w="559"/>
+        <w:gridCol w:w="2242"/>
+        <w:gridCol w:w="1896"/>
+        <w:gridCol w:w="2045"/>
+        <w:gridCol w:w="1197"/>
+        <w:gridCol w:w="450"/>
+        <w:gridCol w:w="450"/>
+        <w:gridCol w:w="634"/>
+        <w:gridCol w:w="999"/>
+        <w:gridCol w:w="2991"/>
+        <w:gridCol w:w="1107"/>
       </w:tblGrid>
       <w:tr>
         <w:trPr>
@@ -41361,11 +41361,9 @@
             <w:r>
               <w:rPr>
                 <w:b/>
-                <w:bCs/>
                 <w:sz w:val="16"/>
-                <w:szCs w:val="16"/>
-              </w:rPr>
-              <w:t>R09</w:t>
+              </w:rPr>
+              <w:t>R12</w:t>
             </w:r>
           </w:p>
         </w:tc>
@@ -41392,9 +41390,8 @@
             <w:r>
               <w:rPr>
                 <w:sz w:val="16"/>
-                <w:szCs w:val="16"/>
-              </w:rPr>
-              <w:t>Quy định ngành dược (GPP, thuốc kê đơn) có thể yêu cầu lưu trữ hoặc báo cáo đặc thù chưa nêu trong yêu cầu</w:t>
+              </w:rPr>
+              <w:t>Nhóm đọc yêu cầu theo cách hiểu của mình, không xác nhận lại (đồ án trước nhóm từng hiểu sai yêu cầu của giảng viên và phải làm lại)</w:t>
             </w:r>
           </w:p>
         </w:tc>
@@ -41421,9 +41418,8 @@
             <w:r>
               <w:rPr>
                 <w:sz w:val="16"/>
-                <w:szCs w:val="16"/>
-              </w:rPr>
-              <w:t>Phát sinh yêu cầu bắt buộc muộn</w:t>
+              </w:rPr>
+              <w:t>Hiểu sai một yêu cầu của khách hàng (ví dụ cách tính lợi nhuận, quy tắc cảnh báo hạn dùng), phát hiện muộn khi demo hoặc UAT</w:t>
             </w:r>
           </w:p>
         </w:tc>
@@ -41450,9 +41446,8 @@
             <w:r>
               <w:rPr>
                 <w:sz w:val="16"/>
-                <w:szCs w:val="16"/>
-              </w:rPr>
-              <w:t>Phải làm thêm chức năng, trễ tiến độ</w:t>
+              </w:rPr>
+              <w:t>Phải làm lại (rework) chức năng đã xong, tốn thêm giờ công, ăn vào 2 ngày dự trữ của lịch đã nén</w:t>
             </w:r>
           </w:p>
         </w:tc>
@@ -41479,9 +41474,8 @@
             <w:r>
               <w:rPr>
                 <w:sz w:val="16"/>
-                <w:szCs w:val="16"/>
-              </w:rPr>
-              <w:t>Khách hàng / Pháp lý</w:t>
+              </w:rPr>
+              <w:t>Yêu cầu</w:t>
             </w:r>
           </w:p>
         </w:tc>
@@ -41504,14 +41498,12 @@
           <w:p>
             <w:pPr>
               <w:spacing w:after="20"/>
-              <w:jc w:val="center"/>
             </w:pPr>
             <w:r>
               <w:rPr>
                 <w:sz w:val="16"/>
-                <w:szCs w:val="16"/>
-              </w:rPr>
-              <w:t>2</w:t>
+              </w:rPr>
+              <w:t>3</w:t>
             </w:r>
           </w:p>
         </w:tc>
@@ -41534,14 +41526,12 @@
           <w:p>
             <w:pPr>
               <w:spacing w:after="20"/>
-              <w:jc w:val="center"/>
             </w:pPr>
             <w:r>
               <w:rPr>
                 <w:sz w:val="16"/>
-                <w:szCs w:val="16"/>
-              </w:rPr>
-              <w:t>4</w:t>
+              </w:rPr>
+              <w:t>3</w:t>
             </w:r>
           </w:p>
         </w:tc>
@@ -41565,29 +41555,21 @@
           <w:p>
             <w:pPr>
               <w:spacing w:after="20"/>
-              <w:jc w:val="center"/>
             </w:pPr>
             <w:r>
               <w:rPr>
                 <w:b/>
-                <w:bCs/>
                 <w:sz w:val="16"/>
-                <w:szCs w:val="16"/>
-              </w:rPr>
-              <w:t>8</w:t>
-            </w:r>
-          </w:p>
-          <w:p>
-            <w:pPr>
-              <w:spacing w:after="20"/>
-              <w:jc w:val="center"/>
-            </w:pPr>
+              </w:rPr>
+              <w:t>9</w:t>
+            </w:r>
+            <w:r>
+              <w:br/>
+            </w:r>
             <w:r>
               <w:rPr>
                 <w:b/>
-                <w:bCs/>
                 <w:sz w:val="16"/>
-                <w:szCs w:val="16"/>
               </w:rPr>
               <w:t>Trung bình</w:t>
             </w:r>
@@ -41616,7 +41598,6 @@
             <w:r>
               <w:rPr>
                 <w:sz w:val="16"/>
-                <w:szCs w:val="16"/>
               </w:rPr>
               <w:t>Giảm</w:t>
             </w:r>
@@ -41645,9 +41626,8 @@
             <w:r>
               <w:rPr>
                 <w:sz w:val="16"/>
-                <w:szCs w:val="16"/>
-              </w:rPr>
-              <w:t>Hỏi rõ với chủ nhà thuốc và dược sĩ phụ trách chuyên môn ngay khi khảo sát; ghi nhận vào SRS</w:t>
+              </w:rPr>
+              <w:t>Sau mỗi buổi làm việc với khách hàng, BA gửi lại biên bản tóm tắt yêu cầu để khách xác nhận; viết tiêu chí chấp nhận cho từng FR trước khi code; demo bản nháp sớm (mockup) thay vì chờ demo cuối tháng</w:t>
             </w:r>
           </w:p>
         </w:tc>
@@ -41674,7 +41654,6 @@
             <w:r>
               <w:rPr>
                 <w:sz w:val="16"/>
-                <w:szCs w:val="16"/>
               </w:rPr>
               <w:t>BA</w:t>
             </w:r>
@@ -41712,7 +41691,7 @@
                 <w:sz w:val="16"/>
                 <w:szCs w:val="16"/>
               </w:rPr>
-              <w:t>R10</w:t>
+              <w:t>R09</w:t>
             </w:r>
           </w:p>
         </w:tc>
@@ -41741,7 +41720,7 @@
                 <w:sz w:val="16"/>
                 <w:szCs w:val="16"/>
               </w:rPr>
-              <w:t>Hệ thống chạy trên máy chủ thuê ngoài, mạng Internet tại chi nhánh không ổn định</w:t>
+              <w:t>Quy định ngành dược (GPP, thuốc kê đơn) có thể yêu cầu lưu trữ hoặc báo cáo đặc thù chưa nêu trong yêu cầu</w:t>
             </w:r>
           </w:p>
         </w:tc>
@@ -41770,7 +41749,7 @@
                 <w:sz w:val="16"/>
                 <w:szCs w:val="16"/>
               </w:rPr>
-              <w:t>Máy chủ hoặc mạng gặp sự cố</w:t>
+              <w:t>Phát sinh yêu cầu bắt buộc muộn</w:t>
             </w:r>
           </w:p>
         </w:tc>
@@ -41799,7 +41778,7 @@
                 <w:sz w:val="16"/>
                 <w:szCs w:val="16"/>
               </w:rPr>
-              <w:t>Không truy cập được dashboard trong giờ bán hàng</w:t>
+              <w:t>Phải làm thêm chức năng, trễ tiến độ</w:t>
             </w:r>
           </w:p>
         </w:tc>
@@ -41828,7 +41807,7 @@
                 <w:sz w:val="16"/>
                 <w:szCs w:val="16"/>
               </w:rPr>
-              <w:t>Bên ngoài / Hạ tầng</w:t>
+              <w:t>Khách hàng / Pháp lý</w:t>
             </w:r>
           </w:p>
         </w:tc>
@@ -41888,7 +41867,7 @@
                 <w:sz w:val="16"/>
                 <w:szCs w:val="16"/>
               </w:rPr>
-              <w:t>3</w:t>
+              <w:t>4</w:t>
             </w:r>
           </w:p>
         </w:tc>
@@ -41901,7 +41880,7 @@
               <w:bottom w:val="single" w:sz="4" w:space="0" w:color="BFBFBF"/>
               <w:right w:val="single" w:sz="4" w:space="0" w:color="BFBFBF"/>
             </w:tcBorders>
-            <w:shd w:val="clear" w:color="auto" w:fill="D8F0DD"/>
+            <w:shd w:val="clear" w:color="auto" w:fill="FCE4C4"/>
             <w:tcMar>
               <w:top w:w="50" w:type="dxa"/>
               <w:left w:w="90" w:type="dxa"/>
@@ -41921,7 +41900,7 @@
                 <w:sz w:val="16"/>
                 <w:szCs w:val="16"/>
               </w:rPr>
-              <w:t>6</w:t>
+              <w:t>8</w:t>
             </w:r>
           </w:p>
           <w:p>
@@ -41936,7 +41915,7 @@
                 <w:sz w:val="16"/>
                 <w:szCs w:val="16"/>
               </w:rPr>
-              <w:t>Thấp</w:t>
+              <w:t>Trung bình</w:t>
             </w:r>
           </w:p>
         </w:tc>
@@ -41965,7 +41944,7 @@
                 <w:sz w:val="16"/>
                 <w:szCs w:val="16"/>
               </w:rPr>
-              <w:t>Chuyển giao</w:t>
+              <w:t>Giảm</w:t>
             </w:r>
           </w:p>
         </w:tc>
@@ -41994,7 +41973,7 @@
                 <w:sz w:val="16"/>
                 <w:szCs w:val="16"/>
               </w:rPr>
-              <w:t>Chọn nhà cung cấp VPS có cam kết SLA 99,9% trong hợp đồng; sao lưu hằng ngày; hướng dẫn phương án xử lý sự cố</w:t>
+              <w:t>Hỏi rõ với chủ nhà thuốc và dược sĩ phụ trách chuyên môn ngay khi khảo sát; ghi nhận vào SRS</w:t>
             </w:r>
           </w:p>
         </w:tc>
@@ -42023,7 +42002,7 @@
                 <w:sz w:val="16"/>
                 <w:szCs w:val="16"/>
               </w:rPr>
-              <w:t>BE</w:t>
+              <w:t>BA</w:t>
             </w:r>
           </w:p>
         </w:tc>
@@ -42059,7 +42038,7 @@
                 <w:sz w:val="16"/>
                 <w:szCs w:val="16"/>
               </w:rPr>
-              <w:t>R12</w:t>
+              <w:t>R10</w:t>
             </w:r>
           </w:p>
         </w:tc>
@@ -42085,12 +42064,10 @@
             </w:pPr>
             <w:r>
               <w:rPr>
-                <w:i/>
-                <w:iCs/>
-                <w:color w:val="7A5C00"/>
-                <w:highlight w:val="yellow"/>
-              </w:rPr>
-              <w:t>[NHÓM ĐIỀN: rủi ro nhóm tự bổ sung]</w:t>
+                <w:sz w:val="16"/>
+                <w:szCs w:val="16"/>
+              </w:rPr>
+              <w:t>Hệ thống chạy trên máy chủ thuê ngoài, mạng Internet tại chi nhánh không ổn định</w:t>
             </w:r>
           </w:p>
         </w:tc>
@@ -42116,12 +42093,10 @@
             </w:pPr>
             <w:r>
               <w:rPr>
-                <w:i/>
-                <w:iCs/>
-                <w:color w:val="7A5C00"/>
-                <w:highlight w:val="yellow"/>
-              </w:rPr>
-              <w:t>[NHÓM ĐIỀN: …]</w:t>
+                <w:sz w:val="16"/>
+                <w:szCs w:val="16"/>
+              </w:rPr>
+              <w:t>Máy chủ hoặc mạng gặp sự cố</w:t>
             </w:r>
           </w:p>
         </w:tc>
@@ -42147,12 +42122,10 @@
             </w:pPr>
             <w:r>
               <w:rPr>
-                <w:i/>
-                <w:iCs/>
-                <w:color w:val="7A5C00"/>
-                <w:highlight w:val="yellow"/>
-              </w:rPr>
-              <w:t>[NHÓM ĐIỀN: …]</w:t>
+                <w:sz w:val="16"/>
+                <w:szCs w:val="16"/>
+              </w:rPr>
+              <w:t>Không truy cập được dashboard trong giờ bán hàng</w:t>
             </w:r>
           </w:p>
         </w:tc>
@@ -42178,12 +42151,10 @@
             </w:pPr>
             <w:r>
               <w:rPr>
-                <w:i/>
-                <w:iCs/>
-                <w:color w:val="7A5C00"/>
-                <w:highlight w:val="yellow"/>
-              </w:rPr>
-              <w:t>[NHÓM ĐIỀN: …]</w:t>
+                <w:sz w:val="16"/>
+                <w:szCs w:val="16"/>
+              </w:rPr>
+              <w:t>Bên ngoài / Hạ tầng</w:t>
             </w:r>
           </w:p>
         </w:tc>
@@ -42206,15 +42177,14 @@
           <w:p>
             <w:pPr>
               <w:spacing w:after="20"/>
-            </w:pPr>
-            <w:r>
-              <w:rPr>
-                <w:i/>
-                <w:iCs/>
-                <w:color w:val="7A5C00"/>
-                <w:highlight w:val="yellow"/>
-              </w:rPr>
-              <w:t>[NHÓM ĐIỀN: …]</w:t>
+              <w:jc w:val="center"/>
+            </w:pPr>
+            <w:r>
+              <w:rPr>
+                <w:sz w:val="16"/>
+                <w:szCs w:val="16"/>
+              </w:rPr>
+              <w:t>2</w:t>
             </w:r>
           </w:p>
         </w:tc>
@@ -42237,15 +42207,14 @@
           <w:p>
             <w:pPr>
               <w:spacing w:after="20"/>
-            </w:pPr>
-            <w:r>
-              <w:rPr>
-                <w:i/>
-                <w:iCs/>
-                <w:color w:val="7A5C00"/>
-                <w:highlight w:val="yellow"/>
-              </w:rPr>
-              <w:t>[NHÓM ĐIỀN: …]</w:t>
+              <w:jc w:val="center"/>
+            </w:pPr>
+            <w:r>
+              <w:rPr>
+                <w:sz w:val="16"/>
+                <w:szCs w:val="16"/>
+              </w:rPr>
+              <w:t>3</w:t>
             </w:r>
           </w:p>
         </w:tc>
@@ -42258,25 +42227,42 @@
               <w:bottom w:val="single" w:sz="4" w:space="0" w:color="BFBFBF"/>
               <w:right w:val="single" w:sz="4" w:space="0" w:color="BFBFBF"/>
             </w:tcBorders>
-            <w:tcMar>
-              <w:top w:w="50" w:type="dxa"/>
-              <w:left w:w="90" w:type="dxa"/>
-              <w:bottom w:w="50" w:type="dxa"/>
-              <w:right w:w="90" w:type="dxa"/>
-            </w:tcMar>
-          </w:tcPr>
-          <w:p>
-            <w:pPr>
-              <w:spacing w:after="20"/>
-            </w:pPr>
-            <w:r>
-              <w:rPr>
-                <w:i/>
-                <w:iCs/>
-                <w:color w:val="7A5C00"/>
-                <w:highlight w:val="yellow"/>
-              </w:rPr>
-              <w:t>[NHÓM ĐIỀN: …]</w:t>
+            <w:shd w:val="clear" w:color="auto" w:fill="D8F0DD"/>
+            <w:tcMar>
+              <w:top w:w="50" w:type="dxa"/>
+              <w:left w:w="90" w:type="dxa"/>
+              <w:bottom w:w="50" w:type="dxa"/>
+              <w:right w:w="90" w:type="dxa"/>
+            </w:tcMar>
+          </w:tcPr>
+          <w:p>
+            <w:pPr>
+              <w:spacing w:after="20"/>
+              <w:jc w:val="center"/>
+            </w:pPr>
+            <w:r>
+              <w:rPr>
+                <w:b/>
+                <w:bCs/>
+                <w:sz w:val="16"/>
+                <w:szCs w:val="16"/>
+              </w:rPr>
+              <w:t>6</w:t>
+            </w:r>
+          </w:p>
+          <w:p>
+            <w:pPr>
+              <w:spacing w:after="20"/>
+              <w:jc w:val="center"/>
+            </w:pPr>
+            <w:r>
+              <w:rPr>
+                <w:b/>
+                <w:bCs/>
+                <w:sz w:val="16"/>
+                <w:szCs w:val="16"/>
+              </w:rPr>
+              <w:t>Thấp</w:t>
             </w:r>
           </w:p>
         </w:tc>
@@ -42302,12 +42288,10 @@
             </w:pPr>
             <w:r>
               <w:rPr>
-                <w:i/>
-                <w:iCs/>
-                <w:color w:val="7A5C00"/>
-                <w:highlight w:val="yellow"/>
-              </w:rPr>
-              <w:t>[NHÓM ĐIỀN: …]</w:t>
+                <w:sz w:val="16"/>
+                <w:szCs w:val="16"/>
+              </w:rPr>
+              <w:t>Chuyển giao</w:t>
             </w:r>
           </w:p>
         </w:tc>
@@ -42333,12 +42317,10 @@
             </w:pPr>
             <w:r>
               <w:rPr>
-                <w:i/>
-                <w:iCs/>
-                <w:color w:val="7A5C00"/>
-                <w:highlight w:val="yellow"/>
-              </w:rPr>
-              <w:t>[NHÓM ĐIỀN: …]</w:t>
+                <w:sz w:val="16"/>
+                <w:szCs w:val="16"/>
+              </w:rPr>
+              <w:t>Chọn nhà cung cấp VPS có cam kết SLA 99,9% trong hợp đồng; sao lưu hằng ngày; hướng dẫn phương án xử lý sự cố</w:t>
             </w:r>
           </w:p>
         </w:tc>
@@ -42364,12 +42346,10 @@
             </w:pPr>
             <w:r>
               <w:rPr>
-                <w:i/>
-                <w:iCs/>
-                <w:color w:val="7A5C00"/>
-                <w:highlight w:val="yellow"/>
-              </w:rPr>
-              <w:t>[NHÓM ĐIỀN: …]</w:t>
+                <w:sz w:val="16"/>
+                <w:szCs w:val="16"/>
+              </w:rPr>
+              <w:t>BE</w:t>
             </w:r>
           </w:p>
         </w:tc>
@@ -42382,11 +42362,9 @@
       <w:r>
         <w:rPr>
           <w:i/>
-          <w:iCs/>
           <w:sz w:val="18"/>
-          <w:szCs w:val="18"/>
         </w:rPr>
-        <w:t>Theo yêu cầu bài lab, R11–R12 là rủi ro nhóm tự bổ sung từ kinh nghiệm làm đồ án (AI không nêu).</w:t>
+        <w:t>R11, R12 là rủi ro nhóm tự bổ sung từ kinh nghiệm làm đồ án của nhóm (trễ vì việc gia đình; hiểu sai yêu cầu phải làm lại). Cả hai không có trong 14 rủi ro Claude Project đưa ra ở Bài 4.</w:t>
       </w:r>
     </w:p>
     <w:p>
@@ -42664,7 +42642,7 @@
         <w:keepNext/>
         <w:keepLines/>
       </w:pPr>
-      <w:bookmarkStart w:id="23" w:name="_Toc242016302"/>
+      <w:bookmarkStart w:id="23" w:name="_Toc242016439"/>
       <w:r>
         <w:t>6.1 Ma trận xác suất – tác động</w:t>
       </w:r>
@@ -42742,7 +42720,7 @@
         <w:keepNext/>
         <w:keepLines/>
       </w:pPr>
-      <w:bookmarkStart w:id="24" w:name="_Toc242016303"/>
+      <w:bookmarkStart w:id="24" w:name="_Toc242016440"/>
       <w:r>
         <w:t>6.2 Kế hoạch dự phòng cho rủi ro điểm cao nhất – R01</w:t>
       </w:r>
@@ -43310,7 +43288,7 @@
         <w:keepNext/>
         <w:keepLines/>
       </w:pPr>
-      <w:bookmarkStart w:id="25" w:name="_Toc242016304"/>
+      <w:bookmarkStart w:id="25" w:name="_Toc242016441"/>
       <w:r>
         <w:t>7. Phản biện đầu ra AI</w:t>
       </w:r>
@@ -44053,7 +44031,7 @@
         <w:keepNext/>
         <w:keepLines/>
       </w:pPr>
-      <w:bookmarkStart w:id="26" w:name="_Toc242016305"/>
+      <w:bookmarkStart w:id="26" w:name="_Toc242016442"/>
       <w:r>
         <w:t>7.1 Phản tư</w:t>
       </w:r>
@@ -44117,7 +44095,7 @@
         <w:keepNext/>
         <w:keepLines/>
       </w:pPr>
-      <w:bookmarkStart w:id="27" w:name="_Toc242016306"/>
+      <w:bookmarkStart w:id="27" w:name="_Toc242016443"/>
       <w:r>
         <w:t>8. Nhật ký sử dụng AI</w:t>
       </w:r>

</xml_diff>

<commit_message>
Báo cáo lab: câu trả lời Sponsor theo phương án nhóm chọn (Claude Code diễn đạt)
Co-Authored-By: Claude Opus 5.5 <noreply@anthropic.com>
</commit_message>
<xml_diff>
--- a/docs/lab/QLDA_Nhom_PharmaDash_Lab.docx
+++ b/docs/lab/QLDA_Nhom_PharmaDash_Lab.docx
@@ -998,7 +998,7 @@
           <w:r>
             <w:fldChar w:fldCharType="separate"/>
           </w:r>
-          <w:hyperlink w:anchor="_Toc242016416" w:history="1">
+          <w:hyperlink w:anchor="_Toc242016852" w:history="1">
             <w:r>
               <w:rPr>
                 <w:rStyle w:val="Hyperlink"/>
@@ -1022,7 +1022,7 @@
               <w:rPr>
                 <w:noProof/>
               </w:rPr>
-              <w:instrText xml:space="preserve"> PAGEREF _Toc242016416 \h </w:instrText>
+              <w:instrText xml:space="preserve"> PAGEREF _Toc242016852 \h </w:instrText>
             </w:r>
             <w:r>
               <w:rPr>
@@ -1064,7 +1064,7 @@
               <w14:ligatures w14:val="standardContextual"/>
             </w:rPr>
           </w:pPr>
-          <w:hyperlink w:anchor="_Toc242016417" w:history="1">
+          <w:hyperlink w:anchor="_Toc242016853" w:history="1">
             <w:r>
               <w:rPr>
                 <w:rStyle w:val="Hyperlink"/>
@@ -1088,7 +1088,7 @@
               <w:rPr>
                 <w:noProof/>
               </w:rPr>
-              <w:instrText xml:space="preserve"> PAGEREF _Toc242016417 \h </w:instrText>
+              <w:instrText xml:space="preserve"> PAGEREF _Toc242016853 \h </w:instrText>
             </w:r>
             <w:r>
               <w:rPr>
@@ -1130,7 +1130,7 @@
               <w14:ligatures w14:val="standardContextual"/>
             </w:rPr>
           </w:pPr>
-          <w:hyperlink w:anchor="_Toc242016418" w:history="1">
+          <w:hyperlink w:anchor="_Toc242016854" w:history="1">
             <w:r>
               <w:rPr>
                 <w:rStyle w:val="Hyperlink"/>
@@ -1154,7 +1154,7 @@
               <w:rPr>
                 <w:noProof/>
               </w:rPr>
-              <w:instrText xml:space="preserve"> PAGEREF _Toc242016418 \h </w:instrText>
+              <w:instrText xml:space="preserve"> PAGEREF _Toc242016854 \h </w:instrText>
             </w:r>
             <w:r>
               <w:rPr>
@@ -1196,7 +1196,7 @@
               <w14:ligatures w14:val="standardContextual"/>
             </w:rPr>
           </w:pPr>
-          <w:hyperlink w:anchor="_Toc242016419" w:history="1">
+          <w:hyperlink w:anchor="_Toc242016855" w:history="1">
             <w:r>
               <w:rPr>
                 <w:rStyle w:val="Hyperlink"/>
@@ -1220,7 +1220,7 @@
               <w:rPr>
                 <w:noProof/>
               </w:rPr>
-              <w:instrText xml:space="preserve"> PAGEREF _Toc242016419 \h </w:instrText>
+              <w:instrText xml:space="preserve"> PAGEREF _Toc242016855 \h </w:instrText>
             </w:r>
             <w:r>
               <w:rPr>
@@ -1262,7 +1262,7 @@
               <w14:ligatures w14:val="standardContextual"/>
             </w:rPr>
           </w:pPr>
-          <w:hyperlink w:anchor="_Toc242016420" w:history="1">
+          <w:hyperlink w:anchor="_Toc242016856" w:history="1">
             <w:r>
               <w:rPr>
                 <w:rStyle w:val="Hyperlink"/>
@@ -1286,7 +1286,7 @@
               <w:rPr>
                 <w:noProof/>
               </w:rPr>
-              <w:instrText xml:space="preserve"> PAGEREF _Toc242016420 \h </w:instrText>
+              <w:instrText xml:space="preserve"> PAGEREF _Toc242016856 \h </w:instrText>
             </w:r>
             <w:r>
               <w:rPr>
@@ -1328,7 +1328,7 @@
               <w14:ligatures w14:val="standardContextual"/>
             </w:rPr>
           </w:pPr>
-          <w:hyperlink w:anchor="_Toc242016421" w:history="1">
+          <w:hyperlink w:anchor="_Toc242016857" w:history="1">
             <w:r>
               <w:rPr>
                 <w:rStyle w:val="Hyperlink"/>
@@ -1352,7 +1352,7 @@
               <w:rPr>
                 <w:noProof/>
               </w:rPr>
-              <w:instrText xml:space="preserve"> PAGEREF _Toc242016421 \h </w:instrText>
+              <w:instrText xml:space="preserve"> PAGEREF _Toc242016857 \h </w:instrText>
             </w:r>
             <w:r>
               <w:rPr>
@@ -1394,7 +1394,7 @@
               <w14:ligatures w14:val="standardContextual"/>
             </w:rPr>
           </w:pPr>
-          <w:hyperlink w:anchor="_Toc242016422" w:history="1">
+          <w:hyperlink w:anchor="_Toc242016858" w:history="1">
             <w:r>
               <w:rPr>
                 <w:rStyle w:val="Hyperlink"/>
@@ -1418,7 +1418,7 @@
               <w:rPr>
                 <w:noProof/>
               </w:rPr>
-              <w:instrText xml:space="preserve"> PAGEREF _Toc242016422 \h </w:instrText>
+              <w:instrText xml:space="preserve"> PAGEREF _Toc242016858 \h </w:instrText>
             </w:r>
             <w:r>
               <w:rPr>
@@ -1460,7 +1460,7 @@
               <w14:ligatures w14:val="standardContextual"/>
             </w:rPr>
           </w:pPr>
-          <w:hyperlink w:anchor="_Toc242016423" w:history="1">
+          <w:hyperlink w:anchor="_Toc242016859" w:history="1">
             <w:r>
               <w:rPr>
                 <w:rStyle w:val="Hyperlink"/>
@@ -1484,7 +1484,7 @@
               <w:rPr>
                 <w:noProof/>
               </w:rPr>
-              <w:instrText xml:space="preserve"> PAGEREF _Toc242016423 \h </w:instrText>
+              <w:instrText xml:space="preserve"> PAGEREF _Toc242016859 \h </w:instrText>
             </w:r>
             <w:r>
               <w:rPr>
@@ -1526,7 +1526,7 @@
               <w14:ligatures w14:val="standardContextual"/>
             </w:rPr>
           </w:pPr>
-          <w:hyperlink w:anchor="_Toc242016424" w:history="1">
+          <w:hyperlink w:anchor="_Toc242016860" w:history="1">
             <w:r>
               <w:rPr>
                 <w:rStyle w:val="Hyperlink"/>
@@ -1550,7 +1550,7 @@
               <w:rPr>
                 <w:noProof/>
               </w:rPr>
-              <w:instrText xml:space="preserve"> PAGEREF _Toc242016424 \h </w:instrText>
+              <w:instrText xml:space="preserve"> PAGEREF _Toc242016860 \h </w:instrText>
             </w:r>
             <w:r>
               <w:rPr>
@@ -1592,7 +1592,7 @@
               <w14:ligatures w14:val="standardContextual"/>
             </w:rPr>
           </w:pPr>
-          <w:hyperlink w:anchor="_Toc242016425" w:history="1">
+          <w:hyperlink w:anchor="_Toc242016861" w:history="1">
             <w:r>
               <w:rPr>
                 <w:rStyle w:val="Hyperlink"/>
@@ -1616,7 +1616,7 @@
               <w:rPr>
                 <w:noProof/>
               </w:rPr>
-              <w:instrText xml:space="preserve"> PAGEREF _Toc242016425 \h </w:instrText>
+              <w:instrText xml:space="preserve"> PAGEREF _Toc242016861 \h </w:instrText>
             </w:r>
             <w:r>
               <w:rPr>
@@ -1658,7 +1658,7 @@
               <w14:ligatures w14:val="standardContextual"/>
             </w:rPr>
           </w:pPr>
-          <w:hyperlink w:anchor="_Toc242016426" w:history="1">
+          <w:hyperlink w:anchor="_Toc242016862" w:history="1">
             <w:r>
               <w:rPr>
                 <w:rStyle w:val="Hyperlink"/>
@@ -1682,7 +1682,7 @@
               <w:rPr>
                 <w:noProof/>
               </w:rPr>
-              <w:instrText xml:space="preserve"> PAGEREF _Toc242016426 \h </w:instrText>
+              <w:instrText xml:space="preserve"> PAGEREF _Toc242016862 \h </w:instrText>
             </w:r>
             <w:r>
               <w:rPr>
@@ -1724,7 +1724,7 @@
               <w14:ligatures w14:val="standardContextual"/>
             </w:rPr>
           </w:pPr>
-          <w:hyperlink w:anchor="_Toc242016427" w:history="1">
+          <w:hyperlink w:anchor="_Toc242016863" w:history="1">
             <w:r>
               <w:rPr>
                 <w:rStyle w:val="Hyperlink"/>
@@ -1748,7 +1748,7 @@
               <w:rPr>
                 <w:noProof/>
               </w:rPr>
-              <w:instrText xml:space="preserve"> PAGEREF _Toc242016427 \h </w:instrText>
+              <w:instrText xml:space="preserve"> PAGEREF _Toc242016863 \h </w:instrText>
             </w:r>
             <w:r>
               <w:rPr>
@@ -1790,7 +1790,7 @@
               <w14:ligatures w14:val="standardContextual"/>
             </w:rPr>
           </w:pPr>
-          <w:hyperlink w:anchor="_Toc242016428" w:history="1">
+          <w:hyperlink w:anchor="_Toc242016864" w:history="1">
             <w:r>
               <w:rPr>
                 <w:rStyle w:val="Hyperlink"/>
@@ -1814,7 +1814,7 @@
               <w:rPr>
                 <w:noProof/>
               </w:rPr>
-              <w:instrText xml:space="preserve"> PAGEREF _Toc242016428 \h </w:instrText>
+              <w:instrText xml:space="preserve"> PAGEREF _Toc242016864 \h </w:instrText>
             </w:r>
             <w:r>
               <w:rPr>
@@ -1856,7 +1856,7 @@
               <w14:ligatures w14:val="standardContextual"/>
             </w:rPr>
           </w:pPr>
-          <w:hyperlink w:anchor="_Toc242016429" w:history="1">
+          <w:hyperlink w:anchor="_Toc242016865" w:history="1">
             <w:r>
               <w:rPr>
                 <w:rStyle w:val="Hyperlink"/>
@@ -1880,7 +1880,7 @@
               <w:rPr>
                 <w:noProof/>
               </w:rPr>
-              <w:instrText xml:space="preserve"> PAGEREF _Toc242016429 \h </w:instrText>
+              <w:instrText xml:space="preserve"> PAGEREF _Toc242016865 \h </w:instrText>
             </w:r>
             <w:r>
               <w:rPr>
@@ -1922,7 +1922,7 @@
               <w14:ligatures w14:val="standardContextual"/>
             </w:rPr>
           </w:pPr>
-          <w:hyperlink w:anchor="_Toc242016430" w:history="1">
+          <w:hyperlink w:anchor="_Toc242016866" w:history="1">
             <w:r>
               <w:rPr>
                 <w:rStyle w:val="Hyperlink"/>
@@ -1946,7 +1946,7 @@
               <w:rPr>
                 <w:noProof/>
               </w:rPr>
-              <w:instrText xml:space="preserve"> PAGEREF _Toc242016430 \h </w:instrText>
+              <w:instrText xml:space="preserve"> PAGEREF _Toc242016866 \h </w:instrText>
             </w:r>
             <w:r>
               <w:rPr>
@@ -1988,7 +1988,7 @@
               <w14:ligatures w14:val="standardContextual"/>
             </w:rPr>
           </w:pPr>
-          <w:hyperlink w:anchor="_Toc242016431" w:history="1">
+          <w:hyperlink w:anchor="_Toc242016867" w:history="1">
             <w:r>
               <w:rPr>
                 <w:rStyle w:val="Hyperlink"/>
@@ -2012,7 +2012,7 @@
               <w:rPr>
                 <w:noProof/>
               </w:rPr>
-              <w:instrText xml:space="preserve"> PAGEREF _Toc242016431 \h </w:instrText>
+              <w:instrText xml:space="preserve"> PAGEREF _Toc242016867 \h </w:instrText>
             </w:r>
             <w:r>
               <w:rPr>
@@ -2054,7 +2054,7 @@
               <w14:ligatures w14:val="standardContextual"/>
             </w:rPr>
           </w:pPr>
-          <w:hyperlink w:anchor="_Toc242016432" w:history="1">
+          <w:hyperlink w:anchor="_Toc242016868" w:history="1">
             <w:r>
               <w:rPr>
                 <w:rStyle w:val="Hyperlink"/>
@@ -2078,7 +2078,7 @@
               <w:rPr>
                 <w:noProof/>
               </w:rPr>
-              <w:instrText xml:space="preserve"> PAGEREF _Toc242016432 \h </w:instrText>
+              <w:instrText xml:space="preserve"> PAGEREF _Toc242016868 \h </w:instrText>
             </w:r>
             <w:r>
               <w:rPr>
@@ -2120,7 +2120,7 @@
               <w14:ligatures w14:val="standardContextual"/>
             </w:rPr>
           </w:pPr>
-          <w:hyperlink w:anchor="_Toc242016433" w:history="1">
+          <w:hyperlink w:anchor="_Toc242016869" w:history="1">
             <w:r>
               <w:rPr>
                 <w:rStyle w:val="Hyperlink"/>
@@ -2144,7 +2144,7 @@
               <w:rPr>
                 <w:noProof/>
               </w:rPr>
-              <w:instrText xml:space="preserve"> PAGEREF _Toc242016433 \h </w:instrText>
+              <w:instrText xml:space="preserve"> PAGEREF _Toc242016869 \h </w:instrText>
             </w:r>
             <w:r>
               <w:rPr>
@@ -2186,7 +2186,7 @@
               <w14:ligatures w14:val="standardContextual"/>
             </w:rPr>
           </w:pPr>
-          <w:hyperlink w:anchor="_Toc242016434" w:history="1">
+          <w:hyperlink w:anchor="_Toc242016870" w:history="1">
             <w:r>
               <w:rPr>
                 <w:rStyle w:val="Hyperlink"/>
@@ -2210,7 +2210,7 @@
               <w:rPr>
                 <w:noProof/>
               </w:rPr>
-              <w:instrText xml:space="preserve"> PAGEREF _Toc242016434 \h </w:instrText>
+              <w:instrText xml:space="preserve"> PAGEREF _Toc242016870 \h </w:instrText>
             </w:r>
             <w:r>
               <w:rPr>
@@ -2252,7 +2252,7 @@
               <w14:ligatures w14:val="standardContextual"/>
             </w:rPr>
           </w:pPr>
-          <w:hyperlink w:anchor="_Toc242016435" w:history="1">
+          <w:hyperlink w:anchor="_Toc242016871" w:history="1">
             <w:r>
               <w:rPr>
                 <w:rStyle w:val="Hyperlink"/>
@@ -2276,7 +2276,7 @@
               <w:rPr>
                 <w:noProof/>
               </w:rPr>
-              <w:instrText xml:space="preserve"> PAGEREF _Toc242016435 \h </w:instrText>
+              <w:instrText xml:space="preserve"> PAGEREF _Toc242016871 \h </w:instrText>
             </w:r>
             <w:r>
               <w:rPr>
@@ -2318,7 +2318,7 @@
               <w14:ligatures w14:val="standardContextual"/>
             </w:rPr>
           </w:pPr>
-          <w:hyperlink w:anchor="_Toc242016436" w:history="1">
+          <w:hyperlink w:anchor="_Toc242016872" w:history="1">
             <w:r>
               <w:rPr>
                 <w:rStyle w:val="Hyperlink"/>
@@ -2342,7 +2342,7 @@
               <w:rPr>
                 <w:noProof/>
               </w:rPr>
-              <w:instrText xml:space="preserve"> PAGEREF _Toc242016436 \h </w:instrText>
+              <w:instrText xml:space="preserve"> PAGEREF _Toc242016872 \h </w:instrText>
             </w:r>
             <w:r>
               <w:rPr>
@@ -2384,7 +2384,7 @@
               <w14:ligatures w14:val="standardContextual"/>
             </w:rPr>
           </w:pPr>
-          <w:hyperlink w:anchor="_Toc242016437" w:history="1">
+          <w:hyperlink w:anchor="_Toc242016873" w:history="1">
             <w:r>
               <w:rPr>
                 <w:rStyle w:val="Hyperlink"/>
@@ -2408,7 +2408,7 @@
               <w:rPr>
                 <w:noProof/>
               </w:rPr>
-              <w:instrText xml:space="preserve"> PAGEREF _Toc242016437 \h </w:instrText>
+              <w:instrText xml:space="preserve"> PAGEREF _Toc242016873 \h </w:instrText>
             </w:r>
             <w:r>
               <w:rPr>
@@ -2450,7 +2450,7 @@
               <w14:ligatures w14:val="standardContextual"/>
             </w:rPr>
           </w:pPr>
-          <w:hyperlink w:anchor="_Toc242016438" w:history="1">
+          <w:hyperlink w:anchor="_Toc242016874" w:history="1">
             <w:r>
               <w:rPr>
                 <w:rStyle w:val="Hyperlink"/>
@@ -2474,7 +2474,7 @@
               <w:rPr>
                 <w:noProof/>
               </w:rPr>
-              <w:instrText xml:space="preserve"> PAGEREF _Toc242016438 \h </w:instrText>
+              <w:instrText xml:space="preserve"> PAGEREF _Toc242016874 \h </w:instrText>
             </w:r>
             <w:r>
               <w:rPr>
@@ -2516,7 +2516,7 @@
               <w14:ligatures w14:val="standardContextual"/>
             </w:rPr>
           </w:pPr>
-          <w:hyperlink w:anchor="_Toc242016439" w:history="1">
+          <w:hyperlink w:anchor="_Toc242016875" w:history="1">
             <w:r>
               <w:rPr>
                 <w:rStyle w:val="Hyperlink"/>
@@ -2540,7 +2540,7 @@
               <w:rPr>
                 <w:noProof/>
               </w:rPr>
-              <w:instrText xml:space="preserve"> PAGEREF _Toc242016439 \h </w:instrText>
+              <w:instrText xml:space="preserve"> PAGEREF _Toc242016875 \h </w:instrText>
             </w:r>
             <w:r>
               <w:rPr>
@@ -2582,7 +2582,7 @@
               <w14:ligatures w14:val="standardContextual"/>
             </w:rPr>
           </w:pPr>
-          <w:hyperlink w:anchor="_Toc242016440" w:history="1">
+          <w:hyperlink w:anchor="_Toc242016876" w:history="1">
             <w:r>
               <w:rPr>
                 <w:rStyle w:val="Hyperlink"/>
@@ -2606,7 +2606,7 @@
               <w:rPr>
                 <w:noProof/>
               </w:rPr>
-              <w:instrText xml:space="preserve"> PAGEREF _Toc242016440 \h </w:instrText>
+              <w:instrText xml:space="preserve"> PAGEREF _Toc242016876 \h </w:instrText>
             </w:r>
             <w:r>
               <w:rPr>
@@ -2648,7 +2648,7 @@
               <w14:ligatures w14:val="standardContextual"/>
             </w:rPr>
           </w:pPr>
-          <w:hyperlink w:anchor="_Toc242016441" w:history="1">
+          <w:hyperlink w:anchor="_Toc242016877" w:history="1">
             <w:r>
               <w:rPr>
                 <w:rStyle w:val="Hyperlink"/>
@@ -2672,7 +2672,7 @@
               <w:rPr>
                 <w:noProof/>
               </w:rPr>
-              <w:instrText xml:space="preserve"> PAGEREF _Toc242016441 \h </w:instrText>
+              <w:instrText xml:space="preserve"> PAGEREF _Toc242016877 \h </w:instrText>
             </w:r>
             <w:r>
               <w:rPr>
@@ -2714,7 +2714,7 @@
               <w14:ligatures w14:val="standardContextual"/>
             </w:rPr>
           </w:pPr>
-          <w:hyperlink w:anchor="_Toc242016442" w:history="1">
+          <w:hyperlink w:anchor="_Toc242016878" w:history="1">
             <w:r>
               <w:rPr>
                 <w:rStyle w:val="Hyperlink"/>
@@ -2738,7 +2738,7 @@
               <w:rPr>
                 <w:noProof/>
               </w:rPr>
-              <w:instrText xml:space="preserve"> PAGEREF _Toc242016442 \h </w:instrText>
+              <w:instrText xml:space="preserve"> PAGEREF _Toc242016878 \h </w:instrText>
             </w:r>
             <w:r>
               <w:rPr>
@@ -2780,7 +2780,7 @@
               <w14:ligatures w14:val="standardContextual"/>
             </w:rPr>
           </w:pPr>
-          <w:hyperlink w:anchor="_Toc242016443" w:history="1">
+          <w:hyperlink w:anchor="_Toc242016879" w:history="1">
             <w:r>
               <w:rPr>
                 <w:rStyle w:val="Hyperlink"/>
@@ -2804,7 +2804,7 @@
               <w:rPr>
                 <w:noProof/>
               </w:rPr>
-              <w:instrText xml:space="preserve"> PAGEREF _Toc242016443 \h </w:instrText>
+              <w:instrText xml:space="preserve"> PAGEREF _Toc242016879 \h </w:instrText>
             </w:r>
             <w:r>
               <w:rPr>
@@ -2864,7 +2864,7 @@
         <w:keepNext/>
         <w:keepLines/>
       </w:pPr>
-      <w:bookmarkStart w:id="0" w:name="_Toc242016416"/>
+      <w:bookmarkStart w:id="0" w:name="_Toc242016852"/>
       <w:r>
         <w:lastRenderedPageBreak/>
         <w:t>1. Thiết lập Claude Project</w:t>
@@ -3683,7 +3683,7 @@
         <w:keepNext/>
         <w:keepLines/>
       </w:pPr>
-      <w:bookmarkStart w:id="1" w:name="_Toc242016417"/>
+      <w:bookmarkStart w:id="1" w:name="_Toc242016853"/>
       <w:r>
         <w:t>2. Project Charter (Tuyên bố dự án)</w:t>
       </w:r>
@@ -4169,7 +4169,7 @@
         <w:keepNext/>
         <w:keepLines/>
       </w:pPr>
-      <w:bookmarkStart w:id="2" w:name="_Toc242016418"/>
+      <w:bookmarkStart w:id="2" w:name="_Toc242016854"/>
       <w:r>
         <w:t>2.1 Mục tiêu SMART</w:t>
       </w:r>
@@ -5194,7 +5194,7 @@
         <w:keepNext/>
         <w:keepLines/>
       </w:pPr>
-      <w:bookmarkStart w:id="3" w:name="_Toc242016419"/>
+      <w:bookmarkStart w:id="3" w:name="_Toc242016855"/>
       <w:r>
         <w:t>2.2 Phạm vi</w:t>
       </w:r>
@@ -5604,7 +5604,7 @@
         <w:keepNext/>
         <w:keepLines/>
       </w:pPr>
-      <w:bookmarkStart w:id="4" w:name="_Toc242016420"/>
+      <w:bookmarkStart w:id="4" w:name="_Toc242016856"/>
       <w:r>
         <w:t>2.3 Sản phẩm bàn giao chính</w:t>
       </w:r>
@@ -5668,7 +5668,7 @@
         <w:keepNext/>
         <w:keepLines/>
       </w:pPr>
-      <w:bookmarkStart w:id="5" w:name="_Toc242016421"/>
+      <w:bookmarkStart w:id="5" w:name="_Toc242016857"/>
       <w:r>
         <w:t>2.4 Các bên liên quan</w:t>
       </w:r>
@@ -6455,7 +6455,7 @@
         <w:keepNext/>
         <w:keepLines/>
       </w:pPr>
-      <w:bookmarkStart w:id="6" w:name="_Toc242016422"/>
+      <w:bookmarkStart w:id="6" w:name="_Toc242016858"/>
       <w:r>
         <w:t>2.5 Mốc thời gian chính (mục tiêu)</w:t>
       </w:r>
@@ -7501,7 +7501,7 @@
         <w:keepNext/>
         <w:keepLines/>
       </w:pPr>
-      <w:bookmarkStart w:id="7" w:name="_Toc242016423"/>
+      <w:bookmarkStart w:id="7" w:name="_Toc242016859"/>
       <w:r>
         <w:t>2.6 Giả định và ràng buộc</w:t>
       </w:r>
@@ -7768,7 +7768,7 @@
         <w:keepNext/>
         <w:keepLines/>
       </w:pPr>
-      <w:bookmarkStart w:id="8" w:name="_Toc242016424"/>
+      <w:bookmarkStart w:id="8" w:name="_Toc242016860"/>
       <w:r>
         <w:t>2.7 Rủi ro cấp cao</w:t>
       </w:r>
@@ -7832,7 +7832,7 @@
         <w:keepNext/>
         <w:keepLines/>
       </w:pPr>
-      <w:bookmarkStart w:id="9" w:name="_Toc242016425"/>
+      <w:bookmarkStart w:id="9" w:name="_Toc242016861"/>
       <w:r>
         <w:t>2.8 Tiêu chí thành công và nghiệm thu</w:t>
       </w:r>
@@ -7909,7 +7909,7 @@
         <w:keepNext/>
         <w:keepLines/>
       </w:pPr>
-      <w:bookmarkStart w:id="10" w:name="_Toc242016426"/>
+      <w:bookmarkStart w:id="10" w:name="_Toc242016862"/>
       <w:r>
         <w:t>2.9 Thông tin còn thiếu – câu hỏi làm rõ với khách hàng</w:t>
       </w:r>
@@ -9534,7 +9534,7 @@
         <w:keepNext/>
         <w:keepLines/>
       </w:pPr>
-      <w:bookmarkStart w:id="11" w:name="_Toc242016427"/>
+      <w:bookmarkStart w:id="11" w:name="_Toc242016863"/>
       <w:r>
         <w:t>3. Phạm vi và WBS</w:t>
       </w:r>
@@ -9565,7 +9565,7 @@
         <w:keepNext/>
         <w:keepLines/>
       </w:pPr>
-      <w:bookmarkStart w:id="12" w:name="_Toc242016428"/>
+      <w:bookmarkStart w:id="12" w:name="_Toc242016864"/>
       <w:r>
         <w:t>3.1 Sơ đồ cây WBS</w:t>
       </w:r>
@@ -9654,7 +9654,7 @@
         <w:keepNext/>
         <w:keepLines/>
       </w:pPr>
-      <w:bookmarkStart w:id="13" w:name="_Toc242016429"/>
+      <w:bookmarkStart w:id="13" w:name="_Toc242016865"/>
       <w:r>
         <w:t>3.2 Bảng WBS</w:t>
       </w:r>
@@ -21688,7 +21688,7 @@
         <w:keepNext/>
         <w:keepLines/>
       </w:pPr>
-      <w:bookmarkStart w:id="14" w:name="_Toc242016430"/>
+      <w:bookmarkStart w:id="14" w:name="_Toc242016866"/>
       <w:r>
         <w:t>3.3 Từ điển WBS (3 gói công việc quan trọng nhất)</w:t>
       </w:r>
@@ -23394,7 +23394,7 @@
         <w:keepNext/>
         <w:keepLines/>
       </w:pPr>
-      <w:bookmarkStart w:id="15" w:name="_Toc242016431"/>
+      <w:bookmarkStart w:id="15" w:name="_Toc242016867"/>
       <w:r>
         <w:t>4. Ước lượng, lịch dự án và đường găng</w:t>
       </w:r>
@@ -23414,7 +23414,7 @@
         <w:keepNext/>
         <w:keepLines/>
       </w:pPr>
-      <w:bookmarkStart w:id="16" w:name="_Toc242016432"/>
+      <w:bookmarkStart w:id="16" w:name="_Toc242016868"/>
       <w:r>
         <w:t>4.1 Bảng PERT và CPM</w:t>
       </w:r>
@@ -31014,7 +31014,7 @@
         <w:keepNext/>
         <w:keepLines/>
       </w:pPr>
-      <w:bookmarkStart w:id="17" w:name="_Toc242016433"/>
+      <w:bookmarkStart w:id="17" w:name="_Toc242016869"/>
       <w:r>
         <w:t>4.2 Kết quả</w:t>
       </w:r>
@@ -31563,7 +31563,7 @@
         <w:keepNext/>
         <w:keepLines/>
       </w:pPr>
-      <w:bookmarkStart w:id="18" w:name="_Toc242016434"/>
+      <w:bookmarkStart w:id="18" w:name="_Toc242016870"/>
       <w:r>
         <w:t>4.3 Biểu đồ Gantt</w:t>
       </w:r>
@@ -31641,7 +31641,7 @@
         <w:keepNext/>
         <w:keepLines/>
       </w:pPr>
-      <w:bookmarkStart w:id="19" w:name="_Toc242016435"/>
+      <w:bookmarkStart w:id="19" w:name="_Toc242016871"/>
       <w:r>
         <w:t>4.4 So sánh kết quả Excel với câu trả lời của AI (Claude Project)</w:t>
       </w:r>
@@ -32476,7 +32476,7 @@
         <w:keepNext/>
         <w:keepLines/>
       </w:pPr>
-      <w:bookmarkStart w:id="20" w:name="_Toc242016436"/>
+      <w:bookmarkStart w:id="20" w:name="_Toc242016872"/>
       <w:r>
         <w:t>4.5 Phương án nén lịch (AI gợi ý – nhóm tự chọn và lý giải)</w:t>
       </w:r>
@@ -35474,7 +35474,7 @@
         <w:keepNext/>
         <w:keepLines/>
       </w:pPr>
-      <w:bookmarkStart w:id="21" w:name="_Toc242016437"/>
+      <w:bookmarkStart w:id="21" w:name="_Toc242016873"/>
       <w:r>
         <w:t>5. Ước lượng chi phí</w:t>
       </w:r>
@@ -37808,7 +37808,7 @@
         <w:keepNext/>
         <w:keepLines/>
       </w:pPr>
-      <w:bookmarkStart w:id="22" w:name="_Toc242016438"/>
+      <w:bookmarkStart w:id="22" w:name="_Toc242016874"/>
       <w:r>
         <w:t>6. Quản lý rủi ro</w:t>
       </w:r>
@@ -42642,7 +42642,7 @@
         <w:keepNext/>
         <w:keepLines/>
       </w:pPr>
-      <w:bookmarkStart w:id="23" w:name="_Toc242016439"/>
+      <w:bookmarkStart w:id="23" w:name="_Toc242016875"/>
       <w:r>
         <w:t>6.1 Ma trận xác suất – tác động</w:t>
       </w:r>
@@ -42720,7 +42720,7 @@
         <w:keepNext/>
         <w:keepLines/>
       </w:pPr>
-      <w:bookmarkStart w:id="24" w:name="_Toc242016440"/>
+      <w:bookmarkStart w:id="24" w:name="_Toc242016876"/>
       <w:r>
         <w:t>6.2 Kế hoạch dự phòng cho rủi ro điểm cao nhất – R01</w:t>
       </w:r>
@@ -43288,7 +43288,7 @@
         <w:keepNext/>
         <w:keepLines/>
       </w:pPr>
-      <w:bookmarkStart w:id="25" w:name="_Toc242016441"/>
+      <w:bookmarkStart w:id="25" w:name="_Toc242016877"/>
       <w:r>
         <w:t>7. Phản biện đầu ra AI</w:t>
       </w:r>
@@ -43299,7 +43299,7 @@
         <w:spacing w:after="100" w:line="276" w:lineRule="auto"/>
       </w:pPr>
       <w:r>
-        <w:t>Trong chat “Bai5_PhanBien”, yêu cầu Claude đóng vai Chủ chuỗi nhà thuốc (Sponsor) khó tính, đọc Charter, WBS, lịch, Risk Register trong Knowledge và đặt 5 câu hỏi chất vấn khó nhất. Theo quy định bài lab, câu trả lời do nhóm TỰ VIẾT, không nhờ AI.</w:t>
+        <w:t>Trong chat “Bai5_PhanBien”, yêu cầu Claude đóng vai Chủ chuỗi nhà thuốc (Sponsor) khó tính, đọc Charter, WBS, lịch, Risk Register và đặt 5 câu hỏi chất vấn khó nhất. Với mỗi câu, nhóm tự quyết định phương án xử lý; Claude Code diễn đạt thành câu trả lời và dẫn số liệu từ báo cáo (ghi rõ trong nhật ký AI, mục 8).</w:t>
       </w:r>
     </w:p>
     <w:tbl>
@@ -43427,7 +43427,7 @@
                 <w:sz w:val="19"/>
                 <w:szCs w:val="19"/>
               </w:rPr>
-              <w:t>Câu trả lời của nhóm (tự viết)</w:t>
+              <w:t>Câu trả lời của nhóm (nhóm chọn phương án)</w:t>
             </w:r>
           </w:p>
         </w:tc>
@@ -43515,12 +43515,9 @@
             </w:pPr>
             <w:r>
               <w:rPr>
-                <w:i/>
-                <w:iCs/>
-                <w:color w:val="7A5C00"/>
-                <w:highlight w:val="yellow"/>
-              </w:rPr>
-              <w:t>[NHÓM ĐIỀN: câu trả lời có lập luận, dẫn số liệu từ kế hoạch]</w:t>
+                <w:sz w:val="18"/>
+              </w:rPr>
+              <w:t>Chúng em công nhận lịch gốc (75,33 ngày, xong khoảng 18/01/2027) không kịp hạn. Vì vậy nhóm đã nén lịch (mục 4.5): làm song song thiết kế – lập trình – kiểm thử theo module và dời FR09–FR10 sang giai đoạn 2. Lịch sau khi nén là 61,83 ngày làm việc, kết thúc 29/12/2026, khả năng kịp hạn khoảng 74% (σ = 3,39 ngày). Ngày nhóm đề nghị anh/chị ký là go-live 29/12/2026, còn dự trữ khoảng 2 ngày trước 31/12; PM theo dõi tiến độ đường găng hằng tuần và báo ngay nếu dự trữ bị ăn hết.</w:t>
             </w:r>
           </w:p>
         </w:tc>
@@ -43608,12 +43605,9 @@
             </w:pPr>
             <w:r>
               <w:rPr>
-                <w:i/>
-                <w:iCs/>
-                <w:color w:val="7A5C00"/>
-                <w:highlight w:val="yellow"/>
-              </w:rPr>
-              <w:t>[NHÓM ĐIỀN: câu trả lời có lập luận, dẫn số liệu từ kế hoạch]</w:t>
+                <w:sz w:val="18"/>
+              </w:rPr>
+              <w:t>Đúng là Backend đang quá tải và lịch PERT giả định G (API) chạy song song H (tích hợp, chuyển đổi dữ liệu) dù chỉ có 1 Backend. Nhóm đề xuất thuê thêm 1 lập trình viên Backend bán thời gian nhận riêng gói 4.4 (đồng bộ dữ liệu POS và chuyển đổi dữ liệu cũ, khoảng 100 giờ). Chi phí khoảng 16 triệu đồng (100 giờ × 160.000 đ), lấy từ quỹ dự phòng 21,9 triệu. Khi đó Backend chính chỉ còn khoảng 360/512 giờ, G và H chạy song song đúng như lịch; nếu Backend chính nghỉ, người bán thời gian đã nắm hệ thống có thể hỗ trợ.</w:t>
             </w:r>
           </w:p>
         </w:tc>
@@ -43701,12 +43695,9 @@
             </w:pPr>
             <w:r>
               <w:rPr>
-                <w:i/>
-                <w:iCs/>
-                <w:color w:val="7A5C00"/>
-                <w:highlight w:val="yellow"/>
-              </w:rPr>
-              <w:t>[NHÓM ĐIỀN: câu trả lời có lập luận, dẫn số liệu từ kế hoạch]</w:t>
+                <w:sz w:val="18"/>
+              </w:rPr>
+              <w:t>Dự toán chi tiết ở mục 5: 1.364 giờ công theo WBS × đơn giá từng vai trò, cộng hosting, tên miền, đào tạo và 10% dự phòng, tổng 241 triệu đồng, còn dư khoảng 9 triệu so với 250 triệu. Sau khi dùng 16 triệu dự phòng để thuê Backend bán thời gian, quỹ dự phòng chỉ còn khoảng 5,9 triệu, không đủ cho phương án dự phòng POS (tối đa 6,4 triệu) và chưa tính phí mở API của nhà cung cấp POS (chưa có báo giá). Vì vậy nhóm xin anh/chị phê duyệt thêm một khoản dự phòng có điều kiện, chỉ giải ngân khi có báo giá API POS; mọi khoản chi ngoài dự toán đều phải trình anh/chị duyệt trước.</w:t>
             </w:r>
           </w:p>
         </w:tc>
@@ -43794,12 +43785,9 @@
             </w:pPr>
             <w:r>
               <w:rPr>
-                <w:i/>
-                <w:iCs/>
-                <w:color w:val="7A5C00"/>
-                <w:highlight w:val="yellow"/>
-              </w:rPr>
-              <w:t>[NHÓM ĐIỀN: câu trả lời có lập luận, dẫn số liệu từ kế hoạch]</w:t>
+                <w:sz w:val="18"/>
+              </w:rPr>
+              <w:t>Nhóm sẽ kiểm tra khả năng kết nối POS ngay trong tuần khảo sát (hạn khoảng 20/10/2026), không chờ đến giai đoạn lập trình. Song song, nhóm làm việc với nhà cung cấp POS để mở API và xin báo giá (phần này cần khoản ngân sách ở câu 3). Trong lúc chờ, hệ thống vẫn chạy được bằng cách nhập file Excel/CSV xuất từ POS theo lịch (mỗi 15 phút hoặc cuối ca): doanh thu trễ tối đa đến cuối ca, nhóm sẽ thống nhất lại mức trễ này với anh/chị. Cảnh báo hạn dùng không phụ thuộc vào POS vì số lô và hạn dùng được ghi khi nhận hàng từ phiếu nhập; nếu hóa đơn không có số lô, hệ thống trừ tồn theo nguyên tắc lô hết hạn trước xuất trước (FEFO).</w:t>
             </w:r>
           </w:p>
         </w:tc>
@@ -43887,12 +43875,9 @@
             </w:pPr>
             <w:r>
               <w:rPr>
-                <w:i/>
-                <w:iCs/>
-                <w:color w:val="7A5C00"/>
-                <w:highlight w:val="yellow"/>
-              </w:rPr>
-              <w:t>[NHÓM ĐIỀN: câu trả lời có lập luận, dẫn số liệu từ kế hoạch]</w:t>
+                <w:sz w:val="18"/>
+              </w:rPr>
+              <w:t>Phương án nhóm đề nghị anh/chị chọn: giữ đủ 8 yêu cầu Bắt buộc FR01–FR08 cho go-live 29/12/2026, dời FR09 (khách hàng thân thiết) và FR10 (doanh số nhân viên, lịch ca) sang giai đoạn 2. Đây là 2 yêu cầu “Nên có”, ít ảnh hưởng tới mục tiêu chính là cảnh báo hạn dùng và báo cáo nhanh, đồng thời rút ngắn được 3–4 ngày trên mỗi nhánh lập trình (API: 18,67 → 15,67 ngày; màn hình: 20,5 → 16,5 ngày). Về đợt kiểm kê cuối năm: file Excel cũ được giữ nguyên, không xóa, dữ liệu mới sao lưu hằng ngày (gói 7.1.1), nên nếu hệ thống lỗi vẫn kiểm kê được bằng cách cũ. Nhóm cần anh/chị xác nhận việc dời FR09–FR10 trong buổi demo tháng 10.</w:t>
             </w:r>
           </w:p>
         </w:tc>
@@ -44031,7 +44016,7 @@
         <w:keepNext/>
         <w:keepLines/>
       </w:pPr>
-      <w:bookmarkStart w:id="26" w:name="_Toc242016442"/>
+      <w:bookmarkStart w:id="26" w:name="_Toc242016878"/>
       <w:r>
         <w:t>7.1 Phản tư</w:t>
       </w:r>
@@ -44095,7 +44080,7 @@
         <w:keepNext/>
         <w:keepLines/>
       </w:pPr>
-      <w:bookmarkStart w:id="27" w:name="_Toc242016443"/>
+      <w:bookmarkStart w:id="27" w:name="_Toc242016879"/>
       <w:r>
         <w:t>8. Nhật ký sử dụng AI</w:t>
       </w:r>
@@ -45348,12 +45333,9 @@
             </w:pPr>
             <w:r>
               <w:rPr>
-                <w:i/>
-                <w:iCs/>
-                <w:color w:val="7A5C00"/>
-                <w:highlight w:val="yellow"/>
-              </w:rPr>
-              <w:t>[NHÓM ĐIỀN: …]</w:t>
+                <w:sz w:val="18"/>
+              </w:rPr>
+              <w:t>Nhóm tự chọn phương án trả lời cho từng câu (1: cam kết 29/12 theo lịch nén; 2: thuê thêm Backend bán thời gian; 3: xin thêm dự phòng có điều kiện; 4: nhập file POS + đàm phán mở API; 5: dời FR09–FR10). Claude Code diễn đạt các lựa chọn này thành câu trả lời và dẫn số liệu từ báo cáo.</w:t>
             </w:r>
           </w:p>
         </w:tc>

</xml_diff>

<commit_message>
Báo cáo lab: hoàn thiện nhật ký AI dòng 0, 0b
Co-Authored-By: Claude Opus 5.5 <noreply@anthropic.com>
</commit_message>
<xml_diff>
--- a/docs/lab/QLDA_Nhom_PharmaDash_Lab.docx
+++ b/docs/lab/QLDA_Nhom_PharmaDash_Lab.docx
@@ -44407,12 +44407,9 @@
             </w:pPr>
             <w:r>
               <w:rPr>
-                <w:i/>
-                <w:iCs/>
-                <w:color w:val="7A5C00"/>
-                <w:highlight w:val="yellow"/>
-              </w:rPr>
-              <w:t>[NHÓM ĐIỀN: …]</w:t>
+                <w:sz w:val="18"/>
+              </w:rPr>
+              <w:t>Tạo nhanh bộ khung đầy đủ (tài liệu yêu cầu, Charter, WBS 47 gói, PERT, dự toán, 10 rủi ro); file Excel tính toàn bộ bằng công thức, tự kiểm tra quy tắc 8/80 và 100%, không có ô lỗi.</w:t>
             </w:r>
           </w:p>
         </w:tc>
@@ -44438,12 +44435,9 @@
             </w:pPr>
             <w:r>
               <w:rPr>
-                <w:i/>
-                <w:iCs/>
-                <w:color w:val="7A5C00"/>
-                <w:highlight w:val="yellow"/>
-              </w:rPr>
-              <w:t>[NHÓM ĐIỀN: …]</w:t>
+                <w:sz w:val="18"/>
+              </w:rPr>
+              <w:t>Đổi tên khách hàng thành Nhà thuốc Hữu Duyên; tạo Claude Project và chạy lại từng bài để đối chiếu; bản nháp ban đầu có lịch trễ hạn (75,33 &gt; 64 ngày) nên phải bổ sung phương án nén lịch.</w:t>
             </w:r>
           </w:p>
         </w:tc>
@@ -44560,12 +44554,9 @@
             </w:pPr>
             <w:r>
               <w:rPr>
-                <w:i/>
-                <w:iCs/>
-                <w:color w:val="7A5C00"/>
-                <w:highlight w:val="yellow"/>
-              </w:rPr>
-              <w:t>[NHÓM ĐIỀN: …]</w:t>
+                <w:sz w:val="18"/>
+              </w:rPr>
+              <w:t>Chỉ ra điểm chưa đạt SMART và mục AI tự thêm ngoài tài liệu (bán hàng online); phát hiện nén riêng nhánh màn hình sẽ làm nhánh API thành găng; tính lại lịch bằng Excel (sheet NenLich).</w:t>
             </w:r>
           </w:p>
         </w:tc>
@@ -44591,12 +44582,9 @@
             </w:pPr>
             <w:r>
               <w:rPr>
-                <w:i/>
-                <w:iCs/>
-                <w:color w:val="7A5C00"/>
-                <w:highlight w:val="yellow"/>
-              </w:rPr>
-              <w:t>[NHÓM ĐIỀN: …]</w:t>
+                <w:sz w:val="18"/>
+              </w:rPr>
+              <w:t>Nhóm chọn phương án nén lịch, chọn phương án trả lời Sponsor và đưa ra R11, R12 từ kinh nghiệm thật; Claude Code chỉ trình bày và điền vào file.</w:t>
             </w:r>
           </w:p>
         </w:tc>
@@ -45336,164 +45324,6 @@
                 <w:sz w:val="18"/>
               </w:rPr>
               <w:t>Nhóm tự chọn phương án trả lời cho từng câu (1: cam kết 29/12 theo lịch nén; 2: thuê thêm Backend bán thời gian; 3: xin thêm dự phòng có điều kiện; 4: nhập file POS + đàm phán mở API; 5: dời FR09–FR10). Claude Code diễn đạt các lựa chọn này thành câu trả lời và dẫn số liệu từ báo cáo.</w:t>
-            </w:r>
-          </w:p>
-        </w:tc>
-      </w:tr>
-      <w:tr>
-        <w:trPr>
-          <w:cantSplit/>
-        </w:trPr>
-        <w:tc>
-          <w:tcPr>
-            <w:tcW w:w="600" w:type="dxa"/>
-            <w:tcBorders>
-              <w:top w:val="single" w:sz="4" w:space="0" w:color="BFBFBF"/>
-              <w:left w:val="single" w:sz="4" w:space="0" w:color="BFBFBF"/>
-              <w:bottom w:val="single" w:sz="4" w:space="0" w:color="BFBFBF"/>
-              <w:right w:val="single" w:sz="4" w:space="0" w:color="BFBFBF"/>
-            </w:tcBorders>
-            <w:tcMar>
-              <w:top w:w="50" w:type="dxa"/>
-              <w:left w:w="90" w:type="dxa"/>
-              <w:bottom w:w="50" w:type="dxa"/>
-              <w:right w:w="90" w:type="dxa"/>
-            </w:tcMar>
-          </w:tcPr>
-          <w:p>
-            <w:pPr>
-              <w:spacing w:after="20"/>
-            </w:pPr>
-            <w:r>
-              <w:rPr>
-                <w:sz w:val="18"/>
-                <w:szCs w:val="18"/>
-              </w:rPr>
-              <w:t>6</w:t>
-            </w:r>
-          </w:p>
-        </w:tc>
-        <w:tc>
-          <w:tcPr>
-            <w:tcW w:w="1100" w:type="dxa"/>
-            <w:tcBorders>
-              <w:top w:val="single" w:sz="4" w:space="0" w:color="BFBFBF"/>
-              <w:left w:val="single" w:sz="4" w:space="0" w:color="BFBFBF"/>
-              <w:bottom w:val="single" w:sz="4" w:space="0" w:color="BFBFBF"/>
-              <w:right w:val="single" w:sz="4" w:space="0" w:color="BFBFBF"/>
-            </w:tcBorders>
-            <w:tcMar>
-              <w:top w:w="50" w:type="dxa"/>
-              <w:left w:w="90" w:type="dxa"/>
-              <w:bottom w:w="50" w:type="dxa"/>
-              <w:right w:w="90" w:type="dxa"/>
-            </w:tcMar>
-          </w:tcPr>
-          <w:p>
-            <w:pPr>
-              <w:spacing w:after="20"/>
-            </w:pPr>
-            <w:r>
-              <w:rPr>
-                <w:i/>
-                <w:iCs/>
-                <w:color w:val="7A5C00"/>
-                <w:highlight w:val="yellow"/>
-              </w:rPr>
-              <w:t>[NHÓM ĐIỀN: …]</w:t>
-            </w:r>
-          </w:p>
-        </w:tc>
-        <w:tc>
-          <w:tcPr>
-            <w:tcW w:w="3600" w:type="dxa"/>
-            <w:tcBorders>
-              <w:top w:val="single" w:sz="4" w:space="0" w:color="BFBFBF"/>
-              <w:left w:val="single" w:sz="4" w:space="0" w:color="BFBFBF"/>
-              <w:bottom w:val="single" w:sz="4" w:space="0" w:color="BFBFBF"/>
-              <w:right w:val="single" w:sz="4" w:space="0" w:color="BFBFBF"/>
-            </w:tcBorders>
-            <w:tcMar>
-              <w:top w:w="50" w:type="dxa"/>
-              <w:left w:w="90" w:type="dxa"/>
-              <w:bottom w:w="50" w:type="dxa"/>
-              <w:right w:w="90" w:type="dxa"/>
-            </w:tcMar>
-          </w:tcPr>
-          <w:p>
-            <w:pPr>
-              <w:spacing w:after="20"/>
-            </w:pPr>
-            <w:r>
-              <w:rPr>
-                <w:i/>
-                <w:iCs/>
-                <w:color w:val="7A5C00"/>
-                <w:highlight w:val="yellow"/>
-              </w:rPr>
-              <w:t>[NHÓM ĐIỀN: …]</w:t>
-            </w:r>
-          </w:p>
-        </w:tc>
-        <w:tc>
-          <w:tcPr>
-            <w:tcW w:w="2169" w:type="dxa"/>
-            <w:tcBorders>
-              <w:top w:val="single" w:sz="4" w:space="0" w:color="BFBFBF"/>
-              <w:left w:val="single" w:sz="4" w:space="0" w:color="BFBFBF"/>
-              <w:bottom w:val="single" w:sz="4" w:space="0" w:color="BFBFBF"/>
-              <w:right w:val="single" w:sz="4" w:space="0" w:color="BFBFBF"/>
-            </w:tcBorders>
-            <w:tcMar>
-              <w:top w:w="50" w:type="dxa"/>
-              <w:left w:w="90" w:type="dxa"/>
-              <w:bottom w:w="50" w:type="dxa"/>
-              <w:right w:w="90" w:type="dxa"/>
-            </w:tcMar>
-          </w:tcPr>
-          <w:p>
-            <w:pPr>
-              <w:spacing w:after="20"/>
-            </w:pPr>
-            <w:r>
-              <w:rPr>
-                <w:i/>
-                <w:iCs/>
-                <w:color w:val="7A5C00"/>
-                <w:highlight w:val="yellow"/>
-              </w:rPr>
-              <w:t>[NHÓM ĐIỀN: …]</w:t>
-            </w:r>
-          </w:p>
-        </w:tc>
-        <w:tc>
-          <w:tcPr>
-            <w:tcW w:w="2169" w:type="dxa"/>
-            <w:tcBorders>
-              <w:top w:val="single" w:sz="4" w:space="0" w:color="BFBFBF"/>
-              <w:left w:val="single" w:sz="4" w:space="0" w:color="BFBFBF"/>
-              <w:bottom w:val="single" w:sz="4" w:space="0" w:color="BFBFBF"/>
-              <w:right w:val="single" w:sz="4" w:space="0" w:color="BFBFBF"/>
-            </w:tcBorders>
-            <w:tcMar>
-              <w:top w:w="50" w:type="dxa"/>
-              <w:left w:w="90" w:type="dxa"/>
-              <w:bottom w:w="50" w:type="dxa"/>
-              <w:right w:w="90" w:type="dxa"/>
-            </w:tcMar>
-          </w:tcPr>
-          <w:p>
-            <w:pPr>
-              <w:spacing w:after="20"/>
-            </w:pPr>
-            <w:r>
-              <w:rPr>
-                <w:i/>
-                <w:iCs/>
-                <w:color w:val="7A5C00"/>
-                <w:highlight w:val="yellow"/>
-              </w:rPr>
-              <w:t>[NHÓM ĐIỀN: …]</w:t>
             </w:r>
           </w:p>
         </w:tc>

</xml_diff>

<commit_message>
Báo cáo lab: phần phản tư theo các ý nhóm chọn
Co-Authored-By: Claude Opus 5.5 <noreply@anthropic.com>
</commit_message>
<xml_diff>
--- a/docs/lab/QLDA_Nhom_PharmaDash_Lab.docx
+++ b/docs/lab/QLDA_Nhom_PharmaDash_Lab.docx
@@ -44040,12 +44040,9 @@
       </w:pPr>
       <w:r>
         <w:rPr>
-          <w:i/>
-          <w:iCs/>
-          <w:color w:val="7A5C00"/>
-          <w:highlight w:val="yellow"/>
+          <w:sz w:val="21"/>
         </w:rPr>
-        <w:t>[NHÓM ĐIỀN: trả lời]</w:t>
+        <w:t>AI giúp nhóm nhanh hơn rõ nhất ở khâu soạn bản nháp: Charter, WBS 3 cấp và sổ rủi ro có khung đầy đủ chỉ trong vài phút, thay vì mất cả buổi để dựng từ đầu. Ở Bài 5, khi đóng vai Sponsor, Claude đặt các câu hỏi rất sắc và chỉ ra những điểm yếu nhóm chưa tự thấy, ví dụ mâu thuẫn giữa các ngày kết thúc và việc lịch giả định có hai Backend. Tuy nhiên AI cũng sai và thiếu ở nhiều chỗ: WBS của Claude ở Bài 2 lên tới 1.912 giờ công, quy ra khoảng 293 triệu đồng tiền công, vượt ngân sách 250 triệu mà Claude không tự kiểm tra; bản nháp Charter tự thêm mục “bán hàng online” vào phạm vi dù tài liệu yêu cầu không hề nhắc tới; và lịch PERT giả định đủ người để hoạt động G (API) và H (tích hợp, chuyển đổi dữ liệu) chạy song song, trong khi cả hai đều là việc của một Backend duy nhất. Những lỗi này chỉ phát hiện được khi nhóm đối chiếu với ngân sách, tài liệu gốc và phân công thực tế.</w:t>
       </w:r>
     </w:p>
     <w:p>
@@ -44066,12 +44063,9 @@
       </w:pPr>
       <w:r>
         <w:rPr>
-          <w:i/>
-          <w:iCs/>
-          <w:color w:val="7A5C00"/>
-          <w:highlight w:val="yellow"/>
+          <w:sz w:val="21"/>
         </w:rPr>
-        <w:t>[NHÓM ĐIỀN: trả lời]</w:t>
+        <w:t>Theo nhóm, có hai loại quyết định không nên giao cho AI. Thứ nhất là phân công và đánh giá thành viên: AI không biết hoàn cảnh của từng người, ví dụ chuyện gia đình khiến một thành viên phải nghỉ đột xuất (rủi ro R11), nên chỉ người trong nhóm mới sắp xếp và hỗ trợ nhau hợp lý được. Thứ hai là chấp nhận số liệu khi chưa đối chiếu: AI có thể sai nhưng vẫn trình bày rất tự tin, như WBS vượt ngân sách ở Bài 2. Vì vậy mọi con số đưa vào kế hoạch đều phải được nhóm kiểm tra lại bằng Excel hoặc so với tài liệu gốc trước khi dùng.</w:t>
       </w:r>
     </w:p>
     <w:p>

</xml_diff>

<commit_message>
Báo cáo lab: ghi chú kế hoạch dự phòng cho R11, R12
Co-Authored-By: Claude Opus 5.5 <noreply@anthropic.com>
</commit_message>
<xml_diff>
--- a/docs/lab/QLDA_Nhom_PharmaDash_Lab.docx
+++ b/docs/lab/QLDA_Nhom_PharmaDash_Lab.docx
@@ -43270,11 +43270,9 @@
       <w:r>
         <w:rPr>
           <w:i/>
-          <w:iCs/>
-          <w:color w:val="7A5C00"/>
-          <w:highlight w:val="yellow"/>
+          <w:sz w:val="20"/>
         </w:rPr>
-        <w:t>[NHÓM ĐIỀN: Nhóm rà soát lại kế hoạch dự phòng, và viết kế hoạch dự phòng cho rủi ro nhóm tự bổ sung nếu điểm cao hơn]</w:t>
+        <w:t>Hai rủi ro nhóm tự bổ sung có điểm thấp hơn R01 (R11: 12 điểm, R12: 9 điểm, đều mức Trung bình) nên chưa cần kế hoạch dự phòng riêng; nhóm theo dõi qua hành động ứng phó trong sổ rủi ro.</w:t>
       </w:r>
     </w:p>
     <w:p>

</xml_diff>